<commit_message>
test: Add massive dummy datasets for RAG performance testing
</commit_message>
<xml_diff>
--- a/data/library_policies.docx
+++ b/data/library_policies.docx
@@ -7,7 +7,7 @@
         <w:pStyle w:val="Title"/>
       </w:pPr>
       <w:r>
-        <w:t>Meridian University Library - Rules and Policies</w:t>
+        <w:t>Library Policies and Procedures</w:t>
       </w:r>
     </w:p>
     <w:p>
@@ -15,12 +15,27 @@
         <w:pStyle w:val="Heading1"/>
       </w:pPr>
       <w:r>
-        <w:t>1. General Conduct</w:t>
-      </w:r>
-    </w:p>
-    <w:p>
-      <w:r>
-        <w:t>All library users are expected to maintain a quiet environment in study areas. Mobile phones must be kept on silent mode. Food and drinks are strictly prohibited in all areas except the cafe on Floor 1 Ground near the entrance.</w:t>
+        <w:t>Section 1: Policy Guidelines</w:t>
+      </w:r>
+    </w:p>
+    <w:p>
+      <w:r>
+        <w:t xml:space="preserve">All patrons are required to adhere to the code of conduct, respect library property, and ensure timely return of borrowed materials. All patrons are required to adhere to the code of conduct, respect library property, and ensure timely return of borrowed materials. All patrons are required to adhere to the code of conduct, respect library property, and ensure timely return of borrowed materials. All patrons are required to adhere to the code of conduct, respect library property, and ensure timely return of borrowed materials. All patrons are required to adhere to the code of conduct, respect library property, and ensure timely return of borrowed materials. All patrons are required to adhere to the code of conduct, respect library property, and ensure timely return of borrowed materials. All patrons are required to adhere to the code of conduct, respect library property, and ensure timely return of borrowed materials. All patrons are required to adhere to the code of conduct, respect library property, and ensure timely return of borrowed materials. </w:t>
+      </w:r>
+    </w:p>
+    <w:p>
+      <w:r>
+        <w:t xml:space="preserve">All patrons are required to adhere to the code of conduct, respect library property, and ensure timely return of borrowed materials. All patrons are required to adhere to the code of conduct, respect library property, and ensure timely return of borrowed materials. All patrons are required to adhere to the code of conduct, respect library property, and ensure timely return of borrowed materials. All patrons are required to adhere to the code of conduct, respect library property, and ensure timely return of borrowed materials. All patrons are required to adhere to the code of conduct, respect library property, and ensure timely return of borrowed materials. All patrons are required to adhere to the code of conduct, respect library property, and ensure timely return of borrowed materials. All patrons are required to adhere to the code of conduct, respect library property, and ensure timely return of borrowed materials. All patrons are required to adhere to the code of conduct, respect library property, and ensure timely return of borrowed materials. </w:t>
+      </w:r>
+    </w:p>
+    <w:p>
+      <w:r>
+        <w:t xml:space="preserve">All patrons are required to adhere to the code of conduct, respect library property, and ensure timely return of borrowed materials. All patrons are required to adhere to the code of conduct, respect library property, and ensure timely return of borrowed materials. All patrons are required to adhere to the code of conduct, respect library property, and ensure timely return of borrowed materials. All patrons are required to adhere to the code of conduct, respect library property, and ensure timely return of borrowed materials. All patrons are required to adhere to the code of conduct, respect library property, and ensure timely return of borrowed materials. All patrons are required to adhere to the code of conduct, respect library property, and ensure timely return of borrowed materials. All patrons are required to adhere to the code of conduct, respect library property, and ensure timely return of borrowed materials. All patrons are required to adhere to the code of conduct, respect library property, and ensure timely return of borrowed materials. </w:t>
+      </w:r>
+    </w:p>
+    <w:p>
+      <w:r>
+        <w:br w:type="page"/>
       </w:r>
     </w:p>
     <w:p>
@@ -28,12 +43,27 @@
         <w:pStyle w:val="Heading1"/>
       </w:pPr>
       <w:r>
-        <w:t>2. Membership and Registration</w:t>
-      </w:r>
-    </w:p>
-    <w:p>
-      <w:r>
-        <w:t>All currently enrolled students and faculty members are automatically registered as library members. Visiting researchers and alumni can apply for a temporary membership card at the Help Desk with a valid photo ID and an introduction letter from their department.</w:t>
+        <w:t>Section 2: Policy Guidelines</w:t>
+      </w:r>
+    </w:p>
+    <w:p>
+      <w:r>
+        <w:t xml:space="preserve">All patrons are required to adhere to the code of conduct, respect library property, and ensure timely return of borrowed materials. All patrons are required to adhere to the code of conduct, respect library property, and ensure timely return of borrowed materials. All patrons are required to adhere to the code of conduct, respect library property, and ensure timely return of borrowed materials. All patrons are required to adhere to the code of conduct, respect library property, and ensure timely return of borrowed materials. All patrons are required to adhere to the code of conduct, respect library property, and ensure timely return of borrowed materials. All patrons are required to adhere to the code of conduct, respect library property, and ensure timely return of borrowed materials. All patrons are required to adhere to the code of conduct, respect library property, and ensure timely return of borrowed materials. All patrons are required to adhere to the code of conduct, respect library property, and ensure timely return of borrowed materials. </w:t>
+      </w:r>
+    </w:p>
+    <w:p>
+      <w:r>
+        <w:t xml:space="preserve">All patrons are required to adhere to the code of conduct, respect library property, and ensure timely return of borrowed materials. All patrons are required to adhere to the code of conduct, respect library property, and ensure timely return of borrowed materials. All patrons are required to adhere to the code of conduct, respect library property, and ensure timely return of borrowed materials. All patrons are required to adhere to the code of conduct, respect library property, and ensure timely return of borrowed materials. All patrons are required to adhere to the code of conduct, respect library property, and ensure timely return of borrowed materials. All patrons are required to adhere to the code of conduct, respect library property, and ensure timely return of borrowed materials. All patrons are required to adhere to the code of conduct, respect library property, and ensure timely return of borrowed materials. All patrons are required to adhere to the code of conduct, respect library property, and ensure timely return of borrowed materials. </w:t>
+      </w:r>
+    </w:p>
+    <w:p>
+      <w:r>
+        <w:t xml:space="preserve">All patrons are required to adhere to the code of conduct, respect library property, and ensure timely return of borrowed materials. All patrons are required to adhere to the code of conduct, respect library property, and ensure timely return of borrowed materials. All patrons are required to adhere to the code of conduct, respect library property, and ensure timely return of borrowed materials. All patrons are required to adhere to the code of conduct, respect library property, and ensure timely return of borrowed materials. All patrons are required to adhere to the code of conduct, respect library property, and ensure timely return of borrowed materials. All patrons are required to adhere to the code of conduct, respect library property, and ensure timely return of borrowed materials. All patrons are required to adhere to the code of conduct, respect library property, and ensure timely return of borrowed materials. All patrons are required to adhere to the code of conduct, respect library property, and ensure timely return of borrowed materials. </w:t>
+      </w:r>
+    </w:p>
+    <w:p>
+      <w:r>
+        <w:br w:type="page"/>
       </w:r>
     </w:p>
     <w:p>
@@ -41,12 +71,27 @@
         <w:pStyle w:val="Heading1"/>
       </w:pPr>
       <w:r>
-        <w:t>3. Borrowing Rules</w:t>
-      </w:r>
-    </w:p>
-    <w:p>
-      <w:r>
-        <w:t>Undergraduate students may borrow up to 10 books for 14 days. Postgraduate students and final-year students may borrow up to 20 books for 30 days. Faculty members may borrow up to 50 books for 90 days. Books can be renewed once online via the student portal if no other reservation exists.</w:t>
+        <w:t>Section 3: Policy Guidelines</w:t>
+      </w:r>
+    </w:p>
+    <w:p>
+      <w:r>
+        <w:t xml:space="preserve">All patrons are required to adhere to the code of conduct, respect library property, and ensure timely return of borrowed materials. All patrons are required to adhere to the code of conduct, respect library property, and ensure timely return of borrowed materials. All patrons are required to adhere to the code of conduct, respect library property, and ensure timely return of borrowed materials. All patrons are required to adhere to the code of conduct, respect library property, and ensure timely return of borrowed materials. All patrons are required to adhere to the code of conduct, respect library property, and ensure timely return of borrowed materials. All patrons are required to adhere to the code of conduct, respect library property, and ensure timely return of borrowed materials. All patrons are required to adhere to the code of conduct, respect library property, and ensure timely return of borrowed materials. All patrons are required to adhere to the code of conduct, respect library property, and ensure timely return of borrowed materials. </w:t>
+      </w:r>
+    </w:p>
+    <w:p>
+      <w:r>
+        <w:t xml:space="preserve">All patrons are required to adhere to the code of conduct, respect library property, and ensure timely return of borrowed materials. All patrons are required to adhere to the code of conduct, respect library property, and ensure timely return of borrowed materials. All patrons are required to adhere to the code of conduct, respect library property, and ensure timely return of borrowed materials. All patrons are required to adhere to the code of conduct, respect library property, and ensure timely return of borrowed materials. All patrons are required to adhere to the code of conduct, respect library property, and ensure timely return of borrowed materials. All patrons are required to adhere to the code of conduct, respect library property, and ensure timely return of borrowed materials. All patrons are required to adhere to the code of conduct, respect library property, and ensure timely return of borrowed materials. All patrons are required to adhere to the code of conduct, respect library property, and ensure timely return of borrowed materials. </w:t>
+      </w:r>
+    </w:p>
+    <w:p>
+      <w:r>
+        <w:t xml:space="preserve">All patrons are required to adhere to the code of conduct, respect library property, and ensure timely return of borrowed materials. All patrons are required to adhere to the code of conduct, respect library property, and ensure timely return of borrowed materials. All patrons are required to adhere to the code of conduct, respect library property, and ensure timely return of borrowed materials. All patrons are required to adhere to the code of conduct, respect library property, and ensure timely return of borrowed materials. All patrons are required to adhere to the code of conduct, respect library property, and ensure timely return of borrowed materials. All patrons are required to adhere to the code of conduct, respect library property, and ensure timely return of borrowed materials. All patrons are required to adhere to the code of conduct, respect library property, and ensure timely return of borrowed materials. All patrons are required to adhere to the code of conduct, respect library property, and ensure timely return of borrowed materials. </w:t>
+      </w:r>
+    </w:p>
+    <w:p>
+      <w:r>
+        <w:br w:type="page"/>
       </w:r>
     </w:p>
     <w:p>
@@ -54,12 +99,27 @@
         <w:pStyle w:val="Heading1"/>
       </w:pPr>
       <w:r>
-        <w:t>4. Fines and Penalties</w:t>
-      </w:r>
-    </w:p>
-    <w:p>
-      <w:r>
-        <w:t>Overdue books attract a fine of 10 rupees per day per book. Lost or damaged books must be replaced or paid for at the current market price. Repeated violations of library rules may result in suspension of borrowing privileges.</w:t>
+        <w:t>Section 4: Policy Guidelines</w:t>
+      </w:r>
+    </w:p>
+    <w:p>
+      <w:r>
+        <w:t xml:space="preserve">All patrons are required to adhere to the code of conduct, respect library property, and ensure timely return of borrowed materials. All patrons are required to adhere to the code of conduct, respect library property, and ensure timely return of borrowed materials. All patrons are required to adhere to the code of conduct, respect library property, and ensure timely return of borrowed materials. All patrons are required to adhere to the code of conduct, respect library property, and ensure timely return of borrowed materials. All patrons are required to adhere to the code of conduct, respect library property, and ensure timely return of borrowed materials. All patrons are required to adhere to the code of conduct, respect library property, and ensure timely return of borrowed materials. All patrons are required to adhere to the code of conduct, respect library property, and ensure timely return of borrowed materials. All patrons are required to adhere to the code of conduct, respect library property, and ensure timely return of borrowed materials. </w:t>
+      </w:r>
+    </w:p>
+    <w:p>
+      <w:r>
+        <w:t xml:space="preserve">All patrons are required to adhere to the code of conduct, respect library property, and ensure timely return of borrowed materials. All patrons are required to adhere to the code of conduct, respect library property, and ensure timely return of borrowed materials. All patrons are required to adhere to the code of conduct, respect library property, and ensure timely return of borrowed materials. All patrons are required to adhere to the code of conduct, respect library property, and ensure timely return of borrowed materials. All patrons are required to adhere to the code of conduct, respect library property, and ensure timely return of borrowed materials. All patrons are required to adhere to the code of conduct, respect library property, and ensure timely return of borrowed materials. All patrons are required to adhere to the code of conduct, respect library property, and ensure timely return of borrowed materials. All patrons are required to adhere to the code of conduct, respect library property, and ensure timely return of borrowed materials. </w:t>
+      </w:r>
+    </w:p>
+    <w:p>
+      <w:r>
+        <w:t xml:space="preserve">All patrons are required to adhere to the code of conduct, respect library property, and ensure timely return of borrowed materials. All patrons are required to adhere to the code of conduct, respect library property, and ensure timely return of borrowed materials. All patrons are required to adhere to the code of conduct, respect library property, and ensure timely return of borrowed materials. All patrons are required to adhere to the code of conduct, respect library property, and ensure timely return of borrowed materials. All patrons are required to adhere to the code of conduct, respect library property, and ensure timely return of borrowed materials. All patrons are required to adhere to the code of conduct, respect library property, and ensure timely return of borrowed materials. All patrons are required to adhere to the code of conduct, respect library property, and ensure timely return of borrowed materials. All patrons are required to adhere to the code of conduct, respect library property, and ensure timely return of borrowed materials. </w:t>
+      </w:r>
+    </w:p>
+    <w:p>
+      <w:r>
+        <w:br w:type="page"/>
       </w:r>
     </w:p>
     <w:p>
@@ -67,12 +127,27 @@
         <w:pStyle w:val="Heading1"/>
       </w:pPr>
       <w:r>
-        <w:t>5. Study Room Booking</w:t>
-      </w:r>
-    </w:p>
-    <w:p>
-      <w:r>
-        <w:t>Study rooms on Floor 2 can be booked online via the library portal up to 3 days in advance. Each booking is for a maximum of 3 hours. Groups of 3 to 8 students are allowed. Individual bookings are not permitted for group study rooms.</w:t>
+        <w:t>Section 5: Policy Guidelines</w:t>
+      </w:r>
+    </w:p>
+    <w:p>
+      <w:r>
+        <w:t xml:space="preserve">All patrons are required to adhere to the code of conduct, respect library property, and ensure timely return of borrowed materials. All patrons are required to adhere to the code of conduct, respect library property, and ensure timely return of borrowed materials. All patrons are required to adhere to the code of conduct, respect library property, and ensure timely return of borrowed materials. All patrons are required to adhere to the code of conduct, respect library property, and ensure timely return of borrowed materials. All patrons are required to adhere to the code of conduct, respect library property, and ensure timely return of borrowed materials. All patrons are required to adhere to the code of conduct, respect library property, and ensure timely return of borrowed materials. All patrons are required to adhere to the code of conduct, respect library property, and ensure timely return of borrowed materials. All patrons are required to adhere to the code of conduct, respect library property, and ensure timely return of borrowed materials. </w:t>
+      </w:r>
+    </w:p>
+    <w:p>
+      <w:r>
+        <w:t xml:space="preserve">All patrons are required to adhere to the code of conduct, respect library property, and ensure timely return of borrowed materials. All patrons are required to adhere to the code of conduct, respect library property, and ensure timely return of borrowed materials. All patrons are required to adhere to the code of conduct, respect library property, and ensure timely return of borrowed materials. All patrons are required to adhere to the code of conduct, respect library property, and ensure timely return of borrowed materials. All patrons are required to adhere to the code of conduct, respect library property, and ensure timely return of borrowed materials. All patrons are required to adhere to the code of conduct, respect library property, and ensure timely return of borrowed materials. All patrons are required to adhere to the code of conduct, respect library property, and ensure timely return of borrowed materials. All patrons are required to adhere to the code of conduct, respect library property, and ensure timely return of borrowed materials. </w:t>
+      </w:r>
+    </w:p>
+    <w:p>
+      <w:r>
+        <w:t xml:space="preserve">All patrons are required to adhere to the code of conduct, respect library property, and ensure timely return of borrowed materials. All patrons are required to adhere to the code of conduct, respect library property, and ensure timely return of borrowed materials. All patrons are required to adhere to the code of conduct, respect library property, and ensure timely return of borrowed materials. All patrons are required to adhere to the code of conduct, respect library property, and ensure timely return of borrowed materials. All patrons are required to adhere to the code of conduct, respect library property, and ensure timely return of borrowed materials. All patrons are required to adhere to the code of conduct, respect library property, and ensure timely return of borrowed materials. All patrons are required to adhere to the code of conduct, respect library property, and ensure timely return of borrowed materials. All patrons are required to adhere to the code of conduct, respect library property, and ensure timely return of borrowed materials. </w:t>
+      </w:r>
+    </w:p>
+    <w:p>
+      <w:r>
+        <w:br w:type="page"/>
       </w:r>
     </w:p>
     <w:p>
@@ -80,12 +155,27 @@
         <w:pStyle w:val="Heading1"/>
       </w:pPr>
       <w:r>
-        <w:t>6. Digital and E-Resources</w:t>
-      </w:r>
-    </w:p>
-    <w:p>
-      <w:r>
-        <w:t>Access to e-resources like IEEE Xplore, ScienceDirect, JSTOR, and ACS Publications is available on campus. Off-campus access requires a VPN login using university credentials. Contact the IT helpdesk at it.help@meridian.edu for VPN setup assistance.</w:t>
+        <w:t>Section 6: Policy Guidelines</w:t>
+      </w:r>
+    </w:p>
+    <w:p>
+      <w:r>
+        <w:t xml:space="preserve">All patrons are required to adhere to the code of conduct, respect library property, and ensure timely return of borrowed materials. All patrons are required to adhere to the code of conduct, respect library property, and ensure timely return of borrowed materials. All patrons are required to adhere to the code of conduct, respect library property, and ensure timely return of borrowed materials. All patrons are required to adhere to the code of conduct, respect library property, and ensure timely return of borrowed materials. All patrons are required to adhere to the code of conduct, respect library property, and ensure timely return of borrowed materials. All patrons are required to adhere to the code of conduct, respect library property, and ensure timely return of borrowed materials. All patrons are required to adhere to the code of conduct, respect library property, and ensure timely return of borrowed materials. All patrons are required to adhere to the code of conduct, respect library property, and ensure timely return of borrowed materials. </w:t>
+      </w:r>
+    </w:p>
+    <w:p>
+      <w:r>
+        <w:t xml:space="preserve">All patrons are required to adhere to the code of conduct, respect library property, and ensure timely return of borrowed materials. All patrons are required to adhere to the code of conduct, respect library property, and ensure timely return of borrowed materials. All patrons are required to adhere to the code of conduct, respect library property, and ensure timely return of borrowed materials. All patrons are required to adhere to the code of conduct, respect library property, and ensure timely return of borrowed materials. All patrons are required to adhere to the code of conduct, respect library property, and ensure timely return of borrowed materials. All patrons are required to adhere to the code of conduct, respect library property, and ensure timely return of borrowed materials. All patrons are required to adhere to the code of conduct, respect library property, and ensure timely return of borrowed materials. All patrons are required to adhere to the code of conduct, respect library property, and ensure timely return of borrowed materials. </w:t>
+      </w:r>
+    </w:p>
+    <w:p>
+      <w:r>
+        <w:t xml:space="preserve">All patrons are required to adhere to the code of conduct, respect library property, and ensure timely return of borrowed materials. All patrons are required to adhere to the code of conduct, respect library property, and ensure timely return of borrowed materials. All patrons are required to adhere to the code of conduct, respect library property, and ensure timely return of borrowed materials. All patrons are required to adhere to the code of conduct, respect library property, and ensure timely return of borrowed materials. All patrons are required to adhere to the code of conduct, respect library property, and ensure timely return of borrowed materials. All patrons are required to adhere to the code of conduct, respect library property, and ensure timely return of borrowed materials. All patrons are required to adhere to the code of conduct, respect library property, and ensure timely return of borrowed materials. All patrons are required to adhere to the code of conduct, respect library property, and ensure timely return of borrowed materials. </w:t>
+      </w:r>
+    </w:p>
+    <w:p>
+      <w:r>
+        <w:br w:type="page"/>
       </w:r>
     </w:p>
     <w:p>
@@ -93,12 +183,2626 @@
         <w:pStyle w:val="Heading1"/>
       </w:pPr>
       <w:r>
-        <w:t>7. Interlibrary Loan Service</w:t>
-      </w:r>
-    </w:p>
-    <w:p>
-      <w:r>
-        <w:t>Books not available in our collection can be requested through the Interlibrary Loan (ILL) service via the student portal. Requests typically take 3 to 5 working days. There is no charge for up to 5 ILL requests per semester.</w:t>
+        <w:t>Section 7: Policy Guidelines</w:t>
+      </w:r>
+    </w:p>
+    <w:p>
+      <w:r>
+        <w:t xml:space="preserve">All patrons are required to adhere to the code of conduct, respect library property, and ensure timely return of borrowed materials. All patrons are required to adhere to the code of conduct, respect library property, and ensure timely return of borrowed materials. All patrons are required to adhere to the code of conduct, respect library property, and ensure timely return of borrowed materials. All patrons are required to adhere to the code of conduct, respect library property, and ensure timely return of borrowed materials. All patrons are required to adhere to the code of conduct, respect library property, and ensure timely return of borrowed materials. All patrons are required to adhere to the code of conduct, respect library property, and ensure timely return of borrowed materials. All patrons are required to adhere to the code of conduct, respect library property, and ensure timely return of borrowed materials. All patrons are required to adhere to the code of conduct, respect library property, and ensure timely return of borrowed materials. </w:t>
+      </w:r>
+    </w:p>
+    <w:p>
+      <w:r>
+        <w:t xml:space="preserve">All patrons are required to adhere to the code of conduct, respect library property, and ensure timely return of borrowed materials. All patrons are required to adhere to the code of conduct, respect library property, and ensure timely return of borrowed materials. All patrons are required to adhere to the code of conduct, respect library property, and ensure timely return of borrowed materials. All patrons are required to adhere to the code of conduct, respect library property, and ensure timely return of borrowed materials. All patrons are required to adhere to the code of conduct, respect library property, and ensure timely return of borrowed materials. All patrons are required to adhere to the code of conduct, respect library property, and ensure timely return of borrowed materials. All patrons are required to adhere to the code of conduct, respect library property, and ensure timely return of borrowed materials. All patrons are required to adhere to the code of conduct, respect library property, and ensure timely return of borrowed materials. </w:t>
+      </w:r>
+    </w:p>
+    <w:p>
+      <w:r>
+        <w:t xml:space="preserve">All patrons are required to adhere to the code of conduct, respect library property, and ensure timely return of borrowed materials. All patrons are required to adhere to the code of conduct, respect library property, and ensure timely return of borrowed materials. All patrons are required to adhere to the code of conduct, respect library property, and ensure timely return of borrowed materials. All patrons are required to adhere to the code of conduct, respect library property, and ensure timely return of borrowed materials. All patrons are required to adhere to the code of conduct, respect library property, and ensure timely return of borrowed materials. All patrons are required to adhere to the code of conduct, respect library property, and ensure timely return of borrowed materials. All patrons are required to adhere to the code of conduct, respect library property, and ensure timely return of borrowed materials. All patrons are required to adhere to the code of conduct, respect library property, and ensure timely return of borrowed materials. </w:t>
+      </w:r>
+    </w:p>
+    <w:p>
+      <w:r>
+        <w:br w:type="page"/>
+      </w:r>
+    </w:p>
+    <w:p>
+      <w:pPr>
+        <w:pStyle w:val="Heading1"/>
+      </w:pPr>
+      <w:r>
+        <w:t>Section 8: Policy Guidelines</w:t>
+      </w:r>
+    </w:p>
+    <w:p>
+      <w:r>
+        <w:t xml:space="preserve">All patrons are required to adhere to the code of conduct, respect library property, and ensure timely return of borrowed materials. All patrons are required to adhere to the code of conduct, respect library property, and ensure timely return of borrowed materials. All patrons are required to adhere to the code of conduct, respect library property, and ensure timely return of borrowed materials. All patrons are required to adhere to the code of conduct, respect library property, and ensure timely return of borrowed materials. All patrons are required to adhere to the code of conduct, respect library property, and ensure timely return of borrowed materials. All patrons are required to adhere to the code of conduct, respect library property, and ensure timely return of borrowed materials. All patrons are required to adhere to the code of conduct, respect library property, and ensure timely return of borrowed materials. All patrons are required to adhere to the code of conduct, respect library property, and ensure timely return of borrowed materials. </w:t>
+      </w:r>
+    </w:p>
+    <w:p>
+      <w:r>
+        <w:t xml:space="preserve">All patrons are required to adhere to the code of conduct, respect library property, and ensure timely return of borrowed materials. All patrons are required to adhere to the code of conduct, respect library property, and ensure timely return of borrowed materials. All patrons are required to adhere to the code of conduct, respect library property, and ensure timely return of borrowed materials. All patrons are required to adhere to the code of conduct, respect library property, and ensure timely return of borrowed materials. All patrons are required to adhere to the code of conduct, respect library property, and ensure timely return of borrowed materials. All patrons are required to adhere to the code of conduct, respect library property, and ensure timely return of borrowed materials. All patrons are required to adhere to the code of conduct, respect library property, and ensure timely return of borrowed materials. All patrons are required to adhere to the code of conduct, respect library property, and ensure timely return of borrowed materials. </w:t>
+      </w:r>
+    </w:p>
+    <w:p>
+      <w:r>
+        <w:t xml:space="preserve">All patrons are required to adhere to the code of conduct, respect library property, and ensure timely return of borrowed materials. All patrons are required to adhere to the code of conduct, respect library property, and ensure timely return of borrowed materials. All patrons are required to adhere to the code of conduct, respect library property, and ensure timely return of borrowed materials. All patrons are required to adhere to the code of conduct, respect library property, and ensure timely return of borrowed materials. All patrons are required to adhere to the code of conduct, respect library property, and ensure timely return of borrowed materials. All patrons are required to adhere to the code of conduct, respect library property, and ensure timely return of borrowed materials. All patrons are required to adhere to the code of conduct, respect library property, and ensure timely return of borrowed materials. All patrons are required to adhere to the code of conduct, respect library property, and ensure timely return of borrowed materials. </w:t>
+      </w:r>
+    </w:p>
+    <w:p>
+      <w:r>
+        <w:br w:type="page"/>
+      </w:r>
+    </w:p>
+    <w:p>
+      <w:pPr>
+        <w:pStyle w:val="Heading1"/>
+      </w:pPr>
+      <w:r>
+        <w:t>Section 9: Policy Guidelines</w:t>
+      </w:r>
+    </w:p>
+    <w:p>
+      <w:r>
+        <w:t xml:space="preserve">All patrons are required to adhere to the code of conduct, respect library property, and ensure timely return of borrowed materials. All patrons are required to adhere to the code of conduct, respect library property, and ensure timely return of borrowed materials. All patrons are required to adhere to the code of conduct, respect library property, and ensure timely return of borrowed materials. All patrons are required to adhere to the code of conduct, respect library property, and ensure timely return of borrowed materials. All patrons are required to adhere to the code of conduct, respect library property, and ensure timely return of borrowed materials. All patrons are required to adhere to the code of conduct, respect library property, and ensure timely return of borrowed materials. All patrons are required to adhere to the code of conduct, respect library property, and ensure timely return of borrowed materials. All patrons are required to adhere to the code of conduct, respect library property, and ensure timely return of borrowed materials. </w:t>
+      </w:r>
+    </w:p>
+    <w:p>
+      <w:r>
+        <w:t xml:space="preserve">All patrons are required to adhere to the code of conduct, respect library property, and ensure timely return of borrowed materials. All patrons are required to adhere to the code of conduct, respect library property, and ensure timely return of borrowed materials. All patrons are required to adhere to the code of conduct, respect library property, and ensure timely return of borrowed materials. All patrons are required to adhere to the code of conduct, respect library property, and ensure timely return of borrowed materials. All patrons are required to adhere to the code of conduct, respect library property, and ensure timely return of borrowed materials. All patrons are required to adhere to the code of conduct, respect library property, and ensure timely return of borrowed materials. All patrons are required to adhere to the code of conduct, respect library property, and ensure timely return of borrowed materials. All patrons are required to adhere to the code of conduct, respect library property, and ensure timely return of borrowed materials. </w:t>
+      </w:r>
+    </w:p>
+    <w:p>
+      <w:r>
+        <w:t xml:space="preserve">All patrons are required to adhere to the code of conduct, respect library property, and ensure timely return of borrowed materials. All patrons are required to adhere to the code of conduct, respect library property, and ensure timely return of borrowed materials. All patrons are required to adhere to the code of conduct, respect library property, and ensure timely return of borrowed materials. All patrons are required to adhere to the code of conduct, respect library property, and ensure timely return of borrowed materials. All patrons are required to adhere to the code of conduct, respect library property, and ensure timely return of borrowed materials. All patrons are required to adhere to the code of conduct, respect library property, and ensure timely return of borrowed materials. All patrons are required to adhere to the code of conduct, respect library property, and ensure timely return of borrowed materials. All patrons are required to adhere to the code of conduct, respect library property, and ensure timely return of borrowed materials. </w:t>
+      </w:r>
+    </w:p>
+    <w:p>
+      <w:r>
+        <w:br w:type="page"/>
+      </w:r>
+    </w:p>
+    <w:p>
+      <w:pPr>
+        <w:pStyle w:val="Heading1"/>
+      </w:pPr>
+      <w:r>
+        <w:t>Section 10: Policy Guidelines</w:t>
+      </w:r>
+    </w:p>
+    <w:p>
+      <w:r>
+        <w:t xml:space="preserve">All patrons are required to adhere to the code of conduct, respect library property, and ensure timely return of borrowed materials. All patrons are required to adhere to the code of conduct, respect library property, and ensure timely return of borrowed materials. All patrons are required to adhere to the code of conduct, respect library property, and ensure timely return of borrowed materials. All patrons are required to adhere to the code of conduct, respect library property, and ensure timely return of borrowed materials. All patrons are required to adhere to the code of conduct, respect library property, and ensure timely return of borrowed materials. All patrons are required to adhere to the code of conduct, respect library property, and ensure timely return of borrowed materials. All patrons are required to adhere to the code of conduct, respect library property, and ensure timely return of borrowed materials. All patrons are required to adhere to the code of conduct, respect library property, and ensure timely return of borrowed materials. </w:t>
+      </w:r>
+    </w:p>
+    <w:p>
+      <w:r>
+        <w:t xml:space="preserve">All patrons are required to adhere to the code of conduct, respect library property, and ensure timely return of borrowed materials. All patrons are required to adhere to the code of conduct, respect library property, and ensure timely return of borrowed materials. All patrons are required to adhere to the code of conduct, respect library property, and ensure timely return of borrowed materials. All patrons are required to adhere to the code of conduct, respect library property, and ensure timely return of borrowed materials. All patrons are required to adhere to the code of conduct, respect library property, and ensure timely return of borrowed materials. All patrons are required to adhere to the code of conduct, respect library property, and ensure timely return of borrowed materials. All patrons are required to adhere to the code of conduct, respect library property, and ensure timely return of borrowed materials. All patrons are required to adhere to the code of conduct, respect library property, and ensure timely return of borrowed materials. </w:t>
+      </w:r>
+    </w:p>
+    <w:p>
+      <w:r>
+        <w:t xml:space="preserve">All patrons are required to adhere to the code of conduct, respect library property, and ensure timely return of borrowed materials. All patrons are required to adhere to the code of conduct, respect library property, and ensure timely return of borrowed materials. All patrons are required to adhere to the code of conduct, respect library property, and ensure timely return of borrowed materials. All patrons are required to adhere to the code of conduct, respect library property, and ensure timely return of borrowed materials. All patrons are required to adhere to the code of conduct, respect library property, and ensure timely return of borrowed materials. All patrons are required to adhere to the code of conduct, respect library property, and ensure timely return of borrowed materials. All patrons are required to adhere to the code of conduct, respect library property, and ensure timely return of borrowed materials. All patrons are required to adhere to the code of conduct, respect library property, and ensure timely return of borrowed materials. </w:t>
+      </w:r>
+    </w:p>
+    <w:p>
+      <w:r>
+        <w:br w:type="page"/>
+      </w:r>
+    </w:p>
+    <w:p>
+      <w:pPr>
+        <w:pStyle w:val="Heading1"/>
+      </w:pPr>
+      <w:r>
+        <w:t>Section 11: Policy Guidelines</w:t>
+      </w:r>
+    </w:p>
+    <w:p>
+      <w:r>
+        <w:t xml:space="preserve">All patrons are required to adhere to the code of conduct, respect library property, and ensure timely return of borrowed materials. All patrons are required to adhere to the code of conduct, respect library property, and ensure timely return of borrowed materials. All patrons are required to adhere to the code of conduct, respect library property, and ensure timely return of borrowed materials. All patrons are required to adhere to the code of conduct, respect library property, and ensure timely return of borrowed materials. All patrons are required to adhere to the code of conduct, respect library property, and ensure timely return of borrowed materials. All patrons are required to adhere to the code of conduct, respect library property, and ensure timely return of borrowed materials. All patrons are required to adhere to the code of conduct, respect library property, and ensure timely return of borrowed materials. All patrons are required to adhere to the code of conduct, respect library property, and ensure timely return of borrowed materials. </w:t>
+      </w:r>
+    </w:p>
+    <w:p>
+      <w:r>
+        <w:t xml:space="preserve">All patrons are required to adhere to the code of conduct, respect library property, and ensure timely return of borrowed materials. All patrons are required to adhere to the code of conduct, respect library property, and ensure timely return of borrowed materials. All patrons are required to adhere to the code of conduct, respect library property, and ensure timely return of borrowed materials. All patrons are required to adhere to the code of conduct, respect library property, and ensure timely return of borrowed materials. All patrons are required to adhere to the code of conduct, respect library property, and ensure timely return of borrowed materials. All patrons are required to adhere to the code of conduct, respect library property, and ensure timely return of borrowed materials. All patrons are required to adhere to the code of conduct, respect library property, and ensure timely return of borrowed materials. All patrons are required to adhere to the code of conduct, respect library property, and ensure timely return of borrowed materials. </w:t>
+      </w:r>
+    </w:p>
+    <w:p>
+      <w:r>
+        <w:t xml:space="preserve">All patrons are required to adhere to the code of conduct, respect library property, and ensure timely return of borrowed materials. All patrons are required to adhere to the code of conduct, respect library property, and ensure timely return of borrowed materials. All patrons are required to adhere to the code of conduct, respect library property, and ensure timely return of borrowed materials. All patrons are required to adhere to the code of conduct, respect library property, and ensure timely return of borrowed materials. All patrons are required to adhere to the code of conduct, respect library property, and ensure timely return of borrowed materials. All patrons are required to adhere to the code of conduct, respect library property, and ensure timely return of borrowed materials. All patrons are required to adhere to the code of conduct, respect library property, and ensure timely return of borrowed materials. All patrons are required to adhere to the code of conduct, respect library property, and ensure timely return of borrowed materials. </w:t>
+      </w:r>
+    </w:p>
+    <w:p>
+      <w:r>
+        <w:br w:type="page"/>
+      </w:r>
+    </w:p>
+    <w:p>
+      <w:pPr>
+        <w:pStyle w:val="Heading1"/>
+      </w:pPr>
+      <w:r>
+        <w:t>Section 12: Policy Guidelines</w:t>
+      </w:r>
+    </w:p>
+    <w:p>
+      <w:r>
+        <w:t xml:space="preserve">All patrons are required to adhere to the code of conduct, respect library property, and ensure timely return of borrowed materials. All patrons are required to adhere to the code of conduct, respect library property, and ensure timely return of borrowed materials. All patrons are required to adhere to the code of conduct, respect library property, and ensure timely return of borrowed materials. All patrons are required to adhere to the code of conduct, respect library property, and ensure timely return of borrowed materials. All patrons are required to adhere to the code of conduct, respect library property, and ensure timely return of borrowed materials. All patrons are required to adhere to the code of conduct, respect library property, and ensure timely return of borrowed materials. All patrons are required to adhere to the code of conduct, respect library property, and ensure timely return of borrowed materials. All patrons are required to adhere to the code of conduct, respect library property, and ensure timely return of borrowed materials. </w:t>
+      </w:r>
+    </w:p>
+    <w:p>
+      <w:r>
+        <w:t xml:space="preserve">All patrons are required to adhere to the code of conduct, respect library property, and ensure timely return of borrowed materials. All patrons are required to adhere to the code of conduct, respect library property, and ensure timely return of borrowed materials. All patrons are required to adhere to the code of conduct, respect library property, and ensure timely return of borrowed materials. All patrons are required to adhere to the code of conduct, respect library property, and ensure timely return of borrowed materials. All patrons are required to adhere to the code of conduct, respect library property, and ensure timely return of borrowed materials. All patrons are required to adhere to the code of conduct, respect library property, and ensure timely return of borrowed materials. All patrons are required to adhere to the code of conduct, respect library property, and ensure timely return of borrowed materials. All patrons are required to adhere to the code of conduct, respect library property, and ensure timely return of borrowed materials. </w:t>
+      </w:r>
+    </w:p>
+    <w:p>
+      <w:r>
+        <w:t xml:space="preserve">All patrons are required to adhere to the code of conduct, respect library property, and ensure timely return of borrowed materials. All patrons are required to adhere to the code of conduct, respect library property, and ensure timely return of borrowed materials. All patrons are required to adhere to the code of conduct, respect library property, and ensure timely return of borrowed materials. All patrons are required to adhere to the code of conduct, respect library property, and ensure timely return of borrowed materials. All patrons are required to adhere to the code of conduct, respect library property, and ensure timely return of borrowed materials. All patrons are required to adhere to the code of conduct, respect library property, and ensure timely return of borrowed materials. All patrons are required to adhere to the code of conduct, respect library property, and ensure timely return of borrowed materials. All patrons are required to adhere to the code of conduct, respect library property, and ensure timely return of borrowed materials. </w:t>
+      </w:r>
+    </w:p>
+    <w:p>
+      <w:r>
+        <w:br w:type="page"/>
+      </w:r>
+    </w:p>
+    <w:p>
+      <w:pPr>
+        <w:pStyle w:val="Heading1"/>
+      </w:pPr>
+      <w:r>
+        <w:t>Section 13: Policy Guidelines</w:t>
+      </w:r>
+    </w:p>
+    <w:p>
+      <w:r>
+        <w:t xml:space="preserve">All patrons are required to adhere to the code of conduct, respect library property, and ensure timely return of borrowed materials. All patrons are required to adhere to the code of conduct, respect library property, and ensure timely return of borrowed materials. All patrons are required to adhere to the code of conduct, respect library property, and ensure timely return of borrowed materials. All patrons are required to adhere to the code of conduct, respect library property, and ensure timely return of borrowed materials. All patrons are required to adhere to the code of conduct, respect library property, and ensure timely return of borrowed materials. All patrons are required to adhere to the code of conduct, respect library property, and ensure timely return of borrowed materials. All patrons are required to adhere to the code of conduct, respect library property, and ensure timely return of borrowed materials. All patrons are required to adhere to the code of conduct, respect library property, and ensure timely return of borrowed materials. </w:t>
+      </w:r>
+    </w:p>
+    <w:p>
+      <w:r>
+        <w:t xml:space="preserve">All patrons are required to adhere to the code of conduct, respect library property, and ensure timely return of borrowed materials. All patrons are required to adhere to the code of conduct, respect library property, and ensure timely return of borrowed materials. All patrons are required to adhere to the code of conduct, respect library property, and ensure timely return of borrowed materials. All patrons are required to adhere to the code of conduct, respect library property, and ensure timely return of borrowed materials. All patrons are required to adhere to the code of conduct, respect library property, and ensure timely return of borrowed materials. All patrons are required to adhere to the code of conduct, respect library property, and ensure timely return of borrowed materials. All patrons are required to adhere to the code of conduct, respect library property, and ensure timely return of borrowed materials. All patrons are required to adhere to the code of conduct, respect library property, and ensure timely return of borrowed materials. </w:t>
+      </w:r>
+    </w:p>
+    <w:p>
+      <w:r>
+        <w:t xml:space="preserve">All patrons are required to adhere to the code of conduct, respect library property, and ensure timely return of borrowed materials. All patrons are required to adhere to the code of conduct, respect library property, and ensure timely return of borrowed materials. All patrons are required to adhere to the code of conduct, respect library property, and ensure timely return of borrowed materials. All patrons are required to adhere to the code of conduct, respect library property, and ensure timely return of borrowed materials. All patrons are required to adhere to the code of conduct, respect library property, and ensure timely return of borrowed materials. All patrons are required to adhere to the code of conduct, respect library property, and ensure timely return of borrowed materials. All patrons are required to adhere to the code of conduct, respect library property, and ensure timely return of borrowed materials. All patrons are required to adhere to the code of conduct, respect library property, and ensure timely return of borrowed materials. </w:t>
+      </w:r>
+    </w:p>
+    <w:p>
+      <w:r>
+        <w:br w:type="page"/>
+      </w:r>
+    </w:p>
+    <w:p>
+      <w:pPr>
+        <w:pStyle w:val="Heading1"/>
+      </w:pPr>
+      <w:r>
+        <w:t>Section 14: Policy Guidelines</w:t>
+      </w:r>
+    </w:p>
+    <w:p>
+      <w:r>
+        <w:t xml:space="preserve">All patrons are required to adhere to the code of conduct, respect library property, and ensure timely return of borrowed materials. All patrons are required to adhere to the code of conduct, respect library property, and ensure timely return of borrowed materials. All patrons are required to adhere to the code of conduct, respect library property, and ensure timely return of borrowed materials. All patrons are required to adhere to the code of conduct, respect library property, and ensure timely return of borrowed materials. All patrons are required to adhere to the code of conduct, respect library property, and ensure timely return of borrowed materials. All patrons are required to adhere to the code of conduct, respect library property, and ensure timely return of borrowed materials. All patrons are required to adhere to the code of conduct, respect library property, and ensure timely return of borrowed materials. All patrons are required to adhere to the code of conduct, respect library property, and ensure timely return of borrowed materials. </w:t>
+      </w:r>
+    </w:p>
+    <w:p>
+      <w:r>
+        <w:t xml:space="preserve">All patrons are required to adhere to the code of conduct, respect library property, and ensure timely return of borrowed materials. All patrons are required to adhere to the code of conduct, respect library property, and ensure timely return of borrowed materials. All patrons are required to adhere to the code of conduct, respect library property, and ensure timely return of borrowed materials. All patrons are required to adhere to the code of conduct, respect library property, and ensure timely return of borrowed materials. All patrons are required to adhere to the code of conduct, respect library property, and ensure timely return of borrowed materials. All patrons are required to adhere to the code of conduct, respect library property, and ensure timely return of borrowed materials. All patrons are required to adhere to the code of conduct, respect library property, and ensure timely return of borrowed materials. All patrons are required to adhere to the code of conduct, respect library property, and ensure timely return of borrowed materials. </w:t>
+      </w:r>
+    </w:p>
+    <w:p>
+      <w:r>
+        <w:t xml:space="preserve">All patrons are required to adhere to the code of conduct, respect library property, and ensure timely return of borrowed materials. All patrons are required to adhere to the code of conduct, respect library property, and ensure timely return of borrowed materials. All patrons are required to adhere to the code of conduct, respect library property, and ensure timely return of borrowed materials. All patrons are required to adhere to the code of conduct, respect library property, and ensure timely return of borrowed materials. All patrons are required to adhere to the code of conduct, respect library property, and ensure timely return of borrowed materials. All patrons are required to adhere to the code of conduct, respect library property, and ensure timely return of borrowed materials. All patrons are required to adhere to the code of conduct, respect library property, and ensure timely return of borrowed materials. All patrons are required to adhere to the code of conduct, respect library property, and ensure timely return of borrowed materials. </w:t>
+      </w:r>
+    </w:p>
+    <w:p>
+      <w:r>
+        <w:br w:type="page"/>
+      </w:r>
+    </w:p>
+    <w:p>
+      <w:pPr>
+        <w:pStyle w:val="Heading1"/>
+      </w:pPr>
+      <w:r>
+        <w:t>Section 15: Policy Guidelines</w:t>
+      </w:r>
+    </w:p>
+    <w:p>
+      <w:r>
+        <w:t xml:space="preserve">All patrons are required to adhere to the code of conduct, respect library property, and ensure timely return of borrowed materials. All patrons are required to adhere to the code of conduct, respect library property, and ensure timely return of borrowed materials. All patrons are required to adhere to the code of conduct, respect library property, and ensure timely return of borrowed materials. All patrons are required to adhere to the code of conduct, respect library property, and ensure timely return of borrowed materials. All patrons are required to adhere to the code of conduct, respect library property, and ensure timely return of borrowed materials. All patrons are required to adhere to the code of conduct, respect library property, and ensure timely return of borrowed materials. All patrons are required to adhere to the code of conduct, respect library property, and ensure timely return of borrowed materials. All patrons are required to adhere to the code of conduct, respect library property, and ensure timely return of borrowed materials. </w:t>
+      </w:r>
+    </w:p>
+    <w:p>
+      <w:r>
+        <w:t xml:space="preserve">All patrons are required to adhere to the code of conduct, respect library property, and ensure timely return of borrowed materials. All patrons are required to adhere to the code of conduct, respect library property, and ensure timely return of borrowed materials. All patrons are required to adhere to the code of conduct, respect library property, and ensure timely return of borrowed materials. All patrons are required to adhere to the code of conduct, respect library property, and ensure timely return of borrowed materials. All patrons are required to adhere to the code of conduct, respect library property, and ensure timely return of borrowed materials. All patrons are required to adhere to the code of conduct, respect library property, and ensure timely return of borrowed materials. All patrons are required to adhere to the code of conduct, respect library property, and ensure timely return of borrowed materials. All patrons are required to adhere to the code of conduct, respect library property, and ensure timely return of borrowed materials. </w:t>
+      </w:r>
+    </w:p>
+    <w:p>
+      <w:r>
+        <w:t xml:space="preserve">All patrons are required to adhere to the code of conduct, respect library property, and ensure timely return of borrowed materials. All patrons are required to adhere to the code of conduct, respect library property, and ensure timely return of borrowed materials. All patrons are required to adhere to the code of conduct, respect library property, and ensure timely return of borrowed materials. All patrons are required to adhere to the code of conduct, respect library property, and ensure timely return of borrowed materials. All patrons are required to adhere to the code of conduct, respect library property, and ensure timely return of borrowed materials. All patrons are required to adhere to the code of conduct, respect library property, and ensure timely return of borrowed materials. All patrons are required to adhere to the code of conduct, respect library property, and ensure timely return of borrowed materials. All patrons are required to adhere to the code of conduct, respect library property, and ensure timely return of borrowed materials. </w:t>
+      </w:r>
+    </w:p>
+    <w:p>
+      <w:r>
+        <w:br w:type="page"/>
+      </w:r>
+    </w:p>
+    <w:p>
+      <w:pPr>
+        <w:pStyle w:val="Heading1"/>
+      </w:pPr>
+      <w:r>
+        <w:t>Section 16: Policy Guidelines</w:t>
+      </w:r>
+    </w:p>
+    <w:p>
+      <w:r>
+        <w:t xml:space="preserve">All patrons are required to adhere to the code of conduct, respect library property, and ensure timely return of borrowed materials. All patrons are required to adhere to the code of conduct, respect library property, and ensure timely return of borrowed materials. All patrons are required to adhere to the code of conduct, respect library property, and ensure timely return of borrowed materials. All patrons are required to adhere to the code of conduct, respect library property, and ensure timely return of borrowed materials. All patrons are required to adhere to the code of conduct, respect library property, and ensure timely return of borrowed materials. All patrons are required to adhere to the code of conduct, respect library property, and ensure timely return of borrowed materials. All patrons are required to adhere to the code of conduct, respect library property, and ensure timely return of borrowed materials. All patrons are required to adhere to the code of conduct, respect library property, and ensure timely return of borrowed materials. </w:t>
+      </w:r>
+    </w:p>
+    <w:p>
+      <w:r>
+        <w:t xml:space="preserve">All patrons are required to adhere to the code of conduct, respect library property, and ensure timely return of borrowed materials. All patrons are required to adhere to the code of conduct, respect library property, and ensure timely return of borrowed materials. All patrons are required to adhere to the code of conduct, respect library property, and ensure timely return of borrowed materials. All patrons are required to adhere to the code of conduct, respect library property, and ensure timely return of borrowed materials. All patrons are required to adhere to the code of conduct, respect library property, and ensure timely return of borrowed materials. All patrons are required to adhere to the code of conduct, respect library property, and ensure timely return of borrowed materials. All patrons are required to adhere to the code of conduct, respect library property, and ensure timely return of borrowed materials. All patrons are required to adhere to the code of conduct, respect library property, and ensure timely return of borrowed materials. </w:t>
+      </w:r>
+    </w:p>
+    <w:p>
+      <w:r>
+        <w:t xml:space="preserve">All patrons are required to adhere to the code of conduct, respect library property, and ensure timely return of borrowed materials. All patrons are required to adhere to the code of conduct, respect library property, and ensure timely return of borrowed materials. All patrons are required to adhere to the code of conduct, respect library property, and ensure timely return of borrowed materials. All patrons are required to adhere to the code of conduct, respect library property, and ensure timely return of borrowed materials. All patrons are required to adhere to the code of conduct, respect library property, and ensure timely return of borrowed materials. All patrons are required to adhere to the code of conduct, respect library property, and ensure timely return of borrowed materials. All patrons are required to adhere to the code of conduct, respect library property, and ensure timely return of borrowed materials. All patrons are required to adhere to the code of conduct, respect library property, and ensure timely return of borrowed materials. </w:t>
+      </w:r>
+    </w:p>
+    <w:p>
+      <w:r>
+        <w:br w:type="page"/>
+      </w:r>
+    </w:p>
+    <w:p>
+      <w:pPr>
+        <w:pStyle w:val="Heading1"/>
+      </w:pPr>
+      <w:r>
+        <w:t>Section 17: Policy Guidelines</w:t>
+      </w:r>
+    </w:p>
+    <w:p>
+      <w:r>
+        <w:t xml:space="preserve">All patrons are required to adhere to the code of conduct, respect library property, and ensure timely return of borrowed materials. All patrons are required to adhere to the code of conduct, respect library property, and ensure timely return of borrowed materials. All patrons are required to adhere to the code of conduct, respect library property, and ensure timely return of borrowed materials. All patrons are required to adhere to the code of conduct, respect library property, and ensure timely return of borrowed materials. All patrons are required to adhere to the code of conduct, respect library property, and ensure timely return of borrowed materials. All patrons are required to adhere to the code of conduct, respect library property, and ensure timely return of borrowed materials. All patrons are required to adhere to the code of conduct, respect library property, and ensure timely return of borrowed materials. All patrons are required to adhere to the code of conduct, respect library property, and ensure timely return of borrowed materials. </w:t>
+      </w:r>
+    </w:p>
+    <w:p>
+      <w:r>
+        <w:t xml:space="preserve">All patrons are required to adhere to the code of conduct, respect library property, and ensure timely return of borrowed materials. All patrons are required to adhere to the code of conduct, respect library property, and ensure timely return of borrowed materials. All patrons are required to adhere to the code of conduct, respect library property, and ensure timely return of borrowed materials. All patrons are required to adhere to the code of conduct, respect library property, and ensure timely return of borrowed materials. All patrons are required to adhere to the code of conduct, respect library property, and ensure timely return of borrowed materials. All patrons are required to adhere to the code of conduct, respect library property, and ensure timely return of borrowed materials. All patrons are required to adhere to the code of conduct, respect library property, and ensure timely return of borrowed materials. All patrons are required to adhere to the code of conduct, respect library property, and ensure timely return of borrowed materials. </w:t>
+      </w:r>
+    </w:p>
+    <w:p>
+      <w:r>
+        <w:t xml:space="preserve">All patrons are required to adhere to the code of conduct, respect library property, and ensure timely return of borrowed materials. All patrons are required to adhere to the code of conduct, respect library property, and ensure timely return of borrowed materials. All patrons are required to adhere to the code of conduct, respect library property, and ensure timely return of borrowed materials. All patrons are required to adhere to the code of conduct, respect library property, and ensure timely return of borrowed materials. All patrons are required to adhere to the code of conduct, respect library property, and ensure timely return of borrowed materials. All patrons are required to adhere to the code of conduct, respect library property, and ensure timely return of borrowed materials. All patrons are required to adhere to the code of conduct, respect library property, and ensure timely return of borrowed materials. All patrons are required to adhere to the code of conduct, respect library property, and ensure timely return of borrowed materials. </w:t>
+      </w:r>
+    </w:p>
+    <w:p>
+      <w:r>
+        <w:br w:type="page"/>
+      </w:r>
+    </w:p>
+    <w:p>
+      <w:pPr>
+        <w:pStyle w:val="Heading1"/>
+      </w:pPr>
+      <w:r>
+        <w:t>Section 18: Policy Guidelines</w:t>
+      </w:r>
+    </w:p>
+    <w:p>
+      <w:r>
+        <w:t xml:space="preserve">All patrons are required to adhere to the code of conduct, respect library property, and ensure timely return of borrowed materials. All patrons are required to adhere to the code of conduct, respect library property, and ensure timely return of borrowed materials. All patrons are required to adhere to the code of conduct, respect library property, and ensure timely return of borrowed materials. All patrons are required to adhere to the code of conduct, respect library property, and ensure timely return of borrowed materials. All patrons are required to adhere to the code of conduct, respect library property, and ensure timely return of borrowed materials. All patrons are required to adhere to the code of conduct, respect library property, and ensure timely return of borrowed materials. All patrons are required to adhere to the code of conduct, respect library property, and ensure timely return of borrowed materials. All patrons are required to adhere to the code of conduct, respect library property, and ensure timely return of borrowed materials. </w:t>
+      </w:r>
+    </w:p>
+    <w:p>
+      <w:r>
+        <w:t xml:space="preserve">All patrons are required to adhere to the code of conduct, respect library property, and ensure timely return of borrowed materials. All patrons are required to adhere to the code of conduct, respect library property, and ensure timely return of borrowed materials. All patrons are required to adhere to the code of conduct, respect library property, and ensure timely return of borrowed materials. All patrons are required to adhere to the code of conduct, respect library property, and ensure timely return of borrowed materials. All patrons are required to adhere to the code of conduct, respect library property, and ensure timely return of borrowed materials. All patrons are required to adhere to the code of conduct, respect library property, and ensure timely return of borrowed materials. All patrons are required to adhere to the code of conduct, respect library property, and ensure timely return of borrowed materials. All patrons are required to adhere to the code of conduct, respect library property, and ensure timely return of borrowed materials. </w:t>
+      </w:r>
+    </w:p>
+    <w:p>
+      <w:r>
+        <w:t xml:space="preserve">All patrons are required to adhere to the code of conduct, respect library property, and ensure timely return of borrowed materials. All patrons are required to adhere to the code of conduct, respect library property, and ensure timely return of borrowed materials. All patrons are required to adhere to the code of conduct, respect library property, and ensure timely return of borrowed materials. All patrons are required to adhere to the code of conduct, respect library property, and ensure timely return of borrowed materials. All patrons are required to adhere to the code of conduct, respect library property, and ensure timely return of borrowed materials. All patrons are required to adhere to the code of conduct, respect library property, and ensure timely return of borrowed materials. All patrons are required to adhere to the code of conduct, respect library property, and ensure timely return of borrowed materials. All patrons are required to adhere to the code of conduct, respect library property, and ensure timely return of borrowed materials. </w:t>
+      </w:r>
+    </w:p>
+    <w:p>
+      <w:r>
+        <w:br w:type="page"/>
+      </w:r>
+    </w:p>
+    <w:p>
+      <w:pPr>
+        <w:pStyle w:val="Heading1"/>
+      </w:pPr>
+      <w:r>
+        <w:t>Section 19: Policy Guidelines</w:t>
+      </w:r>
+    </w:p>
+    <w:p>
+      <w:r>
+        <w:t xml:space="preserve">All patrons are required to adhere to the code of conduct, respect library property, and ensure timely return of borrowed materials. All patrons are required to adhere to the code of conduct, respect library property, and ensure timely return of borrowed materials. All patrons are required to adhere to the code of conduct, respect library property, and ensure timely return of borrowed materials. All patrons are required to adhere to the code of conduct, respect library property, and ensure timely return of borrowed materials. All patrons are required to adhere to the code of conduct, respect library property, and ensure timely return of borrowed materials. All patrons are required to adhere to the code of conduct, respect library property, and ensure timely return of borrowed materials. All patrons are required to adhere to the code of conduct, respect library property, and ensure timely return of borrowed materials. All patrons are required to adhere to the code of conduct, respect library property, and ensure timely return of borrowed materials. </w:t>
+      </w:r>
+    </w:p>
+    <w:p>
+      <w:r>
+        <w:t xml:space="preserve">All patrons are required to adhere to the code of conduct, respect library property, and ensure timely return of borrowed materials. All patrons are required to adhere to the code of conduct, respect library property, and ensure timely return of borrowed materials. All patrons are required to adhere to the code of conduct, respect library property, and ensure timely return of borrowed materials. All patrons are required to adhere to the code of conduct, respect library property, and ensure timely return of borrowed materials. All patrons are required to adhere to the code of conduct, respect library property, and ensure timely return of borrowed materials. All patrons are required to adhere to the code of conduct, respect library property, and ensure timely return of borrowed materials. All patrons are required to adhere to the code of conduct, respect library property, and ensure timely return of borrowed materials. All patrons are required to adhere to the code of conduct, respect library property, and ensure timely return of borrowed materials. </w:t>
+      </w:r>
+    </w:p>
+    <w:p>
+      <w:r>
+        <w:t xml:space="preserve">All patrons are required to adhere to the code of conduct, respect library property, and ensure timely return of borrowed materials. All patrons are required to adhere to the code of conduct, respect library property, and ensure timely return of borrowed materials. All patrons are required to adhere to the code of conduct, respect library property, and ensure timely return of borrowed materials. All patrons are required to adhere to the code of conduct, respect library property, and ensure timely return of borrowed materials. All patrons are required to adhere to the code of conduct, respect library property, and ensure timely return of borrowed materials. All patrons are required to adhere to the code of conduct, respect library property, and ensure timely return of borrowed materials. All patrons are required to adhere to the code of conduct, respect library property, and ensure timely return of borrowed materials. All patrons are required to adhere to the code of conduct, respect library property, and ensure timely return of borrowed materials. </w:t>
+      </w:r>
+    </w:p>
+    <w:p>
+      <w:r>
+        <w:br w:type="page"/>
+      </w:r>
+    </w:p>
+    <w:p>
+      <w:pPr>
+        <w:pStyle w:val="Heading1"/>
+      </w:pPr>
+      <w:r>
+        <w:t>Section 20: Policy Guidelines</w:t>
+      </w:r>
+    </w:p>
+    <w:p>
+      <w:r>
+        <w:t xml:space="preserve">All patrons are required to adhere to the code of conduct, respect library property, and ensure timely return of borrowed materials. All patrons are required to adhere to the code of conduct, respect library property, and ensure timely return of borrowed materials. All patrons are required to adhere to the code of conduct, respect library property, and ensure timely return of borrowed materials. All patrons are required to adhere to the code of conduct, respect library property, and ensure timely return of borrowed materials. All patrons are required to adhere to the code of conduct, respect library property, and ensure timely return of borrowed materials. All patrons are required to adhere to the code of conduct, respect library property, and ensure timely return of borrowed materials. All patrons are required to adhere to the code of conduct, respect library property, and ensure timely return of borrowed materials. All patrons are required to adhere to the code of conduct, respect library property, and ensure timely return of borrowed materials. </w:t>
+      </w:r>
+    </w:p>
+    <w:p>
+      <w:r>
+        <w:t xml:space="preserve">All patrons are required to adhere to the code of conduct, respect library property, and ensure timely return of borrowed materials. All patrons are required to adhere to the code of conduct, respect library property, and ensure timely return of borrowed materials. All patrons are required to adhere to the code of conduct, respect library property, and ensure timely return of borrowed materials. All patrons are required to adhere to the code of conduct, respect library property, and ensure timely return of borrowed materials. All patrons are required to adhere to the code of conduct, respect library property, and ensure timely return of borrowed materials. All patrons are required to adhere to the code of conduct, respect library property, and ensure timely return of borrowed materials. All patrons are required to adhere to the code of conduct, respect library property, and ensure timely return of borrowed materials. All patrons are required to adhere to the code of conduct, respect library property, and ensure timely return of borrowed materials. </w:t>
+      </w:r>
+    </w:p>
+    <w:p>
+      <w:r>
+        <w:t xml:space="preserve">All patrons are required to adhere to the code of conduct, respect library property, and ensure timely return of borrowed materials. All patrons are required to adhere to the code of conduct, respect library property, and ensure timely return of borrowed materials. All patrons are required to adhere to the code of conduct, respect library property, and ensure timely return of borrowed materials. All patrons are required to adhere to the code of conduct, respect library property, and ensure timely return of borrowed materials. All patrons are required to adhere to the code of conduct, respect library property, and ensure timely return of borrowed materials. All patrons are required to adhere to the code of conduct, respect library property, and ensure timely return of borrowed materials. All patrons are required to adhere to the code of conduct, respect library property, and ensure timely return of borrowed materials. All patrons are required to adhere to the code of conduct, respect library property, and ensure timely return of borrowed materials. </w:t>
+      </w:r>
+    </w:p>
+    <w:p>
+      <w:r>
+        <w:br w:type="page"/>
+      </w:r>
+    </w:p>
+    <w:p>
+      <w:pPr>
+        <w:pStyle w:val="Heading1"/>
+      </w:pPr>
+      <w:r>
+        <w:t>Section 21: Policy Guidelines</w:t>
+      </w:r>
+    </w:p>
+    <w:p>
+      <w:r>
+        <w:t xml:space="preserve">All patrons are required to adhere to the code of conduct, respect library property, and ensure timely return of borrowed materials. All patrons are required to adhere to the code of conduct, respect library property, and ensure timely return of borrowed materials. All patrons are required to adhere to the code of conduct, respect library property, and ensure timely return of borrowed materials. All patrons are required to adhere to the code of conduct, respect library property, and ensure timely return of borrowed materials. All patrons are required to adhere to the code of conduct, respect library property, and ensure timely return of borrowed materials. All patrons are required to adhere to the code of conduct, respect library property, and ensure timely return of borrowed materials. All patrons are required to adhere to the code of conduct, respect library property, and ensure timely return of borrowed materials. All patrons are required to adhere to the code of conduct, respect library property, and ensure timely return of borrowed materials. </w:t>
+      </w:r>
+    </w:p>
+    <w:p>
+      <w:r>
+        <w:t xml:space="preserve">All patrons are required to adhere to the code of conduct, respect library property, and ensure timely return of borrowed materials. All patrons are required to adhere to the code of conduct, respect library property, and ensure timely return of borrowed materials. All patrons are required to adhere to the code of conduct, respect library property, and ensure timely return of borrowed materials. All patrons are required to adhere to the code of conduct, respect library property, and ensure timely return of borrowed materials. All patrons are required to adhere to the code of conduct, respect library property, and ensure timely return of borrowed materials. All patrons are required to adhere to the code of conduct, respect library property, and ensure timely return of borrowed materials. All patrons are required to adhere to the code of conduct, respect library property, and ensure timely return of borrowed materials. All patrons are required to adhere to the code of conduct, respect library property, and ensure timely return of borrowed materials. </w:t>
+      </w:r>
+    </w:p>
+    <w:p>
+      <w:r>
+        <w:t xml:space="preserve">All patrons are required to adhere to the code of conduct, respect library property, and ensure timely return of borrowed materials. All patrons are required to adhere to the code of conduct, respect library property, and ensure timely return of borrowed materials. All patrons are required to adhere to the code of conduct, respect library property, and ensure timely return of borrowed materials. All patrons are required to adhere to the code of conduct, respect library property, and ensure timely return of borrowed materials. All patrons are required to adhere to the code of conduct, respect library property, and ensure timely return of borrowed materials. All patrons are required to adhere to the code of conduct, respect library property, and ensure timely return of borrowed materials. All patrons are required to adhere to the code of conduct, respect library property, and ensure timely return of borrowed materials. All patrons are required to adhere to the code of conduct, respect library property, and ensure timely return of borrowed materials. </w:t>
+      </w:r>
+    </w:p>
+    <w:p>
+      <w:r>
+        <w:br w:type="page"/>
+      </w:r>
+    </w:p>
+    <w:p>
+      <w:pPr>
+        <w:pStyle w:val="Heading1"/>
+      </w:pPr>
+      <w:r>
+        <w:t>Section 22: Policy Guidelines</w:t>
+      </w:r>
+    </w:p>
+    <w:p>
+      <w:r>
+        <w:t xml:space="preserve">All patrons are required to adhere to the code of conduct, respect library property, and ensure timely return of borrowed materials. All patrons are required to adhere to the code of conduct, respect library property, and ensure timely return of borrowed materials. All patrons are required to adhere to the code of conduct, respect library property, and ensure timely return of borrowed materials. All patrons are required to adhere to the code of conduct, respect library property, and ensure timely return of borrowed materials. All patrons are required to adhere to the code of conduct, respect library property, and ensure timely return of borrowed materials. All patrons are required to adhere to the code of conduct, respect library property, and ensure timely return of borrowed materials. All patrons are required to adhere to the code of conduct, respect library property, and ensure timely return of borrowed materials. All patrons are required to adhere to the code of conduct, respect library property, and ensure timely return of borrowed materials. </w:t>
+      </w:r>
+    </w:p>
+    <w:p>
+      <w:r>
+        <w:t xml:space="preserve">All patrons are required to adhere to the code of conduct, respect library property, and ensure timely return of borrowed materials. All patrons are required to adhere to the code of conduct, respect library property, and ensure timely return of borrowed materials. All patrons are required to adhere to the code of conduct, respect library property, and ensure timely return of borrowed materials. All patrons are required to adhere to the code of conduct, respect library property, and ensure timely return of borrowed materials. All patrons are required to adhere to the code of conduct, respect library property, and ensure timely return of borrowed materials. All patrons are required to adhere to the code of conduct, respect library property, and ensure timely return of borrowed materials. All patrons are required to adhere to the code of conduct, respect library property, and ensure timely return of borrowed materials. All patrons are required to adhere to the code of conduct, respect library property, and ensure timely return of borrowed materials. </w:t>
+      </w:r>
+    </w:p>
+    <w:p>
+      <w:r>
+        <w:t xml:space="preserve">All patrons are required to adhere to the code of conduct, respect library property, and ensure timely return of borrowed materials. All patrons are required to adhere to the code of conduct, respect library property, and ensure timely return of borrowed materials. All patrons are required to adhere to the code of conduct, respect library property, and ensure timely return of borrowed materials. All patrons are required to adhere to the code of conduct, respect library property, and ensure timely return of borrowed materials. All patrons are required to adhere to the code of conduct, respect library property, and ensure timely return of borrowed materials. All patrons are required to adhere to the code of conduct, respect library property, and ensure timely return of borrowed materials. All patrons are required to adhere to the code of conduct, respect library property, and ensure timely return of borrowed materials. All patrons are required to adhere to the code of conduct, respect library property, and ensure timely return of borrowed materials. </w:t>
+      </w:r>
+    </w:p>
+    <w:p>
+      <w:r>
+        <w:br w:type="page"/>
+      </w:r>
+    </w:p>
+    <w:p>
+      <w:pPr>
+        <w:pStyle w:val="Heading1"/>
+      </w:pPr>
+      <w:r>
+        <w:t>Section 23: Policy Guidelines</w:t>
+      </w:r>
+    </w:p>
+    <w:p>
+      <w:r>
+        <w:t xml:space="preserve">All patrons are required to adhere to the code of conduct, respect library property, and ensure timely return of borrowed materials. All patrons are required to adhere to the code of conduct, respect library property, and ensure timely return of borrowed materials. All patrons are required to adhere to the code of conduct, respect library property, and ensure timely return of borrowed materials. All patrons are required to adhere to the code of conduct, respect library property, and ensure timely return of borrowed materials. All patrons are required to adhere to the code of conduct, respect library property, and ensure timely return of borrowed materials. All patrons are required to adhere to the code of conduct, respect library property, and ensure timely return of borrowed materials. All patrons are required to adhere to the code of conduct, respect library property, and ensure timely return of borrowed materials. All patrons are required to adhere to the code of conduct, respect library property, and ensure timely return of borrowed materials. </w:t>
+      </w:r>
+    </w:p>
+    <w:p>
+      <w:r>
+        <w:t xml:space="preserve">All patrons are required to adhere to the code of conduct, respect library property, and ensure timely return of borrowed materials. All patrons are required to adhere to the code of conduct, respect library property, and ensure timely return of borrowed materials. All patrons are required to adhere to the code of conduct, respect library property, and ensure timely return of borrowed materials. All patrons are required to adhere to the code of conduct, respect library property, and ensure timely return of borrowed materials. All patrons are required to adhere to the code of conduct, respect library property, and ensure timely return of borrowed materials. All patrons are required to adhere to the code of conduct, respect library property, and ensure timely return of borrowed materials. All patrons are required to adhere to the code of conduct, respect library property, and ensure timely return of borrowed materials. All patrons are required to adhere to the code of conduct, respect library property, and ensure timely return of borrowed materials. </w:t>
+      </w:r>
+    </w:p>
+    <w:p>
+      <w:r>
+        <w:t xml:space="preserve">All patrons are required to adhere to the code of conduct, respect library property, and ensure timely return of borrowed materials. All patrons are required to adhere to the code of conduct, respect library property, and ensure timely return of borrowed materials. All patrons are required to adhere to the code of conduct, respect library property, and ensure timely return of borrowed materials. All patrons are required to adhere to the code of conduct, respect library property, and ensure timely return of borrowed materials. All patrons are required to adhere to the code of conduct, respect library property, and ensure timely return of borrowed materials. All patrons are required to adhere to the code of conduct, respect library property, and ensure timely return of borrowed materials. All patrons are required to adhere to the code of conduct, respect library property, and ensure timely return of borrowed materials. All patrons are required to adhere to the code of conduct, respect library property, and ensure timely return of borrowed materials. </w:t>
+      </w:r>
+    </w:p>
+    <w:p>
+      <w:r>
+        <w:br w:type="page"/>
+      </w:r>
+    </w:p>
+    <w:p>
+      <w:pPr>
+        <w:pStyle w:val="Heading1"/>
+      </w:pPr>
+      <w:r>
+        <w:t>Section 24: Policy Guidelines</w:t>
+      </w:r>
+    </w:p>
+    <w:p>
+      <w:r>
+        <w:t xml:space="preserve">All patrons are required to adhere to the code of conduct, respect library property, and ensure timely return of borrowed materials. All patrons are required to adhere to the code of conduct, respect library property, and ensure timely return of borrowed materials. All patrons are required to adhere to the code of conduct, respect library property, and ensure timely return of borrowed materials. All patrons are required to adhere to the code of conduct, respect library property, and ensure timely return of borrowed materials. All patrons are required to adhere to the code of conduct, respect library property, and ensure timely return of borrowed materials. All patrons are required to adhere to the code of conduct, respect library property, and ensure timely return of borrowed materials. All patrons are required to adhere to the code of conduct, respect library property, and ensure timely return of borrowed materials. All patrons are required to adhere to the code of conduct, respect library property, and ensure timely return of borrowed materials. </w:t>
+      </w:r>
+    </w:p>
+    <w:p>
+      <w:r>
+        <w:t xml:space="preserve">All patrons are required to adhere to the code of conduct, respect library property, and ensure timely return of borrowed materials. All patrons are required to adhere to the code of conduct, respect library property, and ensure timely return of borrowed materials. All patrons are required to adhere to the code of conduct, respect library property, and ensure timely return of borrowed materials. All patrons are required to adhere to the code of conduct, respect library property, and ensure timely return of borrowed materials. All patrons are required to adhere to the code of conduct, respect library property, and ensure timely return of borrowed materials. All patrons are required to adhere to the code of conduct, respect library property, and ensure timely return of borrowed materials. All patrons are required to adhere to the code of conduct, respect library property, and ensure timely return of borrowed materials. All patrons are required to adhere to the code of conduct, respect library property, and ensure timely return of borrowed materials. </w:t>
+      </w:r>
+    </w:p>
+    <w:p>
+      <w:r>
+        <w:t xml:space="preserve">All patrons are required to adhere to the code of conduct, respect library property, and ensure timely return of borrowed materials. All patrons are required to adhere to the code of conduct, respect library property, and ensure timely return of borrowed materials. All patrons are required to adhere to the code of conduct, respect library property, and ensure timely return of borrowed materials. All patrons are required to adhere to the code of conduct, respect library property, and ensure timely return of borrowed materials. All patrons are required to adhere to the code of conduct, respect library property, and ensure timely return of borrowed materials. All patrons are required to adhere to the code of conduct, respect library property, and ensure timely return of borrowed materials. All patrons are required to adhere to the code of conduct, respect library property, and ensure timely return of borrowed materials. All patrons are required to adhere to the code of conduct, respect library property, and ensure timely return of borrowed materials. </w:t>
+      </w:r>
+    </w:p>
+    <w:p>
+      <w:r>
+        <w:br w:type="page"/>
+      </w:r>
+    </w:p>
+    <w:p>
+      <w:pPr>
+        <w:pStyle w:val="Heading1"/>
+      </w:pPr>
+      <w:r>
+        <w:t>Section 25: Policy Guidelines</w:t>
+      </w:r>
+    </w:p>
+    <w:p>
+      <w:r>
+        <w:t xml:space="preserve">All patrons are required to adhere to the code of conduct, respect library property, and ensure timely return of borrowed materials. All patrons are required to adhere to the code of conduct, respect library property, and ensure timely return of borrowed materials. All patrons are required to adhere to the code of conduct, respect library property, and ensure timely return of borrowed materials. All patrons are required to adhere to the code of conduct, respect library property, and ensure timely return of borrowed materials. All patrons are required to adhere to the code of conduct, respect library property, and ensure timely return of borrowed materials. All patrons are required to adhere to the code of conduct, respect library property, and ensure timely return of borrowed materials. All patrons are required to adhere to the code of conduct, respect library property, and ensure timely return of borrowed materials. All patrons are required to adhere to the code of conduct, respect library property, and ensure timely return of borrowed materials. </w:t>
+      </w:r>
+    </w:p>
+    <w:p>
+      <w:r>
+        <w:t xml:space="preserve">All patrons are required to adhere to the code of conduct, respect library property, and ensure timely return of borrowed materials. All patrons are required to adhere to the code of conduct, respect library property, and ensure timely return of borrowed materials. All patrons are required to adhere to the code of conduct, respect library property, and ensure timely return of borrowed materials. All patrons are required to adhere to the code of conduct, respect library property, and ensure timely return of borrowed materials. All patrons are required to adhere to the code of conduct, respect library property, and ensure timely return of borrowed materials. All patrons are required to adhere to the code of conduct, respect library property, and ensure timely return of borrowed materials. All patrons are required to adhere to the code of conduct, respect library property, and ensure timely return of borrowed materials. All patrons are required to adhere to the code of conduct, respect library property, and ensure timely return of borrowed materials. </w:t>
+      </w:r>
+    </w:p>
+    <w:p>
+      <w:r>
+        <w:t xml:space="preserve">All patrons are required to adhere to the code of conduct, respect library property, and ensure timely return of borrowed materials. All patrons are required to adhere to the code of conduct, respect library property, and ensure timely return of borrowed materials. All patrons are required to adhere to the code of conduct, respect library property, and ensure timely return of borrowed materials. All patrons are required to adhere to the code of conduct, respect library property, and ensure timely return of borrowed materials. All patrons are required to adhere to the code of conduct, respect library property, and ensure timely return of borrowed materials. All patrons are required to adhere to the code of conduct, respect library property, and ensure timely return of borrowed materials. All patrons are required to adhere to the code of conduct, respect library property, and ensure timely return of borrowed materials. All patrons are required to adhere to the code of conduct, respect library property, and ensure timely return of borrowed materials. </w:t>
+      </w:r>
+    </w:p>
+    <w:p>
+      <w:r>
+        <w:br w:type="page"/>
+      </w:r>
+    </w:p>
+    <w:p>
+      <w:pPr>
+        <w:pStyle w:val="Heading1"/>
+      </w:pPr>
+      <w:r>
+        <w:t>Section 26: Policy Guidelines</w:t>
+      </w:r>
+    </w:p>
+    <w:p>
+      <w:r>
+        <w:t xml:space="preserve">All patrons are required to adhere to the code of conduct, respect library property, and ensure timely return of borrowed materials. All patrons are required to adhere to the code of conduct, respect library property, and ensure timely return of borrowed materials. All patrons are required to adhere to the code of conduct, respect library property, and ensure timely return of borrowed materials. All patrons are required to adhere to the code of conduct, respect library property, and ensure timely return of borrowed materials. All patrons are required to adhere to the code of conduct, respect library property, and ensure timely return of borrowed materials. All patrons are required to adhere to the code of conduct, respect library property, and ensure timely return of borrowed materials. All patrons are required to adhere to the code of conduct, respect library property, and ensure timely return of borrowed materials. All patrons are required to adhere to the code of conduct, respect library property, and ensure timely return of borrowed materials. </w:t>
+      </w:r>
+    </w:p>
+    <w:p>
+      <w:r>
+        <w:t xml:space="preserve">All patrons are required to adhere to the code of conduct, respect library property, and ensure timely return of borrowed materials. All patrons are required to adhere to the code of conduct, respect library property, and ensure timely return of borrowed materials. All patrons are required to adhere to the code of conduct, respect library property, and ensure timely return of borrowed materials. All patrons are required to adhere to the code of conduct, respect library property, and ensure timely return of borrowed materials. All patrons are required to adhere to the code of conduct, respect library property, and ensure timely return of borrowed materials. All patrons are required to adhere to the code of conduct, respect library property, and ensure timely return of borrowed materials. All patrons are required to adhere to the code of conduct, respect library property, and ensure timely return of borrowed materials. All patrons are required to adhere to the code of conduct, respect library property, and ensure timely return of borrowed materials. </w:t>
+      </w:r>
+    </w:p>
+    <w:p>
+      <w:r>
+        <w:t xml:space="preserve">All patrons are required to adhere to the code of conduct, respect library property, and ensure timely return of borrowed materials. All patrons are required to adhere to the code of conduct, respect library property, and ensure timely return of borrowed materials. All patrons are required to adhere to the code of conduct, respect library property, and ensure timely return of borrowed materials. All patrons are required to adhere to the code of conduct, respect library property, and ensure timely return of borrowed materials. All patrons are required to adhere to the code of conduct, respect library property, and ensure timely return of borrowed materials. All patrons are required to adhere to the code of conduct, respect library property, and ensure timely return of borrowed materials. All patrons are required to adhere to the code of conduct, respect library property, and ensure timely return of borrowed materials. All patrons are required to adhere to the code of conduct, respect library property, and ensure timely return of borrowed materials. </w:t>
+      </w:r>
+    </w:p>
+    <w:p>
+      <w:r>
+        <w:br w:type="page"/>
+      </w:r>
+    </w:p>
+    <w:p>
+      <w:pPr>
+        <w:pStyle w:val="Heading1"/>
+      </w:pPr>
+      <w:r>
+        <w:t>Section 27: Policy Guidelines</w:t>
+      </w:r>
+    </w:p>
+    <w:p>
+      <w:r>
+        <w:t xml:space="preserve">All patrons are required to adhere to the code of conduct, respect library property, and ensure timely return of borrowed materials. All patrons are required to adhere to the code of conduct, respect library property, and ensure timely return of borrowed materials. All patrons are required to adhere to the code of conduct, respect library property, and ensure timely return of borrowed materials. All patrons are required to adhere to the code of conduct, respect library property, and ensure timely return of borrowed materials. All patrons are required to adhere to the code of conduct, respect library property, and ensure timely return of borrowed materials. All patrons are required to adhere to the code of conduct, respect library property, and ensure timely return of borrowed materials. All patrons are required to adhere to the code of conduct, respect library property, and ensure timely return of borrowed materials. All patrons are required to adhere to the code of conduct, respect library property, and ensure timely return of borrowed materials. </w:t>
+      </w:r>
+    </w:p>
+    <w:p>
+      <w:r>
+        <w:t xml:space="preserve">All patrons are required to adhere to the code of conduct, respect library property, and ensure timely return of borrowed materials. All patrons are required to adhere to the code of conduct, respect library property, and ensure timely return of borrowed materials. All patrons are required to adhere to the code of conduct, respect library property, and ensure timely return of borrowed materials. All patrons are required to adhere to the code of conduct, respect library property, and ensure timely return of borrowed materials. All patrons are required to adhere to the code of conduct, respect library property, and ensure timely return of borrowed materials. All patrons are required to adhere to the code of conduct, respect library property, and ensure timely return of borrowed materials. All patrons are required to adhere to the code of conduct, respect library property, and ensure timely return of borrowed materials. All patrons are required to adhere to the code of conduct, respect library property, and ensure timely return of borrowed materials. </w:t>
+      </w:r>
+    </w:p>
+    <w:p>
+      <w:r>
+        <w:t xml:space="preserve">All patrons are required to adhere to the code of conduct, respect library property, and ensure timely return of borrowed materials. All patrons are required to adhere to the code of conduct, respect library property, and ensure timely return of borrowed materials. All patrons are required to adhere to the code of conduct, respect library property, and ensure timely return of borrowed materials. All patrons are required to adhere to the code of conduct, respect library property, and ensure timely return of borrowed materials. All patrons are required to adhere to the code of conduct, respect library property, and ensure timely return of borrowed materials. All patrons are required to adhere to the code of conduct, respect library property, and ensure timely return of borrowed materials. All patrons are required to adhere to the code of conduct, respect library property, and ensure timely return of borrowed materials. All patrons are required to adhere to the code of conduct, respect library property, and ensure timely return of borrowed materials. </w:t>
+      </w:r>
+    </w:p>
+    <w:p>
+      <w:r>
+        <w:br w:type="page"/>
+      </w:r>
+    </w:p>
+    <w:p>
+      <w:pPr>
+        <w:pStyle w:val="Heading1"/>
+      </w:pPr>
+      <w:r>
+        <w:t>Section 28: Policy Guidelines</w:t>
+      </w:r>
+    </w:p>
+    <w:p>
+      <w:r>
+        <w:t xml:space="preserve">All patrons are required to adhere to the code of conduct, respect library property, and ensure timely return of borrowed materials. All patrons are required to adhere to the code of conduct, respect library property, and ensure timely return of borrowed materials. All patrons are required to adhere to the code of conduct, respect library property, and ensure timely return of borrowed materials. All patrons are required to adhere to the code of conduct, respect library property, and ensure timely return of borrowed materials. All patrons are required to adhere to the code of conduct, respect library property, and ensure timely return of borrowed materials. All patrons are required to adhere to the code of conduct, respect library property, and ensure timely return of borrowed materials. All patrons are required to adhere to the code of conduct, respect library property, and ensure timely return of borrowed materials. All patrons are required to adhere to the code of conduct, respect library property, and ensure timely return of borrowed materials. </w:t>
+      </w:r>
+    </w:p>
+    <w:p>
+      <w:r>
+        <w:t xml:space="preserve">All patrons are required to adhere to the code of conduct, respect library property, and ensure timely return of borrowed materials. All patrons are required to adhere to the code of conduct, respect library property, and ensure timely return of borrowed materials. All patrons are required to adhere to the code of conduct, respect library property, and ensure timely return of borrowed materials. All patrons are required to adhere to the code of conduct, respect library property, and ensure timely return of borrowed materials. All patrons are required to adhere to the code of conduct, respect library property, and ensure timely return of borrowed materials. All patrons are required to adhere to the code of conduct, respect library property, and ensure timely return of borrowed materials. All patrons are required to adhere to the code of conduct, respect library property, and ensure timely return of borrowed materials. All patrons are required to adhere to the code of conduct, respect library property, and ensure timely return of borrowed materials. </w:t>
+      </w:r>
+    </w:p>
+    <w:p>
+      <w:r>
+        <w:t xml:space="preserve">All patrons are required to adhere to the code of conduct, respect library property, and ensure timely return of borrowed materials. All patrons are required to adhere to the code of conduct, respect library property, and ensure timely return of borrowed materials. All patrons are required to adhere to the code of conduct, respect library property, and ensure timely return of borrowed materials. All patrons are required to adhere to the code of conduct, respect library property, and ensure timely return of borrowed materials. All patrons are required to adhere to the code of conduct, respect library property, and ensure timely return of borrowed materials. All patrons are required to adhere to the code of conduct, respect library property, and ensure timely return of borrowed materials. All patrons are required to adhere to the code of conduct, respect library property, and ensure timely return of borrowed materials. All patrons are required to adhere to the code of conduct, respect library property, and ensure timely return of borrowed materials. </w:t>
+      </w:r>
+    </w:p>
+    <w:p>
+      <w:r>
+        <w:br w:type="page"/>
+      </w:r>
+    </w:p>
+    <w:p>
+      <w:pPr>
+        <w:pStyle w:val="Heading1"/>
+      </w:pPr>
+      <w:r>
+        <w:t>Section 29: Policy Guidelines</w:t>
+      </w:r>
+    </w:p>
+    <w:p>
+      <w:r>
+        <w:t xml:space="preserve">All patrons are required to adhere to the code of conduct, respect library property, and ensure timely return of borrowed materials. All patrons are required to adhere to the code of conduct, respect library property, and ensure timely return of borrowed materials. All patrons are required to adhere to the code of conduct, respect library property, and ensure timely return of borrowed materials. All patrons are required to adhere to the code of conduct, respect library property, and ensure timely return of borrowed materials. All patrons are required to adhere to the code of conduct, respect library property, and ensure timely return of borrowed materials. All patrons are required to adhere to the code of conduct, respect library property, and ensure timely return of borrowed materials. All patrons are required to adhere to the code of conduct, respect library property, and ensure timely return of borrowed materials. All patrons are required to adhere to the code of conduct, respect library property, and ensure timely return of borrowed materials. </w:t>
+      </w:r>
+    </w:p>
+    <w:p>
+      <w:r>
+        <w:t xml:space="preserve">All patrons are required to adhere to the code of conduct, respect library property, and ensure timely return of borrowed materials. All patrons are required to adhere to the code of conduct, respect library property, and ensure timely return of borrowed materials. All patrons are required to adhere to the code of conduct, respect library property, and ensure timely return of borrowed materials. All patrons are required to adhere to the code of conduct, respect library property, and ensure timely return of borrowed materials. All patrons are required to adhere to the code of conduct, respect library property, and ensure timely return of borrowed materials. All patrons are required to adhere to the code of conduct, respect library property, and ensure timely return of borrowed materials. All patrons are required to adhere to the code of conduct, respect library property, and ensure timely return of borrowed materials. All patrons are required to adhere to the code of conduct, respect library property, and ensure timely return of borrowed materials. </w:t>
+      </w:r>
+    </w:p>
+    <w:p>
+      <w:r>
+        <w:t xml:space="preserve">All patrons are required to adhere to the code of conduct, respect library property, and ensure timely return of borrowed materials. All patrons are required to adhere to the code of conduct, respect library property, and ensure timely return of borrowed materials. All patrons are required to adhere to the code of conduct, respect library property, and ensure timely return of borrowed materials. All patrons are required to adhere to the code of conduct, respect library property, and ensure timely return of borrowed materials. All patrons are required to adhere to the code of conduct, respect library property, and ensure timely return of borrowed materials. All patrons are required to adhere to the code of conduct, respect library property, and ensure timely return of borrowed materials. All patrons are required to adhere to the code of conduct, respect library property, and ensure timely return of borrowed materials. All patrons are required to adhere to the code of conduct, respect library property, and ensure timely return of borrowed materials. </w:t>
+      </w:r>
+    </w:p>
+    <w:p>
+      <w:r>
+        <w:br w:type="page"/>
+      </w:r>
+    </w:p>
+    <w:p>
+      <w:pPr>
+        <w:pStyle w:val="Heading1"/>
+      </w:pPr>
+      <w:r>
+        <w:t>Section 30: Policy Guidelines</w:t>
+      </w:r>
+    </w:p>
+    <w:p>
+      <w:r>
+        <w:t xml:space="preserve">All patrons are required to adhere to the code of conduct, respect library property, and ensure timely return of borrowed materials. All patrons are required to adhere to the code of conduct, respect library property, and ensure timely return of borrowed materials. All patrons are required to adhere to the code of conduct, respect library property, and ensure timely return of borrowed materials. All patrons are required to adhere to the code of conduct, respect library property, and ensure timely return of borrowed materials. All patrons are required to adhere to the code of conduct, respect library property, and ensure timely return of borrowed materials. All patrons are required to adhere to the code of conduct, respect library property, and ensure timely return of borrowed materials. All patrons are required to adhere to the code of conduct, respect library property, and ensure timely return of borrowed materials. All patrons are required to adhere to the code of conduct, respect library property, and ensure timely return of borrowed materials. </w:t>
+      </w:r>
+    </w:p>
+    <w:p>
+      <w:r>
+        <w:t xml:space="preserve">All patrons are required to adhere to the code of conduct, respect library property, and ensure timely return of borrowed materials. All patrons are required to adhere to the code of conduct, respect library property, and ensure timely return of borrowed materials. All patrons are required to adhere to the code of conduct, respect library property, and ensure timely return of borrowed materials. All patrons are required to adhere to the code of conduct, respect library property, and ensure timely return of borrowed materials. All patrons are required to adhere to the code of conduct, respect library property, and ensure timely return of borrowed materials. All patrons are required to adhere to the code of conduct, respect library property, and ensure timely return of borrowed materials. All patrons are required to adhere to the code of conduct, respect library property, and ensure timely return of borrowed materials. All patrons are required to adhere to the code of conduct, respect library property, and ensure timely return of borrowed materials. </w:t>
+      </w:r>
+    </w:p>
+    <w:p>
+      <w:r>
+        <w:t xml:space="preserve">All patrons are required to adhere to the code of conduct, respect library property, and ensure timely return of borrowed materials. All patrons are required to adhere to the code of conduct, respect library property, and ensure timely return of borrowed materials. All patrons are required to adhere to the code of conduct, respect library property, and ensure timely return of borrowed materials. All patrons are required to adhere to the code of conduct, respect library property, and ensure timely return of borrowed materials. All patrons are required to adhere to the code of conduct, respect library property, and ensure timely return of borrowed materials. All patrons are required to adhere to the code of conduct, respect library property, and ensure timely return of borrowed materials. All patrons are required to adhere to the code of conduct, respect library property, and ensure timely return of borrowed materials. All patrons are required to adhere to the code of conduct, respect library property, and ensure timely return of borrowed materials. </w:t>
+      </w:r>
+    </w:p>
+    <w:p>
+      <w:r>
+        <w:br w:type="page"/>
+      </w:r>
+    </w:p>
+    <w:p>
+      <w:pPr>
+        <w:pStyle w:val="Heading1"/>
+      </w:pPr>
+      <w:r>
+        <w:t>Section 31: Policy Guidelines</w:t>
+      </w:r>
+    </w:p>
+    <w:p>
+      <w:r>
+        <w:t xml:space="preserve">All patrons are required to adhere to the code of conduct, respect library property, and ensure timely return of borrowed materials. All patrons are required to adhere to the code of conduct, respect library property, and ensure timely return of borrowed materials. All patrons are required to adhere to the code of conduct, respect library property, and ensure timely return of borrowed materials. All patrons are required to adhere to the code of conduct, respect library property, and ensure timely return of borrowed materials. All patrons are required to adhere to the code of conduct, respect library property, and ensure timely return of borrowed materials. All patrons are required to adhere to the code of conduct, respect library property, and ensure timely return of borrowed materials. All patrons are required to adhere to the code of conduct, respect library property, and ensure timely return of borrowed materials. All patrons are required to adhere to the code of conduct, respect library property, and ensure timely return of borrowed materials. </w:t>
+      </w:r>
+    </w:p>
+    <w:p>
+      <w:r>
+        <w:t xml:space="preserve">All patrons are required to adhere to the code of conduct, respect library property, and ensure timely return of borrowed materials. All patrons are required to adhere to the code of conduct, respect library property, and ensure timely return of borrowed materials. All patrons are required to adhere to the code of conduct, respect library property, and ensure timely return of borrowed materials. All patrons are required to adhere to the code of conduct, respect library property, and ensure timely return of borrowed materials. All patrons are required to adhere to the code of conduct, respect library property, and ensure timely return of borrowed materials. All patrons are required to adhere to the code of conduct, respect library property, and ensure timely return of borrowed materials. All patrons are required to adhere to the code of conduct, respect library property, and ensure timely return of borrowed materials. All patrons are required to adhere to the code of conduct, respect library property, and ensure timely return of borrowed materials. </w:t>
+      </w:r>
+    </w:p>
+    <w:p>
+      <w:r>
+        <w:t xml:space="preserve">All patrons are required to adhere to the code of conduct, respect library property, and ensure timely return of borrowed materials. All patrons are required to adhere to the code of conduct, respect library property, and ensure timely return of borrowed materials. All patrons are required to adhere to the code of conduct, respect library property, and ensure timely return of borrowed materials. All patrons are required to adhere to the code of conduct, respect library property, and ensure timely return of borrowed materials. All patrons are required to adhere to the code of conduct, respect library property, and ensure timely return of borrowed materials. All patrons are required to adhere to the code of conduct, respect library property, and ensure timely return of borrowed materials. All patrons are required to adhere to the code of conduct, respect library property, and ensure timely return of borrowed materials. All patrons are required to adhere to the code of conduct, respect library property, and ensure timely return of borrowed materials. </w:t>
+      </w:r>
+    </w:p>
+    <w:p>
+      <w:r>
+        <w:br w:type="page"/>
+      </w:r>
+    </w:p>
+    <w:p>
+      <w:pPr>
+        <w:pStyle w:val="Heading1"/>
+      </w:pPr>
+      <w:r>
+        <w:t>Section 32: Policy Guidelines</w:t>
+      </w:r>
+    </w:p>
+    <w:p>
+      <w:r>
+        <w:t xml:space="preserve">All patrons are required to adhere to the code of conduct, respect library property, and ensure timely return of borrowed materials. All patrons are required to adhere to the code of conduct, respect library property, and ensure timely return of borrowed materials. All patrons are required to adhere to the code of conduct, respect library property, and ensure timely return of borrowed materials. All patrons are required to adhere to the code of conduct, respect library property, and ensure timely return of borrowed materials. All patrons are required to adhere to the code of conduct, respect library property, and ensure timely return of borrowed materials. All patrons are required to adhere to the code of conduct, respect library property, and ensure timely return of borrowed materials. All patrons are required to adhere to the code of conduct, respect library property, and ensure timely return of borrowed materials. All patrons are required to adhere to the code of conduct, respect library property, and ensure timely return of borrowed materials. </w:t>
+      </w:r>
+    </w:p>
+    <w:p>
+      <w:r>
+        <w:t xml:space="preserve">All patrons are required to adhere to the code of conduct, respect library property, and ensure timely return of borrowed materials. All patrons are required to adhere to the code of conduct, respect library property, and ensure timely return of borrowed materials. All patrons are required to adhere to the code of conduct, respect library property, and ensure timely return of borrowed materials. All patrons are required to adhere to the code of conduct, respect library property, and ensure timely return of borrowed materials. All patrons are required to adhere to the code of conduct, respect library property, and ensure timely return of borrowed materials. All patrons are required to adhere to the code of conduct, respect library property, and ensure timely return of borrowed materials. All patrons are required to adhere to the code of conduct, respect library property, and ensure timely return of borrowed materials. All patrons are required to adhere to the code of conduct, respect library property, and ensure timely return of borrowed materials. </w:t>
+      </w:r>
+    </w:p>
+    <w:p>
+      <w:r>
+        <w:t xml:space="preserve">All patrons are required to adhere to the code of conduct, respect library property, and ensure timely return of borrowed materials. All patrons are required to adhere to the code of conduct, respect library property, and ensure timely return of borrowed materials. All patrons are required to adhere to the code of conduct, respect library property, and ensure timely return of borrowed materials. All patrons are required to adhere to the code of conduct, respect library property, and ensure timely return of borrowed materials. All patrons are required to adhere to the code of conduct, respect library property, and ensure timely return of borrowed materials. All patrons are required to adhere to the code of conduct, respect library property, and ensure timely return of borrowed materials. All patrons are required to adhere to the code of conduct, respect library property, and ensure timely return of borrowed materials. All patrons are required to adhere to the code of conduct, respect library property, and ensure timely return of borrowed materials. </w:t>
+      </w:r>
+    </w:p>
+    <w:p>
+      <w:r>
+        <w:br w:type="page"/>
+      </w:r>
+    </w:p>
+    <w:p>
+      <w:pPr>
+        <w:pStyle w:val="Heading1"/>
+      </w:pPr>
+      <w:r>
+        <w:t>Section 33: Policy Guidelines</w:t>
+      </w:r>
+    </w:p>
+    <w:p>
+      <w:r>
+        <w:t xml:space="preserve">All patrons are required to adhere to the code of conduct, respect library property, and ensure timely return of borrowed materials. All patrons are required to adhere to the code of conduct, respect library property, and ensure timely return of borrowed materials. All patrons are required to adhere to the code of conduct, respect library property, and ensure timely return of borrowed materials. All patrons are required to adhere to the code of conduct, respect library property, and ensure timely return of borrowed materials. All patrons are required to adhere to the code of conduct, respect library property, and ensure timely return of borrowed materials. All patrons are required to adhere to the code of conduct, respect library property, and ensure timely return of borrowed materials. All patrons are required to adhere to the code of conduct, respect library property, and ensure timely return of borrowed materials. All patrons are required to adhere to the code of conduct, respect library property, and ensure timely return of borrowed materials. </w:t>
+      </w:r>
+    </w:p>
+    <w:p>
+      <w:r>
+        <w:t xml:space="preserve">All patrons are required to adhere to the code of conduct, respect library property, and ensure timely return of borrowed materials. All patrons are required to adhere to the code of conduct, respect library property, and ensure timely return of borrowed materials. All patrons are required to adhere to the code of conduct, respect library property, and ensure timely return of borrowed materials. All patrons are required to adhere to the code of conduct, respect library property, and ensure timely return of borrowed materials. All patrons are required to adhere to the code of conduct, respect library property, and ensure timely return of borrowed materials. All patrons are required to adhere to the code of conduct, respect library property, and ensure timely return of borrowed materials. All patrons are required to adhere to the code of conduct, respect library property, and ensure timely return of borrowed materials. All patrons are required to adhere to the code of conduct, respect library property, and ensure timely return of borrowed materials. </w:t>
+      </w:r>
+    </w:p>
+    <w:p>
+      <w:r>
+        <w:t xml:space="preserve">All patrons are required to adhere to the code of conduct, respect library property, and ensure timely return of borrowed materials. All patrons are required to adhere to the code of conduct, respect library property, and ensure timely return of borrowed materials. All patrons are required to adhere to the code of conduct, respect library property, and ensure timely return of borrowed materials. All patrons are required to adhere to the code of conduct, respect library property, and ensure timely return of borrowed materials. All patrons are required to adhere to the code of conduct, respect library property, and ensure timely return of borrowed materials. All patrons are required to adhere to the code of conduct, respect library property, and ensure timely return of borrowed materials. All patrons are required to adhere to the code of conduct, respect library property, and ensure timely return of borrowed materials. All patrons are required to adhere to the code of conduct, respect library property, and ensure timely return of borrowed materials. </w:t>
+      </w:r>
+    </w:p>
+    <w:p>
+      <w:r>
+        <w:br w:type="page"/>
+      </w:r>
+    </w:p>
+    <w:p>
+      <w:pPr>
+        <w:pStyle w:val="Heading1"/>
+      </w:pPr>
+      <w:r>
+        <w:t>Section 34: Policy Guidelines</w:t>
+      </w:r>
+    </w:p>
+    <w:p>
+      <w:r>
+        <w:t xml:space="preserve">All patrons are required to adhere to the code of conduct, respect library property, and ensure timely return of borrowed materials. All patrons are required to adhere to the code of conduct, respect library property, and ensure timely return of borrowed materials. All patrons are required to adhere to the code of conduct, respect library property, and ensure timely return of borrowed materials. All patrons are required to adhere to the code of conduct, respect library property, and ensure timely return of borrowed materials. All patrons are required to adhere to the code of conduct, respect library property, and ensure timely return of borrowed materials. All patrons are required to adhere to the code of conduct, respect library property, and ensure timely return of borrowed materials. All patrons are required to adhere to the code of conduct, respect library property, and ensure timely return of borrowed materials. All patrons are required to adhere to the code of conduct, respect library property, and ensure timely return of borrowed materials. </w:t>
+      </w:r>
+    </w:p>
+    <w:p>
+      <w:r>
+        <w:t xml:space="preserve">All patrons are required to adhere to the code of conduct, respect library property, and ensure timely return of borrowed materials. All patrons are required to adhere to the code of conduct, respect library property, and ensure timely return of borrowed materials. All patrons are required to adhere to the code of conduct, respect library property, and ensure timely return of borrowed materials. All patrons are required to adhere to the code of conduct, respect library property, and ensure timely return of borrowed materials. All patrons are required to adhere to the code of conduct, respect library property, and ensure timely return of borrowed materials. All patrons are required to adhere to the code of conduct, respect library property, and ensure timely return of borrowed materials. All patrons are required to adhere to the code of conduct, respect library property, and ensure timely return of borrowed materials. All patrons are required to adhere to the code of conduct, respect library property, and ensure timely return of borrowed materials. </w:t>
+      </w:r>
+    </w:p>
+    <w:p>
+      <w:r>
+        <w:t xml:space="preserve">All patrons are required to adhere to the code of conduct, respect library property, and ensure timely return of borrowed materials. All patrons are required to adhere to the code of conduct, respect library property, and ensure timely return of borrowed materials. All patrons are required to adhere to the code of conduct, respect library property, and ensure timely return of borrowed materials. All patrons are required to adhere to the code of conduct, respect library property, and ensure timely return of borrowed materials. All patrons are required to adhere to the code of conduct, respect library property, and ensure timely return of borrowed materials. All patrons are required to adhere to the code of conduct, respect library property, and ensure timely return of borrowed materials. All patrons are required to adhere to the code of conduct, respect library property, and ensure timely return of borrowed materials. All patrons are required to adhere to the code of conduct, respect library property, and ensure timely return of borrowed materials. </w:t>
+      </w:r>
+    </w:p>
+    <w:p>
+      <w:r>
+        <w:br w:type="page"/>
+      </w:r>
+    </w:p>
+    <w:p>
+      <w:pPr>
+        <w:pStyle w:val="Heading1"/>
+      </w:pPr>
+      <w:r>
+        <w:t>Section 35: Policy Guidelines</w:t>
+      </w:r>
+    </w:p>
+    <w:p>
+      <w:r>
+        <w:t xml:space="preserve">All patrons are required to adhere to the code of conduct, respect library property, and ensure timely return of borrowed materials. All patrons are required to adhere to the code of conduct, respect library property, and ensure timely return of borrowed materials. All patrons are required to adhere to the code of conduct, respect library property, and ensure timely return of borrowed materials. All patrons are required to adhere to the code of conduct, respect library property, and ensure timely return of borrowed materials. All patrons are required to adhere to the code of conduct, respect library property, and ensure timely return of borrowed materials. All patrons are required to adhere to the code of conduct, respect library property, and ensure timely return of borrowed materials. All patrons are required to adhere to the code of conduct, respect library property, and ensure timely return of borrowed materials. All patrons are required to adhere to the code of conduct, respect library property, and ensure timely return of borrowed materials. </w:t>
+      </w:r>
+    </w:p>
+    <w:p>
+      <w:r>
+        <w:t xml:space="preserve">All patrons are required to adhere to the code of conduct, respect library property, and ensure timely return of borrowed materials. All patrons are required to adhere to the code of conduct, respect library property, and ensure timely return of borrowed materials. All patrons are required to adhere to the code of conduct, respect library property, and ensure timely return of borrowed materials. All patrons are required to adhere to the code of conduct, respect library property, and ensure timely return of borrowed materials. All patrons are required to adhere to the code of conduct, respect library property, and ensure timely return of borrowed materials. All patrons are required to adhere to the code of conduct, respect library property, and ensure timely return of borrowed materials. All patrons are required to adhere to the code of conduct, respect library property, and ensure timely return of borrowed materials. All patrons are required to adhere to the code of conduct, respect library property, and ensure timely return of borrowed materials. </w:t>
+      </w:r>
+    </w:p>
+    <w:p>
+      <w:r>
+        <w:t xml:space="preserve">All patrons are required to adhere to the code of conduct, respect library property, and ensure timely return of borrowed materials. All patrons are required to adhere to the code of conduct, respect library property, and ensure timely return of borrowed materials. All patrons are required to adhere to the code of conduct, respect library property, and ensure timely return of borrowed materials. All patrons are required to adhere to the code of conduct, respect library property, and ensure timely return of borrowed materials. All patrons are required to adhere to the code of conduct, respect library property, and ensure timely return of borrowed materials. All patrons are required to adhere to the code of conduct, respect library property, and ensure timely return of borrowed materials. All patrons are required to adhere to the code of conduct, respect library property, and ensure timely return of borrowed materials. All patrons are required to adhere to the code of conduct, respect library property, and ensure timely return of borrowed materials. </w:t>
+      </w:r>
+    </w:p>
+    <w:p>
+      <w:r>
+        <w:br w:type="page"/>
+      </w:r>
+    </w:p>
+    <w:p>
+      <w:pPr>
+        <w:pStyle w:val="Heading1"/>
+      </w:pPr>
+      <w:r>
+        <w:t>Section 36: Policy Guidelines</w:t>
+      </w:r>
+    </w:p>
+    <w:p>
+      <w:r>
+        <w:t xml:space="preserve">All patrons are required to adhere to the code of conduct, respect library property, and ensure timely return of borrowed materials. All patrons are required to adhere to the code of conduct, respect library property, and ensure timely return of borrowed materials. All patrons are required to adhere to the code of conduct, respect library property, and ensure timely return of borrowed materials. All patrons are required to adhere to the code of conduct, respect library property, and ensure timely return of borrowed materials. All patrons are required to adhere to the code of conduct, respect library property, and ensure timely return of borrowed materials. All patrons are required to adhere to the code of conduct, respect library property, and ensure timely return of borrowed materials. All patrons are required to adhere to the code of conduct, respect library property, and ensure timely return of borrowed materials. All patrons are required to adhere to the code of conduct, respect library property, and ensure timely return of borrowed materials. </w:t>
+      </w:r>
+    </w:p>
+    <w:p>
+      <w:r>
+        <w:t xml:space="preserve">All patrons are required to adhere to the code of conduct, respect library property, and ensure timely return of borrowed materials. All patrons are required to adhere to the code of conduct, respect library property, and ensure timely return of borrowed materials. All patrons are required to adhere to the code of conduct, respect library property, and ensure timely return of borrowed materials. All patrons are required to adhere to the code of conduct, respect library property, and ensure timely return of borrowed materials. All patrons are required to adhere to the code of conduct, respect library property, and ensure timely return of borrowed materials. All patrons are required to adhere to the code of conduct, respect library property, and ensure timely return of borrowed materials. All patrons are required to adhere to the code of conduct, respect library property, and ensure timely return of borrowed materials. All patrons are required to adhere to the code of conduct, respect library property, and ensure timely return of borrowed materials. </w:t>
+      </w:r>
+    </w:p>
+    <w:p>
+      <w:r>
+        <w:t xml:space="preserve">All patrons are required to adhere to the code of conduct, respect library property, and ensure timely return of borrowed materials. All patrons are required to adhere to the code of conduct, respect library property, and ensure timely return of borrowed materials. All patrons are required to adhere to the code of conduct, respect library property, and ensure timely return of borrowed materials. All patrons are required to adhere to the code of conduct, respect library property, and ensure timely return of borrowed materials. All patrons are required to adhere to the code of conduct, respect library property, and ensure timely return of borrowed materials. All patrons are required to adhere to the code of conduct, respect library property, and ensure timely return of borrowed materials. All patrons are required to adhere to the code of conduct, respect library property, and ensure timely return of borrowed materials. All patrons are required to adhere to the code of conduct, respect library property, and ensure timely return of borrowed materials. </w:t>
+      </w:r>
+    </w:p>
+    <w:p>
+      <w:r>
+        <w:br w:type="page"/>
+      </w:r>
+    </w:p>
+    <w:p>
+      <w:pPr>
+        <w:pStyle w:val="Heading1"/>
+      </w:pPr>
+      <w:r>
+        <w:t>Section 37: Policy Guidelines</w:t>
+      </w:r>
+    </w:p>
+    <w:p>
+      <w:r>
+        <w:t xml:space="preserve">All patrons are required to adhere to the code of conduct, respect library property, and ensure timely return of borrowed materials. All patrons are required to adhere to the code of conduct, respect library property, and ensure timely return of borrowed materials. All patrons are required to adhere to the code of conduct, respect library property, and ensure timely return of borrowed materials. All patrons are required to adhere to the code of conduct, respect library property, and ensure timely return of borrowed materials. All patrons are required to adhere to the code of conduct, respect library property, and ensure timely return of borrowed materials. All patrons are required to adhere to the code of conduct, respect library property, and ensure timely return of borrowed materials. All patrons are required to adhere to the code of conduct, respect library property, and ensure timely return of borrowed materials. All patrons are required to adhere to the code of conduct, respect library property, and ensure timely return of borrowed materials. </w:t>
+      </w:r>
+    </w:p>
+    <w:p>
+      <w:r>
+        <w:t xml:space="preserve">All patrons are required to adhere to the code of conduct, respect library property, and ensure timely return of borrowed materials. All patrons are required to adhere to the code of conduct, respect library property, and ensure timely return of borrowed materials. All patrons are required to adhere to the code of conduct, respect library property, and ensure timely return of borrowed materials. All patrons are required to adhere to the code of conduct, respect library property, and ensure timely return of borrowed materials. All patrons are required to adhere to the code of conduct, respect library property, and ensure timely return of borrowed materials. All patrons are required to adhere to the code of conduct, respect library property, and ensure timely return of borrowed materials. All patrons are required to adhere to the code of conduct, respect library property, and ensure timely return of borrowed materials. All patrons are required to adhere to the code of conduct, respect library property, and ensure timely return of borrowed materials. </w:t>
+      </w:r>
+    </w:p>
+    <w:p>
+      <w:r>
+        <w:t xml:space="preserve">All patrons are required to adhere to the code of conduct, respect library property, and ensure timely return of borrowed materials. All patrons are required to adhere to the code of conduct, respect library property, and ensure timely return of borrowed materials. All patrons are required to adhere to the code of conduct, respect library property, and ensure timely return of borrowed materials. All patrons are required to adhere to the code of conduct, respect library property, and ensure timely return of borrowed materials. All patrons are required to adhere to the code of conduct, respect library property, and ensure timely return of borrowed materials. All patrons are required to adhere to the code of conduct, respect library property, and ensure timely return of borrowed materials. All patrons are required to adhere to the code of conduct, respect library property, and ensure timely return of borrowed materials. All patrons are required to adhere to the code of conduct, respect library property, and ensure timely return of borrowed materials. </w:t>
+      </w:r>
+    </w:p>
+    <w:p>
+      <w:r>
+        <w:br w:type="page"/>
+      </w:r>
+    </w:p>
+    <w:p>
+      <w:pPr>
+        <w:pStyle w:val="Heading1"/>
+      </w:pPr>
+      <w:r>
+        <w:t>Section 38: Policy Guidelines</w:t>
+      </w:r>
+    </w:p>
+    <w:p>
+      <w:r>
+        <w:t xml:space="preserve">All patrons are required to adhere to the code of conduct, respect library property, and ensure timely return of borrowed materials. All patrons are required to adhere to the code of conduct, respect library property, and ensure timely return of borrowed materials. All patrons are required to adhere to the code of conduct, respect library property, and ensure timely return of borrowed materials. All patrons are required to adhere to the code of conduct, respect library property, and ensure timely return of borrowed materials. All patrons are required to adhere to the code of conduct, respect library property, and ensure timely return of borrowed materials. All patrons are required to adhere to the code of conduct, respect library property, and ensure timely return of borrowed materials. All patrons are required to adhere to the code of conduct, respect library property, and ensure timely return of borrowed materials. All patrons are required to adhere to the code of conduct, respect library property, and ensure timely return of borrowed materials. </w:t>
+      </w:r>
+    </w:p>
+    <w:p>
+      <w:r>
+        <w:t xml:space="preserve">All patrons are required to adhere to the code of conduct, respect library property, and ensure timely return of borrowed materials. All patrons are required to adhere to the code of conduct, respect library property, and ensure timely return of borrowed materials. All patrons are required to adhere to the code of conduct, respect library property, and ensure timely return of borrowed materials. All patrons are required to adhere to the code of conduct, respect library property, and ensure timely return of borrowed materials. All patrons are required to adhere to the code of conduct, respect library property, and ensure timely return of borrowed materials. All patrons are required to adhere to the code of conduct, respect library property, and ensure timely return of borrowed materials. All patrons are required to adhere to the code of conduct, respect library property, and ensure timely return of borrowed materials. All patrons are required to adhere to the code of conduct, respect library property, and ensure timely return of borrowed materials. </w:t>
+      </w:r>
+    </w:p>
+    <w:p>
+      <w:r>
+        <w:t xml:space="preserve">All patrons are required to adhere to the code of conduct, respect library property, and ensure timely return of borrowed materials. All patrons are required to adhere to the code of conduct, respect library property, and ensure timely return of borrowed materials. All patrons are required to adhere to the code of conduct, respect library property, and ensure timely return of borrowed materials. All patrons are required to adhere to the code of conduct, respect library property, and ensure timely return of borrowed materials. All patrons are required to adhere to the code of conduct, respect library property, and ensure timely return of borrowed materials. All patrons are required to adhere to the code of conduct, respect library property, and ensure timely return of borrowed materials. All patrons are required to adhere to the code of conduct, respect library property, and ensure timely return of borrowed materials. All patrons are required to adhere to the code of conduct, respect library property, and ensure timely return of borrowed materials. </w:t>
+      </w:r>
+    </w:p>
+    <w:p>
+      <w:r>
+        <w:br w:type="page"/>
+      </w:r>
+    </w:p>
+    <w:p>
+      <w:pPr>
+        <w:pStyle w:val="Heading1"/>
+      </w:pPr>
+      <w:r>
+        <w:t>Section 39: Policy Guidelines</w:t>
+      </w:r>
+    </w:p>
+    <w:p>
+      <w:r>
+        <w:t xml:space="preserve">All patrons are required to adhere to the code of conduct, respect library property, and ensure timely return of borrowed materials. All patrons are required to adhere to the code of conduct, respect library property, and ensure timely return of borrowed materials. All patrons are required to adhere to the code of conduct, respect library property, and ensure timely return of borrowed materials. All patrons are required to adhere to the code of conduct, respect library property, and ensure timely return of borrowed materials. All patrons are required to adhere to the code of conduct, respect library property, and ensure timely return of borrowed materials. All patrons are required to adhere to the code of conduct, respect library property, and ensure timely return of borrowed materials. All patrons are required to adhere to the code of conduct, respect library property, and ensure timely return of borrowed materials. All patrons are required to adhere to the code of conduct, respect library property, and ensure timely return of borrowed materials. </w:t>
+      </w:r>
+    </w:p>
+    <w:p>
+      <w:r>
+        <w:t xml:space="preserve">All patrons are required to adhere to the code of conduct, respect library property, and ensure timely return of borrowed materials. All patrons are required to adhere to the code of conduct, respect library property, and ensure timely return of borrowed materials. All patrons are required to adhere to the code of conduct, respect library property, and ensure timely return of borrowed materials. All patrons are required to adhere to the code of conduct, respect library property, and ensure timely return of borrowed materials. All patrons are required to adhere to the code of conduct, respect library property, and ensure timely return of borrowed materials. All patrons are required to adhere to the code of conduct, respect library property, and ensure timely return of borrowed materials. All patrons are required to adhere to the code of conduct, respect library property, and ensure timely return of borrowed materials. All patrons are required to adhere to the code of conduct, respect library property, and ensure timely return of borrowed materials. </w:t>
+      </w:r>
+    </w:p>
+    <w:p>
+      <w:r>
+        <w:t xml:space="preserve">All patrons are required to adhere to the code of conduct, respect library property, and ensure timely return of borrowed materials. All patrons are required to adhere to the code of conduct, respect library property, and ensure timely return of borrowed materials. All patrons are required to adhere to the code of conduct, respect library property, and ensure timely return of borrowed materials. All patrons are required to adhere to the code of conduct, respect library property, and ensure timely return of borrowed materials. All patrons are required to adhere to the code of conduct, respect library property, and ensure timely return of borrowed materials. All patrons are required to adhere to the code of conduct, respect library property, and ensure timely return of borrowed materials. All patrons are required to adhere to the code of conduct, respect library property, and ensure timely return of borrowed materials. All patrons are required to adhere to the code of conduct, respect library property, and ensure timely return of borrowed materials. </w:t>
+      </w:r>
+    </w:p>
+    <w:p>
+      <w:r>
+        <w:br w:type="page"/>
+      </w:r>
+    </w:p>
+    <w:p>
+      <w:pPr>
+        <w:pStyle w:val="Heading1"/>
+      </w:pPr>
+      <w:r>
+        <w:t>Section 40: Policy Guidelines</w:t>
+      </w:r>
+    </w:p>
+    <w:p>
+      <w:r>
+        <w:t xml:space="preserve">All patrons are required to adhere to the code of conduct, respect library property, and ensure timely return of borrowed materials. All patrons are required to adhere to the code of conduct, respect library property, and ensure timely return of borrowed materials. All patrons are required to adhere to the code of conduct, respect library property, and ensure timely return of borrowed materials. All patrons are required to adhere to the code of conduct, respect library property, and ensure timely return of borrowed materials. All patrons are required to adhere to the code of conduct, respect library property, and ensure timely return of borrowed materials. All patrons are required to adhere to the code of conduct, respect library property, and ensure timely return of borrowed materials. All patrons are required to adhere to the code of conduct, respect library property, and ensure timely return of borrowed materials. All patrons are required to adhere to the code of conduct, respect library property, and ensure timely return of borrowed materials. </w:t>
+      </w:r>
+    </w:p>
+    <w:p>
+      <w:r>
+        <w:t xml:space="preserve">All patrons are required to adhere to the code of conduct, respect library property, and ensure timely return of borrowed materials. All patrons are required to adhere to the code of conduct, respect library property, and ensure timely return of borrowed materials. All patrons are required to adhere to the code of conduct, respect library property, and ensure timely return of borrowed materials. All patrons are required to adhere to the code of conduct, respect library property, and ensure timely return of borrowed materials. All patrons are required to adhere to the code of conduct, respect library property, and ensure timely return of borrowed materials. All patrons are required to adhere to the code of conduct, respect library property, and ensure timely return of borrowed materials. All patrons are required to adhere to the code of conduct, respect library property, and ensure timely return of borrowed materials. All patrons are required to adhere to the code of conduct, respect library property, and ensure timely return of borrowed materials. </w:t>
+      </w:r>
+    </w:p>
+    <w:p>
+      <w:r>
+        <w:t xml:space="preserve">All patrons are required to adhere to the code of conduct, respect library property, and ensure timely return of borrowed materials. All patrons are required to adhere to the code of conduct, respect library property, and ensure timely return of borrowed materials. All patrons are required to adhere to the code of conduct, respect library property, and ensure timely return of borrowed materials. All patrons are required to adhere to the code of conduct, respect library property, and ensure timely return of borrowed materials. All patrons are required to adhere to the code of conduct, respect library property, and ensure timely return of borrowed materials. All patrons are required to adhere to the code of conduct, respect library property, and ensure timely return of borrowed materials. All patrons are required to adhere to the code of conduct, respect library property, and ensure timely return of borrowed materials. All patrons are required to adhere to the code of conduct, respect library property, and ensure timely return of borrowed materials. </w:t>
+      </w:r>
+    </w:p>
+    <w:p>
+      <w:r>
+        <w:br w:type="page"/>
+      </w:r>
+    </w:p>
+    <w:p>
+      <w:pPr>
+        <w:pStyle w:val="Heading1"/>
+      </w:pPr>
+      <w:r>
+        <w:t>Section 41: Policy Guidelines</w:t>
+      </w:r>
+    </w:p>
+    <w:p>
+      <w:r>
+        <w:t xml:space="preserve">All patrons are required to adhere to the code of conduct, respect library property, and ensure timely return of borrowed materials. All patrons are required to adhere to the code of conduct, respect library property, and ensure timely return of borrowed materials. All patrons are required to adhere to the code of conduct, respect library property, and ensure timely return of borrowed materials. All patrons are required to adhere to the code of conduct, respect library property, and ensure timely return of borrowed materials. All patrons are required to adhere to the code of conduct, respect library property, and ensure timely return of borrowed materials. All patrons are required to adhere to the code of conduct, respect library property, and ensure timely return of borrowed materials. All patrons are required to adhere to the code of conduct, respect library property, and ensure timely return of borrowed materials. All patrons are required to adhere to the code of conduct, respect library property, and ensure timely return of borrowed materials. </w:t>
+      </w:r>
+    </w:p>
+    <w:p>
+      <w:r>
+        <w:t xml:space="preserve">All patrons are required to adhere to the code of conduct, respect library property, and ensure timely return of borrowed materials. All patrons are required to adhere to the code of conduct, respect library property, and ensure timely return of borrowed materials. All patrons are required to adhere to the code of conduct, respect library property, and ensure timely return of borrowed materials. All patrons are required to adhere to the code of conduct, respect library property, and ensure timely return of borrowed materials. All patrons are required to adhere to the code of conduct, respect library property, and ensure timely return of borrowed materials. All patrons are required to adhere to the code of conduct, respect library property, and ensure timely return of borrowed materials. All patrons are required to adhere to the code of conduct, respect library property, and ensure timely return of borrowed materials. All patrons are required to adhere to the code of conduct, respect library property, and ensure timely return of borrowed materials. </w:t>
+      </w:r>
+    </w:p>
+    <w:p>
+      <w:r>
+        <w:t xml:space="preserve">All patrons are required to adhere to the code of conduct, respect library property, and ensure timely return of borrowed materials. All patrons are required to adhere to the code of conduct, respect library property, and ensure timely return of borrowed materials. All patrons are required to adhere to the code of conduct, respect library property, and ensure timely return of borrowed materials. All patrons are required to adhere to the code of conduct, respect library property, and ensure timely return of borrowed materials. All patrons are required to adhere to the code of conduct, respect library property, and ensure timely return of borrowed materials. All patrons are required to adhere to the code of conduct, respect library property, and ensure timely return of borrowed materials. All patrons are required to adhere to the code of conduct, respect library property, and ensure timely return of borrowed materials. All patrons are required to adhere to the code of conduct, respect library property, and ensure timely return of borrowed materials. </w:t>
+      </w:r>
+    </w:p>
+    <w:p>
+      <w:r>
+        <w:br w:type="page"/>
+      </w:r>
+    </w:p>
+    <w:p>
+      <w:pPr>
+        <w:pStyle w:val="Heading1"/>
+      </w:pPr>
+      <w:r>
+        <w:t>Section 42: Policy Guidelines</w:t>
+      </w:r>
+    </w:p>
+    <w:p>
+      <w:r>
+        <w:t xml:space="preserve">All patrons are required to adhere to the code of conduct, respect library property, and ensure timely return of borrowed materials. All patrons are required to adhere to the code of conduct, respect library property, and ensure timely return of borrowed materials. All patrons are required to adhere to the code of conduct, respect library property, and ensure timely return of borrowed materials. All patrons are required to adhere to the code of conduct, respect library property, and ensure timely return of borrowed materials. All patrons are required to adhere to the code of conduct, respect library property, and ensure timely return of borrowed materials. All patrons are required to adhere to the code of conduct, respect library property, and ensure timely return of borrowed materials. All patrons are required to adhere to the code of conduct, respect library property, and ensure timely return of borrowed materials. All patrons are required to adhere to the code of conduct, respect library property, and ensure timely return of borrowed materials. </w:t>
+      </w:r>
+    </w:p>
+    <w:p>
+      <w:r>
+        <w:t xml:space="preserve">All patrons are required to adhere to the code of conduct, respect library property, and ensure timely return of borrowed materials. All patrons are required to adhere to the code of conduct, respect library property, and ensure timely return of borrowed materials. All patrons are required to adhere to the code of conduct, respect library property, and ensure timely return of borrowed materials. All patrons are required to adhere to the code of conduct, respect library property, and ensure timely return of borrowed materials. All patrons are required to adhere to the code of conduct, respect library property, and ensure timely return of borrowed materials. All patrons are required to adhere to the code of conduct, respect library property, and ensure timely return of borrowed materials. All patrons are required to adhere to the code of conduct, respect library property, and ensure timely return of borrowed materials. All patrons are required to adhere to the code of conduct, respect library property, and ensure timely return of borrowed materials. </w:t>
+      </w:r>
+    </w:p>
+    <w:p>
+      <w:r>
+        <w:t xml:space="preserve">All patrons are required to adhere to the code of conduct, respect library property, and ensure timely return of borrowed materials. All patrons are required to adhere to the code of conduct, respect library property, and ensure timely return of borrowed materials. All patrons are required to adhere to the code of conduct, respect library property, and ensure timely return of borrowed materials. All patrons are required to adhere to the code of conduct, respect library property, and ensure timely return of borrowed materials. All patrons are required to adhere to the code of conduct, respect library property, and ensure timely return of borrowed materials. All patrons are required to adhere to the code of conduct, respect library property, and ensure timely return of borrowed materials. All patrons are required to adhere to the code of conduct, respect library property, and ensure timely return of borrowed materials. All patrons are required to adhere to the code of conduct, respect library property, and ensure timely return of borrowed materials. </w:t>
+      </w:r>
+    </w:p>
+    <w:p>
+      <w:r>
+        <w:br w:type="page"/>
+      </w:r>
+    </w:p>
+    <w:p>
+      <w:pPr>
+        <w:pStyle w:val="Heading1"/>
+      </w:pPr>
+      <w:r>
+        <w:t>Section 43: Policy Guidelines</w:t>
+      </w:r>
+    </w:p>
+    <w:p>
+      <w:r>
+        <w:t xml:space="preserve">All patrons are required to adhere to the code of conduct, respect library property, and ensure timely return of borrowed materials. All patrons are required to adhere to the code of conduct, respect library property, and ensure timely return of borrowed materials. All patrons are required to adhere to the code of conduct, respect library property, and ensure timely return of borrowed materials. All patrons are required to adhere to the code of conduct, respect library property, and ensure timely return of borrowed materials. All patrons are required to adhere to the code of conduct, respect library property, and ensure timely return of borrowed materials. All patrons are required to adhere to the code of conduct, respect library property, and ensure timely return of borrowed materials. All patrons are required to adhere to the code of conduct, respect library property, and ensure timely return of borrowed materials. All patrons are required to adhere to the code of conduct, respect library property, and ensure timely return of borrowed materials. </w:t>
+      </w:r>
+    </w:p>
+    <w:p>
+      <w:r>
+        <w:t xml:space="preserve">All patrons are required to adhere to the code of conduct, respect library property, and ensure timely return of borrowed materials. All patrons are required to adhere to the code of conduct, respect library property, and ensure timely return of borrowed materials. All patrons are required to adhere to the code of conduct, respect library property, and ensure timely return of borrowed materials. All patrons are required to adhere to the code of conduct, respect library property, and ensure timely return of borrowed materials. All patrons are required to adhere to the code of conduct, respect library property, and ensure timely return of borrowed materials. All patrons are required to adhere to the code of conduct, respect library property, and ensure timely return of borrowed materials. All patrons are required to adhere to the code of conduct, respect library property, and ensure timely return of borrowed materials. All patrons are required to adhere to the code of conduct, respect library property, and ensure timely return of borrowed materials. </w:t>
+      </w:r>
+    </w:p>
+    <w:p>
+      <w:r>
+        <w:t xml:space="preserve">All patrons are required to adhere to the code of conduct, respect library property, and ensure timely return of borrowed materials. All patrons are required to adhere to the code of conduct, respect library property, and ensure timely return of borrowed materials. All patrons are required to adhere to the code of conduct, respect library property, and ensure timely return of borrowed materials. All patrons are required to adhere to the code of conduct, respect library property, and ensure timely return of borrowed materials. All patrons are required to adhere to the code of conduct, respect library property, and ensure timely return of borrowed materials. All patrons are required to adhere to the code of conduct, respect library property, and ensure timely return of borrowed materials. All patrons are required to adhere to the code of conduct, respect library property, and ensure timely return of borrowed materials. All patrons are required to adhere to the code of conduct, respect library property, and ensure timely return of borrowed materials. </w:t>
+      </w:r>
+    </w:p>
+    <w:p>
+      <w:r>
+        <w:br w:type="page"/>
+      </w:r>
+    </w:p>
+    <w:p>
+      <w:pPr>
+        <w:pStyle w:val="Heading1"/>
+      </w:pPr>
+      <w:r>
+        <w:t>Section 44: Policy Guidelines</w:t>
+      </w:r>
+    </w:p>
+    <w:p>
+      <w:r>
+        <w:t xml:space="preserve">All patrons are required to adhere to the code of conduct, respect library property, and ensure timely return of borrowed materials. All patrons are required to adhere to the code of conduct, respect library property, and ensure timely return of borrowed materials. All patrons are required to adhere to the code of conduct, respect library property, and ensure timely return of borrowed materials. All patrons are required to adhere to the code of conduct, respect library property, and ensure timely return of borrowed materials. All patrons are required to adhere to the code of conduct, respect library property, and ensure timely return of borrowed materials. All patrons are required to adhere to the code of conduct, respect library property, and ensure timely return of borrowed materials. All patrons are required to adhere to the code of conduct, respect library property, and ensure timely return of borrowed materials. All patrons are required to adhere to the code of conduct, respect library property, and ensure timely return of borrowed materials. </w:t>
+      </w:r>
+    </w:p>
+    <w:p>
+      <w:r>
+        <w:t xml:space="preserve">All patrons are required to adhere to the code of conduct, respect library property, and ensure timely return of borrowed materials. All patrons are required to adhere to the code of conduct, respect library property, and ensure timely return of borrowed materials. All patrons are required to adhere to the code of conduct, respect library property, and ensure timely return of borrowed materials. All patrons are required to adhere to the code of conduct, respect library property, and ensure timely return of borrowed materials. All patrons are required to adhere to the code of conduct, respect library property, and ensure timely return of borrowed materials. All patrons are required to adhere to the code of conduct, respect library property, and ensure timely return of borrowed materials. All patrons are required to adhere to the code of conduct, respect library property, and ensure timely return of borrowed materials. All patrons are required to adhere to the code of conduct, respect library property, and ensure timely return of borrowed materials. </w:t>
+      </w:r>
+    </w:p>
+    <w:p>
+      <w:r>
+        <w:t xml:space="preserve">All patrons are required to adhere to the code of conduct, respect library property, and ensure timely return of borrowed materials. All patrons are required to adhere to the code of conduct, respect library property, and ensure timely return of borrowed materials. All patrons are required to adhere to the code of conduct, respect library property, and ensure timely return of borrowed materials. All patrons are required to adhere to the code of conduct, respect library property, and ensure timely return of borrowed materials. All patrons are required to adhere to the code of conduct, respect library property, and ensure timely return of borrowed materials. All patrons are required to adhere to the code of conduct, respect library property, and ensure timely return of borrowed materials. All patrons are required to adhere to the code of conduct, respect library property, and ensure timely return of borrowed materials. All patrons are required to adhere to the code of conduct, respect library property, and ensure timely return of borrowed materials. </w:t>
+      </w:r>
+    </w:p>
+    <w:p>
+      <w:r>
+        <w:br w:type="page"/>
+      </w:r>
+    </w:p>
+    <w:p>
+      <w:pPr>
+        <w:pStyle w:val="Heading1"/>
+      </w:pPr>
+      <w:r>
+        <w:t>Section 45: Policy Guidelines</w:t>
+      </w:r>
+    </w:p>
+    <w:p>
+      <w:r>
+        <w:t xml:space="preserve">All patrons are required to adhere to the code of conduct, respect library property, and ensure timely return of borrowed materials. All patrons are required to adhere to the code of conduct, respect library property, and ensure timely return of borrowed materials. All patrons are required to adhere to the code of conduct, respect library property, and ensure timely return of borrowed materials. All patrons are required to adhere to the code of conduct, respect library property, and ensure timely return of borrowed materials. All patrons are required to adhere to the code of conduct, respect library property, and ensure timely return of borrowed materials. All patrons are required to adhere to the code of conduct, respect library property, and ensure timely return of borrowed materials. All patrons are required to adhere to the code of conduct, respect library property, and ensure timely return of borrowed materials. All patrons are required to adhere to the code of conduct, respect library property, and ensure timely return of borrowed materials. </w:t>
+      </w:r>
+    </w:p>
+    <w:p>
+      <w:r>
+        <w:t xml:space="preserve">All patrons are required to adhere to the code of conduct, respect library property, and ensure timely return of borrowed materials. All patrons are required to adhere to the code of conduct, respect library property, and ensure timely return of borrowed materials. All patrons are required to adhere to the code of conduct, respect library property, and ensure timely return of borrowed materials. All patrons are required to adhere to the code of conduct, respect library property, and ensure timely return of borrowed materials. All patrons are required to adhere to the code of conduct, respect library property, and ensure timely return of borrowed materials. All patrons are required to adhere to the code of conduct, respect library property, and ensure timely return of borrowed materials. All patrons are required to adhere to the code of conduct, respect library property, and ensure timely return of borrowed materials. All patrons are required to adhere to the code of conduct, respect library property, and ensure timely return of borrowed materials. </w:t>
+      </w:r>
+    </w:p>
+    <w:p>
+      <w:r>
+        <w:t xml:space="preserve">All patrons are required to adhere to the code of conduct, respect library property, and ensure timely return of borrowed materials. All patrons are required to adhere to the code of conduct, respect library property, and ensure timely return of borrowed materials. All patrons are required to adhere to the code of conduct, respect library property, and ensure timely return of borrowed materials. All patrons are required to adhere to the code of conduct, respect library property, and ensure timely return of borrowed materials. All patrons are required to adhere to the code of conduct, respect library property, and ensure timely return of borrowed materials. All patrons are required to adhere to the code of conduct, respect library property, and ensure timely return of borrowed materials. All patrons are required to adhere to the code of conduct, respect library property, and ensure timely return of borrowed materials. All patrons are required to adhere to the code of conduct, respect library property, and ensure timely return of borrowed materials. </w:t>
+      </w:r>
+    </w:p>
+    <w:p>
+      <w:r>
+        <w:br w:type="page"/>
+      </w:r>
+    </w:p>
+    <w:p>
+      <w:pPr>
+        <w:pStyle w:val="Heading1"/>
+      </w:pPr>
+      <w:r>
+        <w:t>Section 46: Policy Guidelines</w:t>
+      </w:r>
+    </w:p>
+    <w:p>
+      <w:r>
+        <w:t xml:space="preserve">All patrons are required to adhere to the code of conduct, respect library property, and ensure timely return of borrowed materials. All patrons are required to adhere to the code of conduct, respect library property, and ensure timely return of borrowed materials. All patrons are required to adhere to the code of conduct, respect library property, and ensure timely return of borrowed materials. All patrons are required to adhere to the code of conduct, respect library property, and ensure timely return of borrowed materials. All patrons are required to adhere to the code of conduct, respect library property, and ensure timely return of borrowed materials. All patrons are required to adhere to the code of conduct, respect library property, and ensure timely return of borrowed materials. All patrons are required to adhere to the code of conduct, respect library property, and ensure timely return of borrowed materials. All patrons are required to adhere to the code of conduct, respect library property, and ensure timely return of borrowed materials. </w:t>
+      </w:r>
+    </w:p>
+    <w:p>
+      <w:r>
+        <w:t xml:space="preserve">All patrons are required to adhere to the code of conduct, respect library property, and ensure timely return of borrowed materials. All patrons are required to adhere to the code of conduct, respect library property, and ensure timely return of borrowed materials. All patrons are required to adhere to the code of conduct, respect library property, and ensure timely return of borrowed materials. All patrons are required to adhere to the code of conduct, respect library property, and ensure timely return of borrowed materials. All patrons are required to adhere to the code of conduct, respect library property, and ensure timely return of borrowed materials. All patrons are required to adhere to the code of conduct, respect library property, and ensure timely return of borrowed materials. All patrons are required to adhere to the code of conduct, respect library property, and ensure timely return of borrowed materials. All patrons are required to adhere to the code of conduct, respect library property, and ensure timely return of borrowed materials. </w:t>
+      </w:r>
+    </w:p>
+    <w:p>
+      <w:r>
+        <w:t xml:space="preserve">All patrons are required to adhere to the code of conduct, respect library property, and ensure timely return of borrowed materials. All patrons are required to adhere to the code of conduct, respect library property, and ensure timely return of borrowed materials. All patrons are required to adhere to the code of conduct, respect library property, and ensure timely return of borrowed materials. All patrons are required to adhere to the code of conduct, respect library property, and ensure timely return of borrowed materials. All patrons are required to adhere to the code of conduct, respect library property, and ensure timely return of borrowed materials. All patrons are required to adhere to the code of conduct, respect library property, and ensure timely return of borrowed materials. All patrons are required to adhere to the code of conduct, respect library property, and ensure timely return of borrowed materials. All patrons are required to adhere to the code of conduct, respect library property, and ensure timely return of borrowed materials. </w:t>
+      </w:r>
+    </w:p>
+    <w:p>
+      <w:r>
+        <w:br w:type="page"/>
+      </w:r>
+    </w:p>
+    <w:p>
+      <w:pPr>
+        <w:pStyle w:val="Heading1"/>
+      </w:pPr>
+      <w:r>
+        <w:t>Section 47: Policy Guidelines</w:t>
+      </w:r>
+    </w:p>
+    <w:p>
+      <w:r>
+        <w:t xml:space="preserve">All patrons are required to adhere to the code of conduct, respect library property, and ensure timely return of borrowed materials. All patrons are required to adhere to the code of conduct, respect library property, and ensure timely return of borrowed materials. All patrons are required to adhere to the code of conduct, respect library property, and ensure timely return of borrowed materials. All patrons are required to adhere to the code of conduct, respect library property, and ensure timely return of borrowed materials. All patrons are required to adhere to the code of conduct, respect library property, and ensure timely return of borrowed materials. All patrons are required to adhere to the code of conduct, respect library property, and ensure timely return of borrowed materials. All patrons are required to adhere to the code of conduct, respect library property, and ensure timely return of borrowed materials. All patrons are required to adhere to the code of conduct, respect library property, and ensure timely return of borrowed materials. </w:t>
+      </w:r>
+    </w:p>
+    <w:p>
+      <w:r>
+        <w:t xml:space="preserve">All patrons are required to adhere to the code of conduct, respect library property, and ensure timely return of borrowed materials. All patrons are required to adhere to the code of conduct, respect library property, and ensure timely return of borrowed materials. All patrons are required to adhere to the code of conduct, respect library property, and ensure timely return of borrowed materials. All patrons are required to adhere to the code of conduct, respect library property, and ensure timely return of borrowed materials. All patrons are required to adhere to the code of conduct, respect library property, and ensure timely return of borrowed materials. All patrons are required to adhere to the code of conduct, respect library property, and ensure timely return of borrowed materials. All patrons are required to adhere to the code of conduct, respect library property, and ensure timely return of borrowed materials. All patrons are required to adhere to the code of conduct, respect library property, and ensure timely return of borrowed materials. </w:t>
+      </w:r>
+    </w:p>
+    <w:p>
+      <w:r>
+        <w:t xml:space="preserve">All patrons are required to adhere to the code of conduct, respect library property, and ensure timely return of borrowed materials. All patrons are required to adhere to the code of conduct, respect library property, and ensure timely return of borrowed materials. All patrons are required to adhere to the code of conduct, respect library property, and ensure timely return of borrowed materials. All patrons are required to adhere to the code of conduct, respect library property, and ensure timely return of borrowed materials. All patrons are required to adhere to the code of conduct, respect library property, and ensure timely return of borrowed materials. All patrons are required to adhere to the code of conduct, respect library property, and ensure timely return of borrowed materials. All patrons are required to adhere to the code of conduct, respect library property, and ensure timely return of borrowed materials. All patrons are required to adhere to the code of conduct, respect library property, and ensure timely return of borrowed materials. </w:t>
+      </w:r>
+    </w:p>
+    <w:p>
+      <w:r>
+        <w:br w:type="page"/>
+      </w:r>
+    </w:p>
+    <w:p>
+      <w:pPr>
+        <w:pStyle w:val="Heading1"/>
+      </w:pPr>
+      <w:r>
+        <w:t>Section 48: Policy Guidelines</w:t>
+      </w:r>
+    </w:p>
+    <w:p>
+      <w:r>
+        <w:t xml:space="preserve">All patrons are required to adhere to the code of conduct, respect library property, and ensure timely return of borrowed materials. All patrons are required to adhere to the code of conduct, respect library property, and ensure timely return of borrowed materials. All patrons are required to adhere to the code of conduct, respect library property, and ensure timely return of borrowed materials. All patrons are required to adhere to the code of conduct, respect library property, and ensure timely return of borrowed materials. All patrons are required to adhere to the code of conduct, respect library property, and ensure timely return of borrowed materials. All patrons are required to adhere to the code of conduct, respect library property, and ensure timely return of borrowed materials. All patrons are required to adhere to the code of conduct, respect library property, and ensure timely return of borrowed materials. All patrons are required to adhere to the code of conduct, respect library property, and ensure timely return of borrowed materials. </w:t>
+      </w:r>
+    </w:p>
+    <w:p>
+      <w:r>
+        <w:t xml:space="preserve">All patrons are required to adhere to the code of conduct, respect library property, and ensure timely return of borrowed materials. All patrons are required to adhere to the code of conduct, respect library property, and ensure timely return of borrowed materials. All patrons are required to adhere to the code of conduct, respect library property, and ensure timely return of borrowed materials. All patrons are required to adhere to the code of conduct, respect library property, and ensure timely return of borrowed materials. All patrons are required to adhere to the code of conduct, respect library property, and ensure timely return of borrowed materials. All patrons are required to adhere to the code of conduct, respect library property, and ensure timely return of borrowed materials. All patrons are required to adhere to the code of conduct, respect library property, and ensure timely return of borrowed materials. All patrons are required to adhere to the code of conduct, respect library property, and ensure timely return of borrowed materials. </w:t>
+      </w:r>
+    </w:p>
+    <w:p>
+      <w:r>
+        <w:t xml:space="preserve">All patrons are required to adhere to the code of conduct, respect library property, and ensure timely return of borrowed materials. All patrons are required to adhere to the code of conduct, respect library property, and ensure timely return of borrowed materials. All patrons are required to adhere to the code of conduct, respect library property, and ensure timely return of borrowed materials. All patrons are required to adhere to the code of conduct, respect library property, and ensure timely return of borrowed materials. All patrons are required to adhere to the code of conduct, respect library property, and ensure timely return of borrowed materials. All patrons are required to adhere to the code of conduct, respect library property, and ensure timely return of borrowed materials. All patrons are required to adhere to the code of conduct, respect library property, and ensure timely return of borrowed materials. All patrons are required to adhere to the code of conduct, respect library property, and ensure timely return of borrowed materials. </w:t>
+      </w:r>
+    </w:p>
+    <w:p>
+      <w:r>
+        <w:br w:type="page"/>
+      </w:r>
+    </w:p>
+    <w:p>
+      <w:pPr>
+        <w:pStyle w:val="Heading1"/>
+      </w:pPr>
+      <w:r>
+        <w:t>Section 49: Policy Guidelines</w:t>
+      </w:r>
+    </w:p>
+    <w:p>
+      <w:r>
+        <w:t xml:space="preserve">All patrons are required to adhere to the code of conduct, respect library property, and ensure timely return of borrowed materials. All patrons are required to adhere to the code of conduct, respect library property, and ensure timely return of borrowed materials. All patrons are required to adhere to the code of conduct, respect library property, and ensure timely return of borrowed materials. All patrons are required to adhere to the code of conduct, respect library property, and ensure timely return of borrowed materials. All patrons are required to adhere to the code of conduct, respect library property, and ensure timely return of borrowed materials. All patrons are required to adhere to the code of conduct, respect library property, and ensure timely return of borrowed materials. All patrons are required to adhere to the code of conduct, respect library property, and ensure timely return of borrowed materials. All patrons are required to adhere to the code of conduct, respect library property, and ensure timely return of borrowed materials. </w:t>
+      </w:r>
+    </w:p>
+    <w:p>
+      <w:r>
+        <w:t xml:space="preserve">All patrons are required to adhere to the code of conduct, respect library property, and ensure timely return of borrowed materials. All patrons are required to adhere to the code of conduct, respect library property, and ensure timely return of borrowed materials. All patrons are required to adhere to the code of conduct, respect library property, and ensure timely return of borrowed materials. All patrons are required to adhere to the code of conduct, respect library property, and ensure timely return of borrowed materials. All patrons are required to adhere to the code of conduct, respect library property, and ensure timely return of borrowed materials. All patrons are required to adhere to the code of conduct, respect library property, and ensure timely return of borrowed materials. All patrons are required to adhere to the code of conduct, respect library property, and ensure timely return of borrowed materials. All patrons are required to adhere to the code of conduct, respect library property, and ensure timely return of borrowed materials. </w:t>
+      </w:r>
+    </w:p>
+    <w:p>
+      <w:r>
+        <w:t xml:space="preserve">All patrons are required to adhere to the code of conduct, respect library property, and ensure timely return of borrowed materials. All patrons are required to adhere to the code of conduct, respect library property, and ensure timely return of borrowed materials. All patrons are required to adhere to the code of conduct, respect library property, and ensure timely return of borrowed materials. All patrons are required to adhere to the code of conduct, respect library property, and ensure timely return of borrowed materials. All patrons are required to adhere to the code of conduct, respect library property, and ensure timely return of borrowed materials. All patrons are required to adhere to the code of conduct, respect library property, and ensure timely return of borrowed materials. All patrons are required to adhere to the code of conduct, respect library property, and ensure timely return of borrowed materials. All patrons are required to adhere to the code of conduct, respect library property, and ensure timely return of borrowed materials. </w:t>
+      </w:r>
+    </w:p>
+    <w:p>
+      <w:r>
+        <w:br w:type="page"/>
+      </w:r>
+    </w:p>
+    <w:p>
+      <w:pPr>
+        <w:pStyle w:val="Heading1"/>
+      </w:pPr>
+      <w:r>
+        <w:t>Section 50: Policy Guidelines</w:t>
+      </w:r>
+    </w:p>
+    <w:p>
+      <w:r>
+        <w:t xml:space="preserve">All patrons are required to adhere to the code of conduct, respect library property, and ensure timely return of borrowed materials. All patrons are required to adhere to the code of conduct, respect library property, and ensure timely return of borrowed materials. All patrons are required to adhere to the code of conduct, respect library property, and ensure timely return of borrowed materials. All patrons are required to adhere to the code of conduct, respect library property, and ensure timely return of borrowed materials. All patrons are required to adhere to the code of conduct, respect library property, and ensure timely return of borrowed materials. All patrons are required to adhere to the code of conduct, respect library property, and ensure timely return of borrowed materials. All patrons are required to adhere to the code of conduct, respect library property, and ensure timely return of borrowed materials. All patrons are required to adhere to the code of conduct, respect library property, and ensure timely return of borrowed materials. </w:t>
+      </w:r>
+    </w:p>
+    <w:p>
+      <w:r>
+        <w:t xml:space="preserve">All patrons are required to adhere to the code of conduct, respect library property, and ensure timely return of borrowed materials. All patrons are required to adhere to the code of conduct, respect library property, and ensure timely return of borrowed materials. All patrons are required to adhere to the code of conduct, respect library property, and ensure timely return of borrowed materials. All patrons are required to adhere to the code of conduct, respect library property, and ensure timely return of borrowed materials. All patrons are required to adhere to the code of conduct, respect library property, and ensure timely return of borrowed materials. All patrons are required to adhere to the code of conduct, respect library property, and ensure timely return of borrowed materials. All patrons are required to adhere to the code of conduct, respect library property, and ensure timely return of borrowed materials. All patrons are required to adhere to the code of conduct, respect library property, and ensure timely return of borrowed materials. </w:t>
+      </w:r>
+    </w:p>
+    <w:p>
+      <w:r>
+        <w:t xml:space="preserve">All patrons are required to adhere to the code of conduct, respect library property, and ensure timely return of borrowed materials. All patrons are required to adhere to the code of conduct, respect library property, and ensure timely return of borrowed materials. All patrons are required to adhere to the code of conduct, respect library property, and ensure timely return of borrowed materials. All patrons are required to adhere to the code of conduct, respect library property, and ensure timely return of borrowed materials. All patrons are required to adhere to the code of conduct, respect library property, and ensure timely return of borrowed materials. All patrons are required to adhere to the code of conduct, respect library property, and ensure timely return of borrowed materials. All patrons are required to adhere to the code of conduct, respect library property, and ensure timely return of borrowed materials. All patrons are required to adhere to the code of conduct, respect library property, and ensure timely return of borrowed materials. </w:t>
+      </w:r>
+    </w:p>
+    <w:p>
+      <w:r>
+        <w:br w:type="page"/>
+      </w:r>
+    </w:p>
+    <w:p>
+      <w:pPr>
+        <w:pStyle w:val="Heading1"/>
+      </w:pPr>
+      <w:r>
+        <w:t>Section 51: Policy Guidelines</w:t>
+      </w:r>
+    </w:p>
+    <w:p>
+      <w:r>
+        <w:t xml:space="preserve">All patrons are required to adhere to the code of conduct, respect library property, and ensure timely return of borrowed materials. All patrons are required to adhere to the code of conduct, respect library property, and ensure timely return of borrowed materials. All patrons are required to adhere to the code of conduct, respect library property, and ensure timely return of borrowed materials. All patrons are required to adhere to the code of conduct, respect library property, and ensure timely return of borrowed materials. All patrons are required to adhere to the code of conduct, respect library property, and ensure timely return of borrowed materials. All patrons are required to adhere to the code of conduct, respect library property, and ensure timely return of borrowed materials. All patrons are required to adhere to the code of conduct, respect library property, and ensure timely return of borrowed materials. All patrons are required to adhere to the code of conduct, respect library property, and ensure timely return of borrowed materials. </w:t>
+      </w:r>
+    </w:p>
+    <w:p>
+      <w:r>
+        <w:t xml:space="preserve">All patrons are required to adhere to the code of conduct, respect library property, and ensure timely return of borrowed materials. All patrons are required to adhere to the code of conduct, respect library property, and ensure timely return of borrowed materials. All patrons are required to adhere to the code of conduct, respect library property, and ensure timely return of borrowed materials. All patrons are required to adhere to the code of conduct, respect library property, and ensure timely return of borrowed materials. All patrons are required to adhere to the code of conduct, respect library property, and ensure timely return of borrowed materials. All patrons are required to adhere to the code of conduct, respect library property, and ensure timely return of borrowed materials. All patrons are required to adhere to the code of conduct, respect library property, and ensure timely return of borrowed materials. All patrons are required to adhere to the code of conduct, respect library property, and ensure timely return of borrowed materials. </w:t>
+      </w:r>
+    </w:p>
+    <w:p>
+      <w:r>
+        <w:t xml:space="preserve">All patrons are required to adhere to the code of conduct, respect library property, and ensure timely return of borrowed materials. All patrons are required to adhere to the code of conduct, respect library property, and ensure timely return of borrowed materials. All patrons are required to adhere to the code of conduct, respect library property, and ensure timely return of borrowed materials. All patrons are required to adhere to the code of conduct, respect library property, and ensure timely return of borrowed materials. All patrons are required to adhere to the code of conduct, respect library property, and ensure timely return of borrowed materials. All patrons are required to adhere to the code of conduct, respect library property, and ensure timely return of borrowed materials. All patrons are required to adhere to the code of conduct, respect library property, and ensure timely return of borrowed materials. All patrons are required to adhere to the code of conduct, respect library property, and ensure timely return of borrowed materials. </w:t>
+      </w:r>
+    </w:p>
+    <w:p>
+      <w:r>
+        <w:br w:type="page"/>
+      </w:r>
+    </w:p>
+    <w:p>
+      <w:pPr>
+        <w:pStyle w:val="Heading1"/>
+      </w:pPr>
+      <w:r>
+        <w:t>Section 52: Policy Guidelines</w:t>
+      </w:r>
+    </w:p>
+    <w:p>
+      <w:r>
+        <w:t xml:space="preserve">All patrons are required to adhere to the code of conduct, respect library property, and ensure timely return of borrowed materials. All patrons are required to adhere to the code of conduct, respect library property, and ensure timely return of borrowed materials. All patrons are required to adhere to the code of conduct, respect library property, and ensure timely return of borrowed materials. All patrons are required to adhere to the code of conduct, respect library property, and ensure timely return of borrowed materials. All patrons are required to adhere to the code of conduct, respect library property, and ensure timely return of borrowed materials. All patrons are required to adhere to the code of conduct, respect library property, and ensure timely return of borrowed materials. All patrons are required to adhere to the code of conduct, respect library property, and ensure timely return of borrowed materials. All patrons are required to adhere to the code of conduct, respect library property, and ensure timely return of borrowed materials. </w:t>
+      </w:r>
+    </w:p>
+    <w:p>
+      <w:r>
+        <w:t xml:space="preserve">All patrons are required to adhere to the code of conduct, respect library property, and ensure timely return of borrowed materials. All patrons are required to adhere to the code of conduct, respect library property, and ensure timely return of borrowed materials. All patrons are required to adhere to the code of conduct, respect library property, and ensure timely return of borrowed materials. All patrons are required to adhere to the code of conduct, respect library property, and ensure timely return of borrowed materials. All patrons are required to adhere to the code of conduct, respect library property, and ensure timely return of borrowed materials. All patrons are required to adhere to the code of conduct, respect library property, and ensure timely return of borrowed materials. All patrons are required to adhere to the code of conduct, respect library property, and ensure timely return of borrowed materials. All patrons are required to adhere to the code of conduct, respect library property, and ensure timely return of borrowed materials. </w:t>
+      </w:r>
+    </w:p>
+    <w:p>
+      <w:r>
+        <w:t xml:space="preserve">All patrons are required to adhere to the code of conduct, respect library property, and ensure timely return of borrowed materials. All patrons are required to adhere to the code of conduct, respect library property, and ensure timely return of borrowed materials. All patrons are required to adhere to the code of conduct, respect library property, and ensure timely return of borrowed materials. All patrons are required to adhere to the code of conduct, respect library property, and ensure timely return of borrowed materials. All patrons are required to adhere to the code of conduct, respect library property, and ensure timely return of borrowed materials. All patrons are required to adhere to the code of conduct, respect library property, and ensure timely return of borrowed materials. All patrons are required to adhere to the code of conduct, respect library property, and ensure timely return of borrowed materials. All patrons are required to adhere to the code of conduct, respect library property, and ensure timely return of borrowed materials. </w:t>
+      </w:r>
+    </w:p>
+    <w:p>
+      <w:r>
+        <w:br w:type="page"/>
+      </w:r>
+    </w:p>
+    <w:p>
+      <w:pPr>
+        <w:pStyle w:val="Heading1"/>
+      </w:pPr>
+      <w:r>
+        <w:t>Section 53: Policy Guidelines</w:t>
+      </w:r>
+    </w:p>
+    <w:p>
+      <w:r>
+        <w:t xml:space="preserve">All patrons are required to adhere to the code of conduct, respect library property, and ensure timely return of borrowed materials. All patrons are required to adhere to the code of conduct, respect library property, and ensure timely return of borrowed materials. All patrons are required to adhere to the code of conduct, respect library property, and ensure timely return of borrowed materials. All patrons are required to adhere to the code of conduct, respect library property, and ensure timely return of borrowed materials. All patrons are required to adhere to the code of conduct, respect library property, and ensure timely return of borrowed materials. All patrons are required to adhere to the code of conduct, respect library property, and ensure timely return of borrowed materials. All patrons are required to adhere to the code of conduct, respect library property, and ensure timely return of borrowed materials. All patrons are required to adhere to the code of conduct, respect library property, and ensure timely return of borrowed materials. </w:t>
+      </w:r>
+    </w:p>
+    <w:p>
+      <w:r>
+        <w:t xml:space="preserve">All patrons are required to adhere to the code of conduct, respect library property, and ensure timely return of borrowed materials. All patrons are required to adhere to the code of conduct, respect library property, and ensure timely return of borrowed materials. All patrons are required to adhere to the code of conduct, respect library property, and ensure timely return of borrowed materials. All patrons are required to adhere to the code of conduct, respect library property, and ensure timely return of borrowed materials. All patrons are required to adhere to the code of conduct, respect library property, and ensure timely return of borrowed materials. All patrons are required to adhere to the code of conduct, respect library property, and ensure timely return of borrowed materials. All patrons are required to adhere to the code of conduct, respect library property, and ensure timely return of borrowed materials. All patrons are required to adhere to the code of conduct, respect library property, and ensure timely return of borrowed materials. </w:t>
+      </w:r>
+    </w:p>
+    <w:p>
+      <w:r>
+        <w:t xml:space="preserve">All patrons are required to adhere to the code of conduct, respect library property, and ensure timely return of borrowed materials. All patrons are required to adhere to the code of conduct, respect library property, and ensure timely return of borrowed materials. All patrons are required to adhere to the code of conduct, respect library property, and ensure timely return of borrowed materials. All patrons are required to adhere to the code of conduct, respect library property, and ensure timely return of borrowed materials. All patrons are required to adhere to the code of conduct, respect library property, and ensure timely return of borrowed materials. All patrons are required to adhere to the code of conduct, respect library property, and ensure timely return of borrowed materials. All patrons are required to adhere to the code of conduct, respect library property, and ensure timely return of borrowed materials. All patrons are required to adhere to the code of conduct, respect library property, and ensure timely return of borrowed materials. </w:t>
+      </w:r>
+    </w:p>
+    <w:p>
+      <w:r>
+        <w:br w:type="page"/>
+      </w:r>
+    </w:p>
+    <w:p>
+      <w:pPr>
+        <w:pStyle w:val="Heading1"/>
+      </w:pPr>
+      <w:r>
+        <w:t>Section 54: Policy Guidelines</w:t>
+      </w:r>
+    </w:p>
+    <w:p>
+      <w:r>
+        <w:t xml:space="preserve">All patrons are required to adhere to the code of conduct, respect library property, and ensure timely return of borrowed materials. All patrons are required to adhere to the code of conduct, respect library property, and ensure timely return of borrowed materials. All patrons are required to adhere to the code of conduct, respect library property, and ensure timely return of borrowed materials. All patrons are required to adhere to the code of conduct, respect library property, and ensure timely return of borrowed materials. All patrons are required to adhere to the code of conduct, respect library property, and ensure timely return of borrowed materials. All patrons are required to adhere to the code of conduct, respect library property, and ensure timely return of borrowed materials. All patrons are required to adhere to the code of conduct, respect library property, and ensure timely return of borrowed materials. All patrons are required to adhere to the code of conduct, respect library property, and ensure timely return of borrowed materials. </w:t>
+      </w:r>
+    </w:p>
+    <w:p>
+      <w:r>
+        <w:t xml:space="preserve">All patrons are required to adhere to the code of conduct, respect library property, and ensure timely return of borrowed materials. All patrons are required to adhere to the code of conduct, respect library property, and ensure timely return of borrowed materials. All patrons are required to adhere to the code of conduct, respect library property, and ensure timely return of borrowed materials. All patrons are required to adhere to the code of conduct, respect library property, and ensure timely return of borrowed materials. All patrons are required to adhere to the code of conduct, respect library property, and ensure timely return of borrowed materials. All patrons are required to adhere to the code of conduct, respect library property, and ensure timely return of borrowed materials. All patrons are required to adhere to the code of conduct, respect library property, and ensure timely return of borrowed materials. All patrons are required to adhere to the code of conduct, respect library property, and ensure timely return of borrowed materials. </w:t>
+      </w:r>
+    </w:p>
+    <w:p>
+      <w:r>
+        <w:t xml:space="preserve">All patrons are required to adhere to the code of conduct, respect library property, and ensure timely return of borrowed materials. All patrons are required to adhere to the code of conduct, respect library property, and ensure timely return of borrowed materials. All patrons are required to adhere to the code of conduct, respect library property, and ensure timely return of borrowed materials. All patrons are required to adhere to the code of conduct, respect library property, and ensure timely return of borrowed materials. All patrons are required to adhere to the code of conduct, respect library property, and ensure timely return of borrowed materials. All patrons are required to adhere to the code of conduct, respect library property, and ensure timely return of borrowed materials. All patrons are required to adhere to the code of conduct, respect library property, and ensure timely return of borrowed materials. All patrons are required to adhere to the code of conduct, respect library property, and ensure timely return of borrowed materials. </w:t>
+      </w:r>
+    </w:p>
+    <w:p>
+      <w:r>
+        <w:br w:type="page"/>
+      </w:r>
+    </w:p>
+    <w:p>
+      <w:pPr>
+        <w:pStyle w:val="Heading1"/>
+      </w:pPr>
+      <w:r>
+        <w:t>Section 55: Policy Guidelines</w:t>
+      </w:r>
+    </w:p>
+    <w:p>
+      <w:r>
+        <w:t xml:space="preserve">All patrons are required to adhere to the code of conduct, respect library property, and ensure timely return of borrowed materials. All patrons are required to adhere to the code of conduct, respect library property, and ensure timely return of borrowed materials. All patrons are required to adhere to the code of conduct, respect library property, and ensure timely return of borrowed materials. All patrons are required to adhere to the code of conduct, respect library property, and ensure timely return of borrowed materials. All patrons are required to adhere to the code of conduct, respect library property, and ensure timely return of borrowed materials. All patrons are required to adhere to the code of conduct, respect library property, and ensure timely return of borrowed materials. All patrons are required to adhere to the code of conduct, respect library property, and ensure timely return of borrowed materials. All patrons are required to adhere to the code of conduct, respect library property, and ensure timely return of borrowed materials. </w:t>
+      </w:r>
+    </w:p>
+    <w:p>
+      <w:r>
+        <w:t xml:space="preserve">All patrons are required to adhere to the code of conduct, respect library property, and ensure timely return of borrowed materials. All patrons are required to adhere to the code of conduct, respect library property, and ensure timely return of borrowed materials. All patrons are required to adhere to the code of conduct, respect library property, and ensure timely return of borrowed materials. All patrons are required to adhere to the code of conduct, respect library property, and ensure timely return of borrowed materials. All patrons are required to adhere to the code of conduct, respect library property, and ensure timely return of borrowed materials. All patrons are required to adhere to the code of conduct, respect library property, and ensure timely return of borrowed materials. All patrons are required to adhere to the code of conduct, respect library property, and ensure timely return of borrowed materials. All patrons are required to adhere to the code of conduct, respect library property, and ensure timely return of borrowed materials. </w:t>
+      </w:r>
+    </w:p>
+    <w:p>
+      <w:r>
+        <w:t xml:space="preserve">All patrons are required to adhere to the code of conduct, respect library property, and ensure timely return of borrowed materials. All patrons are required to adhere to the code of conduct, respect library property, and ensure timely return of borrowed materials. All patrons are required to adhere to the code of conduct, respect library property, and ensure timely return of borrowed materials. All patrons are required to adhere to the code of conduct, respect library property, and ensure timely return of borrowed materials. All patrons are required to adhere to the code of conduct, respect library property, and ensure timely return of borrowed materials. All patrons are required to adhere to the code of conduct, respect library property, and ensure timely return of borrowed materials. All patrons are required to adhere to the code of conduct, respect library property, and ensure timely return of borrowed materials. All patrons are required to adhere to the code of conduct, respect library property, and ensure timely return of borrowed materials. </w:t>
+      </w:r>
+    </w:p>
+    <w:p>
+      <w:r>
+        <w:br w:type="page"/>
+      </w:r>
+    </w:p>
+    <w:p>
+      <w:pPr>
+        <w:pStyle w:val="Heading1"/>
+      </w:pPr>
+      <w:r>
+        <w:t>Section 56: Policy Guidelines</w:t>
+      </w:r>
+    </w:p>
+    <w:p>
+      <w:r>
+        <w:t xml:space="preserve">All patrons are required to adhere to the code of conduct, respect library property, and ensure timely return of borrowed materials. All patrons are required to adhere to the code of conduct, respect library property, and ensure timely return of borrowed materials. All patrons are required to adhere to the code of conduct, respect library property, and ensure timely return of borrowed materials. All patrons are required to adhere to the code of conduct, respect library property, and ensure timely return of borrowed materials. All patrons are required to adhere to the code of conduct, respect library property, and ensure timely return of borrowed materials. All patrons are required to adhere to the code of conduct, respect library property, and ensure timely return of borrowed materials. All patrons are required to adhere to the code of conduct, respect library property, and ensure timely return of borrowed materials. All patrons are required to adhere to the code of conduct, respect library property, and ensure timely return of borrowed materials. </w:t>
+      </w:r>
+    </w:p>
+    <w:p>
+      <w:r>
+        <w:t xml:space="preserve">All patrons are required to adhere to the code of conduct, respect library property, and ensure timely return of borrowed materials. All patrons are required to adhere to the code of conduct, respect library property, and ensure timely return of borrowed materials. All patrons are required to adhere to the code of conduct, respect library property, and ensure timely return of borrowed materials. All patrons are required to adhere to the code of conduct, respect library property, and ensure timely return of borrowed materials. All patrons are required to adhere to the code of conduct, respect library property, and ensure timely return of borrowed materials. All patrons are required to adhere to the code of conduct, respect library property, and ensure timely return of borrowed materials. All patrons are required to adhere to the code of conduct, respect library property, and ensure timely return of borrowed materials. All patrons are required to adhere to the code of conduct, respect library property, and ensure timely return of borrowed materials. </w:t>
+      </w:r>
+    </w:p>
+    <w:p>
+      <w:r>
+        <w:t xml:space="preserve">All patrons are required to adhere to the code of conduct, respect library property, and ensure timely return of borrowed materials. All patrons are required to adhere to the code of conduct, respect library property, and ensure timely return of borrowed materials. All patrons are required to adhere to the code of conduct, respect library property, and ensure timely return of borrowed materials. All patrons are required to adhere to the code of conduct, respect library property, and ensure timely return of borrowed materials. All patrons are required to adhere to the code of conduct, respect library property, and ensure timely return of borrowed materials. All patrons are required to adhere to the code of conduct, respect library property, and ensure timely return of borrowed materials. All patrons are required to adhere to the code of conduct, respect library property, and ensure timely return of borrowed materials. All patrons are required to adhere to the code of conduct, respect library property, and ensure timely return of borrowed materials. </w:t>
+      </w:r>
+    </w:p>
+    <w:p>
+      <w:r>
+        <w:br w:type="page"/>
+      </w:r>
+    </w:p>
+    <w:p>
+      <w:pPr>
+        <w:pStyle w:val="Heading1"/>
+      </w:pPr>
+      <w:r>
+        <w:t>Section 57: Policy Guidelines</w:t>
+      </w:r>
+    </w:p>
+    <w:p>
+      <w:r>
+        <w:t xml:space="preserve">All patrons are required to adhere to the code of conduct, respect library property, and ensure timely return of borrowed materials. All patrons are required to adhere to the code of conduct, respect library property, and ensure timely return of borrowed materials. All patrons are required to adhere to the code of conduct, respect library property, and ensure timely return of borrowed materials. All patrons are required to adhere to the code of conduct, respect library property, and ensure timely return of borrowed materials. All patrons are required to adhere to the code of conduct, respect library property, and ensure timely return of borrowed materials. All patrons are required to adhere to the code of conduct, respect library property, and ensure timely return of borrowed materials. All patrons are required to adhere to the code of conduct, respect library property, and ensure timely return of borrowed materials. All patrons are required to adhere to the code of conduct, respect library property, and ensure timely return of borrowed materials. </w:t>
+      </w:r>
+    </w:p>
+    <w:p>
+      <w:r>
+        <w:t xml:space="preserve">All patrons are required to adhere to the code of conduct, respect library property, and ensure timely return of borrowed materials. All patrons are required to adhere to the code of conduct, respect library property, and ensure timely return of borrowed materials. All patrons are required to adhere to the code of conduct, respect library property, and ensure timely return of borrowed materials. All patrons are required to adhere to the code of conduct, respect library property, and ensure timely return of borrowed materials. All patrons are required to adhere to the code of conduct, respect library property, and ensure timely return of borrowed materials. All patrons are required to adhere to the code of conduct, respect library property, and ensure timely return of borrowed materials. All patrons are required to adhere to the code of conduct, respect library property, and ensure timely return of borrowed materials. All patrons are required to adhere to the code of conduct, respect library property, and ensure timely return of borrowed materials. </w:t>
+      </w:r>
+    </w:p>
+    <w:p>
+      <w:r>
+        <w:t xml:space="preserve">All patrons are required to adhere to the code of conduct, respect library property, and ensure timely return of borrowed materials. All patrons are required to adhere to the code of conduct, respect library property, and ensure timely return of borrowed materials. All patrons are required to adhere to the code of conduct, respect library property, and ensure timely return of borrowed materials. All patrons are required to adhere to the code of conduct, respect library property, and ensure timely return of borrowed materials. All patrons are required to adhere to the code of conduct, respect library property, and ensure timely return of borrowed materials. All patrons are required to adhere to the code of conduct, respect library property, and ensure timely return of borrowed materials. All patrons are required to adhere to the code of conduct, respect library property, and ensure timely return of borrowed materials. All patrons are required to adhere to the code of conduct, respect library property, and ensure timely return of borrowed materials. </w:t>
+      </w:r>
+    </w:p>
+    <w:p>
+      <w:r>
+        <w:br w:type="page"/>
+      </w:r>
+    </w:p>
+    <w:p>
+      <w:pPr>
+        <w:pStyle w:val="Heading1"/>
+      </w:pPr>
+      <w:r>
+        <w:t>Section 58: Policy Guidelines</w:t>
+      </w:r>
+    </w:p>
+    <w:p>
+      <w:r>
+        <w:t xml:space="preserve">All patrons are required to adhere to the code of conduct, respect library property, and ensure timely return of borrowed materials. All patrons are required to adhere to the code of conduct, respect library property, and ensure timely return of borrowed materials. All patrons are required to adhere to the code of conduct, respect library property, and ensure timely return of borrowed materials. All patrons are required to adhere to the code of conduct, respect library property, and ensure timely return of borrowed materials. All patrons are required to adhere to the code of conduct, respect library property, and ensure timely return of borrowed materials. All patrons are required to adhere to the code of conduct, respect library property, and ensure timely return of borrowed materials. All patrons are required to adhere to the code of conduct, respect library property, and ensure timely return of borrowed materials. All patrons are required to adhere to the code of conduct, respect library property, and ensure timely return of borrowed materials. </w:t>
+      </w:r>
+    </w:p>
+    <w:p>
+      <w:r>
+        <w:t xml:space="preserve">All patrons are required to adhere to the code of conduct, respect library property, and ensure timely return of borrowed materials. All patrons are required to adhere to the code of conduct, respect library property, and ensure timely return of borrowed materials. All patrons are required to adhere to the code of conduct, respect library property, and ensure timely return of borrowed materials. All patrons are required to adhere to the code of conduct, respect library property, and ensure timely return of borrowed materials. All patrons are required to adhere to the code of conduct, respect library property, and ensure timely return of borrowed materials. All patrons are required to adhere to the code of conduct, respect library property, and ensure timely return of borrowed materials. All patrons are required to adhere to the code of conduct, respect library property, and ensure timely return of borrowed materials. All patrons are required to adhere to the code of conduct, respect library property, and ensure timely return of borrowed materials. </w:t>
+      </w:r>
+    </w:p>
+    <w:p>
+      <w:r>
+        <w:t xml:space="preserve">All patrons are required to adhere to the code of conduct, respect library property, and ensure timely return of borrowed materials. All patrons are required to adhere to the code of conduct, respect library property, and ensure timely return of borrowed materials. All patrons are required to adhere to the code of conduct, respect library property, and ensure timely return of borrowed materials. All patrons are required to adhere to the code of conduct, respect library property, and ensure timely return of borrowed materials. All patrons are required to adhere to the code of conduct, respect library property, and ensure timely return of borrowed materials. All patrons are required to adhere to the code of conduct, respect library property, and ensure timely return of borrowed materials. All patrons are required to adhere to the code of conduct, respect library property, and ensure timely return of borrowed materials. All patrons are required to adhere to the code of conduct, respect library property, and ensure timely return of borrowed materials. </w:t>
+      </w:r>
+    </w:p>
+    <w:p>
+      <w:r>
+        <w:br w:type="page"/>
+      </w:r>
+    </w:p>
+    <w:p>
+      <w:pPr>
+        <w:pStyle w:val="Heading1"/>
+      </w:pPr>
+      <w:r>
+        <w:t>Section 59: Policy Guidelines</w:t>
+      </w:r>
+    </w:p>
+    <w:p>
+      <w:r>
+        <w:t xml:space="preserve">All patrons are required to adhere to the code of conduct, respect library property, and ensure timely return of borrowed materials. All patrons are required to adhere to the code of conduct, respect library property, and ensure timely return of borrowed materials. All patrons are required to adhere to the code of conduct, respect library property, and ensure timely return of borrowed materials. All patrons are required to adhere to the code of conduct, respect library property, and ensure timely return of borrowed materials. All patrons are required to adhere to the code of conduct, respect library property, and ensure timely return of borrowed materials. All patrons are required to adhere to the code of conduct, respect library property, and ensure timely return of borrowed materials. All patrons are required to adhere to the code of conduct, respect library property, and ensure timely return of borrowed materials. All patrons are required to adhere to the code of conduct, respect library property, and ensure timely return of borrowed materials. </w:t>
+      </w:r>
+    </w:p>
+    <w:p>
+      <w:r>
+        <w:t xml:space="preserve">All patrons are required to adhere to the code of conduct, respect library property, and ensure timely return of borrowed materials. All patrons are required to adhere to the code of conduct, respect library property, and ensure timely return of borrowed materials. All patrons are required to adhere to the code of conduct, respect library property, and ensure timely return of borrowed materials. All patrons are required to adhere to the code of conduct, respect library property, and ensure timely return of borrowed materials. All patrons are required to adhere to the code of conduct, respect library property, and ensure timely return of borrowed materials. All patrons are required to adhere to the code of conduct, respect library property, and ensure timely return of borrowed materials. All patrons are required to adhere to the code of conduct, respect library property, and ensure timely return of borrowed materials. All patrons are required to adhere to the code of conduct, respect library property, and ensure timely return of borrowed materials. </w:t>
+      </w:r>
+    </w:p>
+    <w:p>
+      <w:r>
+        <w:t xml:space="preserve">All patrons are required to adhere to the code of conduct, respect library property, and ensure timely return of borrowed materials. All patrons are required to adhere to the code of conduct, respect library property, and ensure timely return of borrowed materials. All patrons are required to adhere to the code of conduct, respect library property, and ensure timely return of borrowed materials. All patrons are required to adhere to the code of conduct, respect library property, and ensure timely return of borrowed materials. All patrons are required to adhere to the code of conduct, respect library property, and ensure timely return of borrowed materials. All patrons are required to adhere to the code of conduct, respect library property, and ensure timely return of borrowed materials. All patrons are required to adhere to the code of conduct, respect library property, and ensure timely return of borrowed materials. All patrons are required to adhere to the code of conduct, respect library property, and ensure timely return of borrowed materials. </w:t>
+      </w:r>
+    </w:p>
+    <w:p>
+      <w:r>
+        <w:br w:type="page"/>
+      </w:r>
+    </w:p>
+    <w:p>
+      <w:pPr>
+        <w:pStyle w:val="Heading1"/>
+      </w:pPr>
+      <w:r>
+        <w:t>Section 60: Policy Guidelines</w:t>
+      </w:r>
+    </w:p>
+    <w:p>
+      <w:r>
+        <w:t xml:space="preserve">All patrons are required to adhere to the code of conduct, respect library property, and ensure timely return of borrowed materials. All patrons are required to adhere to the code of conduct, respect library property, and ensure timely return of borrowed materials. All patrons are required to adhere to the code of conduct, respect library property, and ensure timely return of borrowed materials. All patrons are required to adhere to the code of conduct, respect library property, and ensure timely return of borrowed materials. All patrons are required to adhere to the code of conduct, respect library property, and ensure timely return of borrowed materials. All patrons are required to adhere to the code of conduct, respect library property, and ensure timely return of borrowed materials. All patrons are required to adhere to the code of conduct, respect library property, and ensure timely return of borrowed materials. All patrons are required to adhere to the code of conduct, respect library property, and ensure timely return of borrowed materials. </w:t>
+      </w:r>
+    </w:p>
+    <w:p>
+      <w:r>
+        <w:t xml:space="preserve">All patrons are required to adhere to the code of conduct, respect library property, and ensure timely return of borrowed materials. All patrons are required to adhere to the code of conduct, respect library property, and ensure timely return of borrowed materials. All patrons are required to adhere to the code of conduct, respect library property, and ensure timely return of borrowed materials. All patrons are required to adhere to the code of conduct, respect library property, and ensure timely return of borrowed materials. All patrons are required to adhere to the code of conduct, respect library property, and ensure timely return of borrowed materials. All patrons are required to adhere to the code of conduct, respect library property, and ensure timely return of borrowed materials. All patrons are required to adhere to the code of conduct, respect library property, and ensure timely return of borrowed materials. All patrons are required to adhere to the code of conduct, respect library property, and ensure timely return of borrowed materials. </w:t>
+      </w:r>
+    </w:p>
+    <w:p>
+      <w:r>
+        <w:t xml:space="preserve">All patrons are required to adhere to the code of conduct, respect library property, and ensure timely return of borrowed materials. All patrons are required to adhere to the code of conduct, respect library property, and ensure timely return of borrowed materials. All patrons are required to adhere to the code of conduct, respect library property, and ensure timely return of borrowed materials. All patrons are required to adhere to the code of conduct, respect library property, and ensure timely return of borrowed materials. All patrons are required to adhere to the code of conduct, respect library property, and ensure timely return of borrowed materials. All patrons are required to adhere to the code of conduct, respect library property, and ensure timely return of borrowed materials. All patrons are required to adhere to the code of conduct, respect library property, and ensure timely return of borrowed materials. All patrons are required to adhere to the code of conduct, respect library property, and ensure timely return of borrowed materials. </w:t>
+      </w:r>
+    </w:p>
+    <w:p>
+      <w:r>
+        <w:br w:type="page"/>
+      </w:r>
+    </w:p>
+    <w:p>
+      <w:pPr>
+        <w:pStyle w:val="Heading1"/>
+      </w:pPr>
+      <w:r>
+        <w:t>Section 61: Policy Guidelines</w:t>
+      </w:r>
+    </w:p>
+    <w:p>
+      <w:r>
+        <w:t xml:space="preserve">All patrons are required to adhere to the code of conduct, respect library property, and ensure timely return of borrowed materials. All patrons are required to adhere to the code of conduct, respect library property, and ensure timely return of borrowed materials. All patrons are required to adhere to the code of conduct, respect library property, and ensure timely return of borrowed materials. All patrons are required to adhere to the code of conduct, respect library property, and ensure timely return of borrowed materials. All patrons are required to adhere to the code of conduct, respect library property, and ensure timely return of borrowed materials. All patrons are required to adhere to the code of conduct, respect library property, and ensure timely return of borrowed materials. All patrons are required to adhere to the code of conduct, respect library property, and ensure timely return of borrowed materials. All patrons are required to adhere to the code of conduct, respect library property, and ensure timely return of borrowed materials. </w:t>
+      </w:r>
+    </w:p>
+    <w:p>
+      <w:r>
+        <w:t xml:space="preserve">All patrons are required to adhere to the code of conduct, respect library property, and ensure timely return of borrowed materials. All patrons are required to adhere to the code of conduct, respect library property, and ensure timely return of borrowed materials. All patrons are required to adhere to the code of conduct, respect library property, and ensure timely return of borrowed materials. All patrons are required to adhere to the code of conduct, respect library property, and ensure timely return of borrowed materials. All patrons are required to adhere to the code of conduct, respect library property, and ensure timely return of borrowed materials. All patrons are required to adhere to the code of conduct, respect library property, and ensure timely return of borrowed materials. All patrons are required to adhere to the code of conduct, respect library property, and ensure timely return of borrowed materials. All patrons are required to adhere to the code of conduct, respect library property, and ensure timely return of borrowed materials. </w:t>
+      </w:r>
+    </w:p>
+    <w:p>
+      <w:r>
+        <w:t xml:space="preserve">All patrons are required to adhere to the code of conduct, respect library property, and ensure timely return of borrowed materials. All patrons are required to adhere to the code of conduct, respect library property, and ensure timely return of borrowed materials. All patrons are required to adhere to the code of conduct, respect library property, and ensure timely return of borrowed materials. All patrons are required to adhere to the code of conduct, respect library property, and ensure timely return of borrowed materials. All patrons are required to adhere to the code of conduct, respect library property, and ensure timely return of borrowed materials. All patrons are required to adhere to the code of conduct, respect library property, and ensure timely return of borrowed materials. All patrons are required to adhere to the code of conduct, respect library property, and ensure timely return of borrowed materials. All patrons are required to adhere to the code of conduct, respect library property, and ensure timely return of borrowed materials. </w:t>
+      </w:r>
+    </w:p>
+    <w:p>
+      <w:r>
+        <w:br w:type="page"/>
+      </w:r>
+    </w:p>
+    <w:p>
+      <w:pPr>
+        <w:pStyle w:val="Heading1"/>
+      </w:pPr>
+      <w:r>
+        <w:t>Section 62: Policy Guidelines</w:t>
+      </w:r>
+    </w:p>
+    <w:p>
+      <w:r>
+        <w:t xml:space="preserve">All patrons are required to adhere to the code of conduct, respect library property, and ensure timely return of borrowed materials. All patrons are required to adhere to the code of conduct, respect library property, and ensure timely return of borrowed materials. All patrons are required to adhere to the code of conduct, respect library property, and ensure timely return of borrowed materials. All patrons are required to adhere to the code of conduct, respect library property, and ensure timely return of borrowed materials. All patrons are required to adhere to the code of conduct, respect library property, and ensure timely return of borrowed materials. All patrons are required to adhere to the code of conduct, respect library property, and ensure timely return of borrowed materials. All patrons are required to adhere to the code of conduct, respect library property, and ensure timely return of borrowed materials. All patrons are required to adhere to the code of conduct, respect library property, and ensure timely return of borrowed materials. </w:t>
+      </w:r>
+    </w:p>
+    <w:p>
+      <w:r>
+        <w:t xml:space="preserve">All patrons are required to adhere to the code of conduct, respect library property, and ensure timely return of borrowed materials. All patrons are required to adhere to the code of conduct, respect library property, and ensure timely return of borrowed materials. All patrons are required to adhere to the code of conduct, respect library property, and ensure timely return of borrowed materials. All patrons are required to adhere to the code of conduct, respect library property, and ensure timely return of borrowed materials. All patrons are required to adhere to the code of conduct, respect library property, and ensure timely return of borrowed materials. All patrons are required to adhere to the code of conduct, respect library property, and ensure timely return of borrowed materials. All patrons are required to adhere to the code of conduct, respect library property, and ensure timely return of borrowed materials. All patrons are required to adhere to the code of conduct, respect library property, and ensure timely return of borrowed materials. </w:t>
+      </w:r>
+    </w:p>
+    <w:p>
+      <w:r>
+        <w:t xml:space="preserve">All patrons are required to adhere to the code of conduct, respect library property, and ensure timely return of borrowed materials. All patrons are required to adhere to the code of conduct, respect library property, and ensure timely return of borrowed materials. All patrons are required to adhere to the code of conduct, respect library property, and ensure timely return of borrowed materials. All patrons are required to adhere to the code of conduct, respect library property, and ensure timely return of borrowed materials. All patrons are required to adhere to the code of conduct, respect library property, and ensure timely return of borrowed materials. All patrons are required to adhere to the code of conduct, respect library property, and ensure timely return of borrowed materials. All patrons are required to adhere to the code of conduct, respect library property, and ensure timely return of borrowed materials. All patrons are required to adhere to the code of conduct, respect library property, and ensure timely return of borrowed materials. </w:t>
+      </w:r>
+    </w:p>
+    <w:p>
+      <w:r>
+        <w:br w:type="page"/>
+      </w:r>
+    </w:p>
+    <w:p>
+      <w:pPr>
+        <w:pStyle w:val="Heading1"/>
+      </w:pPr>
+      <w:r>
+        <w:t>Section 63: Policy Guidelines</w:t>
+      </w:r>
+    </w:p>
+    <w:p>
+      <w:r>
+        <w:t xml:space="preserve">All patrons are required to adhere to the code of conduct, respect library property, and ensure timely return of borrowed materials. All patrons are required to adhere to the code of conduct, respect library property, and ensure timely return of borrowed materials. All patrons are required to adhere to the code of conduct, respect library property, and ensure timely return of borrowed materials. All patrons are required to adhere to the code of conduct, respect library property, and ensure timely return of borrowed materials. All patrons are required to adhere to the code of conduct, respect library property, and ensure timely return of borrowed materials. All patrons are required to adhere to the code of conduct, respect library property, and ensure timely return of borrowed materials. All patrons are required to adhere to the code of conduct, respect library property, and ensure timely return of borrowed materials. All patrons are required to adhere to the code of conduct, respect library property, and ensure timely return of borrowed materials. </w:t>
+      </w:r>
+    </w:p>
+    <w:p>
+      <w:r>
+        <w:t xml:space="preserve">All patrons are required to adhere to the code of conduct, respect library property, and ensure timely return of borrowed materials. All patrons are required to adhere to the code of conduct, respect library property, and ensure timely return of borrowed materials. All patrons are required to adhere to the code of conduct, respect library property, and ensure timely return of borrowed materials. All patrons are required to adhere to the code of conduct, respect library property, and ensure timely return of borrowed materials. All patrons are required to adhere to the code of conduct, respect library property, and ensure timely return of borrowed materials. All patrons are required to adhere to the code of conduct, respect library property, and ensure timely return of borrowed materials. All patrons are required to adhere to the code of conduct, respect library property, and ensure timely return of borrowed materials. All patrons are required to adhere to the code of conduct, respect library property, and ensure timely return of borrowed materials. </w:t>
+      </w:r>
+    </w:p>
+    <w:p>
+      <w:r>
+        <w:t xml:space="preserve">All patrons are required to adhere to the code of conduct, respect library property, and ensure timely return of borrowed materials. All patrons are required to adhere to the code of conduct, respect library property, and ensure timely return of borrowed materials. All patrons are required to adhere to the code of conduct, respect library property, and ensure timely return of borrowed materials. All patrons are required to adhere to the code of conduct, respect library property, and ensure timely return of borrowed materials. All patrons are required to adhere to the code of conduct, respect library property, and ensure timely return of borrowed materials. All patrons are required to adhere to the code of conduct, respect library property, and ensure timely return of borrowed materials. All patrons are required to adhere to the code of conduct, respect library property, and ensure timely return of borrowed materials. All patrons are required to adhere to the code of conduct, respect library property, and ensure timely return of borrowed materials. </w:t>
+      </w:r>
+    </w:p>
+    <w:p>
+      <w:r>
+        <w:br w:type="page"/>
+      </w:r>
+    </w:p>
+    <w:p>
+      <w:pPr>
+        <w:pStyle w:val="Heading1"/>
+      </w:pPr>
+      <w:r>
+        <w:t>Section 64: Policy Guidelines</w:t>
+      </w:r>
+    </w:p>
+    <w:p>
+      <w:r>
+        <w:t xml:space="preserve">All patrons are required to adhere to the code of conduct, respect library property, and ensure timely return of borrowed materials. All patrons are required to adhere to the code of conduct, respect library property, and ensure timely return of borrowed materials. All patrons are required to adhere to the code of conduct, respect library property, and ensure timely return of borrowed materials. All patrons are required to adhere to the code of conduct, respect library property, and ensure timely return of borrowed materials. All patrons are required to adhere to the code of conduct, respect library property, and ensure timely return of borrowed materials. All patrons are required to adhere to the code of conduct, respect library property, and ensure timely return of borrowed materials. All patrons are required to adhere to the code of conduct, respect library property, and ensure timely return of borrowed materials. All patrons are required to adhere to the code of conduct, respect library property, and ensure timely return of borrowed materials. </w:t>
+      </w:r>
+    </w:p>
+    <w:p>
+      <w:r>
+        <w:t xml:space="preserve">All patrons are required to adhere to the code of conduct, respect library property, and ensure timely return of borrowed materials. All patrons are required to adhere to the code of conduct, respect library property, and ensure timely return of borrowed materials. All patrons are required to adhere to the code of conduct, respect library property, and ensure timely return of borrowed materials. All patrons are required to adhere to the code of conduct, respect library property, and ensure timely return of borrowed materials. All patrons are required to adhere to the code of conduct, respect library property, and ensure timely return of borrowed materials. All patrons are required to adhere to the code of conduct, respect library property, and ensure timely return of borrowed materials. All patrons are required to adhere to the code of conduct, respect library property, and ensure timely return of borrowed materials. All patrons are required to adhere to the code of conduct, respect library property, and ensure timely return of borrowed materials. </w:t>
+      </w:r>
+    </w:p>
+    <w:p>
+      <w:r>
+        <w:t xml:space="preserve">All patrons are required to adhere to the code of conduct, respect library property, and ensure timely return of borrowed materials. All patrons are required to adhere to the code of conduct, respect library property, and ensure timely return of borrowed materials. All patrons are required to adhere to the code of conduct, respect library property, and ensure timely return of borrowed materials. All patrons are required to adhere to the code of conduct, respect library property, and ensure timely return of borrowed materials. All patrons are required to adhere to the code of conduct, respect library property, and ensure timely return of borrowed materials. All patrons are required to adhere to the code of conduct, respect library property, and ensure timely return of borrowed materials. All patrons are required to adhere to the code of conduct, respect library property, and ensure timely return of borrowed materials. All patrons are required to adhere to the code of conduct, respect library property, and ensure timely return of borrowed materials. </w:t>
+      </w:r>
+    </w:p>
+    <w:p>
+      <w:r>
+        <w:br w:type="page"/>
+      </w:r>
+    </w:p>
+    <w:p>
+      <w:pPr>
+        <w:pStyle w:val="Heading1"/>
+      </w:pPr>
+      <w:r>
+        <w:t>Section 65: Policy Guidelines</w:t>
+      </w:r>
+    </w:p>
+    <w:p>
+      <w:r>
+        <w:t xml:space="preserve">All patrons are required to adhere to the code of conduct, respect library property, and ensure timely return of borrowed materials. All patrons are required to adhere to the code of conduct, respect library property, and ensure timely return of borrowed materials. All patrons are required to adhere to the code of conduct, respect library property, and ensure timely return of borrowed materials. All patrons are required to adhere to the code of conduct, respect library property, and ensure timely return of borrowed materials. All patrons are required to adhere to the code of conduct, respect library property, and ensure timely return of borrowed materials. All patrons are required to adhere to the code of conduct, respect library property, and ensure timely return of borrowed materials. All patrons are required to adhere to the code of conduct, respect library property, and ensure timely return of borrowed materials. All patrons are required to adhere to the code of conduct, respect library property, and ensure timely return of borrowed materials. </w:t>
+      </w:r>
+    </w:p>
+    <w:p>
+      <w:r>
+        <w:t xml:space="preserve">All patrons are required to adhere to the code of conduct, respect library property, and ensure timely return of borrowed materials. All patrons are required to adhere to the code of conduct, respect library property, and ensure timely return of borrowed materials. All patrons are required to adhere to the code of conduct, respect library property, and ensure timely return of borrowed materials. All patrons are required to adhere to the code of conduct, respect library property, and ensure timely return of borrowed materials. All patrons are required to adhere to the code of conduct, respect library property, and ensure timely return of borrowed materials. All patrons are required to adhere to the code of conduct, respect library property, and ensure timely return of borrowed materials. All patrons are required to adhere to the code of conduct, respect library property, and ensure timely return of borrowed materials. All patrons are required to adhere to the code of conduct, respect library property, and ensure timely return of borrowed materials. </w:t>
+      </w:r>
+    </w:p>
+    <w:p>
+      <w:r>
+        <w:t xml:space="preserve">All patrons are required to adhere to the code of conduct, respect library property, and ensure timely return of borrowed materials. All patrons are required to adhere to the code of conduct, respect library property, and ensure timely return of borrowed materials. All patrons are required to adhere to the code of conduct, respect library property, and ensure timely return of borrowed materials. All patrons are required to adhere to the code of conduct, respect library property, and ensure timely return of borrowed materials. All patrons are required to adhere to the code of conduct, respect library property, and ensure timely return of borrowed materials. All patrons are required to adhere to the code of conduct, respect library property, and ensure timely return of borrowed materials. All patrons are required to adhere to the code of conduct, respect library property, and ensure timely return of borrowed materials. All patrons are required to adhere to the code of conduct, respect library property, and ensure timely return of borrowed materials. </w:t>
+      </w:r>
+    </w:p>
+    <w:p>
+      <w:r>
+        <w:br w:type="page"/>
+      </w:r>
+    </w:p>
+    <w:p>
+      <w:pPr>
+        <w:pStyle w:val="Heading1"/>
+      </w:pPr>
+      <w:r>
+        <w:t>Section 66: Policy Guidelines</w:t>
+      </w:r>
+    </w:p>
+    <w:p>
+      <w:r>
+        <w:t xml:space="preserve">All patrons are required to adhere to the code of conduct, respect library property, and ensure timely return of borrowed materials. All patrons are required to adhere to the code of conduct, respect library property, and ensure timely return of borrowed materials. All patrons are required to adhere to the code of conduct, respect library property, and ensure timely return of borrowed materials. All patrons are required to adhere to the code of conduct, respect library property, and ensure timely return of borrowed materials. All patrons are required to adhere to the code of conduct, respect library property, and ensure timely return of borrowed materials. All patrons are required to adhere to the code of conduct, respect library property, and ensure timely return of borrowed materials. All patrons are required to adhere to the code of conduct, respect library property, and ensure timely return of borrowed materials. All patrons are required to adhere to the code of conduct, respect library property, and ensure timely return of borrowed materials. </w:t>
+      </w:r>
+    </w:p>
+    <w:p>
+      <w:r>
+        <w:t xml:space="preserve">All patrons are required to adhere to the code of conduct, respect library property, and ensure timely return of borrowed materials. All patrons are required to adhere to the code of conduct, respect library property, and ensure timely return of borrowed materials. All patrons are required to adhere to the code of conduct, respect library property, and ensure timely return of borrowed materials. All patrons are required to adhere to the code of conduct, respect library property, and ensure timely return of borrowed materials. All patrons are required to adhere to the code of conduct, respect library property, and ensure timely return of borrowed materials. All patrons are required to adhere to the code of conduct, respect library property, and ensure timely return of borrowed materials. All patrons are required to adhere to the code of conduct, respect library property, and ensure timely return of borrowed materials. All patrons are required to adhere to the code of conduct, respect library property, and ensure timely return of borrowed materials. </w:t>
+      </w:r>
+    </w:p>
+    <w:p>
+      <w:r>
+        <w:t xml:space="preserve">All patrons are required to adhere to the code of conduct, respect library property, and ensure timely return of borrowed materials. All patrons are required to adhere to the code of conduct, respect library property, and ensure timely return of borrowed materials. All patrons are required to adhere to the code of conduct, respect library property, and ensure timely return of borrowed materials. All patrons are required to adhere to the code of conduct, respect library property, and ensure timely return of borrowed materials. All patrons are required to adhere to the code of conduct, respect library property, and ensure timely return of borrowed materials. All patrons are required to adhere to the code of conduct, respect library property, and ensure timely return of borrowed materials. All patrons are required to adhere to the code of conduct, respect library property, and ensure timely return of borrowed materials. All patrons are required to adhere to the code of conduct, respect library property, and ensure timely return of borrowed materials. </w:t>
+      </w:r>
+    </w:p>
+    <w:p>
+      <w:r>
+        <w:br w:type="page"/>
+      </w:r>
+    </w:p>
+    <w:p>
+      <w:pPr>
+        <w:pStyle w:val="Heading1"/>
+      </w:pPr>
+      <w:r>
+        <w:t>Section 67: Policy Guidelines</w:t>
+      </w:r>
+    </w:p>
+    <w:p>
+      <w:r>
+        <w:t xml:space="preserve">All patrons are required to adhere to the code of conduct, respect library property, and ensure timely return of borrowed materials. All patrons are required to adhere to the code of conduct, respect library property, and ensure timely return of borrowed materials. All patrons are required to adhere to the code of conduct, respect library property, and ensure timely return of borrowed materials. All patrons are required to adhere to the code of conduct, respect library property, and ensure timely return of borrowed materials. All patrons are required to adhere to the code of conduct, respect library property, and ensure timely return of borrowed materials. All patrons are required to adhere to the code of conduct, respect library property, and ensure timely return of borrowed materials. All patrons are required to adhere to the code of conduct, respect library property, and ensure timely return of borrowed materials. All patrons are required to adhere to the code of conduct, respect library property, and ensure timely return of borrowed materials. </w:t>
+      </w:r>
+    </w:p>
+    <w:p>
+      <w:r>
+        <w:t xml:space="preserve">All patrons are required to adhere to the code of conduct, respect library property, and ensure timely return of borrowed materials. All patrons are required to adhere to the code of conduct, respect library property, and ensure timely return of borrowed materials. All patrons are required to adhere to the code of conduct, respect library property, and ensure timely return of borrowed materials. All patrons are required to adhere to the code of conduct, respect library property, and ensure timely return of borrowed materials. All patrons are required to adhere to the code of conduct, respect library property, and ensure timely return of borrowed materials. All patrons are required to adhere to the code of conduct, respect library property, and ensure timely return of borrowed materials. All patrons are required to adhere to the code of conduct, respect library property, and ensure timely return of borrowed materials. All patrons are required to adhere to the code of conduct, respect library property, and ensure timely return of borrowed materials. </w:t>
+      </w:r>
+    </w:p>
+    <w:p>
+      <w:r>
+        <w:t xml:space="preserve">All patrons are required to adhere to the code of conduct, respect library property, and ensure timely return of borrowed materials. All patrons are required to adhere to the code of conduct, respect library property, and ensure timely return of borrowed materials. All patrons are required to adhere to the code of conduct, respect library property, and ensure timely return of borrowed materials. All patrons are required to adhere to the code of conduct, respect library property, and ensure timely return of borrowed materials. All patrons are required to adhere to the code of conduct, respect library property, and ensure timely return of borrowed materials. All patrons are required to adhere to the code of conduct, respect library property, and ensure timely return of borrowed materials. All patrons are required to adhere to the code of conduct, respect library property, and ensure timely return of borrowed materials. All patrons are required to adhere to the code of conduct, respect library property, and ensure timely return of borrowed materials. </w:t>
+      </w:r>
+    </w:p>
+    <w:p>
+      <w:r>
+        <w:br w:type="page"/>
+      </w:r>
+    </w:p>
+    <w:p>
+      <w:pPr>
+        <w:pStyle w:val="Heading1"/>
+      </w:pPr>
+      <w:r>
+        <w:t>Section 68: Policy Guidelines</w:t>
+      </w:r>
+    </w:p>
+    <w:p>
+      <w:r>
+        <w:t xml:space="preserve">All patrons are required to adhere to the code of conduct, respect library property, and ensure timely return of borrowed materials. All patrons are required to adhere to the code of conduct, respect library property, and ensure timely return of borrowed materials. All patrons are required to adhere to the code of conduct, respect library property, and ensure timely return of borrowed materials. All patrons are required to adhere to the code of conduct, respect library property, and ensure timely return of borrowed materials. All patrons are required to adhere to the code of conduct, respect library property, and ensure timely return of borrowed materials. All patrons are required to adhere to the code of conduct, respect library property, and ensure timely return of borrowed materials. All patrons are required to adhere to the code of conduct, respect library property, and ensure timely return of borrowed materials. All patrons are required to adhere to the code of conduct, respect library property, and ensure timely return of borrowed materials. </w:t>
+      </w:r>
+    </w:p>
+    <w:p>
+      <w:r>
+        <w:t xml:space="preserve">All patrons are required to adhere to the code of conduct, respect library property, and ensure timely return of borrowed materials. All patrons are required to adhere to the code of conduct, respect library property, and ensure timely return of borrowed materials. All patrons are required to adhere to the code of conduct, respect library property, and ensure timely return of borrowed materials. All patrons are required to adhere to the code of conduct, respect library property, and ensure timely return of borrowed materials. All patrons are required to adhere to the code of conduct, respect library property, and ensure timely return of borrowed materials. All patrons are required to adhere to the code of conduct, respect library property, and ensure timely return of borrowed materials. All patrons are required to adhere to the code of conduct, respect library property, and ensure timely return of borrowed materials. All patrons are required to adhere to the code of conduct, respect library property, and ensure timely return of borrowed materials. </w:t>
+      </w:r>
+    </w:p>
+    <w:p>
+      <w:r>
+        <w:t xml:space="preserve">All patrons are required to adhere to the code of conduct, respect library property, and ensure timely return of borrowed materials. All patrons are required to adhere to the code of conduct, respect library property, and ensure timely return of borrowed materials. All patrons are required to adhere to the code of conduct, respect library property, and ensure timely return of borrowed materials. All patrons are required to adhere to the code of conduct, respect library property, and ensure timely return of borrowed materials. All patrons are required to adhere to the code of conduct, respect library property, and ensure timely return of borrowed materials. All patrons are required to adhere to the code of conduct, respect library property, and ensure timely return of borrowed materials. All patrons are required to adhere to the code of conduct, respect library property, and ensure timely return of borrowed materials. All patrons are required to adhere to the code of conduct, respect library property, and ensure timely return of borrowed materials. </w:t>
+      </w:r>
+    </w:p>
+    <w:p>
+      <w:r>
+        <w:br w:type="page"/>
+      </w:r>
+    </w:p>
+    <w:p>
+      <w:pPr>
+        <w:pStyle w:val="Heading1"/>
+      </w:pPr>
+      <w:r>
+        <w:t>Section 69: Policy Guidelines</w:t>
+      </w:r>
+    </w:p>
+    <w:p>
+      <w:r>
+        <w:t xml:space="preserve">All patrons are required to adhere to the code of conduct, respect library property, and ensure timely return of borrowed materials. All patrons are required to adhere to the code of conduct, respect library property, and ensure timely return of borrowed materials. All patrons are required to adhere to the code of conduct, respect library property, and ensure timely return of borrowed materials. All patrons are required to adhere to the code of conduct, respect library property, and ensure timely return of borrowed materials. All patrons are required to adhere to the code of conduct, respect library property, and ensure timely return of borrowed materials. All patrons are required to adhere to the code of conduct, respect library property, and ensure timely return of borrowed materials. All patrons are required to adhere to the code of conduct, respect library property, and ensure timely return of borrowed materials. All patrons are required to adhere to the code of conduct, respect library property, and ensure timely return of borrowed materials. </w:t>
+      </w:r>
+    </w:p>
+    <w:p>
+      <w:r>
+        <w:t xml:space="preserve">All patrons are required to adhere to the code of conduct, respect library property, and ensure timely return of borrowed materials. All patrons are required to adhere to the code of conduct, respect library property, and ensure timely return of borrowed materials. All patrons are required to adhere to the code of conduct, respect library property, and ensure timely return of borrowed materials. All patrons are required to adhere to the code of conduct, respect library property, and ensure timely return of borrowed materials. All patrons are required to adhere to the code of conduct, respect library property, and ensure timely return of borrowed materials. All patrons are required to adhere to the code of conduct, respect library property, and ensure timely return of borrowed materials. All patrons are required to adhere to the code of conduct, respect library property, and ensure timely return of borrowed materials. All patrons are required to adhere to the code of conduct, respect library property, and ensure timely return of borrowed materials. </w:t>
+      </w:r>
+    </w:p>
+    <w:p>
+      <w:r>
+        <w:t xml:space="preserve">All patrons are required to adhere to the code of conduct, respect library property, and ensure timely return of borrowed materials. All patrons are required to adhere to the code of conduct, respect library property, and ensure timely return of borrowed materials. All patrons are required to adhere to the code of conduct, respect library property, and ensure timely return of borrowed materials. All patrons are required to adhere to the code of conduct, respect library property, and ensure timely return of borrowed materials. All patrons are required to adhere to the code of conduct, respect library property, and ensure timely return of borrowed materials. All patrons are required to adhere to the code of conduct, respect library property, and ensure timely return of borrowed materials. All patrons are required to adhere to the code of conduct, respect library property, and ensure timely return of borrowed materials. All patrons are required to adhere to the code of conduct, respect library property, and ensure timely return of borrowed materials. </w:t>
+      </w:r>
+    </w:p>
+    <w:p>
+      <w:r>
+        <w:br w:type="page"/>
+      </w:r>
+    </w:p>
+    <w:p>
+      <w:pPr>
+        <w:pStyle w:val="Heading1"/>
+      </w:pPr>
+      <w:r>
+        <w:t>Section 70: Policy Guidelines</w:t>
+      </w:r>
+    </w:p>
+    <w:p>
+      <w:r>
+        <w:t xml:space="preserve">All patrons are required to adhere to the code of conduct, respect library property, and ensure timely return of borrowed materials. All patrons are required to adhere to the code of conduct, respect library property, and ensure timely return of borrowed materials. All patrons are required to adhere to the code of conduct, respect library property, and ensure timely return of borrowed materials. All patrons are required to adhere to the code of conduct, respect library property, and ensure timely return of borrowed materials. All patrons are required to adhere to the code of conduct, respect library property, and ensure timely return of borrowed materials. All patrons are required to adhere to the code of conduct, respect library property, and ensure timely return of borrowed materials. All patrons are required to adhere to the code of conduct, respect library property, and ensure timely return of borrowed materials. All patrons are required to adhere to the code of conduct, respect library property, and ensure timely return of borrowed materials. </w:t>
+      </w:r>
+    </w:p>
+    <w:p>
+      <w:r>
+        <w:t xml:space="preserve">All patrons are required to adhere to the code of conduct, respect library property, and ensure timely return of borrowed materials. All patrons are required to adhere to the code of conduct, respect library property, and ensure timely return of borrowed materials. All patrons are required to adhere to the code of conduct, respect library property, and ensure timely return of borrowed materials. All patrons are required to adhere to the code of conduct, respect library property, and ensure timely return of borrowed materials. All patrons are required to adhere to the code of conduct, respect library property, and ensure timely return of borrowed materials. All patrons are required to adhere to the code of conduct, respect library property, and ensure timely return of borrowed materials. All patrons are required to adhere to the code of conduct, respect library property, and ensure timely return of borrowed materials. All patrons are required to adhere to the code of conduct, respect library property, and ensure timely return of borrowed materials. </w:t>
+      </w:r>
+    </w:p>
+    <w:p>
+      <w:r>
+        <w:t xml:space="preserve">All patrons are required to adhere to the code of conduct, respect library property, and ensure timely return of borrowed materials. All patrons are required to adhere to the code of conduct, respect library property, and ensure timely return of borrowed materials. All patrons are required to adhere to the code of conduct, respect library property, and ensure timely return of borrowed materials. All patrons are required to adhere to the code of conduct, respect library property, and ensure timely return of borrowed materials. All patrons are required to adhere to the code of conduct, respect library property, and ensure timely return of borrowed materials. All patrons are required to adhere to the code of conduct, respect library property, and ensure timely return of borrowed materials. All patrons are required to adhere to the code of conduct, respect library property, and ensure timely return of borrowed materials. All patrons are required to adhere to the code of conduct, respect library property, and ensure timely return of borrowed materials. </w:t>
+      </w:r>
+    </w:p>
+    <w:p>
+      <w:r>
+        <w:br w:type="page"/>
+      </w:r>
+    </w:p>
+    <w:p>
+      <w:pPr>
+        <w:pStyle w:val="Heading1"/>
+      </w:pPr>
+      <w:r>
+        <w:t>Section 71: Policy Guidelines</w:t>
+      </w:r>
+    </w:p>
+    <w:p>
+      <w:r>
+        <w:t xml:space="preserve">All patrons are required to adhere to the code of conduct, respect library property, and ensure timely return of borrowed materials. All patrons are required to adhere to the code of conduct, respect library property, and ensure timely return of borrowed materials. All patrons are required to adhere to the code of conduct, respect library property, and ensure timely return of borrowed materials. All patrons are required to adhere to the code of conduct, respect library property, and ensure timely return of borrowed materials. All patrons are required to adhere to the code of conduct, respect library property, and ensure timely return of borrowed materials. All patrons are required to adhere to the code of conduct, respect library property, and ensure timely return of borrowed materials. All patrons are required to adhere to the code of conduct, respect library property, and ensure timely return of borrowed materials. All patrons are required to adhere to the code of conduct, respect library property, and ensure timely return of borrowed materials. </w:t>
+      </w:r>
+    </w:p>
+    <w:p>
+      <w:r>
+        <w:t xml:space="preserve">All patrons are required to adhere to the code of conduct, respect library property, and ensure timely return of borrowed materials. All patrons are required to adhere to the code of conduct, respect library property, and ensure timely return of borrowed materials. All patrons are required to adhere to the code of conduct, respect library property, and ensure timely return of borrowed materials. All patrons are required to adhere to the code of conduct, respect library property, and ensure timely return of borrowed materials. All patrons are required to adhere to the code of conduct, respect library property, and ensure timely return of borrowed materials. All patrons are required to adhere to the code of conduct, respect library property, and ensure timely return of borrowed materials. All patrons are required to adhere to the code of conduct, respect library property, and ensure timely return of borrowed materials. All patrons are required to adhere to the code of conduct, respect library property, and ensure timely return of borrowed materials. </w:t>
+      </w:r>
+    </w:p>
+    <w:p>
+      <w:r>
+        <w:t xml:space="preserve">All patrons are required to adhere to the code of conduct, respect library property, and ensure timely return of borrowed materials. All patrons are required to adhere to the code of conduct, respect library property, and ensure timely return of borrowed materials. All patrons are required to adhere to the code of conduct, respect library property, and ensure timely return of borrowed materials. All patrons are required to adhere to the code of conduct, respect library property, and ensure timely return of borrowed materials. All patrons are required to adhere to the code of conduct, respect library property, and ensure timely return of borrowed materials. All patrons are required to adhere to the code of conduct, respect library property, and ensure timely return of borrowed materials. All patrons are required to adhere to the code of conduct, respect library property, and ensure timely return of borrowed materials. All patrons are required to adhere to the code of conduct, respect library property, and ensure timely return of borrowed materials. </w:t>
+      </w:r>
+    </w:p>
+    <w:p>
+      <w:r>
+        <w:br w:type="page"/>
+      </w:r>
+    </w:p>
+    <w:p>
+      <w:pPr>
+        <w:pStyle w:val="Heading1"/>
+      </w:pPr>
+      <w:r>
+        <w:t>Section 72: Policy Guidelines</w:t>
+      </w:r>
+    </w:p>
+    <w:p>
+      <w:r>
+        <w:t xml:space="preserve">All patrons are required to adhere to the code of conduct, respect library property, and ensure timely return of borrowed materials. All patrons are required to adhere to the code of conduct, respect library property, and ensure timely return of borrowed materials. All patrons are required to adhere to the code of conduct, respect library property, and ensure timely return of borrowed materials. All patrons are required to adhere to the code of conduct, respect library property, and ensure timely return of borrowed materials. All patrons are required to adhere to the code of conduct, respect library property, and ensure timely return of borrowed materials. All patrons are required to adhere to the code of conduct, respect library property, and ensure timely return of borrowed materials. All patrons are required to adhere to the code of conduct, respect library property, and ensure timely return of borrowed materials. All patrons are required to adhere to the code of conduct, respect library property, and ensure timely return of borrowed materials. </w:t>
+      </w:r>
+    </w:p>
+    <w:p>
+      <w:r>
+        <w:t xml:space="preserve">All patrons are required to adhere to the code of conduct, respect library property, and ensure timely return of borrowed materials. All patrons are required to adhere to the code of conduct, respect library property, and ensure timely return of borrowed materials. All patrons are required to adhere to the code of conduct, respect library property, and ensure timely return of borrowed materials. All patrons are required to adhere to the code of conduct, respect library property, and ensure timely return of borrowed materials. All patrons are required to adhere to the code of conduct, respect library property, and ensure timely return of borrowed materials. All patrons are required to adhere to the code of conduct, respect library property, and ensure timely return of borrowed materials. All patrons are required to adhere to the code of conduct, respect library property, and ensure timely return of borrowed materials. All patrons are required to adhere to the code of conduct, respect library property, and ensure timely return of borrowed materials. </w:t>
+      </w:r>
+    </w:p>
+    <w:p>
+      <w:r>
+        <w:t xml:space="preserve">All patrons are required to adhere to the code of conduct, respect library property, and ensure timely return of borrowed materials. All patrons are required to adhere to the code of conduct, respect library property, and ensure timely return of borrowed materials. All patrons are required to adhere to the code of conduct, respect library property, and ensure timely return of borrowed materials. All patrons are required to adhere to the code of conduct, respect library property, and ensure timely return of borrowed materials. All patrons are required to adhere to the code of conduct, respect library property, and ensure timely return of borrowed materials. All patrons are required to adhere to the code of conduct, respect library property, and ensure timely return of borrowed materials. All patrons are required to adhere to the code of conduct, respect library property, and ensure timely return of borrowed materials. All patrons are required to adhere to the code of conduct, respect library property, and ensure timely return of borrowed materials. </w:t>
+      </w:r>
+    </w:p>
+    <w:p>
+      <w:r>
+        <w:br w:type="page"/>
+      </w:r>
+    </w:p>
+    <w:p>
+      <w:pPr>
+        <w:pStyle w:val="Heading1"/>
+      </w:pPr>
+      <w:r>
+        <w:t>Section 73: Policy Guidelines</w:t>
+      </w:r>
+    </w:p>
+    <w:p>
+      <w:r>
+        <w:t xml:space="preserve">All patrons are required to adhere to the code of conduct, respect library property, and ensure timely return of borrowed materials. All patrons are required to adhere to the code of conduct, respect library property, and ensure timely return of borrowed materials. All patrons are required to adhere to the code of conduct, respect library property, and ensure timely return of borrowed materials. All patrons are required to adhere to the code of conduct, respect library property, and ensure timely return of borrowed materials. All patrons are required to adhere to the code of conduct, respect library property, and ensure timely return of borrowed materials. All patrons are required to adhere to the code of conduct, respect library property, and ensure timely return of borrowed materials. All patrons are required to adhere to the code of conduct, respect library property, and ensure timely return of borrowed materials. All patrons are required to adhere to the code of conduct, respect library property, and ensure timely return of borrowed materials. </w:t>
+      </w:r>
+    </w:p>
+    <w:p>
+      <w:r>
+        <w:t xml:space="preserve">All patrons are required to adhere to the code of conduct, respect library property, and ensure timely return of borrowed materials. All patrons are required to adhere to the code of conduct, respect library property, and ensure timely return of borrowed materials. All patrons are required to adhere to the code of conduct, respect library property, and ensure timely return of borrowed materials. All patrons are required to adhere to the code of conduct, respect library property, and ensure timely return of borrowed materials. All patrons are required to adhere to the code of conduct, respect library property, and ensure timely return of borrowed materials. All patrons are required to adhere to the code of conduct, respect library property, and ensure timely return of borrowed materials. All patrons are required to adhere to the code of conduct, respect library property, and ensure timely return of borrowed materials. All patrons are required to adhere to the code of conduct, respect library property, and ensure timely return of borrowed materials. </w:t>
+      </w:r>
+    </w:p>
+    <w:p>
+      <w:r>
+        <w:t xml:space="preserve">All patrons are required to adhere to the code of conduct, respect library property, and ensure timely return of borrowed materials. All patrons are required to adhere to the code of conduct, respect library property, and ensure timely return of borrowed materials. All patrons are required to adhere to the code of conduct, respect library property, and ensure timely return of borrowed materials. All patrons are required to adhere to the code of conduct, respect library property, and ensure timely return of borrowed materials. All patrons are required to adhere to the code of conduct, respect library property, and ensure timely return of borrowed materials. All patrons are required to adhere to the code of conduct, respect library property, and ensure timely return of borrowed materials. All patrons are required to adhere to the code of conduct, respect library property, and ensure timely return of borrowed materials. All patrons are required to adhere to the code of conduct, respect library property, and ensure timely return of borrowed materials. </w:t>
+      </w:r>
+    </w:p>
+    <w:p>
+      <w:r>
+        <w:br w:type="page"/>
+      </w:r>
+    </w:p>
+    <w:p>
+      <w:pPr>
+        <w:pStyle w:val="Heading1"/>
+      </w:pPr>
+      <w:r>
+        <w:t>Section 74: Policy Guidelines</w:t>
+      </w:r>
+    </w:p>
+    <w:p>
+      <w:r>
+        <w:t xml:space="preserve">All patrons are required to adhere to the code of conduct, respect library property, and ensure timely return of borrowed materials. All patrons are required to adhere to the code of conduct, respect library property, and ensure timely return of borrowed materials. All patrons are required to adhere to the code of conduct, respect library property, and ensure timely return of borrowed materials. All patrons are required to adhere to the code of conduct, respect library property, and ensure timely return of borrowed materials. All patrons are required to adhere to the code of conduct, respect library property, and ensure timely return of borrowed materials. All patrons are required to adhere to the code of conduct, respect library property, and ensure timely return of borrowed materials. All patrons are required to adhere to the code of conduct, respect library property, and ensure timely return of borrowed materials. All patrons are required to adhere to the code of conduct, respect library property, and ensure timely return of borrowed materials. </w:t>
+      </w:r>
+    </w:p>
+    <w:p>
+      <w:r>
+        <w:t xml:space="preserve">All patrons are required to adhere to the code of conduct, respect library property, and ensure timely return of borrowed materials. All patrons are required to adhere to the code of conduct, respect library property, and ensure timely return of borrowed materials. All patrons are required to adhere to the code of conduct, respect library property, and ensure timely return of borrowed materials. All patrons are required to adhere to the code of conduct, respect library property, and ensure timely return of borrowed materials. All patrons are required to adhere to the code of conduct, respect library property, and ensure timely return of borrowed materials. All patrons are required to adhere to the code of conduct, respect library property, and ensure timely return of borrowed materials. All patrons are required to adhere to the code of conduct, respect library property, and ensure timely return of borrowed materials. All patrons are required to adhere to the code of conduct, respect library property, and ensure timely return of borrowed materials. </w:t>
+      </w:r>
+    </w:p>
+    <w:p>
+      <w:r>
+        <w:t xml:space="preserve">All patrons are required to adhere to the code of conduct, respect library property, and ensure timely return of borrowed materials. All patrons are required to adhere to the code of conduct, respect library property, and ensure timely return of borrowed materials. All patrons are required to adhere to the code of conduct, respect library property, and ensure timely return of borrowed materials. All patrons are required to adhere to the code of conduct, respect library property, and ensure timely return of borrowed materials. All patrons are required to adhere to the code of conduct, respect library property, and ensure timely return of borrowed materials. All patrons are required to adhere to the code of conduct, respect library property, and ensure timely return of borrowed materials. All patrons are required to adhere to the code of conduct, respect library property, and ensure timely return of borrowed materials. All patrons are required to adhere to the code of conduct, respect library property, and ensure timely return of borrowed materials. </w:t>
+      </w:r>
+    </w:p>
+    <w:p>
+      <w:r>
+        <w:br w:type="page"/>
+      </w:r>
+    </w:p>
+    <w:p>
+      <w:pPr>
+        <w:pStyle w:val="Heading1"/>
+      </w:pPr>
+      <w:r>
+        <w:t>Section 75: Policy Guidelines</w:t>
+      </w:r>
+    </w:p>
+    <w:p>
+      <w:r>
+        <w:t xml:space="preserve">All patrons are required to adhere to the code of conduct, respect library property, and ensure timely return of borrowed materials. All patrons are required to adhere to the code of conduct, respect library property, and ensure timely return of borrowed materials. All patrons are required to adhere to the code of conduct, respect library property, and ensure timely return of borrowed materials. All patrons are required to adhere to the code of conduct, respect library property, and ensure timely return of borrowed materials. All patrons are required to adhere to the code of conduct, respect library property, and ensure timely return of borrowed materials. All patrons are required to adhere to the code of conduct, respect library property, and ensure timely return of borrowed materials. All patrons are required to adhere to the code of conduct, respect library property, and ensure timely return of borrowed materials. All patrons are required to adhere to the code of conduct, respect library property, and ensure timely return of borrowed materials. </w:t>
+      </w:r>
+    </w:p>
+    <w:p>
+      <w:r>
+        <w:t xml:space="preserve">All patrons are required to adhere to the code of conduct, respect library property, and ensure timely return of borrowed materials. All patrons are required to adhere to the code of conduct, respect library property, and ensure timely return of borrowed materials. All patrons are required to adhere to the code of conduct, respect library property, and ensure timely return of borrowed materials. All patrons are required to adhere to the code of conduct, respect library property, and ensure timely return of borrowed materials. All patrons are required to adhere to the code of conduct, respect library property, and ensure timely return of borrowed materials. All patrons are required to adhere to the code of conduct, respect library property, and ensure timely return of borrowed materials. All patrons are required to adhere to the code of conduct, respect library property, and ensure timely return of borrowed materials. All patrons are required to adhere to the code of conduct, respect library property, and ensure timely return of borrowed materials. </w:t>
+      </w:r>
+    </w:p>
+    <w:p>
+      <w:r>
+        <w:t xml:space="preserve">All patrons are required to adhere to the code of conduct, respect library property, and ensure timely return of borrowed materials. All patrons are required to adhere to the code of conduct, respect library property, and ensure timely return of borrowed materials. All patrons are required to adhere to the code of conduct, respect library property, and ensure timely return of borrowed materials. All patrons are required to adhere to the code of conduct, respect library property, and ensure timely return of borrowed materials. All patrons are required to adhere to the code of conduct, respect library property, and ensure timely return of borrowed materials. All patrons are required to adhere to the code of conduct, respect library property, and ensure timely return of borrowed materials. All patrons are required to adhere to the code of conduct, respect library property, and ensure timely return of borrowed materials. All patrons are required to adhere to the code of conduct, respect library property, and ensure timely return of borrowed materials. </w:t>
+      </w:r>
+    </w:p>
+    <w:p>
+      <w:r>
+        <w:br w:type="page"/>
+      </w:r>
+    </w:p>
+    <w:p>
+      <w:pPr>
+        <w:pStyle w:val="Heading1"/>
+      </w:pPr>
+      <w:r>
+        <w:t>Section 76: Policy Guidelines</w:t>
+      </w:r>
+    </w:p>
+    <w:p>
+      <w:r>
+        <w:t xml:space="preserve">All patrons are required to adhere to the code of conduct, respect library property, and ensure timely return of borrowed materials. All patrons are required to adhere to the code of conduct, respect library property, and ensure timely return of borrowed materials. All patrons are required to adhere to the code of conduct, respect library property, and ensure timely return of borrowed materials. All patrons are required to adhere to the code of conduct, respect library property, and ensure timely return of borrowed materials. All patrons are required to adhere to the code of conduct, respect library property, and ensure timely return of borrowed materials. All patrons are required to adhere to the code of conduct, respect library property, and ensure timely return of borrowed materials. All patrons are required to adhere to the code of conduct, respect library property, and ensure timely return of borrowed materials. All patrons are required to adhere to the code of conduct, respect library property, and ensure timely return of borrowed materials. </w:t>
+      </w:r>
+    </w:p>
+    <w:p>
+      <w:r>
+        <w:t xml:space="preserve">All patrons are required to adhere to the code of conduct, respect library property, and ensure timely return of borrowed materials. All patrons are required to adhere to the code of conduct, respect library property, and ensure timely return of borrowed materials. All patrons are required to adhere to the code of conduct, respect library property, and ensure timely return of borrowed materials. All patrons are required to adhere to the code of conduct, respect library property, and ensure timely return of borrowed materials. All patrons are required to adhere to the code of conduct, respect library property, and ensure timely return of borrowed materials. All patrons are required to adhere to the code of conduct, respect library property, and ensure timely return of borrowed materials. All patrons are required to adhere to the code of conduct, respect library property, and ensure timely return of borrowed materials. All patrons are required to adhere to the code of conduct, respect library property, and ensure timely return of borrowed materials. </w:t>
+      </w:r>
+    </w:p>
+    <w:p>
+      <w:r>
+        <w:t xml:space="preserve">All patrons are required to adhere to the code of conduct, respect library property, and ensure timely return of borrowed materials. All patrons are required to adhere to the code of conduct, respect library property, and ensure timely return of borrowed materials. All patrons are required to adhere to the code of conduct, respect library property, and ensure timely return of borrowed materials. All patrons are required to adhere to the code of conduct, respect library property, and ensure timely return of borrowed materials. All patrons are required to adhere to the code of conduct, respect library property, and ensure timely return of borrowed materials. All patrons are required to adhere to the code of conduct, respect library property, and ensure timely return of borrowed materials. All patrons are required to adhere to the code of conduct, respect library property, and ensure timely return of borrowed materials. All patrons are required to adhere to the code of conduct, respect library property, and ensure timely return of borrowed materials. </w:t>
+      </w:r>
+    </w:p>
+    <w:p>
+      <w:r>
+        <w:br w:type="page"/>
+      </w:r>
+    </w:p>
+    <w:p>
+      <w:pPr>
+        <w:pStyle w:val="Heading1"/>
+      </w:pPr>
+      <w:r>
+        <w:t>Section 77: Policy Guidelines</w:t>
+      </w:r>
+    </w:p>
+    <w:p>
+      <w:r>
+        <w:t xml:space="preserve">All patrons are required to adhere to the code of conduct, respect library property, and ensure timely return of borrowed materials. All patrons are required to adhere to the code of conduct, respect library property, and ensure timely return of borrowed materials. All patrons are required to adhere to the code of conduct, respect library property, and ensure timely return of borrowed materials. All patrons are required to adhere to the code of conduct, respect library property, and ensure timely return of borrowed materials. All patrons are required to adhere to the code of conduct, respect library property, and ensure timely return of borrowed materials. All patrons are required to adhere to the code of conduct, respect library property, and ensure timely return of borrowed materials. All patrons are required to adhere to the code of conduct, respect library property, and ensure timely return of borrowed materials. All patrons are required to adhere to the code of conduct, respect library property, and ensure timely return of borrowed materials. </w:t>
+      </w:r>
+    </w:p>
+    <w:p>
+      <w:r>
+        <w:t xml:space="preserve">All patrons are required to adhere to the code of conduct, respect library property, and ensure timely return of borrowed materials. All patrons are required to adhere to the code of conduct, respect library property, and ensure timely return of borrowed materials. All patrons are required to adhere to the code of conduct, respect library property, and ensure timely return of borrowed materials. All patrons are required to adhere to the code of conduct, respect library property, and ensure timely return of borrowed materials. All patrons are required to adhere to the code of conduct, respect library property, and ensure timely return of borrowed materials. All patrons are required to adhere to the code of conduct, respect library property, and ensure timely return of borrowed materials. All patrons are required to adhere to the code of conduct, respect library property, and ensure timely return of borrowed materials. All patrons are required to adhere to the code of conduct, respect library property, and ensure timely return of borrowed materials. </w:t>
+      </w:r>
+    </w:p>
+    <w:p>
+      <w:r>
+        <w:t xml:space="preserve">All patrons are required to adhere to the code of conduct, respect library property, and ensure timely return of borrowed materials. All patrons are required to adhere to the code of conduct, respect library property, and ensure timely return of borrowed materials. All patrons are required to adhere to the code of conduct, respect library property, and ensure timely return of borrowed materials. All patrons are required to adhere to the code of conduct, respect library property, and ensure timely return of borrowed materials. All patrons are required to adhere to the code of conduct, respect library property, and ensure timely return of borrowed materials. All patrons are required to adhere to the code of conduct, respect library property, and ensure timely return of borrowed materials. All patrons are required to adhere to the code of conduct, respect library property, and ensure timely return of borrowed materials. All patrons are required to adhere to the code of conduct, respect library property, and ensure timely return of borrowed materials. </w:t>
+      </w:r>
+    </w:p>
+    <w:p>
+      <w:r>
+        <w:br w:type="page"/>
+      </w:r>
+    </w:p>
+    <w:p>
+      <w:pPr>
+        <w:pStyle w:val="Heading1"/>
+      </w:pPr>
+      <w:r>
+        <w:t>Section 78: Policy Guidelines</w:t>
+      </w:r>
+    </w:p>
+    <w:p>
+      <w:r>
+        <w:t xml:space="preserve">All patrons are required to adhere to the code of conduct, respect library property, and ensure timely return of borrowed materials. All patrons are required to adhere to the code of conduct, respect library property, and ensure timely return of borrowed materials. All patrons are required to adhere to the code of conduct, respect library property, and ensure timely return of borrowed materials. All patrons are required to adhere to the code of conduct, respect library property, and ensure timely return of borrowed materials. All patrons are required to adhere to the code of conduct, respect library property, and ensure timely return of borrowed materials. All patrons are required to adhere to the code of conduct, respect library property, and ensure timely return of borrowed materials. All patrons are required to adhere to the code of conduct, respect library property, and ensure timely return of borrowed materials. All patrons are required to adhere to the code of conduct, respect library property, and ensure timely return of borrowed materials. </w:t>
+      </w:r>
+    </w:p>
+    <w:p>
+      <w:r>
+        <w:t xml:space="preserve">All patrons are required to adhere to the code of conduct, respect library property, and ensure timely return of borrowed materials. All patrons are required to adhere to the code of conduct, respect library property, and ensure timely return of borrowed materials. All patrons are required to adhere to the code of conduct, respect library property, and ensure timely return of borrowed materials. All patrons are required to adhere to the code of conduct, respect library property, and ensure timely return of borrowed materials. All patrons are required to adhere to the code of conduct, respect library property, and ensure timely return of borrowed materials. All patrons are required to adhere to the code of conduct, respect library property, and ensure timely return of borrowed materials. All patrons are required to adhere to the code of conduct, respect library property, and ensure timely return of borrowed materials. All patrons are required to adhere to the code of conduct, respect library property, and ensure timely return of borrowed materials. </w:t>
+      </w:r>
+    </w:p>
+    <w:p>
+      <w:r>
+        <w:t xml:space="preserve">All patrons are required to adhere to the code of conduct, respect library property, and ensure timely return of borrowed materials. All patrons are required to adhere to the code of conduct, respect library property, and ensure timely return of borrowed materials. All patrons are required to adhere to the code of conduct, respect library property, and ensure timely return of borrowed materials. All patrons are required to adhere to the code of conduct, respect library property, and ensure timely return of borrowed materials. All patrons are required to adhere to the code of conduct, respect library property, and ensure timely return of borrowed materials. All patrons are required to adhere to the code of conduct, respect library property, and ensure timely return of borrowed materials. All patrons are required to adhere to the code of conduct, respect library property, and ensure timely return of borrowed materials. All patrons are required to adhere to the code of conduct, respect library property, and ensure timely return of borrowed materials. </w:t>
+      </w:r>
+    </w:p>
+    <w:p>
+      <w:r>
+        <w:br w:type="page"/>
+      </w:r>
+    </w:p>
+    <w:p>
+      <w:pPr>
+        <w:pStyle w:val="Heading1"/>
+      </w:pPr>
+      <w:r>
+        <w:t>Section 79: Policy Guidelines</w:t>
+      </w:r>
+    </w:p>
+    <w:p>
+      <w:r>
+        <w:t xml:space="preserve">All patrons are required to adhere to the code of conduct, respect library property, and ensure timely return of borrowed materials. All patrons are required to adhere to the code of conduct, respect library property, and ensure timely return of borrowed materials. All patrons are required to adhere to the code of conduct, respect library property, and ensure timely return of borrowed materials. All patrons are required to adhere to the code of conduct, respect library property, and ensure timely return of borrowed materials. All patrons are required to adhere to the code of conduct, respect library property, and ensure timely return of borrowed materials. All patrons are required to adhere to the code of conduct, respect library property, and ensure timely return of borrowed materials. All patrons are required to adhere to the code of conduct, respect library property, and ensure timely return of borrowed materials. All patrons are required to adhere to the code of conduct, respect library property, and ensure timely return of borrowed materials. </w:t>
+      </w:r>
+    </w:p>
+    <w:p>
+      <w:r>
+        <w:t xml:space="preserve">All patrons are required to adhere to the code of conduct, respect library property, and ensure timely return of borrowed materials. All patrons are required to adhere to the code of conduct, respect library property, and ensure timely return of borrowed materials. All patrons are required to adhere to the code of conduct, respect library property, and ensure timely return of borrowed materials. All patrons are required to adhere to the code of conduct, respect library property, and ensure timely return of borrowed materials. All patrons are required to adhere to the code of conduct, respect library property, and ensure timely return of borrowed materials. All patrons are required to adhere to the code of conduct, respect library property, and ensure timely return of borrowed materials. All patrons are required to adhere to the code of conduct, respect library property, and ensure timely return of borrowed materials. All patrons are required to adhere to the code of conduct, respect library property, and ensure timely return of borrowed materials. </w:t>
+      </w:r>
+    </w:p>
+    <w:p>
+      <w:r>
+        <w:t xml:space="preserve">All patrons are required to adhere to the code of conduct, respect library property, and ensure timely return of borrowed materials. All patrons are required to adhere to the code of conduct, respect library property, and ensure timely return of borrowed materials. All patrons are required to adhere to the code of conduct, respect library property, and ensure timely return of borrowed materials. All patrons are required to adhere to the code of conduct, respect library property, and ensure timely return of borrowed materials. All patrons are required to adhere to the code of conduct, respect library property, and ensure timely return of borrowed materials. All patrons are required to adhere to the code of conduct, respect library property, and ensure timely return of borrowed materials. All patrons are required to adhere to the code of conduct, respect library property, and ensure timely return of borrowed materials. All patrons are required to adhere to the code of conduct, respect library property, and ensure timely return of borrowed materials. </w:t>
+      </w:r>
+    </w:p>
+    <w:p>
+      <w:r>
+        <w:br w:type="page"/>
+      </w:r>
+    </w:p>
+    <w:p>
+      <w:pPr>
+        <w:pStyle w:val="Heading1"/>
+      </w:pPr>
+      <w:r>
+        <w:t>Section 80: Policy Guidelines</w:t>
+      </w:r>
+    </w:p>
+    <w:p>
+      <w:r>
+        <w:t xml:space="preserve">All patrons are required to adhere to the code of conduct, respect library property, and ensure timely return of borrowed materials. All patrons are required to adhere to the code of conduct, respect library property, and ensure timely return of borrowed materials. All patrons are required to adhere to the code of conduct, respect library property, and ensure timely return of borrowed materials. All patrons are required to adhere to the code of conduct, respect library property, and ensure timely return of borrowed materials. All patrons are required to adhere to the code of conduct, respect library property, and ensure timely return of borrowed materials. All patrons are required to adhere to the code of conduct, respect library property, and ensure timely return of borrowed materials. All patrons are required to adhere to the code of conduct, respect library property, and ensure timely return of borrowed materials. All patrons are required to adhere to the code of conduct, respect library property, and ensure timely return of borrowed materials. </w:t>
+      </w:r>
+    </w:p>
+    <w:p>
+      <w:r>
+        <w:t xml:space="preserve">All patrons are required to adhere to the code of conduct, respect library property, and ensure timely return of borrowed materials. All patrons are required to adhere to the code of conduct, respect library property, and ensure timely return of borrowed materials. All patrons are required to adhere to the code of conduct, respect library property, and ensure timely return of borrowed materials. All patrons are required to adhere to the code of conduct, respect library property, and ensure timely return of borrowed materials. All patrons are required to adhere to the code of conduct, respect library property, and ensure timely return of borrowed materials. All patrons are required to adhere to the code of conduct, respect library property, and ensure timely return of borrowed materials. All patrons are required to adhere to the code of conduct, respect library property, and ensure timely return of borrowed materials. All patrons are required to adhere to the code of conduct, respect library property, and ensure timely return of borrowed materials. </w:t>
+      </w:r>
+    </w:p>
+    <w:p>
+      <w:r>
+        <w:t xml:space="preserve">All patrons are required to adhere to the code of conduct, respect library property, and ensure timely return of borrowed materials. All patrons are required to adhere to the code of conduct, respect library property, and ensure timely return of borrowed materials. All patrons are required to adhere to the code of conduct, respect library property, and ensure timely return of borrowed materials. All patrons are required to adhere to the code of conduct, respect library property, and ensure timely return of borrowed materials. All patrons are required to adhere to the code of conduct, respect library property, and ensure timely return of borrowed materials. All patrons are required to adhere to the code of conduct, respect library property, and ensure timely return of borrowed materials. All patrons are required to adhere to the code of conduct, respect library property, and ensure timely return of borrowed materials. All patrons are required to adhere to the code of conduct, respect library property, and ensure timely return of borrowed materials. </w:t>
+      </w:r>
+    </w:p>
+    <w:p>
+      <w:r>
+        <w:br w:type="page"/>
+      </w:r>
+    </w:p>
+    <w:p>
+      <w:pPr>
+        <w:pStyle w:val="Heading1"/>
+      </w:pPr>
+      <w:r>
+        <w:t>Section 81: Policy Guidelines</w:t>
+      </w:r>
+    </w:p>
+    <w:p>
+      <w:r>
+        <w:t xml:space="preserve">All patrons are required to adhere to the code of conduct, respect library property, and ensure timely return of borrowed materials. All patrons are required to adhere to the code of conduct, respect library property, and ensure timely return of borrowed materials. All patrons are required to adhere to the code of conduct, respect library property, and ensure timely return of borrowed materials. All patrons are required to adhere to the code of conduct, respect library property, and ensure timely return of borrowed materials. All patrons are required to adhere to the code of conduct, respect library property, and ensure timely return of borrowed materials. All patrons are required to adhere to the code of conduct, respect library property, and ensure timely return of borrowed materials. All patrons are required to adhere to the code of conduct, respect library property, and ensure timely return of borrowed materials. All patrons are required to adhere to the code of conduct, respect library property, and ensure timely return of borrowed materials. </w:t>
+      </w:r>
+    </w:p>
+    <w:p>
+      <w:r>
+        <w:t xml:space="preserve">All patrons are required to adhere to the code of conduct, respect library property, and ensure timely return of borrowed materials. All patrons are required to adhere to the code of conduct, respect library property, and ensure timely return of borrowed materials. All patrons are required to adhere to the code of conduct, respect library property, and ensure timely return of borrowed materials. All patrons are required to adhere to the code of conduct, respect library property, and ensure timely return of borrowed materials. All patrons are required to adhere to the code of conduct, respect library property, and ensure timely return of borrowed materials. All patrons are required to adhere to the code of conduct, respect library property, and ensure timely return of borrowed materials. All patrons are required to adhere to the code of conduct, respect library property, and ensure timely return of borrowed materials. All patrons are required to adhere to the code of conduct, respect library property, and ensure timely return of borrowed materials. </w:t>
+      </w:r>
+    </w:p>
+    <w:p>
+      <w:r>
+        <w:t xml:space="preserve">All patrons are required to adhere to the code of conduct, respect library property, and ensure timely return of borrowed materials. All patrons are required to adhere to the code of conduct, respect library property, and ensure timely return of borrowed materials. All patrons are required to adhere to the code of conduct, respect library property, and ensure timely return of borrowed materials. All patrons are required to adhere to the code of conduct, respect library property, and ensure timely return of borrowed materials. All patrons are required to adhere to the code of conduct, respect library property, and ensure timely return of borrowed materials. All patrons are required to adhere to the code of conduct, respect library property, and ensure timely return of borrowed materials. All patrons are required to adhere to the code of conduct, respect library property, and ensure timely return of borrowed materials. All patrons are required to adhere to the code of conduct, respect library property, and ensure timely return of borrowed materials. </w:t>
+      </w:r>
+    </w:p>
+    <w:p>
+      <w:r>
+        <w:br w:type="page"/>
+      </w:r>
+    </w:p>
+    <w:p>
+      <w:pPr>
+        <w:pStyle w:val="Heading1"/>
+      </w:pPr>
+      <w:r>
+        <w:t>Section 82: Policy Guidelines</w:t>
+      </w:r>
+    </w:p>
+    <w:p>
+      <w:r>
+        <w:t xml:space="preserve">All patrons are required to adhere to the code of conduct, respect library property, and ensure timely return of borrowed materials. All patrons are required to adhere to the code of conduct, respect library property, and ensure timely return of borrowed materials. All patrons are required to adhere to the code of conduct, respect library property, and ensure timely return of borrowed materials. All patrons are required to adhere to the code of conduct, respect library property, and ensure timely return of borrowed materials. All patrons are required to adhere to the code of conduct, respect library property, and ensure timely return of borrowed materials. All patrons are required to adhere to the code of conduct, respect library property, and ensure timely return of borrowed materials. All patrons are required to adhere to the code of conduct, respect library property, and ensure timely return of borrowed materials. All patrons are required to adhere to the code of conduct, respect library property, and ensure timely return of borrowed materials. </w:t>
+      </w:r>
+    </w:p>
+    <w:p>
+      <w:r>
+        <w:t xml:space="preserve">All patrons are required to adhere to the code of conduct, respect library property, and ensure timely return of borrowed materials. All patrons are required to adhere to the code of conduct, respect library property, and ensure timely return of borrowed materials. All patrons are required to adhere to the code of conduct, respect library property, and ensure timely return of borrowed materials. All patrons are required to adhere to the code of conduct, respect library property, and ensure timely return of borrowed materials. All patrons are required to adhere to the code of conduct, respect library property, and ensure timely return of borrowed materials. All patrons are required to adhere to the code of conduct, respect library property, and ensure timely return of borrowed materials. All patrons are required to adhere to the code of conduct, respect library property, and ensure timely return of borrowed materials. All patrons are required to adhere to the code of conduct, respect library property, and ensure timely return of borrowed materials. </w:t>
+      </w:r>
+    </w:p>
+    <w:p>
+      <w:r>
+        <w:t xml:space="preserve">All patrons are required to adhere to the code of conduct, respect library property, and ensure timely return of borrowed materials. All patrons are required to adhere to the code of conduct, respect library property, and ensure timely return of borrowed materials. All patrons are required to adhere to the code of conduct, respect library property, and ensure timely return of borrowed materials. All patrons are required to adhere to the code of conduct, respect library property, and ensure timely return of borrowed materials. All patrons are required to adhere to the code of conduct, respect library property, and ensure timely return of borrowed materials. All patrons are required to adhere to the code of conduct, respect library property, and ensure timely return of borrowed materials. All patrons are required to adhere to the code of conduct, respect library property, and ensure timely return of borrowed materials. All patrons are required to adhere to the code of conduct, respect library property, and ensure timely return of borrowed materials. </w:t>
+      </w:r>
+    </w:p>
+    <w:p>
+      <w:r>
+        <w:br w:type="page"/>
+      </w:r>
+    </w:p>
+    <w:p>
+      <w:pPr>
+        <w:pStyle w:val="Heading1"/>
+      </w:pPr>
+      <w:r>
+        <w:t>Section 83: Policy Guidelines</w:t>
+      </w:r>
+    </w:p>
+    <w:p>
+      <w:r>
+        <w:t xml:space="preserve">All patrons are required to adhere to the code of conduct, respect library property, and ensure timely return of borrowed materials. All patrons are required to adhere to the code of conduct, respect library property, and ensure timely return of borrowed materials. All patrons are required to adhere to the code of conduct, respect library property, and ensure timely return of borrowed materials. All patrons are required to adhere to the code of conduct, respect library property, and ensure timely return of borrowed materials. All patrons are required to adhere to the code of conduct, respect library property, and ensure timely return of borrowed materials. All patrons are required to adhere to the code of conduct, respect library property, and ensure timely return of borrowed materials. All patrons are required to adhere to the code of conduct, respect library property, and ensure timely return of borrowed materials. All patrons are required to adhere to the code of conduct, respect library property, and ensure timely return of borrowed materials. </w:t>
+      </w:r>
+    </w:p>
+    <w:p>
+      <w:r>
+        <w:t xml:space="preserve">All patrons are required to adhere to the code of conduct, respect library property, and ensure timely return of borrowed materials. All patrons are required to adhere to the code of conduct, respect library property, and ensure timely return of borrowed materials. All patrons are required to adhere to the code of conduct, respect library property, and ensure timely return of borrowed materials. All patrons are required to adhere to the code of conduct, respect library property, and ensure timely return of borrowed materials. All patrons are required to adhere to the code of conduct, respect library property, and ensure timely return of borrowed materials. All patrons are required to adhere to the code of conduct, respect library property, and ensure timely return of borrowed materials. All patrons are required to adhere to the code of conduct, respect library property, and ensure timely return of borrowed materials. All patrons are required to adhere to the code of conduct, respect library property, and ensure timely return of borrowed materials. </w:t>
+      </w:r>
+    </w:p>
+    <w:p>
+      <w:r>
+        <w:t xml:space="preserve">All patrons are required to adhere to the code of conduct, respect library property, and ensure timely return of borrowed materials. All patrons are required to adhere to the code of conduct, respect library property, and ensure timely return of borrowed materials. All patrons are required to adhere to the code of conduct, respect library property, and ensure timely return of borrowed materials. All patrons are required to adhere to the code of conduct, respect library property, and ensure timely return of borrowed materials. All patrons are required to adhere to the code of conduct, respect library property, and ensure timely return of borrowed materials. All patrons are required to adhere to the code of conduct, respect library property, and ensure timely return of borrowed materials. All patrons are required to adhere to the code of conduct, respect library property, and ensure timely return of borrowed materials. All patrons are required to adhere to the code of conduct, respect library property, and ensure timely return of borrowed materials. </w:t>
+      </w:r>
+    </w:p>
+    <w:p>
+      <w:r>
+        <w:br w:type="page"/>
+      </w:r>
+    </w:p>
+    <w:p>
+      <w:pPr>
+        <w:pStyle w:val="Heading1"/>
+      </w:pPr>
+      <w:r>
+        <w:t>Section 84: Policy Guidelines</w:t>
+      </w:r>
+    </w:p>
+    <w:p>
+      <w:r>
+        <w:t xml:space="preserve">All patrons are required to adhere to the code of conduct, respect library property, and ensure timely return of borrowed materials. All patrons are required to adhere to the code of conduct, respect library property, and ensure timely return of borrowed materials. All patrons are required to adhere to the code of conduct, respect library property, and ensure timely return of borrowed materials. All patrons are required to adhere to the code of conduct, respect library property, and ensure timely return of borrowed materials. All patrons are required to adhere to the code of conduct, respect library property, and ensure timely return of borrowed materials. All patrons are required to adhere to the code of conduct, respect library property, and ensure timely return of borrowed materials. All patrons are required to adhere to the code of conduct, respect library property, and ensure timely return of borrowed materials. All patrons are required to adhere to the code of conduct, respect library property, and ensure timely return of borrowed materials. </w:t>
+      </w:r>
+    </w:p>
+    <w:p>
+      <w:r>
+        <w:t xml:space="preserve">All patrons are required to adhere to the code of conduct, respect library property, and ensure timely return of borrowed materials. All patrons are required to adhere to the code of conduct, respect library property, and ensure timely return of borrowed materials. All patrons are required to adhere to the code of conduct, respect library property, and ensure timely return of borrowed materials. All patrons are required to adhere to the code of conduct, respect library property, and ensure timely return of borrowed materials. All patrons are required to adhere to the code of conduct, respect library property, and ensure timely return of borrowed materials. All patrons are required to adhere to the code of conduct, respect library property, and ensure timely return of borrowed materials. All patrons are required to adhere to the code of conduct, respect library property, and ensure timely return of borrowed materials. All patrons are required to adhere to the code of conduct, respect library property, and ensure timely return of borrowed materials. </w:t>
+      </w:r>
+    </w:p>
+    <w:p>
+      <w:r>
+        <w:t xml:space="preserve">All patrons are required to adhere to the code of conduct, respect library property, and ensure timely return of borrowed materials. All patrons are required to adhere to the code of conduct, respect library property, and ensure timely return of borrowed materials. All patrons are required to adhere to the code of conduct, respect library property, and ensure timely return of borrowed materials. All patrons are required to adhere to the code of conduct, respect library property, and ensure timely return of borrowed materials. All patrons are required to adhere to the code of conduct, respect library property, and ensure timely return of borrowed materials. All patrons are required to adhere to the code of conduct, respect library property, and ensure timely return of borrowed materials. All patrons are required to adhere to the code of conduct, respect library property, and ensure timely return of borrowed materials. All patrons are required to adhere to the code of conduct, respect library property, and ensure timely return of borrowed materials. </w:t>
+      </w:r>
+    </w:p>
+    <w:p>
+      <w:r>
+        <w:br w:type="page"/>
+      </w:r>
+    </w:p>
+    <w:p>
+      <w:pPr>
+        <w:pStyle w:val="Heading1"/>
+      </w:pPr>
+      <w:r>
+        <w:t>Section 85: Policy Guidelines</w:t>
+      </w:r>
+    </w:p>
+    <w:p>
+      <w:r>
+        <w:t xml:space="preserve">All patrons are required to adhere to the code of conduct, respect library property, and ensure timely return of borrowed materials. All patrons are required to adhere to the code of conduct, respect library property, and ensure timely return of borrowed materials. All patrons are required to adhere to the code of conduct, respect library property, and ensure timely return of borrowed materials. All patrons are required to adhere to the code of conduct, respect library property, and ensure timely return of borrowed materials. All patrons are required to adhere to the code of conduct, respect library property, and ensure timely return of borrowed materials. All patrons are required to adhere to the code of conduct, respect library property, and ensure timely return of borrowed materials. All patrons are required to adhere to the code of conduct, respect library property, and ensure timely return of borrowed materials. All patrons are required to adhere to the code of conduct, respect library property, and ensure timely return of borrowed materials. </w:t>
+      </w:r>
+    </w:p>
+    <w:p>
+      <w:r>
+        <w:t xml:space="preserve">All patrons are required to adhere to the code of conduct, respect library property, and ensure timely return of borrowed materials. All patrons are required to adhere to the code of conduct, respect library property, and ensure timely return of borrowed materials. All patrons are required to adhere to the code of conduct, respect library property, and ensure timely return of borrowed materials. All patrons are required to adhere to the code of conduct, respect library property, and ensure timely return of borrowed materials. All patrons are required to adhere to the code of conduct, respect library property, and ensure timely return of borrowed materials. All patrons are required to adhere to the code of conduct, respect library property, and ensure timely return of borrowed materials. All patrons are required to adhere to the code of conduct, respect library property, and ensure timely return of borrowed materials. All patrons are required to adhere to the code of conduct, respect library property, and ensure timely return of borrowed materials. </w:t>
+      </w:r>
+    </w:p>
+    <w:p>
+      <w:r>
+        <w:t xml:space="preserve">All patrons are required to adhere to the code of conduct, respect library property, and ensure timely return of borrowed materials. All patrons are required to adhere to the code of conduct, respect library property, and ensure timely return of borrowed materials. All patrons are required to adhere to the code of conduct, respect library property, and ensure timely return of borrowed materials. All patrons are required to adhere to the code of conduct, respect library property, and ensure timely return of borrowed materials. All patrons are required to adhere to the code of conduct, respect library property, and ensure timely return of borrowed materials. All patrons are required to adhere to the code of conduct, respect library property, and ensure timely return of borrowed materials. All patrons are required to adhere to the code of conduct, respect library property, and ensure timely return of borrowed materials. All patrons are required to adhere to the code of conduct, respect library property, and ensure timely return of borrowed materials. </w:t>
+      </w:r>
+    </w:p>
+    <w:p>
+      <w:r>
+        <w:br w:type="page"/>
+      </w:r>
+    </w:p>
+    <w:p>
+      <w:pPr>
+        <w:pStyle w:val="Heading1"/>
+      </w:pPr>
+      <w:r>
+        <w:t>Section 86: Policy Guidelines</w:t>
+      </w:r>
+    </w:p>
+    <w:p>
+      <w:r>
+        <w:t xml:space="preserve">All patrons are required to adhere to the code of conduct, respect library property, and ensure timely return of borrowed materials. All patrons are required to adhere to the code of conduct, respect library property, and ensure timely return of borrowed materials. All patrons are required to adhere to the code of conduct, respect library property, and ensure timely return of borrowed materials. All patrons are required to adhere to the code of conduct, respect library property, and ensure timely return of borrowed materials. All patrons are required to adhere to the code of conduct, respect library property, and ensure timely return of borrowed materials. All patrons are required to adhere to the code of conduct, respect library property, and ensure timely return of borrowed materials. All patrons are required to adhere to the code of conduct, respect library property, and ensure timely return of borrowed materials. All patrons are required to adhere to the code of conduct, respect library property, and ensure timely return of borrowed materials. </w:t>
+      </w:r>
+    </w:p>
+    <w:p>
+      <w:r>
+        <w:t xml:space="preserve">All patrons are required to adhere to the code of conduct, respect library property, and ensure timely return of borrowed materials. All patrons are required to adhere to the code of conduct, respect library property, and ensure timely return of borrowed materials. All patrons are required to adhere to the code of conduct, respect library property, and ensure timely return of borrowed materials. All patrons are required to adhere to the code of conduct, respect library property, and ensure timely return of borrowed materials. All patrons are required to adhere to the code of conduct, respect library property, and ensure timely return of borrowed materials. All patrons are required to adhere to the code of conduct, respect library property, and ensure timely return of borrowed materials. All patrons are required to adhere to the code of conduct, respect library property, and ensure timely return of borrowed materials. All patrons are required to adhere to the code of conduct, respect library property, and ensure timely return of borrowed materials. </w:t>
+      </w:r>
+    </w:p>
+    <w:p>
+      <w:r>
+        <w:t xml:space="preserve">All patrons are required to adhere to the code of conduct, respect library property, and ensure timely return of borrowed materials. All patrons are required to adhere to the code of conduct, respect library property, and ensure timely return of borrowed materials. All patrons are required to adhere to the code of conduct, respect library property, and ensure timely return of borrowed materials. All patrons are required to adhere to the code of conduct, respect library property, and ensure timely return of borrowed materials. All patrons are required to adhere to the code of conduct, respect library property, and ensure timely return of borrowed materials. All patrons are required to adhere to the code of conduct, respect library property, and ensure timely return of borrowed materials. All patrons are required to adhere to the code of conduct, respect library property, and ensure timely return of borrowed materials. All patrons are required to adhere to the code of conduct, respect library property, and ensure timely return of borrowed materials. </w:t>
+      </w:r>
+    </w:p>
+    <w:p>
+      <w:r>
+        <w:br w:type="page"/>
+      </w:r>
+    </w:p>
+    <w:p>
+      <w:pPr>
+        <w:pStyle w:val="Heading1"/>
+      </w:pPr>
+      <w:r>
+        <w:t>Section 87: Policy Guidelines</w:t>
+      </w:r>
+    </w:p>
+    <w:p>
+      <w:r>
+        <w:t xml:space="preserve">All patrons are required to adhere to the code of conduct, respect library property, and ensure timely return of borrowed materials. All patrons are required to adhere to the code of conduct, respect library property, and ensure timely return of borrowed materials. All patrons are required to adhere to the code of conduct, respect library property, and ensure timely return of borrowed materials. All patrons are required to adhere to the code of conduct, respect library property, and ensure timely return of borrowed materials. All patrons are required to adhere to the code of conduct, respect library property, and ensure timely return of borrowed materials. All patrons are required to adhere to the code of conduct, respect library property, and ensure timely return of borrowed materials. All patrons are required to adhere to the code of conduct, respect library property, and ensure timely return of borrowed materials. All patrons are required to adhere to the code of conduct, respect library property, and ensure timely return of borrowed materials. </w:t>
+      </w:r>
+    </w:p>
+    <w:p>
+      <w:r>
+        <w:t xml:space="preserve">All patrons are required to adhere to the code of conduct, respect library property, and ensure timely return of borrowed materials. All patrons are required to adhere to the code of conduct, respect library property, and ensure timely return of borrowed materials. All patrons are required to adhere to the code of conduct, respect library property, and ensure timely return of borrowed materials. All patrons are required to adhere to the code of conduct, respect library property, and ensure timely return of borrowed materials. All patrons are required to adhere to the code of conduct, respect library property, and ensure timely return of borrowed materials. All patrons are required to adhere to the code of conduct, respect library property, and ensure timely return of borrowed materials. All patrons are required to adhere to the code of conduct, respect library property, and ensure timely return of borrowed materials. All patrons are required to adhere to the code of conduct, respect library property, and ensure timely return of borrowed materials. </w:t>
+      </w:r>
+    </w:p>
+    <w:p>
+      <w:r>
+        <w:t xml:space="preserve">All patrons are required to adhere to the code of conduct, respect library property, and ensure timely return of borrowed materials. All patrons are required to adhere to the code of conduct, respect library property, and ensure timely return of borrowed materials. All patrons are required to adhere to the code of conduct, respect library property, and ensure timely return of borrowed materials. All patrons are required to adhere to the code of conduct, respect library property, and ensure timely return of borrowed materials. All patrons are required to adhere to the code of conduct, respect library property, and ensure timely return of borrowed materials. All patrons are required to adhere to the code of conduct, respect library property, and ensure timely return of borrowed materials. All patrons are required to adhere to the code of conduct, respect library property, and ensure timely return of borrowed materials. All patrons are required to adhere to the code of conduct, respect library property, and ensure timely return of borrowed materials. </w:t>
+      </w:r>
+    </w:p>
+    <w:p>
+      <w:r>
+        <w:br w:type="page"/>
+      </w:r>
+    </w:p>
+    <w:p>
+      <w:pPr>
+        <w:pStyle w:val="Heading1"/>
+      </w:pPr>
+      <w:r>
+        <w:t>Section 88: Policy Guidelines</w:t>
+      </w:r>
+    </w:p>
+    <w:p>
+      <w:r>
+        <w:t xml:space="preserve">All patrons are required to adhere to the code of conduct, respect library property, and ensure timely return of borrowed materials. All patrons are required to adhere to the code of conduct, respect library property, and ensure timely return of borrowed materials. All patrons are required to adhere to the code of conduct, respect library property, and ensure timely return of borrowed materials. All patrons are required to adhere to the code of conduct, respect library property, and ensure timely return of borrowed materials. All patrons are required to adhere to the code of conduct, respect library property, and ensure timely return of borrowed materials. All patrons are required to adhere to the code of conduct, respect library property, and ensure timely return of borrowed materials. All patrons are required to adhere to the code of conduct, respect library property, and ensure timely return of borrowed materials. All patrons are required to adhere to the code of conduct, respect library property, and ensure timely return of borrowed materials. </w:t>
+      </w:r>
+    </w:p>
+    <w:p>
+      <w:r>
+        <w:t xml:space="preserve">All patrons are required to adhere to the code of conduct, respect library property, and ensure timely return of borrowed materials. All patrons are required to adhere to the code of conduct, respect library property, and ensure timely return of borrowed materials. All patrons are required to adhere to the code of conduct, respect library property, and ensure timely return of borrowed materials. All patrons are required to adhere to the code of conduct, respect library property, and ensure timely return of borrowed materials. All patrons are required to adhere to the code of conduct, respect library property, and ensure timely return of borrowed materials. All patrons are required to adhere to the code of conduct, respect library property, and ensure timely return of borrowed materials. All patrons are required to adhere to the code of conduct, respect library property, and ensure timely return of borrowed materials. All patrons are required to adhere to the code of conduct, respect library property, and ensure timely return of borrowed materials. </w:t>
+      </w:r>
+    </w:p>
+    <w:p>
+      <w:r>
+        <w:t xml:space="preserve">All patrons are required to adhere to the code of conduct, respect library property, and ensure timely return of borrowed materials. All patrons are required to adhere to the code of conduct, respect library property, and ensure timely return of borrowed materials. All patrons are required to adhere to the code of conduct, respect library property, and ensure timely return of borrowed materials. All patrons are required to adhere to the code of conduct, respect library property, and ensure timely return of borrowed materials. All patrons are required to adhere to the code of conduct, respect library property, and ensure timely return of borrowed materials. All patrons are required to adhere to the code of conduct, respect library property, and ensure timely return of borrowed materials. All patrons are required to adhere to the code of conduct, respect library property, and ensure timely return of borrowed materials. All patrons are required to adhere to the code of conduct, respect library property, and ensure timely return of borrowed materials. </w:t>
+      </w:r>
+    </w:p>
+    <w:p>
+      <w:r>
+        <w:br w:type="page"/>
+      </w:r>
+    </w:p>
+    <w:p>
+      <w:pPr>
+        <w:pStyle w:val="Heading1"/>
+      </w:pPr>
+      <w:r>
+        <w:t>Section 89: Policy Guidelines</w:t>
+      </w:r>
+    </w:p>
+    <w:p>
+      <w:r>
+        <w:t xml:space="preserve">All patrons are required to adhere to the code of conduct, respect library property, and ensure timely return of borrowed materials. All patrons are required to adhere to the code of conduct, respect library property, and ensure timely return of borrowed materials. All patrons are required to adhere to the code of conduct, respect library property, and ensure timely return of borrowed materials. All patrons are required to adhere to the code of conduct, respect library property, and ensure timely return of borrowed materials. All patrons are required to adhere to the code of conduct, respect library property, and ensure timely return of borrowed materials. All patrons are required to adhere to the code of conduct, respect library property, and ensure timely return of borrowed materials. All patrons are required to adhere to the code of conduct, respect library property, and ensure timely return of borrowed materials. All patrons are required to adhere to the code of conduct, respect library property, and ensure timely return of borrowed materials. </w:t>
+      </w:r>
+    </w:p>
+    <w:p>
+      <w:r>
+        <w:t xml:space="preserve">All patrons are required to adhere to the code of conduct, respect library property, and ensure timely return of borrowed materials. All patrons are required to adhere to the code of conduct, respect library property, and ensure timely return of borrowed materials. All patrons are required to adhere to the code of conduct, respect library property, and ensure timely return of borrowed materials. All patrons are required to adhere to the code of conduct, respect library property, and ensure timely return of borrowed materials. All patrons are required to adhere to the code of conduct, respect library property, and ensure timely return of borrowed materials. All patrons are required to adhere to the code of conduct, respect library property, and ensure timely return of borrowed materials. All patrons are required to adhere to the code of conduct, respect library property, and ensure timely return of borrowed materials. All patrons are required to adhere to the code of conduct, respect library property, and ensure timely return of borrowed materials. </w:t>
+      </w:r>
+    </w:p>
+    <w:p>
+      <w:r>
+        <w:t xml:space="preserve">All patrons are required to adhere to the code of conduct, respect library property, and ensure timely return of borrowed materials. All patrons are required to adhere to the code of conduct, respect library property, and ensure timely return of borrowed materials. All patrons are required to adhere to the code of conduct, respect library property, and ensure timely return of borrowed materials. All patrons are required to adhere to the code of conduct, respect library property, and ensure timely return of borrowed materials. All patrons are required to adhere to the code of conduct, respect library property, and ensure timely return of borrowed materials. All patrons are required to adhere to the code of conduct, respect library property, and ensure timely return of borrowed materials. All patrons are required to adhere to the code of conduct, respect library property, and ensure timely return of borrowed materials. All patrons are required to adhere to the code of conduct, respect library property, and ensure timely return of borrowed materials. </w:t>
+      </w:r>
+    </w:p>
+    <w:p>
+      <w:r>
+        <w:br w:type="page"/>
+      </w:r>
+    </w:p>
+    <w:p>
+      <w:pPr>
+        <w:pStyle w:val="Heading1"/>
+      </w:pPr>
+      <w:r>
+        <w:t>Section 90: Policy Guidelines</w:t>
+      </w:r>
+    </w:p>
+    <w:p>
+      <w:r>
+        <w:t xml:space="preserve">All patrons are required to adhere to the code of conduct, respect library property, and ensure timely return of borrowed materials. All patrons are required to adhere to the code of conduct, respect library property, and ensure timely return of borrowed materials. All patrons are required to adhere to the code of conduct, respect library property, and ensure timely return of borrowed materials. All patrons are required to adhere to the code of conduct, respect library property, and ensure timely return of borrowed materials. All patrons are required to adhere to the code of conduct, respect library property, and ensure timely return of borrowed materials. All patrons are required to adhere to the code of conduct, respect library property, and ensure timely return of borrowed materials. All patrons are required to adhere to the code of conduct, respect library property, and ensure timely return of borrowed materials. All patrons are required to adhere to the code of conduct, respect library property, and ensure timely return of borrowed materials. </w:t>
+      </w:r>
+    </w:p>
+    <w:p>
+      <w:r>
+        <w:t xml:space="preserve">All patrons are required to adhere to the code of conduct, respect library property, and ensure timely return of borrowed materials. All patrons are required to adhere to the code of conduct, respect library property, and ensure timely return of borrowed materials. All patrons are required to adhere to the code of conduct, respect library property, and ensure timely return of borrowed materials. All patrons are required to adhere to the code of conduct, respect library property, and ensure timely return of borrowed materials. All patrons are required to adhere to the code of conduct, respect library property, and ensure timely return of borrowed materials. All patrons are required to adhere to the code of conduct, respect library property, and ensure timely return of borrowed materials. All patrons are required to adhere to the code of conduct, respect library property, and ensure timely return of borrowed materials. All patrons are required to adhere to the code of conduct, respect library property, and ensure timely return of borrowed materials. </w:t>
+      </w:r>
+    </w:p>
+    <w:p>
+      <w:r>
+        <w:t xml:space="preserve">All patrons are required to adhere to the code of conduct, respect library property, and ensure timely return of borrowed materials. All patrons are required to adhere to the code of conduct, respect library property, and ensure timely return of borrowed materials. All patrons are required to adhere to the code of conduct, respect library property, and ensure timely return of borrowed materials. All patrons are required to adhere to the code of conduct, respect library property, and ensure timely return of borrowed materials. All patrons are required to adhere to the code of conduct, respect library property, and ensure timely return of borrowed materials. All patrons are required to adhere to the code of conduct, respect library property, and ensure timely return of borrowed materials. All patrons are required to adhere to the code of conduct, respect library property, and ensure timely return of borrowed materials. All patrons are required to adhere to the code of conduct, respect library property, and ensure timely return of borrowed materials. </w:t>
+      </w:r>
+    </w:p>
+    <w:p>
+      <w:r>
+        <w:br w:type="page"/>
+      </w:r>
+    </w:p>
+    <w:p>
+      <w:pPr>
+        <w:pStyle w:val="Heading1"/>
+      </w:pPr>
+      <w:r>
+        <w:t>Section 91: Policy Guidelines</w:t>
+      </w:r>
+    </w:p>
+    <w:p>
+      <w:r>
+        <w:t xml:space="preserve">All patrons are required to adhere to the code of conduct, respect library property, and ensure timely return of borrowed materials. All patrons are required to adhere to the code of conduct, respect library property, and ensure timely return of borrowed materials. All patrons are required to adhere to the code of conduct, respect library property, and ensure timely return of borrowed materials. All patrons are required to adhere to the code of conduct, respect library property, and ensure timely return of borrowed materials. All patrons are required to adhere to the code of conduct, respect library property, and ensure timely return of borrowed materials. All patrons are required to adhere to the code of conduct, respect library property, and ensure timely return of borrowed materials. All patrons are required to adhere to the code of conduct, respect library property, and ensure timely return of borrowed materials. All patrons are required to adhere to the code of conduct, respect library property, and ensure timely return of borrowed materials. </w:t>
+      </w:r>
+    </w:p>
+    <w:p>
+      <w:r>
+        <w:t xml:space="preserve">All patrons are required to adhere to the code of conduct, respect library property, and ensure timely return of borrowed materials. All patrons are required to adhere to the code of conduct, respect library property, and ensure timely return of borrowed materials. All patrons are required to adhere to the code of conduct, respect library property, and ensure timely return of borrowed materials. All patrons are required to adhere to the code of conduct, respect library property, and ensure timely return of borrowed materials. All patrons are required to adhere to the code of conduct, respect library property, and ensure timely return of borrowed materials. All patrons are required to adhere to the code of conduct, respect library property, and ensure timely return of borrowed materials. All patrons are required to adhere to the code of conduct, respect library property, and ensure timely return of borrowed materials. All patrons are required to adhere to the code of conduct, respect library property, and ensure timely return of borrowed materials. </w:t>
+      </w:r>
+    </w:p>
+    <w:p>
+      <w:r>
+        <w:t xml:space="preserve">All patrons are required to adhere to the code of conduct, respect library property, and ensure timely return of borrowed materials. All patrons are required to adhere to the code of conduct, respect library property, and ensure timely return of borrowed materials. All patrons are required to adhere to the code of conduct, respect library property, and ensure timely return of borrowed materials. All patrons are required to adhere to the code of conduct, respect library property, and ensure timely return of borrowed materials. All patrons are required to adhere to the code of conduct, respect library property, and ensure timely return of borrowed materials. All patrons are required to adhere to the code of conduct, respect library property, and ensure timely return of borrowed materials. All patrons are required to adhere to the code of conduct, respect library property, and ensure timely return of borrowed materials. All patrons are required to adhere to the code of conduct, respect library property, and ensure timely return of borrowed materials. </w:t>
+      </w:r>
+    </w:p>
+    <w:p>
+      <w:r>
+        <w:br w:type="page"/>
+      </w:r>
+    </w:p>
+    <w:p>
+      <w:pPr>
+        <w:pStyle w:val="Heading1"/>
+      </w:pPr>
+      <w:r>
+        <w:t>Section 92: Policy Guidelines</w:t>
+      </w:r>
+    </w:p>
+    <w:p>
+      <w:r>
+        <w:t xml:space="preserve">All patrons are required to adhere to the code of conduct, respect library property, and ensure timely return of borrowed materials. All patrons are required to adhere to the code of conduct, respect library property, and ensure timely return of borrowed materials. All patrons are required to adhere to the code of conduct, respect library property, and ensure timely return of borrowed materials. All patrons are required to adhere to the code of conduct, respect library property, and ensure timely return of borrowed materials. All patrons are required to adhere to the code of conduct, respect library property, and ensure timely return of borrowed materials. All patrons are required to adhere to the code of conduct, respect library property, and ensure timely return of borrowed materials. All patrons are required to adhere to the code of conduct, respect library property, and ensure timely return of borrowed materials. All patrons are required to adhere to the code of conduct, respect library property, and ensure timely return of borrowed materials. </w:t>
+      </w:r>
+    </w:p>
+    <w:p>
+      <w:r>
+        <w:t xml:space="preserve">All patrons are required to adhere to the code of conduct, respect library property, and ensure timely return of borrowed materials. All patrons are required to adhere to the code of conduct, respect library property, and ensure timely return of borrowed materials. All patrons are required to adhere to the code of conduct, respect library property, and ensure timely return of borrowed materials. All patrons are required to adhere to the code of conduct, respect library property, and ensure timely return of borrowed materials. All patrons are required to adhere to the code of conduct, respect library property, and ensure timely return of borrowed materials. All patrons are required to adhere to the code of conduct, respect library property, and ensure timely return of borrowed materials. All patrons are required to adhere to the code of conduct, respect library property, and ensure timely return of borrowed materials. All patrons are required to adhere to the code of conduct, respect library property, and ensure timely return of borrowed materials. </w:t>
+      </w:r>
+    </w:p>
+    <w:p>
+      <w:r>
+        <w:t xml:space="preserve">All patrons are required to adhere to the code of conduct, respect library property, and ensure timely return of borrowed materials. All patrons are required to adhere to the code of conduct, respect library property, and ensure timely return of borrowed materials. All patrons are required to adhere to the code of conduct, respect library property, and ensure timely return of borrowed materials. All patrons are required to adhere to the code of conduct, respect library property, and ensure timely return of borrowed materials. All patrons are required to adhere to the code of conduct, respect library property, and ensure timely return of borrowed materials. All patrons are required to adhere to the code of conduct, respect library property, and ensure timely return of borrowed materials. All patrons are required to adhere to the code of conduct, respect library property, and ensure timely return of borrowed materials. All patrons are required to adhere to the code of conduct, respect library property, and ensure timely return of borrowed materials. </w:t>
+      </w:r>
+    </w:p>
+    <w:p>
+      <w:r>
+        <w:br w:type="page"/>
+      </w:r>
+    </w:p>
+    <w:p>
+      <w:pPr>
+        <w:pStyle w:val="Heading1"/>
+      </w:pPr>
+      <w:r>
+        <w:t>Section 93: Policy Guidelines</w:t>
+      </w:r>
+    </w:p>
+    <w:p>
+      <w:r>
+        <w:t xml:space="preserve">All patrons are required to adhere to the code of conduct, respect library property, and ensure timely return of borrowed materials. All patrons are required to adhere to the code of conduct, respect library property, and ensure timely return of borrowed materials. All patrons are required to adhere to the code of conduct, respect library property, and ensure timely return of borrowed materials. All patrons are required to adhere to the code of conduct, respect library property, and ensure timely return of borrowed materials. All patrons are required to adhere to the code of conduct, respect library property, and ensure timely return of borrowed materials. All patrons are required to adhere to the code of conduct, respect library property, and ensure timely return of borrowed materials. All patrons are required to adhere to the code of conduct, respect library property, and ensure timely return of borrowed materials. All patrons are required to adhere to the code of conduct, respect library property, and ensure timely return of borrowed materials. </w:t>
+      </w:r>
+    </w:p>
+    <w:p>
+      <w:r>
+        <w:t xml:space="preserve">All patrons are required to adhere to the code of conduct, respect library property, and ensure timely return of borrowed materials. All patrons are required to adhere to the code of conduct, respect library property, and ensure timely return of borrowed materials. All patrons are required to adhere to the code of conduct, respect library property, and ensure timely return of borrowed materials. All patrons are required to adhere to the code of conduct, respect library property, and ensure timely return of borrowed materials. All patrons are required to adhere to the code of conduct, respect library property, and ensure timely return of borrowed materials. All patrons are required to adhere to the code of conduct, respect library property, and ensure timely return of borrowed materials. All patrons are required to adhere to the code of conduct, respect library property, and ensure timely return of borrowed materials. All patrons are required to adhere to the code of conduct, respect library property, and ensure timely return of borrowed materials. </w:t>
+      </w:r>
+    </w:p>
+    <w:p>
+      <w:r>
+        <w:t xml:space="preserve">All patrons are required to adhere to the code of conduct, respect library property, and ensure timely return of borrowed materials. All patrons are required to adhere to the code of conduct, respect library property, and ensure timely return of borrowed materials. All patrons are required to adhere to the code of conduct, respect library property, and ensure timely return of borrowed materials. All patrons are required to adhere to the code of conduct, respect library property, and ensure timely return of borrowed materials. All patrons are required to adhere to the code of conduct, respect library property, and ensure timely return of borrowed materials. All patrons are required to adhere to the code of conduct, respect library property, and ensure timely return of borrowed materials. All patrons are required to adhere to the code of conduct, respect library property, and ensure timely return of borrowed materials. All patrons are required to adhere to the code of conduct, respect library property, and ensure timely return of borrowed materials. </w:t>
+      </w:r>
+    </w:p>
+    <w:p>
+      <w:r>
+        <w:br w:type="page"/>
+      </w:r>
+    </w:p>
+    <w:p>
+      <w:pPr>
+        <w:pStyle w:val="Heading1"/>
+      </w:pPr>
+      <w:r>
+        <w:t>Section 94: Policy Guidelines</w:t>
+      </w:r>
+    </w:p>
+    <w:p>
+      <w:r>
+        <w:t xml:space="preserve">All patrons are required to adhere to the code of conduct, respect library property, and ensure timely return of borrowed materials. All patrons are required to adhere to the code of conduct, respect library property, and ensure timely return of borrowed materials. All patrons are required to adhere to the code of conduct, respect library property, and ensure timely return of borrowed materials. All patrons are required to adhere to the code of conduct, respect library property, and ensure timely return of borrowed materials. All patrons are required to adhere to the code of conduct, respect library property, and ensure timely return of borrowed materials. All patrons are required to adhere to the code of conduct, respect library property, and ensure timely return of borrowed materials. All patrons are required to adhere to the code of conduct, respect library property, and ensure timely return of borrowed materials. All patrons are required to adhere to the code of conduct, respect library property, and ensure timely return of borrowed materials. </w:t>
+      </w:r>
+    </w:p>
+    <w:p>
+      <w:r>
+        <w:t xml:space="preserve">All patrons are required to adhere to the code of conduct, respect library property, and ensure timely return of borrowed materials. All patrons are required to adhere to the code of conduct, respect library property, and ensure timely return of borrowed materials. All patrons are required to adhere to the code of conduct, respect library property, and ensure timely return of borrowed materials. All patrons are required to adhere to the code of conduct, respect library property, and ensure timely return of borrowed materials. All patrons are required to adhere to the code of conduct, respect library property, and ensure timely return of borrowed materials. All patrons are required to adhere to the code of conduct, respect library property, and ensure timely return of borrowed materials. All patrons are required to adhere to the code of conduct, respect library property, and ensure timely return of borrowed materials. All patrons are required to adhere to the code of conduct, respect library property, and ensure timely return of borrowed materials. </w:t>
+      </w:r>
+    </w:p>
+    <w:p>
+      <w:r>
+        <w:t xml:space="preserve">All patrons are required to adhere to the code of conduct, respect library property, and ensure timely return of borrowed materials. All patrons are required to adhere to the code of conduct, respect library property, and ensure timely return of borrowed materials. All patrons are required to adhere to the code of conduct, respect library property, and ensure timely return of borrowed materials. All patrons are required to adhere to the code of conduct, respect library property, and ensure timely return of borrowed materials. All patrons are required to adhere to the code of conduct, respect library property, and ensure timely return of borrowed materials. All patrons are required to adhere to the code of conduct, respect library property, and ensure timely return of borrowed materials. All patrons are required to adhere to the code of conduct, respect library property, and ensure timely return of borrowed materials. All patrons are required to adhere to the code of conduct, respect library property, and ensure timely return of borrowed materials. </w:t>
+      </w:r>
+    </w:p>
+    <w:p>
+      <w:r>
+        <w:br w:type="page"/>
+      </w:r>
+    </w:p>
+    <w:p>
+      <w:pPr>
+        <w:pStyle w:val="Heading1"/>
+      </w:pPr>
+      <w:r>
+        <w:t>Section 95: Policy Guidelines</w:t>
+      </w:r>
+    </w:p>
+    <w:p>
+      <w:r>
+        <w:t xml:space="preserve">All patrons are required to adhere to the code of conduct, respect library property, and ensure timely return of borrowed materials. All patrons are required to adhere to the code of conduct, respect library property, and ensure timely return of borrowed materials. All patrons are required to adhere to the code of conduct, respect library property, and ensure timely return of borrowed materials. All patrons are required to adhere to the code of conduct, respect library property, and ensure timely return of borrowed materials. All patrons are required to adhere to the code of conduct, respect library property, and ensure timely return of borrowed materials. All patrons are required to adhere to the code of conduct, respect library property, and ensure timely return of borrowed materials. All patrons are required to adhere to the code of conduct, respect library property, and ensure timely return of borrowed materials. All patrons are required to adhere to the code of conduct, respect library property, and ensure timely return of borrowed materials. </w:t>
+      </w:r>
+    </w:p>
+    <w:p>
+      <w:r>
+        <w:t xml:space="preserve">All patrons are required to adhere to the code of conduct, respect library property, and ensure timely return of borrowed materials. All patrons are required to adhere to the code of conduct, respect library property, and ensure timely return of borrowed materials. All patrons are required to adhere to the code of conduct, respect library property, and ensure timely return of borrowed materials. All patrons are required to adhere to the code of conduct, respect library property, and ensure timely return of borrowed materials. All patrons are required to adhere to the code of conduct, respect library property, and ensure timely return of borrowed materials. All patrons are required to adhere to the code of conduct, respect library property, and ensure timely return of borrowed materials. All patrons are required to adhere to the code of conduct, respect library property, and ensure timely return of borrowed materials. All patrons are required to adhere to the code of conduct, respect library property, and ensure timely return of borrowed materials. </w:t>
+      </w:r>
+    </w:p>
+    <w:p>
+      <w:r>
+        <w:t xml:space="preserve">All patrons are required to adhere to the code of conduct, respect library property, and ensure timely return of borrowed materials. All patrons are required to adhere to the code of conduct, respect library property, and ensure timely return of borrowed materials. All patrons are required to adhere to the code of conduct, respect library property, and ensure timely return of borrowed materials. All patrons are required to adhere to the code of conduct, respect library property, and ensure timely return of borrowed materials. All patrons are required to adhere to the code of conduct, respect library property, and ensure timely return of borrowed materials. All patrons are required to adhere to the code of conduct, respect library property, and ensure timely return of borrowed materials. All patrons are required to adhere to the code of conduct, respect library property, and ensure timely return of borrowed materials. All patrons are required to adhere to the code of conduct, respect library property, and ensure timely return of borrowed materials. </w:t>
+      </w:r>
+    </w:p>
+    <w:p>
+      <w:r>
+        <w:br w:type="page"/>
+      </w:r>
+    </w:p>
+    <w:p>
+      <w:pPr>
+        <w:pStyle w:val="Heading1"/>
+      </w:pPr>
+      <w:r>
+        <w:t>Section 96: Policy Guidelines</w:t>
+      </w:r>
+    </w:p>
+    <w:p>
+      <w:r>
+        <w:t xml:space="preserve">All patrons are required to adhere to the code of conduct, respect library property, and ensure timely return of borrowed materials. All patrons are required to adhere to the code of conduct, respect library property, and ensure timely return of borrowed materials. All patrons are required to adhere to the code of conduct, respect library property, and ensure timely return of borrowed materials. All patrons are required to adhere to the code of conduct, respect library property, and ensure timely return of borrowed materials. All patrons are required to adhere to the code of conduct, respect library property, and ensure timely return of borrowed materials. All patrons are required to adhere to the code of conduct, respect library property, and ensure timely return of borrowed materials. All patrons are required to adhere to the code of conduct, respect library property, and ensure timely return of borrowed materials. All patrons are required to adhere to the code of conduct, respect library property, and ensure timely return of borrowed materials. </w:t>
+      </w:r>
+    </w:p>
+    <w:p>
+      <w:r>
+        <w:t xml:space="preserve">All patrons are required to adhere to the code of conduct, respect library property, and ensure timely return of borrowed materials. All patrons are required to adhere to the code of conduct, respect library property, and ensure timely return of borrowed materials. All patrons are required to adhere to the code of conduct, respect library property, and ensure timely return of borrowed materials. All patrons are required to adhere to the code of conduct, respect library property, and ensure timely return of borrowed materials. All patrons are required to adhere to the code of conduct, respect library property, and ensure timely return of borrowed materials. All patrons are required to adhere to the code of conduct, respect library property, and ensure timely return of borrowed materials. All patrons are required to adhere to the code of conduct, respect library property, and ensure timely return of borrowed materials. All patrons are required to adhere to the code of conduct, respect library property, and ensure timely return of borrowed materials. </w:t>
+      </w:r>
+    </w:p>
+    <w:p>
+      <w:r>
+        <w:t xml:space="preserve">All patrons are required to adhere to the code of conduct, respect library property, and ensure timely return of borrowed materials. All patrons are required to adhere to the code of conduct, respect library property, and ensure timely return of borrowed materials. All patrons are required to adhere to the code of conduct, respect library property, and ensure timely return of borrowed materials. All patrons are required to adhere to the code of conduct, respect library property, and ensure timely return of borrowed materials. All patrons are required to adhere to the code of conduct, respect library property, and ensure timely return of borrowed materials. All patrons are required to adhere to the code of conduct, respect library property, and ensure timely return of borrowed materials. All patrons are required to adhere to the code of conduct, respect library property, and ensure timely return of borrowed materials. All patrons are required to adhere to the code of conduct, respect library property, and ensure timely return of borrowed materials. </w:t>
+      </w:r>
+    </w:p>
+    <w:p>
+      <w:r>
+        <w:br w:type="page"/>
+      </w:r>
+    </w:p>
+    <w:p>
+      <w:pPr>
+        <w:pStyle w:val="Heading1"/>
+      </w:pPr>
+      <w:r>
+        <w:t>Section 97: Policy Guidelines</w:t>
+      </w:r>
+    </w:p>
+    <w:p>
+      <w:r>
+        <w:t xml:space="preserve">All patrons are required to adhere to the code of conduct, respect library property, and ensure timely return of borrowed materials. All patrons are required to adhere to the code of conduct, respect library property, and ensure timely return of borrowed materials. All patrons are required to adhere to the code of conduct, respect library property, and ensure timely return of borrowed materials. All patrons are required to adhere to the code of conduct, respect library property, and ensure timely return of borrowed materials. All patrons are required to adhere to the code of conduct, respect library property, and ensure timely return of borrowed materials. All patrons are required to adhere to the code of conduct, respect library property, and ensure timely return of borrowed materials. All patrons are required to adhere to the code of conduct, respect library property, and ensure timely return of borrowed materials. All patrons are required to adhere to the code of conduct, respect library property, and ensure timely return of borrowed materials. </w:t>
+      </w:r>
+    </w:p>
+    <w:p>
+      <w:r>
+        <w:t xml:space="preserve">All patrons are required to adhere to the code of conduct, respect library property, and ensure timely return of borrowed materials. All patrons are required to adhere to the code of conduct, respect library property, and ensure timely return of borrowed materials. All patrons are required to adhere to the code of conduct, respect library property, and ensure timely return of borrowed materials. All patrons are required to adhere to the code of conduct, respect library property, and ensure timely return of borrowed materials. All patrons are required to adhere to the code of conduct, respect library property, and ensure timely return of borrowed materials. All patrons are required to adhere to the code of conduct, respect library property, and ensure timely return of borrowed materials. All patrons are required to adhere to the code of conduct, respect library property, and ensure timely return of borrowed materials. All patrons are required to adhere to the code of conduct, respect library property, and ensure timely return of borrowed materials. </w:t>
+      </w:r>
+    </w:p>
+    <w:p>
+      <w:r>
+        <w:t xml:space="preserve">All patrons are required to adhere to the code of conduct, respect library property, and ensure timely return of borrowed materials. All patrons are required to adhere to the code of conduct, respect library property, and ensure timely return of borrowed materials. All patrons are required to adhere to the code of conduct, respect library property, and ensure timely return of borrowed materials. All patrons are required to adhere to the code of conduct, respect library property, and ensure timely return of borrowed materials. All patrons are required to adhere to the code of conduct, respect library property, and ensure timely return of borrowed materials. All patrons are required to adhere to the code of conduct, respect library property, and ensure timely return of borrowed materials. All patrons are required to adhere to the code of conduct, respect library property, and ensure timely return of borrowed materials. All patrons are required to adhere to the code of conduct, respect library property, and ensure timely return of borrowed materials. </w:t>
+      </w:r>
+    </w:p>
+    <w:p>
+      <w:r>
+        <w:br w:type="page"/>
+      </w:r>
+    </w:p>
+    <w:p>
+      <w:pPr>
+        <w:pStyle w:val="Heading1"/>
+      </w:pPr>
+      <w:r>
+        <w:t>Section 98: Policy Guidelines</w:t>
+      </w:r>
+    </w:p>
+    <w:p>
+      <w:r>
+        <w:t xml:space="preserve">All patrons are required to adhere to the code of conduct, respect library property, and ensure timely return of borrowed materials. All patrons are required to adhere to the code of conduct, respect library property, and ensure timely return of borrowed materials. All patrons are required to adhere to the code of conduct, respect library property, and ensure timely return of borrowed materials. All patrons are required to adhere to the code of conduct, respect library property, and ensure timely return of borrowed materials. All patrons are required to adhere to the code of conduct, respect library property, and ensure timely return of borrowed materials. All patrons are required to adhere to the code of conduct, respect library property, and ensure timely return of borrowed materials. All patrons are required to adhere to the code of conduct, respect library property, and ensure timely return of borrowed materials. All patrons are required to adhere to the code of conduct, respect library property, and ensure timely return of borrowed materials. </w:t>
+      </w:r>
+    </w:p>
+    <w:p>
+      <w:r>
+        <w:t xml:space="preserve">All patrons are required to adhere to the code of conduct, respect library property, and ensure timely return of borrowed materials. All patrons are required to adhere to the code of conduct, respect library property, and ensure timely return of borrowed materials. All patrons are required to adhere to the code of conduct, respect library property, and ensure timely return of borrowed materials. All patrons are required to adhere to the code of conduct, respect library property, and ensure timely return of borrowed materials. All patrons are required to adhere to the code of conduct, respect library property, and ensure timely return of borrowed materials. All patrons are required to adhere to the code of conduct, respect library property, and ensure timely return of borrowed materials. All patrons are required to adhere to the code of conduct, respect library property, and ensure timely return of borrowed materials. All patrons are required to adhere to the code of conduct, respect library property, and ensure timely return of borrowed materials. </w:t>
+      </w:r>
+    </w:p>
+    <w:p>
+      <w:r>
+        <w:t xml:space="preserve">All patrons are required to adhere to the code of conduct, respect library property, and ensure timely return of borrowed materials. All patrons are required to adhere to the code of conduct, respect library property, and ensure timely return of borrowed materials. All patrons are required to adhere to the code of conduct, respect library property, and ensure timely return of borrowed materials. All patrons are required to adhere to the code of conduct, respect library property, and ensure timely return of borrowed materials. All patrons are required to adhere to the code of conduct, respect library property, and ensure timely return of borrowed materials. All patrons are required to adhere to the code of conduct, respect library property, and ensure timely return of borrowed materials. All patrons are required to adhere to the code of conduct, respect library property, and ensure timely return of borrowed materials. All patrons are required to adhere to the code of conduct, respect library property, and ensure timely return of borrowed materials. </w:t>
+      </w:r>
+    </w:p>
+    <w:p>
+      <w:r>
+        <w:br w:type="page"/>
+      </w:r>
+    </w:p>
+    <w:p>
+      <w:pPr>
+        <w:pStyle w:val="Heading1"/>
+      </w:pPr>
+      <w:r>
+        <w:t>Section 99: Policy Guidelines</w:t>
+      </w:r>
+    </w:p>
+    <w:p>
+      <w:r>
+        <w:t xml:space="preserve">All patrons are required to adhere to the code of conduct, respect library property, and ensure timely return of borrowed materials. All patrons are required to adhere to the code of conduct, respect library property, and ensure timely return of borrowed materials. All patrons are required to adhere to the code of conduct, respect library property, and ensure timely return of borrowed materials. All patrons are required to adhere to the code of conduct, respect library property, and ensure timely return of borrowed materials. All patrons are required to adhere to the code of conduct, respect library property, and ensure timely return of borrowed materials. All patrons are required to adhere to the code of conduct, respect library property, and ensure timely return of borrowed materials. All patrons are required to adhere to the code of conduct, respect library property, and ensure timely return of borrowed materials. All patrons are required to adhere to the code of conduct, respect library property, and ensure timely return of borrowed materials. </w:t>
+      </w:r>
+    </w:p>
+    <w:p>
+      <w:r>
+        <w:t xml:space="preserve">All patrons are required to adhere to the code of conduct, respect library property, and ensure timely return of borrowed materials. All patrons are required to adhere to the code of conduct, respect library property, and ensure timely return of borrowed materials. All patrons are required to adhere to the code of conduct, respect library property, and ensure timely return of borrowed materials. All patrons are required to adhere to the code of conduct, respect library property, and ensure timely return of borrowed materials. All patrons are required to adhere to the code of conduct, respect library property, and ensure timely return of borrowed materials. All patrons are required to adhere to the code of conduct, respect library property, and ensure timely return of borrowed materials. All patrons are required to adhere to the code of conduct, respect library property, and ensure timely return of borrowed materials. All patrons are required to adhere to the code of conduct, respect library property, and ensure timely return of borrowed materials. </w:t>
+      </w:r>
+    </w:p>
+    <w:p>
+      <w:r>
+        <w:t xml:space="preserve">All patrons are required to adhere to the code of conduct, respect library property, and ensure timely return of borrowed materials. All patrons are required to adhere to the code of conduct, respect library property, and ensure timely return of borrowed materials. All patrons are required to adhere to the code of conduct, respect library property, and ensure timely return of borrowed materials. All patrons are required to adhere to the code of conduct, respect library property, and ensure timely return of borrowed materials. All patrons are required to adhere to the code of conduct, respect library property, and ensure timely return of borrowed materials. All patrons are required to adhere to the code of conduct, respect library property, and ensure timely return of borrowed materials. All patrons are required to adhere to the code of conduct, respect library property, and ensure timely return of borrowed materials. All patrons are required to adhere to the code of conduct, respect library property, and ensure timely return of borrowed materials. </w:t>
+      </w:r>
+    </w:p>
+    <w:p>
+      <w:r>
+        <w:br w:type="page"/>
+      </w:r>
+    </w:p>
+    <w:p>
+      <w:pPr>
+        <w:pStyle w:val="Heading1"/>
+      </w:pPr>
+      <w:r>
+        <w:t>Section 100: Policy Guidelines</w:t>
+      </w:r>
+    </w:p>
+    <w:p>
+      <w:r>
+        <w:t xml:space="preserve">All patrons are required to adhere to the code of conduct, respect library property, and ensure timely return of borrowed materials. All patrons are required to adhere to the code of conduct, respect library property, and ensure timely return of borrowed materials. All patrons are required to adhere to the code of conduct, respect library property, and ensure timely return of borrowed materials. All patrons are required to adhere to the code of conduct, respect library property, and ensure timely return of borrowed materials. All patrons are required to adhere to the code of conduct, respect library property, and ensure timely return of borrowed materials. All patrons are required to adhere to the code of conduct, respect library property, and ensure timely return of borrowed materials. All patrons are required to adhere to the code of conduct, respect library property, and ensure timely return of borrowed materials. All patrons are required to adhere to the code of conduct, respect library property, and ensure timely return of borrowed materials. </w:t>
+      </w:r>
+    </w:p>
+    <w:p>
+      <w:r>
+        <w:t xml:space="preserve">All patrons are required to adhere to the code of conduct, respect library property, and ensure timely return of borrowed materials. All patrons are required to adhere to the code of conduct, respect library property, and ensure timely return of borrowed materials. All patrons are required to adhere to the code of conduct, respect library property, and ensure timely return of borrowed materials. All patrons are required to adhere to the code of conduct, respect library property, and ensure timely return of borrowed materials. All patrons are required to adhere to the code of conduct, respect library property, and ensure timely return of borrowed materials. All patrons are required to adhere to the code of conduct, respect library property, and ensure timely return of borrowed materials. All patrons are required to adhere to the code of conduct, respect library property, and ensure timely return of borrowed materials. All patrons are required to adhere to the code of conduct, respect library property, and ensure timely return of borrowed materials. </w:t>
+      </w:r>
+    </w:p>
+    <w:p>
+      <w:r>
+        <w:t xml:space="preserve">All patrons are required to adhere to the code of conduct, respect library property, and ensure timely return of borrowed materials. All patrons are required to adhere to the code of conduct, respect library property, and ensure timely return of borrowed materials. All patrons are required to adhere to the code of conduct, respect library property, and ensure timely return of borrowed materials. All patrons are required to adhere to the code of conduct, respect library property, and ensure timely return of borrowed materials. All patrons are required to adhere to the code of conduct, respect library property, and ensure timely return of borrowed materials. All patrons are required to adhere to the code of conduct, respect library property, and ensure timely return of borrowed materials. All patrons are required to adhere to the code of conduct, respect library property, and ensure timely return of borrowed materials. All patrons are required to adhere to the code of conduct, respect library property, and ensure timely return of borrowed materials. </w:t>
       </w:r>
     </w:p>
     <w:sectPr>

</xml_diff>

<commit_message>
docs: v1.0.0 documentation and robust Whisper STT upgrade
</commit_message>
<xml_diff>
--- a/data/library_policies.docx
+++ b/data/library_policies.docx
@@ -19,283 +19,16 @@
       </w:r>
     </w:p>
     <w:p>
-      <w:pPr>
-        <w:pStyle w:val="Heading2"/>
-      </w:pPr>
       <w:r>
-        <w:t>Borrowing Rules - Part 1</w:t>
-      </w:r>
-    </w:p>
-    <w:p>
-      <w:r>
-        <w:t xml:space="preserve">This policy outlines the rules regarding Borrowing Rules. All patrons must adhere strictly to these guidelines to ensure fair access and safety. Failure to comply with the Borrowing Rules policy may result in suspension of library privileges. This policy outlines the rules regarding Borrowing Rules. All patrons must adhere strictly to these guidelines to ensure fair access and safety. Failure to comply with the Borrowing Rules policy may result in suspension of library privileges. This policy outlines the rules regarding Borrowing Rules. All patrons must adhere strictly to these guidelines to ensure fair access and safety. Failure to comply with the Borrowing Rules policy may result in suspension of library privileges. This policy outlines the rules regarding Borrowing Rules. All patrons must adhere strictly to these guidelines to ensure fair access and safety. Failure to comply with the Borrowing Rules policy may result in suspension of library privileges. This policy outlines the rules regarding Borrowing Rules. All patrons must adhere strictly to these guidelines to ensure fair access and safety. Failure to comply with the Borrowing Rules policy may result in suspension of library privileges. This policy outlines the rules regarding Borrowing Rules. All patrons must adhere strictly to these guidelines to ensure fair access and safety. Failure to comply with the Borrowing Rules policy may result in suspension of library privileges. </w:t>
-      </w:r>
-    </w:p>
-    <w:p>
-      <w:r>
-        <w:t xml:space="preserve">This policy outlines the rules regarding Borrowing Rules. All patrons must adhere strictly to these guidelines to ensure fair access and safety. Failure to comply with the Borrowing Rules policy may result in suspension of library privileges. This policy outlines the rules regarding Borrowing Rules. All patrons must adhere strictly to these guidelines to ensure fair access and safety. Failure to comply with the Borrowing Rules policy may result in suspension of library privileges. This policy outlines the rules regarding Borrowing Rules. All patrons must adhere strictly to these guidelines to ensure fair access and safety. Failure to comply with the Borrowing Rules policy may result in suspension of library privileges. This policy outlines the rules regarding Borrowing Rules. All patrons must adhere strictly to these guidelines to ensure fair access and safety. Failure to comply with the Borrowing Rules policy may result in suspension of library privileges. This policy outlines the rules regarding Borrowing Rules. All patrons must adhere strictly to these guidelines to ensure fair access and safety. Failure to comply with the Borrowing Rules policy may result in suspension of library privileges. This policy outlines the rules regarding Borrowing Rules. All patrons must adhere strictly to these guidelines to ensure fair access and safety. Failure to comply with the Borrowing Rules policy may result in suspension of library privileges. </w:t>
-      </w:r>
-    </w:p>
-    <w:p>
-      <w:r>
-        <w:t xml:space="preserve">This policy outlines the rules regarding Borrowing Rules. All patrons must adhere strictly to these guidelines to ensure fair access and safety. Failure to comply with the Borrowing Rules policy may result in suspension of library privileges. This policy outlines the rules regarding Borrowing Rules. All patrons must adhere strictly to these guidelines to ensure fair access and safety. Failure to comply with the Borrowing Rules policy may result in suspension of library privileges. This policy outlines the rules regarding Borrowing Rules. All patrons must adhere strictly to these guidelines to ensure fair access and safety. Failure to comply with the Borrowing Rules policy may result in suspension of library privileges. This policy outlines the rules regarding Borrowing Rules. All patrons must adhere strictly to these guidelines to ensure fair access and safety. Failure to comply with the Borrowing Rules policy may result in suspension of library privileges. This policy outlines the rules regarding Borrowing Rules. All patrons must adhere strictly to these guidelines to ensure fair access and safety. Failure to comply with the Borrowing Rules policy may result in suspension of library privileges. This policy outlines the rules regarding Borrowing Rules. All patrons must adhere strictly to these guidelines to ensure fair access and safety. Failure to comply with the Borrowing Rules policy may result in suspension of library privileges. </w:t>
-      </w:r>
-    </w:p>
-    <w:p>
-      <w:r>
-        <w:br w:type="page"/>
-      </w:r>
-    </w:p>
-    <w:p>
-      <w:pPr>
-        <w:pStyle w:val="Heading2"/>
-      </w:pPr>
-      <w:r>
-        <w:t>Borrowing Rules - Part 2</w:t>
-      </w:r>
-    </w:p>
-    <w:p>
-      <w:r>
-        <w:t xml:space="preserve">This policy outlines the rules regarding Borrowing Rules. All patrons must adhere strictly to these guidelines to ensure fair access and safety. Failure to comply with the Borrowing Rules policy may result in suspension of library privileges. This policy outlines the rules regarding Borrowing Rules. All patrons must adhere strictly to these guidelines to ensure fair access and safety. Failure to comply with the Borrowing Rules policy may result in suspension of library privileges. This policy outlines the rules regarding Borrowing Rules. All patrons must adhere strictly to these guidelines to ensure fair access and safety. Failure to comply with the Borrowing Rules policy may result in suspension of library privileges. This policy outlines the rules regarding Borrowing Rules. All patrons must adhere strictly to these guidelines to ensure fair access and safety. Failure to comply with the Borrowing Rules policy may result in suspension of library privileges. This policy outlines the rules regarding Borrowing Rules. All patrons must adhere strictly to these guidelines to ensure fair access and safety. Failure to comply with the Borrowing Rules policy may result in suspension of library privileges. This policy outlines the rules regarding Borrowing Rules. All patrons must adhere strictly to these guidelines to ensure fair access and safety. Failure to comply with the Borrowing Rules policy may result in suspension of library privileges. </w:t>
-      </w:r>
-    </w:p>
-    <w:p>
-      <w:r>
-        <w:t xml:space="preserve">This policy outlines the rules regarding Borrowing Rules. All patrons must adhere strictly to these guidelines to ensure fair access and safety. Failure to comply with the Borrowing Rules policy may result in suspension of library privileges. This policy outlines the rules regarding Borrowing Rules. All patrons must adhere strictly to these guidelines to ensure fair access and safety. Failure to comply with the Borrowing Rules policy may result in suspension of library privileges. This policy outlines the rules regarding Borrowing Rules. All patrons must adhere strictly to these guidelines to ensure fair access and safety. Failure to comply with the Borrowing Rules policy may result in suspension of library privileges. This policy outlines the rules regarding Borrowing Rules. All patrons must adhere strictly to these guidelines to ensure fair access and safety. Failure to comply with the Borrowing Rules policy may result in suspension of library privileges. This policy outlines the rules regarding Borrowing Rules. All patrons must adhere strictly to these guidelines to ensure fair access and safety. Failure to comply with the Borrowing Rules policy may result in suspension of library privileges. This policy outlines the rules regarding Borrowing Rules. All patrons must adhere strictly to these guidelines to ensure fair access and safety. Failure to comply with the Borrowing Rules policy may result in suspension of library privileges. </w:t>
-      </w:r>
-    </w:p>
-    <w:p>
-      <w:r>
-        <w:t xml:space="preserve">This policy outlines the rules regarding Borrowing Rules. All patrons must adhere strictly to these guidelines to ensure fair access and safety. Failure to comply with the Borrowing Rules policy may result in suspension of library privileges. This policy outlines the rules regarding Borrowing Rules. All patrons must adhere strictly to these guidelines to ensure fair access and safety. Failure to comply with the Borrowing Rules policy may result in suspension of library privileges. This policy outlines the rules regarding Borrowing Rules. All patrons must adhere strictly to these guidelines to ensure fair access and safety. Failure to comply with the Borrowing Rules policy may result in suspension of library privileges. This policy outlines the rules regarding Borrowing Rules. All patrons must adhere strictly to these guidelines to ensure fair access and safety. Failure to comply with the Borrowing Rules policy may result in suspension of library privileges. This policy outlines the rules regarding Borrowing Rules. All patrons must adhere strictly to these guidelines to ensure fair access and safety. Failure to comply with the Borrowing Rules policy may result in suspension of library privileges. This policy outlines the rules regarding Borrowing Rules. All patrons must adhere strictly to these guidelines to ensure fair access and safety. Failure to comply with the Borrowing Rules policy may result in suspension of library privileges. </w:t>
-      </w:r>
-    </w:p>
-    <w:p>
-      <w:r>
-        <w:br w:type="page"/>
-      </w:r>
-    </w:p>
-    <w:p>
-      <w:pPr>
-        <w:pStyle w:val="Heading2"/>
-      </w:pPr>
-      <w:r>
-        <w:t>Borrowing Rules - Part 3</w:t>
-      </w:r>
-    </w:p>
-    <w:p>
-      <w:r>
-        <w:t xml:space="preserve">This policy outlines the rules regarding Borrowing Rules. All patrons must adhere strictly to these guidelines to ensure fair access and safety. Failure to comply with the Borrowing Rules policy may result in suspension of library privileges. This policy outlines the rules regarding Borrowing Rules. All patrons must adhere strictly to these guidelines to ensure fair access and safety. Failure to comply with the Borrowing Rules policy may result in suspension of library privileges. This policy outlines the rules regarding Borrowing Rules. All patrons must adhere strictly to these guidelines to ensure fair access and safety. Failure to comply with the Borrowing Rules policy may result in suspension of library privileges. This policy outlines the rules regarding Borrowing Rules. All patrons must adhere strictly to these guidelines to ensure fair access and safety. Failure to comply with the Borrowing Rules policy may result in suspension of library privileges. This policy outlines the rules regarding Borrowing Rules. All patrons must adhere strictly to these guidelines to ensure fair access and safety. Failure to comply with the Borrowing Rules policy may result in suspension of library privileges. This policy outlines the rules regarding Borrowing Rules. All patrons must adhere strictly to these guidelines to ensure fair access and safety. Failure to comply with the Borrowing Rules policy may result in suspension of library privileges. </w:t>
-      </w:r>
-    </w:p>
-    <w:p>
-      <w:r>
-        <w:t xml:space="preserve">This policy outlines the rules regarding Borrowing Rules. All patrons must adhere strictly to these guidelines to ensure fair access and safety. Failure to comply with the Borrowing Rules policy may result in suspension of library privileges. This policy outlines the rules regarding Borrowing Rules. All patrons must adhere strictly to these guidelines to ensure fair access and safety. Failure to comply with the Borrowing Rules policy may result in suspension of library privileges. This policy outlines the rules regarding Borrowing Rules. All patrons must adhere strictly to these guidelines to ensure fair access and safety. Failure to comply with the Borrowing Rules policy may result in suspension of library privileges. This policy outlines the rules regarding Borrowing Rules. All patrons must adhere strictly to these guidelines to ensure fair access and safety. Failure to comply with the Borrowing Rules policy may result in suspension of library privileges. This policy outlines the rules regarding Borrowing Rules. All patrons must adhere strictly to these guidelines to ensure fair access and safety. Failure to comply with the Borrowing Rules policy may result in suspension of library privileges. This policy outlines the rules regarding Borrowing Rules. All patrons must adhere strictly to these guidelines to ensure fair access and safety. Failure to comply with the Borrowing Rules policy may result in suspension of library privileges. </w:t>
-      </w:r>
-    </w:p>
-    <w:p>
-      <w:r>
-        <w:t xml:space="preserve">This policy outlines the rules regarding Borrowing Rules. All patrons must adhere strictly to these guidelines to ensure fair access and safety. Failure to comply with the Borrowing Rules policy may result in suspension of library privileges. This policy outlines the rules regarding Borrowing Rules. All patrons must adhere strictly to these guidelines to ensure fair access and safety. Failure to comply with the Borrowing Rules policy may result in suspension of library privileges. This policy outlines the rules regarding Borrowing Rules. All patrons must adhere strictly to these guidelines to ensure fair access and safety. Failure to comply with the Borrowing Rules policy may result in suspension of library privileges. This policy outlines the rules regarding Borrowing Rules. All patrons must adhere strictly to these guidelines to ensure fair access and safety. Failure to comply with the Borrowing Rules policy may result in suspension of library privileges. This policy outlines the rules regarding Borrowing Rules. All patrons must adhere strictly to these guidelines to ensure fair access and safety. Failure to comply with the Borrowing Rules policy may result in suspension of library privileges. This policy outlines the rules regarding Borrowing Rules. All patrons must adhere strictly to these guidelines to ensure fair access and safety. Failure to comply with the Borrowing Rules policy may result in suspension of library privileges. </w:t>
-      </w:r>
-    </w:p>
-    <w:p>
-      <w:r>
-        <w:br w:type="page"/>
-      </w:r>
-    </w:p>
-    <w:p>
-      <w:pPr>
-        <w:pStyle w:val="Heading2"/>
-      </w:pPr>
-      <w:r>
-        <w:t>Borrowing Rules - Part 4</w:t>
-      </w:r>
-    </w:p>
-    <w:p>
-      <w:r>
-        <w:t xml:space="preserve">This policy outlines the rules regarding Borrowing Rules. All patrons must adhere strictly to these guidelines to ensure fair access and safety. Failure to comply with the Borrowing Rules policy may result in suspension of library privileges. This policy outlines the rules regarding Borrowing Rules. All patrons must adhere strictly to these guidelines to ensure fair access and safety. Failure to comply with the Borrowing Rules policy may result in suspension of library privileges. This policy outlines the rules regarding Borrowing Rules. All patrons must adhere strictly to these guidelines to ensure fair access and safety. Failure to comply with the Borrowing Rules policy may result in suspension of library privileges. This policy outlines the rules regarding Borrowing Rules. All patrons must adhere strictly to these guidelines to ensure fair access and safety. Failure to comply with the Borrowing Rules policy may result in suspension of library privileges. This policy outlines the rules regarding Borrowing Rules. All patrons must adhere strictly to these guidelines to ensure fair access and safety. Failure to comply with the Borrowing Rules policy may result in suspension of library privileges. This policy outlines the rules regarding Borrowing Rules. All patrons must adhere strictly to these guidelines to ensure fair access and safety. Failure to comply with the Borrowing Rules policy may result in suspension of library privileges. </w:t>
-      </w:r>
-    </w:p>
-    <w:p>
-      <w:r>
-        <w:t xml:space="preserve">This policy outlines the rules regarding Borrowing Rules. All patrons must adhere strictly to these guidelines to ensure fair access and safety. Failure to comply with the Borrowing Rules policy may result in suspension of library privileges. This policy outlines the rules regarding Borrowing Rules. All patrons must adhere strictly to these guidelines to ensure fair access and safety. Failure to comply with the Borrowing Rules policy may result in suspension of library privileges. This policy outlines the rules regarding Borrowing Rules. All patrons must adhere strictly to these guidelines to ensure fair access and safety. Failure to comply with the Borrowing Rules policy may result in suspension of library privileges. This policy outlines the rules regarding Borrowing Rules. All patrons must adhere strictly to these guidelines to ensure fair access and safety. Failure to comply with the Borrowing Rules policy may result in suspension of library privileges. This policy outlines the rules regarding Borrowing Rules. All patrons must adhere strictly to these guidelines to ensure fair access and safety. Failure to comply with the Borrowing Rules policy may result in suspension of library privileges. This policy outlines the rules regarding Borrowing Rules. All patrons must adhere strictly to these guidelines to ensure fair access and safety. Failure to comply with the Borrowing Rules policy may result in suspension of library privileges. </w:t>
-      </w:r>
-    </w:p>
-    <w:p>
-      <w:r>
-        <w:t xml:space="preserve">This policy outlines the rules regarding Borrowing Rules. All patrons must adhere strictly to these guidelines to ensure fair access and safety. Failure to comply with the Borrowing Rules policy may result in suspension of library privileges. This policy outlines the rules regarding Borrowing Rules. All patrons must adhere strictly to these guidelines to ensure fair access and safety. Failure to comply with the Borrowing Rules policy may result in suspension of library privileges. This policy outlines the rules regarding Borrowing Rules. All patrons must adhere strictly to these guidelines to ensure fair access and safety. Failure to comply with the Borrowing Rules policy may result in suspension of library privileges. This policy outlines the rules regarding Borrowing Rules. All patrons must adhere strictly to these guidelines to ensure fair access and safety. Failure to comply with the Borrowing Rules policy may result in suspension of library privileges. This policy outlines the rules regarding Borrowing Rules. All patrons must adhere strictly to these guidelines to ensure fair access and safety. Failure to comply with the Borrowing Rules policy may result in suspension of library privileges. This policy outlines the rules regarding Borrowing Rules. All patrons must adhere strictly to these guidelines to ensure fair access and safety. Failure to comply with the Borrowing Rules policy may result in suspension of library privileges. </w:t>
-      </w:r>
-    </w:p>
-    <w:p>
-      <w:r>
-        <w:br w:type="page"/>
-      </w:r>
-    </w:p>
-    <w:p>
-      <w:pPr>
-        <w:pStyle w:val="Heading2"/>
-      </w:pPr>
-      <w:r>
-        <w:t>Borrowing Rules - Part 5</w:t>
-      </w:r>
-    </w:p>
-    <w:p>
-      <w:r>
-        <w:t xml:space="preserve">This policy outlines the rules regarding Borrowing Rules. All patrons must adhere strictly to these guidelines to ensure fair access and safety. Failure to comply with the Borrowing Rules policy may result in suspension of library privileges. This policy outlines the rules regarding Borrowing Rules. All patrons must adhere strictly to these guidelines to ensure fair access and safety. Failure to comply with the Borrowing Rules policy may result in suspension of library privileges. This policy outlines the rules regarding Borrowing Rules. All patrons must adhere strictly to these guidelines to ensure fair access and safety. Failure to comply with the Borrowing Rules policy may result in suspension of library privileges. This policy outlines the rules regarding Borrowing Rules. All patrons must adhere strictly to these guidelines to ensure fair access and safety. Failure to comply with the Borrowing Rules policy may result in suspension of library privileges. This policy outlines the rules regarding Borrowing Rules. All patrons must adhere strictly to these guidelines to ensure fair access and safety. Failure to comply with the Borrowing Rules policy may result in suspension of library privileges. This policy outlines the rules regarding Borrowing Rules. All patrons must adhere strictly to these guidelines to ensure fair access and safety. Failure to comply with the Borrowing Rules policy may result in suspension of library privileges. </w:t>
-      </w:r>
-    </w:p>
-    <w:p>
-      <w:r>
-        <w:t xml:space="preserve">This policy outlines the rules regarding Borrowing Rules. All patrons must adhere strictly to these guidelines to ensure fair access and safety. Failure to comply with the Borrowing Rules policy may result in suspension of library privileges. This policy outlines the rules regarding Borrowing Rules. All patrons must adhere strictly to these guidelines to ensure fair access and safety. Failure to comply with the Borrowing Rules policy may result in suspension of library privileges. This policy outlines the rules regarding Borrowing Rules. All patrons must adhere strictly to these guidelines to ensure fair access and safety. Failure to comply with the Borrowing Rules policy may result in suspension of library privileges. This policy outlines the rules regarding Borrowing Rules. All patrons must adhere strictly to these guidelines to ensure fair access and safety. Failure to comply with the Borrowing Rules policy may result in suspension of library privileges. This policy outlines the rules regarding Borrowing Rules. All patrons must adhere strictly to these guidelines to ensure fair access and safety. Failure to comply with the Borrowing Rules policy may result in suspension of library privileges. This policy outlines the rules regarding Borrowing Rules. All patrons must adhere strictly to these guidelines to ensure fair access and safety. Failure to comply with the Borrowing Rules policy may result in suspension of library privileges. </w:t>
-      </w:r>
-    </w:p>
-    <w:p>
-      <w:r>
-        <w:t xml:space="preserve">This policy outlines the rules regarding Borrowing Rules. All patrons must adhere strictly to these guidelines to ensure fair access and safety. Failure to comply with the Borrowing Rules policy may result in suspension of library privileges. This policy outlines the rules regarding Borrowing Rules. All patrons must adhere strictly to these guidelines to ensure fair access and safety. Failure to comply with the Borrowing Rules policy may result in suspension of library privileges. This policy outlines the rules regarding Borrowing Rules. All patrons must adhere strictly to these guidelines to ensure fair access and safety. Failure to comply with the Borrowing Rules policy may result in suspension of library privileges. This policy outlines the rules regarding Borrowing Rules. All patrons must adhere strictly to these guidelines to ensure fair access and safety. Failure to comply with the Borrowing Rules policy may result in suspension of library privileges. This policy outlines the rules regarding Borrowing Rules. All patrons must adhere strictly to these guidelines to ensure fair access and safety. Failure to comply with the Borrowing Rules policy may result in suspension of library privileges. This policy outlines the rules regarding Borrowing Rules. All patrons must adhere strictly to these guidelines to ensure fair access and safety. Failure to comply with the Borrowing Rules policy may result in suspension of library privileges. </w:t>
-      </w:r>
-    </w:p>
-    <w:p>
-      <w:r>
-        <w:br w:type="page"/>
-      </w:r>
-    </w:p>
-    <w:p>
-      <w:pPr>
-        <w:pStyle w:val="Heading2"/>
-      </w:pPr>
-      <w:r>
-        <w:t>Borrowing Rules - Part 6</w:t>
-      </w:r>
-    </w:p>
-    <w:p>
-      <w:r>
-        <w:t xml:space="preserve">This policy outlines the rules regarding Borrowing Rules. All patrons must adhere strictly to these guidelines to ensure fair access and safety. Failure to comply with the Borrowing Rules policy may result in suspension of library privileges. This policy outlines the rules regarding Borrowing Rules. All patrons must adhere strictly to these guidelines to ensure fair access and safety. Failure to comply with the Borrowing Rules policy may result in suspension of library privileges. This policy outlines the rules regarding Borrowing Rules. All patrons must adhere strictly to these guidelines to ensure fair access and safety. Failure to comply with the Borrowing Rules policy may result in suspension of library privileges. This policy outlines the rules regarding Borrowing Rules. All patrons must adhere strictly to these guidelines to ensure fair access and safety. Failure to comply with the Borrowing Rules policy may result in suspension of library privileges. This policy outlines the rules regarding Borrowing Rules. All patrons must adhere strictly to these guidelines to ensure fair access and safety. Failure to comply with the Borrowing Rules policy may result in suspension of library privileges. This policy outlines the rules regarding Borrowing Rules. All patrons must adhere strictly to these guidelines to ensure fair access and safety. Failure to comply with the Borrowing Rules policy may result in suspension of library privileges. </w:t>
-      </w:r>
-    </w:p>
-    <w:p>
-      <w:r>
-        <w:t xml:space="preserve">This policy outlines the rules regarding Borrowing Rules. All patrons must adhere strictly to these guidelines to ensure fair access and safety. Failure to comply with the Borrowing Rules policy may result in suspension of library privileges. This policy outlines the rules regarding Borrowing Rules. All patrons must adhere strictly to these guidelines to ensure fair access and safety. Failure to comply with the Borrowing Rules policy may result in suspension of library privileges. This policy outlines the rules regarding Borrowing Rules. All patrons must adhere strictly to these guidelines to ensure fair access and safety. Failure to comply with the Borrowing Rules policy may result in suspension of library privileges. This policy outlines the rules regarding Borrowing Rules. All patrons must adhere strictly to these guidelines to ensure fair access and safety. Failure to comply with the Borrowing Rules policy may result in suspension of library privileges. This policy outlines the rules regarding Borrowing Rules. All patrons must adhere strictly to these guidelines to ensure fair access and safety. Failure to comply with the Borrowing Rules policy may result in suspension of library privileges. This policy outlines the rules regarding Borrowing Rules. All patrons must adhere strictly to these guidelines to ensure fair access and safety. Failure to comply with the Borrowing Rules policy may result in suspension of library privileges. </w:t>
-      </w:r>
-    </w:p>
-    <w:p>
-      <w:r>
-        <w:t xml:space="preserve">This policy outlines the rules regarding Borrowing Rules. All patrons must adhere strictly to these guidelines to ensure fair access and safety. Failure to comply with the Borrowing Rules policy may result in suspension of library privileges. This policy outlines the rules regarding Borrowing Rules. All patrons must adhere strictly to these guidelines to ensure fair access and safety. Failure to comply with the Borrowing Rules policy may result in suspension of library privileges. This policy outlines the rules regarding Borrowing Rules. All patrons must adhere strictly to these guidelines to ensure fair access and safety. Failure to comply with the Borrowing Rules policy may result in suspension of library privileges. This policy outlines the rules regarding Borrowing Rules. All patrons must adhere strictly to these guidelines to ensure fair access and safety. Failure to comply with the Borrowing Rules policy may result in suspension of library privileges. This policy outlines the rules regarding Borrowing Rules. All patrons must adhere strictly to these guidelines to ensure fair access and safety. Failure to comply with the Borrowing Rules policy may result in suspension of library privileges. This policy outlines the rules regarding Borrowing Rules. All patrons must adhere strictly to these guidelines to ensure fair access and safety. Failure to comply with the Borrowing Rules policy may result in suspension of library privileges. </w:t>
-      </w:r>
-    </w:p>
-    <w:p>
-      <w:r>
-        <w:br w:type="page"/>
-      </w:r>
-    </w:p>
-    <w:p>
-      <w:pPr>
-        <w:pStyle w:val="Heading2"/>
-      </w:pPr>
-      <w:r>
-        <w:t>Borrowing Rules - Part 7</w:t>
-      </w:r>
-    </w:p>
-    <w:p>
-      <w:r>
-        <w:t xml:space="preserve">This policy outlines the rules regarding Borrowing Rules. All patrons must adhere strictly to these guidelines to ensure fair access and safety. Failure to comply with the Borrowing Rules policy may result in suspension of library privileges. This policy outlines the rules regarding Borrowing Rules. All patrons must adhere strictly to these guidelines to ensure fair access and safety. Failure to comply with the Borrowing Rules policy may result in suspension of library privileges. This policy outlines the rules regarding Borrowing Rules. All patrons must adhere strictly to these guidelines to ensure fair access and safety. Failure to comply with the Borrowing Rules policy may result in suspension of library privileges. This policy outlines the rules regarding Borrowing Rules. All patrons must adhere strictly to these guidelines to ensure fair access and safety. Failure to comply with the Borrowing Rules policy may result in suspension of library privileges. This policy outlines the rules regarding Borrowing Rules. All patrons must adhere strictly to these guidelines to ensure fair access and safety. Failure to comply with the Borrowing Rules policy may result in suspension of library privileges. This policy outlines the rules regarding Borrowing Rules. All patrons must adhere strictly to these guidelines to ensure fair access and safety. Failure to comply with the Borrowing Rules policy may result in suspension of library privileges. </w:t>
-      </w:r>
-    </w:p>
-    <w:p>
-      <w:r>
-        <w:t xml:space="preserve">This policy outlines the rules regarding Borrowing Rules. All patrons must adhere strictly to these guidelines to ensure fair access and safety. Failure to comply with the Borrowing Rules policy may result in suspension of library privileges. This policy outlines the rules regarding Borrowing Rules. All patrons must adhere strictly to these guidelines to ensure fair access and safety. Failure to comply with the Borrowing Rules policy may result in suspension of library privileges. This policy outlines the rules regarding Borrowing Rules. All patrons must adhere strictly to these guidelines to ensure fair access and safety. Failure to comply with the Borrowing Rules policy may result in suspension of library privileges. This policy outlines the rules regarding Borrowing Rules. All patrons must adhere strictly to these guidelines to ensure fair access and safety. Failure to comply with the Borrowing Rules policy may result in suspension of library privileges. This policy outlines the rules regarding Borrowing Rules. All patrons must adhere strictly to these guidelines to ensure fair access and safety. Failure to comply with the Borrowing Rules policy may result in suspension of library privileges. This policy outlines the rules regarding Borrowing Rules. All patrons must adhere strictly to these guidelines to ensure fair access and safety. Failure to comply with the Borrowing Rules policy may result in suspension of library privileges. </w:t>
-      </w:r>
-    </w:p>
-    <w:p>
-      <w:r>
-        <w:t xml:space="preserve">This policy outlines the rules regarding Borrowing Rules. All patrons must adhere strictly to these guidelines to ensure fair access and safety. Failure to comply with the Borrowing Rules policy may result in suspension of library privileges. This policy outlines the rules regarding Borrowing Rules. All patrons must adhere strictly to these guidelines to ensure fair access and safety. Failure to comply with the Borrowing Rules policy may result in suspension of library privileges. This policy outlines the rules regarding Borrowing Rules. All patrons must adhere strictly to these guidelines to ensure fair access and safety. Failure to comply with the Borrowing Rules policy may result in suspension of library privileges. This policy outlines the rules regarding Borrowing Rules. All patrons must adhere strictly to these guidelines to ensure fair access and safety. Failure to comply with the Borrowing Rules policy may result in suspension of library privileges. This policy outlines the rules regarding Borrowing Rules. All patrons must adhere strictly to these guidelines to ensure fair access and safety. Failure to comply with the Borrowing Rules policy may result in suspension of library privileges. This policy outlines the rules regarding Borrowing Rules. All patrons must adhere strictly to these guidelines to ensure fair access and safety. Failure to comply with the Borrowing Rules policy may result in suspension of library privileges. </w:t>
-      </w:r>
-    </w:p>
-    <w:p>
-      <w:r>
-        <w:br w:type="page"/>
-      </w:r>
-    </w:p>
-    <w:p>
-      <w:pPr>
-        <w:pStyle w:val="Heading2"/>
-      </w:pPr>
-      <w:r>
-        <w:t>Borrowing Rules - Part 8</w:t>
-      </w:r>
-    </w:p>
-    <w:p>
-      <w:r>
-        <w:t xml:space="preserve">This policy outlines the rules regarding Borrowing Rules. All patrons must adhere strictly to these guidelines to ensure fair access and safety. Failure to comply with the Borrowing Rules policy may result in suspension of library privileges. This policy outlines the rules regarding Borrowing Rules. All patrons must adhere strictly to these guidelines to ensure fair access and safety. Failure to comply with the Borrowing Rules policy may result in suspension of library privileges. This policy outlines the rules regarding Borrowing Rules. All patrons must adhere strictly to these guidelines to ensure fair access and safety. Failure to comply with the Borrowing Rules policy may result in suspension of library privileges. This policy outlines the rules regarding Borrowing Rules. All patrons must adhere strictly to these guidelines to ensure fair access and safety. Failure to comply with the Borrowing Rules policy may result in suspension of library privileges. This policy outlines the rules regarding Borrowing Rules. All patrons must adhere strictly to these guidelines to ensure fair access and safety. Failure to comply with the Borrowing Rules policy may result in suspension of library privileges. This policy outlines the rules regarding Borrowing Rules. All patrons must adhere strictly to these guidelines to ensure fair access and safety. Failure to comply with the Borrowing Rules policy may result in suspension of library privileges. </w:t>
-      </w:r>
-    </w:p>
-    <w:p>
-      <w:r>
-        <w:t xml:space="preserve">This policy outlines the rules regarding Borrowing Rules. All patrons must adhere strictly to these guidelines to ensure fair access and safety. Failure to comply with the Borrowing Rules policy may result in suspension of library privileges. This policy outlines the rules regarding Borrowing Rules. All patrons must adhere strictly to these guidelines to ensure fair access and safety. Failure to comply with the Borrowing Rules policy may result in suspension of library privileges. This policy outlines the rules regarding Borrowing Rules. All patrons must adhere strictly to these guidelines to ensure fair access and safety. Failure to comply with the Borrowing Rules policy may result in suspension of library privileges. This policy outlines the rules regarding Borrowing Rules. All patrons must adhere strictly to these guidelines to ensure fair access and safety. Failure to comply with the Borrowing Rules policy may result in suspension of library privileges. This policy outlines the rules regarding Borrowing Rules. All patrons must adhere strictly to these guidelines to ensure fair access and safety. Failure to comply with the Borrowing Rules policy may result in suspension of library privileges. This policy outlines the rules regarding Borrowing Rules. All patrons must adhere strictly to these guidelines to ensure fair access and safety. Failure to comply with the Borrowing Rules policy may result in suspension of library privileges. </w:t>
-      </w:r>
-    </w:p>
-    <w:p>
-      <w:r>
-        <w:t xml:space="preserve">This policy outlines the rules regarding Borrowing Rules. All patrons must adhere strictly to these guidelines to ensure fair access and safety. Failure to comply with the Borrowing Rules policy may result in suspension of library privileges. This policy outlines the rules regarding Borrowing Rules. All patrons must adhere strictly to these guidelines to ensure fair access and safety. Failure to comply with the Borrowing Rules policy may result in suspension of library privileges. This policy outlines the rules regarding Borrowing Rules. All patrons must adhere strictly to these guidelines to ensure fair access and safety. Failure to comply with the Borrowing Rules policy may result in suspension of library privileges. This policy outlines the rules regarding Borrowing Rules. All patrons must adhere strictly to these guidelines to ensure fair access and safety. Failure to comply with the Borrowing Rules policy may result in suspension of library privileges. This policy outlines the rules regarding Borrowing Rules. All patrons must adhere strictly to these guidelines to ensure fair access and safety. Failure to comply with the Borrowing Rules policy may result in suspension of library privileges. This policy outlines the rules regarding Borrowing Rules. All patrons must adhere strictly to these guidelines to ensure fair access and safety. Failure to comply with the Borrowing Rules policy may result in suspension of library privileges. </w:t>
-      </w:r>
-    </w:p>
-    <w:p>
-      <w:r>
-        <w:br w:type="page"/>
-      </w:r>
-    </w:p>
-    <w:p>
-      <w:pPr>
-        <w:pStyle w:val="Heading2"/>
-      </w:pPr>
-      <w:r>
-        <w:t>Borrowing Rules - Part 9</w:t>
-      </w:r>
-    </w:p>
-    <w:p>
-      <w:r>
-        <w:t xml:space="preserve">This policy outlines the rules regarding Borrowing Rules. All patrons must adhere strictly to these guidelines to ensure fair access and safety. Failure to comply with the Borrowing Rules policy may result in suspension of library privileges. This policy outlines the rules regarding Borrowing Rules. All patrons must adhere strictly to these guidelines to ensure fair access and safety. Failure to comply with the Borrowing Rules policy may result in suspension of library privileges. This policy outlines the rules regarding Borrowing Rules. All patrons must adhere strictly to these guidelines to ensure fair access and safety. Failure to comply with the Borrowing Rules policy may result in suspension of library privileges. This policy outlines the rules regarding Borrowing Rules. All patrons must adhere strictly to these guidelines to ensure fair access and safety. Failure to comply with the Borrowing Rules policy may result in suspension of library privileges. This policy outlines the rules regarding Borrowing Rules. All patrons must adhere strictly to these guidelines to ensure fair access and safety. Failure to comply with the Borrowing Rules policy may result in suspension of library privileges. This policy outlines the rules regarding Borrowing Rules. All patrons must adhere strictly to these guidelines to ensure fair access and safety. Failure to comply with the Borrowing Rules policy may result in suspension of library privileges. </w:t>
-      </w:r>
-    </w:p>
-    <w:p>
-      <w:r>
-        <w:t xml:space="preserve">This policy outlines the rules regarding Borrowing Rules. All patrons must adhere strictly to these guidelines to ensure fair access and safety. Failure to comply with the Borrowing Rules policy may result in suspension of library privileges. This policy outlines the rules regarding Borrowing Rules. All patrons must adhere strictly to these guidelines to ensure fair access and safety. Failure to comply with the Borrowing Rules policy may result in suspension of library privileges. This policy outlines the rules regarding Borrowing Rules. All patrons must adhere strictly to these guidelines to ensure fair access and safety. Failure to comply with the Borrowing Rules policy may result in suspension of library privileges. This policy outlines the rules regarding Borrowing Rules. All patrons must adhere strictly to these guidelines to ensure fair access and safety. Failure to comply with the Borrowing Rules policy may result in suspension of library privileges. This policy outlines the rules regarding Borrowing Rules. All patrons must adhere strictly to these guidelines to ensure fair access and safety. Failure to comply with the Borrowing Rules policy may result in suspension of library privileges. This policy outlines the rules regarding Borrowing Rules. All patrons must adhere strictly to these guidelines to ensure fair access and safety. Failure to comply with the Borrowing Rules policy may result in suspension of library privileges. </w:t>
-      </w:r>
-    </w:p>
-    <w:p>
-      <w:r>
-        <w:t xml:space="preserve">This policy outlines the rules regarding Borrowing Rules. All patrons must adhere strictly to these guidelines to ensure fair access and safety. Failure to comply with the Borrowing Rules policy may result in suspension of library privileges. This policy outlines the rules regarding Borrowing Rules. All patrons must adhere strictly to these guidelines to ensure fair access and safety. Failure to comply with the Borrowing Rules policy may result in suspension of library privileges. This policy outlines the rules regarding Borrowing Rules. All patrons must adhere strictly to these guidelines to ensure fair access and safety. Failure to comply with the Borrowing Rules policy may result in suspension of library privileges. This policy outlines the rules regarding Borrowing Rules. All patrons must adhere strictly to these guidelines to ensure fair access and safety. Failure to comply with the Borrowing Rules policy may result in suspension of library privileges. This policy outlines the rules regarding Borrowing Rules. All patrons must adhere strictly to these guidelines to ensure fair access and safety. Failure to comply with the Borrowing Rules policy may result in suspension of library privileges. This policy outlines the rules regarding Borrowing Rules. All patrons must adhere strictly to these guidelines to ensure fair access and safety. Failure to comply with the Borrowing Rules policy may result in suspension of library privileges. </w:t>
-      </w:r>
-    </w:p>
-    <w:p>
-      <w:r>
-        <w:br w:type="page"/>
-      </w:r>
-    </w:p>
-    <w:p>
-      <w:pPr>
-        <w:pStyle w:val="Heading2"/>
-      </w:pPr>
-      <w:r>
-        <w:t>Borrowing Rules - Part 10</w:t>
-      </w:r>
-    </w:p>
-    <w:p>
-      <w:r>
-        <w:t xml:space="preserve">This policy outlines the rules regarding Borrowing Rules. All patrons must adhere strictly to these guidelines to ensure fair access and safety. Failure to comply with the Borrowing Rules policy may result in suspension of library privileges. This policy outlines the rules regarding Borrowing Rules. All patrons must adhere strictly to these guidelines to ensure fair access and safety. Failure to comply with the Borrowing Rules policy may result in suspension of library privileges. This policy outlines the rules regarding Borrowing Rules. All patrons must adhere strictly to these guidelines to ensure fair access and safety. Failure to comply with the Borrowing Rules policy may result in suspension of library privileges. This policy outlines the rules regarding Borrowing Rules. All patrons must adhere strictly to these guidelines to ensure fair access and safety. Failure to comply with the Borrowing Rules policy may result in suspension of library privileges. This policy outlines the rules regarding Borrowing Rules. All patrons must adhere strictly to these guidelines to ensure fair access and safety. Failure to comply with the Borrowing Rules policy may result in suspension of library privileges. This policy outlines the rules regarding Borrowing Rules. All patrons must adhere strictly to these guidelines to ensure fair access and safety. Failure to comply with the Borrowing Rules policy may result in suspension of library privileges. </w:t>
-      </w:r>
-    </w:p>
-    <w:p>
-      <w:r>
-        <w:t xml:space="preserve">This policy outlines the rules regarding Borrowing Rules. All patrons must adhere strictly to these guidelines to ensure fair access and safety. Failure to comply with the Borrowing Rules policy may result in suspension of library privileges. This policy outlines the rules regarding Borrowing Rules. All patrons must adhere strictly to these guidelines to ensure fair access and safety. Failure to comply with the Borrowing Rules policy may result in suspension of library privileges. This policy outlines the rules regarding Borrowing Rules. All patrons must adhere strictly to these guidelines to ensure fair access and safety. Failure to comply with the Borrowing Rules policy may result in suspension of library privileges. This policy outlines the rules regarding Borrowing Rules. All patrons must adhere strictly to these guidelines to ensure fair access and safety. Failure to comply with the Borrowing Rules policy may result in suspension of library privileges. This policy outlines the rules regarding Borrowing Rules. All patrons must adhere strictly to these guidelines to ensure fair access and safety. Failure to comply with the Borrowing Rules policy may result in suspension of library privileges. This policy outlines the rules regarding Borrowing Rules. All patrons must adhere strictly to these guidelines to ensure fair access and safety. Failure to comply with the Borrowing Rules policy may result in suspension of library privileges. </w:t>
-      </w:r>
-    </w:p>
-    <w:p>
-      <w:r>
-        <w:t xml:space="preserve">This policy outlines the rules regarding Borrowing Rules. All patrons must adhere strictly to these guidelines to ensure fair access and safety. Failure to comply with the Borrowing Rules policy may result in suspension of library privileges. This policy outlines the rules regarding Borrowing Rules. All patrons must adhere strictly to these guidelines to ensure fair access and safety. Failure to comply with the Borrowing Rules policy may result in suspension of library privileges. This policy outlines the rules regarding Borrowing Rules. All patrons must adhere strictly to these guidelines to ensure fair access and safety. Failure to comply with the Borrowing Rules policy may result in suspension of library privileges. This policy outlines the rules regarding Borrowing Rules. All patrons must adhere strictly to these guidelines to ensure fair access and safety. Failure to comply with the Borrowing Rules policy may result in suspension of library privileges. This policy outlines the rules regarding Borrowing Rules. All patrons must adhere strictly to these guidelines to ensure fair access and safety. Failure to comply with the Borrowing Rules policy may result in suspension of library privileges. This policy outlines the rules regarding Borrowing Rules. All patrons must adhere strictly to these guidelines to ensure fair access and safety. Failure to comply with the Borrowing Rules policy may result in suspension of library privileges. </w:t>
-      </w:r>
-    </w:p>
-    <w:p>
-      <w:r>
-        <w:br w:type="page"/>
+        <w:t>- Standard Loan Period: Undergraduate students may borrow up to 10 books for 21 days. Graduate students may borrow up to 25 books for 60 days. Faculty members may borrow up to 50 books for an entire semester.</w:t>
+        <w:br/>
+        <w:t>- Renewals: Items may be renewed up to 3 times online unless requested by another patron.</w:t>
+        <w:br/>
+        <w:t>- Reserves &amp; Reference: Reference books and reserve materials must be used within the library and cannot be checked out.</w:t>
+        <w:br/>
+        <w:t>- Overdue Fines: Standard items incur a fine of .50 per day after the due date. Overdue reserve items incur a fine of .00 per hour.</w:t>
+        <w:br/>
+        <w:t>- Account Suspensions: Borrowing privileges are suspended if unpaid fines exceed .00 or if any item is overdue by more than 30 days.</w:t>
       </w:r>
     </w:p>
     <w:p>
@@ -307,283 +40,14 @@
       </w:r>
     </w:p>
     <w:p>
-      <w:pPr>
-        <w:pStyle w:val="Heading2"/>
-      </w:pPr>
       <w:r>
-        <w:t>Code of Conduct - Part 1</w:t>
-      </w:r>
-    </w:p>
-    <w:p>
-      <w:r>
-        <w:t xml:space="preserve">This policy outlines the rules regarding Code of Conduct. All patrons must adhere strictly to these guidelines to ensure fair access and safety. Failure to comply with the Code of Conduct policy may result in suspension of library privileges. This policy outlines the rules regarding Code of Conduct. All patrons must adhere strictly to these guidelines to ensure fair access and safety. Failure to comply with the Code of Conduct policy may result in suspension of library privileges. This policy outlines the rules regarding Code of Conduct. All patrons must adhere strictly to these guidelines to ensure fair access and safety. Failure to comply with the Code of Conduct policy may result in suspension of library privileges. This policy outlines the rules regarding Code of Conduct. All patrons must adhere strictly to these guidelines to ensure fair access and safety. Failure to comply with the Code of Conduct policy may result in suspension of library privileges. This policy outlines the rules regarding Code of Conduct. All patrons must adhere strictly to these guidelines to ensure fair access and safety. Failure to comply with the Code of Conduct policy may result in suspension of library privileges. This policy outlines the rules regarding Code of Conduct. All patrons must adhere strictly to these guidelines to ensure fair access and safety. Failure to comply with the Code of Conduct policy may result in suspension of library privileges. </w:t>
-      </w:r>
-    </w:p>
-    <w:p>
-      <w:r>
-        <w:t xml:space="preserve">This policy outlines the rules regarding Code of Conduct. All patrons must adhere strictly to these guidelines to ensure fair access and safety. Failure to comply with the Code of Conduct policy may result in suspension of library privileges. This policy outlines the rules regarding Code of Conduct. All patrons must adhere strictly to these guidelines to ensure fair access and safety. Failure to comply with the Code of Conduct policy may result in suspension of library privileges. This policy outlines the rules regarding Code of Conduct. All patrons must adhere strictly to these guidelines to ensure fair access and safety. Failure to comply with the Code of Conduct policy may result in suspension of library privileges. This policy outlines the rules regarding Code of Conduct. All patrons must adhere strictly to these guidelines to ensure fair access and safety. Failure to comply with the Code of Conduct policy may result in suspension of library privileges. This policy outlines the rules regarding Code of Conduct. All patrons must adhere strictly to these guidelines to ensure fair access and safety. Failure to comply with the Code of Conduct policy may result in suspension of library privileges. This policy outlines the rules regarding Code of Conduct. All patrons must adhere strictly to these guidelines to ensure fair access and safety. Failure to comply with the Code of Conduct policy may result in suspension of library privileges. </w:t>
-      </w:r>
-    </w:p>
-    <w:p>
-      <w:r>
-        <w:t xml:space="preserve">This policy outlines the rules regarding Code of Conduct. All patrons must adhere strictly to these guidelines to ensure fair access and safety. Failure to comply with the Code of Conduct policy may result in suspension of library privileges. This policy outlines the rules regarding Code of Conduct. All patrons must adhere strictly to these guidelines to ensure fair access and safety. Failure to comply with the Code of Conduct policy may result in suspension of library privileges. This policy outlines the rules regarding Code of Conduct. All patrons must adhere strictly to these guidelines to ensure fair access and safety. Failure to comply with the Code of Conduct policy may result in suspension of library privileges. This policy outlines the rules regarding Code of Conduct. All patrons must adhere strictly to these guidelines to ensure fair access and safety. Failure to comply with the Code of Conduct policy may result in suspension of library privileges. This policy outlines the rules regarding Code of Conduct. All patrons must adhere strictly to these guidelines to ensure fair access and safety. Failure to comply with the Code of Conduct policy may result in suspension of library privileges. This policy outlines the rules regarding Code of Conduct. All patrons must adhere strictly to these guidelines to ensure fair access and safety. Failure to comply with the Code of Conduct policy may result in suspension of library privileges. </w:t>
-      </w:r>
-    </w:p>
-    <w:p>
-      <w:r>
-        <w:br w:type="page"/>
-      </w:r>
-    </w:p>
-    <w:p>
-      <w:pPr>
-        <w:pStyle w:val="Heading2"/>
-      </w:pPr>
-      <w:r>
-        <w:t>Code of Conduct - Part 2</w:t>
-      </w:r>
-    </w:p>
-    <w:p>
-      <w:r>
-        <w:t xml:space="preserve">This policy outlines the rules regarding Code of Conduct. All patrons must adhere strictly to these guidelines to ensure fair access and safety. Failure to comply with the Code of Conduct policy may result in suspension of library privileges. This policy outlines the rules regarding Code of Conduct. All patrons must adhere strictly to these guidelines to ensure fair access and safety. Failure to comply with the Code of Conduct policy may result in suspension of library privileges. This policy outlines the rules regarding Code of Conduct. All patrons must adhere strictly to these guidelines to ensure fair access and safety. Failure to comply with the Code of Conduct policy may result in suspension of library privileges. This policy outlines the rules regarding Code of Conduct. All patrons must adhere strictly to these guidelines to ensure fair access and safety. Failure to comply with the Code of Conduct policy may result in suspension of library privileges. This policy outlines the rules regarding Code of Conduct. All patrons must adhere strictly to these guidelines to ensure fair access and safety. Failure to comply with the Code of Conduct policy may result in suspension of library privileges. This policy outlines the rules regarding Code of Conduct. All patrons must adhere strictly to these guidelines to ensure fair access and safety. Failure to comply with the Code of Conduct policy may result in suspension of library privileges. </w:t>
-      </w:r>
-    </w:p>
-    <w:p>
-      <w:r>
-        <w:t xml:space="preserve">This policy outlines the rules regarding Code of Conduct. All patrons must adhere strictly to these guidelines to ensure fair access and safety. Failure to comply with the Code of Conduct policy may result in suspension of library privileges. This policy outlines the rules regarding Code of Conduct. All patrons must adhere strictly to these guidelines to ensure fair access and safety. Failure to comply with the Code of Conduct policy may result in suspension of library privileges. This policy outlines the rules regarding Code of Conduct. All patrons must adhere strictly to these guidelines to ensure fair access and safety. Failure to comply with the Code of Conduct policy may result in suspension of library privileges. This policy outlines the rules regarding Code of Conduct. All patrons must adhere strictly to these guidelines to ensure fair access and safety. Failure to comply with the Code of Conduct policy may result in suspension of library privileges. This policy outlines the rules regarding Code of Conduct. All patrons must adhere strictly to these guidelines to ensure fair access and safety. Failure to comply with the Code of Conduct policy may result in suspension of library privileges. This policy outlines the rules regarding Code of Conduct. All patrons must adhere strictly to these guidelines to ensure fair access and safety. Failure to comply with the Code of Conduct policy may result in suspension of library privileges. </w:t>
-      </w:r>
-    </w:p>
-    <w:p>
-      <w:r>
-        <w:t xml:space="preserve">This policy outlines the rules regarding Code of Conduct. All patrons must adhere strictly to these guidelines to ensure fair access and safety. Failure to comply with the Code of Conduct policy may result in suspension of library privileges. This policy outlines the rules regarding Code of Conduct. All patrons must adhere strictly to these guidelines to ensure fair access and safety. Failure to comply with the Code of Conduct policy may result in suspension of library privileges. This policy outlines the rules regarding Code of Conduct. All patrons must adhere strictly to these guidelines to ensure fair access and safety. Failure to comply with the Code of Conduct policy may result in suspension of library privileges. This policy outlines the rules regarding Code of Conduct. All patrons must adhere strictly to these guidelines to ensure fair access and safety. Failure to comply with the Code of Conduct policy may result in suspension of library privileges. This policy outlines the rules regarding Code of Conduct. All patrons must adhere strictly to these guidelines to ensure fair access and safety. Failure to comply with the Code of Conduct policy may result in suspension of library privileges. This policy outlines the rules regarding Code of Conduct. All patrons must adhere strictly to these guidelines to ensure fair access and safety. Failure to comply with the Code of Conduct policy may result in suspension of library privileges. </w:t>
-      </w:r>
-    </w:p>
-    <w:p>
-      <w:r>
-        <w:br w:type="page"/>
-      </w:r>
-    </w:p>
-    <w:p>
-      <w:pPr>
-        <w:pStyle w:val="Heading2"/>
-      </w:pPr>
-      <w:r>
-        <w:t>Code of Conduct - Part 3</w:t>
-      </w:r>
-    </w:p>
-    <w:p>
-      <w:r>
-        <w:t xml:space="preserve">This policy outlines the rules regarding Code of Conduct. All patrons must adhere strictly to these guidelines to ensure fair access and safety. Failure to comply with the Code of Conduct policy may result in suspension of library privileges. This policy outlines the rules regarding Code of Conduct. All patrons must adhere strictly to these guidelines to ensure fair access and safety. Failure to comply with the Code of Conduct policy may result in suspension of library privileges. This policy outlines the rules regarding Code of Conduct. All patrons must adhere strictly to these guidelines to ensure fair access and safety. Failure to comply with the Code of Conduct policy may result in suspension of library privileges. This policy outlines the rules regarding Code of Conduct. All patrons must adhere strictly to these guidelines to ensure fair access and safety. Failure to comply with the Code of Conduct policy may result in suspension of library privileges. This policy outlines the rules regarding Code of Conduct. All patrons must adhere strictly to these guidelines to ensure fair access and safety. Failure to comply with the Code of Conduct policy may result in suspension of library privileges. This policy outlines the rules regarding Code of Conduct. All patrons must adhere strictly to these guidelines to ensure fair access and safety. Failure to comply with the Code of Conduct policy may result in suspension of library privileges. </w:t>
-      </w:r>
-    </w:p>
-    <w:p>
-      <w:r>
-        <w:t xml:space="preserve">This policy outlines the rules regarding Code of Conduct. All patrons must adhere strictly to these guidelines to ensure fair access and safety. Failure to comply with the Code of Conduct policy may result in suspension of library privileges. This policy outlines the rules regarding Code of Conduct. All patrons must adhere strictly to these guidelines to ensure fair access and safety. Failure to comply with the Code of Conduct policy may result in suspension of library privileges. This policy outlines the rules regarding Code of Conduct. All patrons must adhere strictly to these guidelines to ensure fair access and safety. Failure to comply with the Code of Conduct policy may result in suspension of library privileges. This policy outlines the rules regarding Code of Conduct. All patrons must adhere strictly to these guidelines to ensure fair access and safety. Failure to comply with the Code of Conduct policy may result in suspension of library privileges. This policy outlines the rules regarding Code of Conduct. All patrons must adhere strictly to these guidelines to ensure fair access and safety. Failure to comply with the Code of Conduct policy may result in suspension of library privileges. This policy outlines the rules regarding Code of Conduct. All patrons must adhere strictly to these guidelines to ensure fair access and safety. Failure to comply with the Code of Conduct policy may result in suspension of library privileges. </w:t>
-      </w:r>
-    </w:p>
-    <w:p>
-      <w:r>
-        <w:t xml:space="preserve">This policy outlines the rules regarding Code of Conduct. All patrons must adhere strictly to these guidelines to ensure fair access and safety. Failure to comply with the Code of Conduct policy may result in suspension of library privileges. This policy outlines the rules regarding Code of Conduct. All patrons must adhere strictly to these guidelines to ensure fair access and safety. Failure to comply with the Code of Conduct policy may result in suspension of library privileges. This policy outlines the rules regarding Code of Conduct. All patrons must adhere strictly to these guidelines to ensure fair access and safety. Failure to comply with the Code of Conduct policy may result in suspension of library privileges. This policy outlines the rules regarding Code of Conduct. All patrons must adhere strictly to these guidelines to ensure fair access and safety. Failure to comply with the Code of Conduct policy may result in suspension of library privileges. This policy outlines the rules regarding Code of Conduct. All patrons must adhere strictly to these guidelines to ensure fair access and safety. Failure to comply with the Code of Conduct policy may result in suspension of library privileges. This policy outlines the rules regarding Code of Conduct. All patrons must adhere strictly to these guidelines to ensure fair access and safety. Failure to comply with the Code of Conduct policy may result in suspension of library privileges. </w:t>
-      </w:r>
-    </w:p>
-    <w:p>
-      <w:r>
-        <w:br w:type="page"/>
-      </w:r>
-    </w:p>
-    <w:p>
-      <w:pPr>
-        <w:pStyle w:val="Heading2"/>
-      </w:pPr>
-      <w:r>
-        <w:t>Code of Conduct - Part 4</w:t>
-      </w:r>
-    </w:p>
-    <w:p>
-      <w:r>
-        <w:t xml:space="preserve">This policy outlines the rules regarding Code of Conduct. All patrons must adhere strictly to these guidelines to ensure fair access and safety. Failure to comply with the Code of Conduct policy may result in suspension of library privileges. This policy outlines the rules regarding Code of Conduct. All patrons must adhere strictly to these guidelines to ensure fair access and safety. Failure to comply with the Code of Conduct policy may result in suspension of library privileges. This policy outlines the rules regarding Code of Conduct. All patrons must adhere strictly to these guidelines to ensure fair access and safety. Failure to comply with the Code of Conduct policy may result in suspension of library privileges. This policy outlines the rules regarding Code of Conduct. All patrons must adhere strictly to these guidelines to ensure fair access and safety. Failure to comply with the Code of Conduct policy may result in suspension of library privileges. This policy outlines the rules regarding Code of Conduct. All patrons must adhere strictly to these guidelines to ensure fair access and safety. Failure to comply with the Code of Conduct policy may result in suspension of library privileges. This policy outlines the rules regarding Code of Conduct. All patrons must adhere strictly to these guidelines to ensure fair access and safety. Failure to comply with the Code of Conduct policy may result in suspension of library privileges. </w:t>
-      </w:r>
-    </w:p>
-    <w:p>
-      <w:r>
-        <w:t xml:space="preserve">This policy outlines the rules regarding Code of Conduct. All patrons must adhere strictly to these guidelines to ensure fair access and safety. Failure to comply with the Code of Conduct policy may result in suspension of library privileges. This policy outlines the rules regarding Code of Conduct. All patrons must adhere strictly to these guidelines to ensure fair access and safety. Failure to comply with the Code of Conduct policy may result in suspension of library privileges. This policy outlines the rules regarding Code of Conduct. All patrons must adhere strictly to these guidelines to ensure fair access and safety. Failure to comply with the Code of Conduct policy may result in suspension of library privileges. This policy outlines the rules regarding Code of Conduct. All patrons must adhere strictly to these guidelines to ensure fair access and safety. Failure to comply with the Code of Conduct policy may result in suspension of library privileges. This policy outlines the rules regarding Code of Conduct. All patrons must adhere strictly to these guidelines to ensure fair access and safety. Failure to comply with the Code of Conduct policy may result in suspension of library privileges. This policy outlines the rules regarding Code of Conduct. All patrons must adhere strictly to these guidelines to ensure fair access and safety. Failure to comply with the Code of Conduct policy may result in suspension of library privileges. </w:t>
-      </w:r>
-    </w:p>
-    <w:p>
-      <w:r>
-        <w:t xml:space="preserve">This policy outlines the rules regarding Code of Conduct. All patrons must adhere strictly to these guidelines to ensure fair access and safety. Failure to comply with the Code of Conduct policy may result in suspension of library privileges. This policy outlines the rules regarding Code of Conduct. All patrons must adhere strictly to these guidelines to ensure fair access and safety. Failure to comply with the Code of Conduct policy may result in suspension of library privileges. This policy outlines the rules regarding Code of Conduct. All patrons must adhere strictly to these guidelines to ensure fair access and safety. Failure to comply with the Code of Conduct policy may result in suspension of library privileges. This policy outlines the rules regarding Code of Conduct. All patrons must adhere strictly to these guidelines to ensure fair access and safety. Failure to comply with the Code of Conduct policy may result in suspension of library privileges. This policy outlines the rules regarding Code of Conduct. All patrons must adhere strictly to these guidelines to ensure fair access and safety. Failure to comply with the Code of Conduct policy may result in suspension of library privileges. This policy outlines the rules regarding Code of Conduct. All patrons must adhere strictly to these guidelines to ensure fair access and safety. Failure to comply with the Code of Conduct policy may result in suspension of library privileges. </w:t>
-      </w:r>
-    </w:p>
-    <w:p>
-      <w:r>
-        <w:br w:type="page"/>
-      </w:r>
-    </w:p>
-    <w:p>
-      <w:pPr>
-        <w:pStyle w:val="Heading2"/>
-      </w:pPr>
-      <w:r>
-        <w:t>Code of Conduct - Part 5</w:t>
-      </w:r>
-    </w:p>
-    <w:p>
-      <w:r>
-        <w:t xml:space="preserve">This policy outlines the rules regarding Code of Conduct. All patrons must adhere strictly to these guidelines to ensure fair access and safety. Failure to comply with the Code of Conduct policy may result in suspension of library privileges. This policy outlines the rules regarding Code of Conduct. All patrons must adhere strictly to these guidelines to ensure fair access and safety. Failure to comply with the Code of Conduct policy may result in suspension of library privileges. This policy outlines the rules regarding Code of Conduct. All patrons must adhere strictly to these guidelines to ensure fair access and safety. Failure to comply with the Code of Conduct policy may result in suspension of library privileges. This policy outlines the rules regarding Code of Conduct. All patrons must adhere strictly to these guidelines to ensure fair access and safety. Failure to comply with the Code of Conduct policy may result in suspension of library privileges. This policy outlines the rules regarding Code of Conduct. All patrons must adhere strictly to these guidelines to ensure fair access and safety. Failure to comply with the Code of Conduct policy may result in suspension of library privileges. This policy outlines the rules regarding Code of Conduct. All patrons must adhere strictly to these guidelines to ensure fair access and safety. Failure to comply with the Code of Conduct policy may result in suspension of library privileges. </w:t>
-      </w:r>
-    </w:p>
-    <w:p>
-      <w:r>
-        <w:t xml:space="preserve">This policy outlines the rules regarding Code of Conduct. All patrons must adhere strictly to these guidelines to ensure fair access and safety. Failure to comply with the Code of Conduct policy may result in suspension of library privileges. This policy outlines the rules regarding Code of Conduct. All patrons must adhere strictly to these guidelines to ensure fair access and safety. Failure to comply with the Code of Conduct policy may result in suspension of library privileges. This policy outlines the rules regarding Code of Conduct. All patrons must adhere strictly to these guidelines to ensure fair access and safety. Failure to comply with the Code of Conduct policy may result in suspension of library privileges. This policy outlines the rules regarding Code of Conduct. All patrons must adhere strictly to these guidelines to ensure fair access and safety. Failure to comply with the Code of Conduct policy may result in suspension of library privileges. This policy outlines the rules regarding Code of Conduct. All patrons must adhere strictly to these guidelines to ensure fair access and safety. Failure to comply with the Code of Conduct policy may result in suspension of library privileges. This policy outlines the rules regarding Code of Conduct. All patrons must adhere strictly to these guidelines to ensure fair access and safety. Failure to comply with the Code of Conduct policy may result in suspension of library privileges. </w:t>
-      </w:r>
-    </w:p>
-    <w:p>
-      <w:r>
-        <w:t xml:space="preserve">This policy outlines the rules regarding Code of Conduct. All patrons must adhere strictly to these guidelines to ensure fair access and safety. Failure to comply with the Code of Conduct policy may result in suspension of library privileges. This policy outlines the rules regarding Code of Conduct. All patrons must adhere strictly to these guidelines to ensure fair access and safety. Failure to comply with the Code of Conduct policy may result in suspension of library privileges. This policy outlines the rules regarding Code of Conduct. All patrons must adhere strictly to these guidelines to ensure fair access and safety. Failure to comply with the Code of Conduct policy may result in suspension of library privileges. This policy outlines the rules regarding Code of Conduct. All patrons must adhere strictly to these guidelines to ensure fair access and safety. Failure to comply with the Code of Conduct policy may result in suspension of library privileges. This policy outlines the rules regarding Code of Conduct. All patrons must adhere strictly to these guidelines to ensure fair access and safety. Failure to comply with the Code of Conduct policy may result in suspension of library privileges. This policy outlines the rules regarding Code of Conduct. All patrons must adhere strictly to these guidelines to ensure fair access and safety. Failure to comply with the Code of Conduct policy may result in suspension of library privileges. </w:t>
-      </w:r>
-    </w:p>
-    <w:p>
-      <w:r>
-        <w:br w:type="page"/>
-      </w:r>
-    </w:p>
-    <w:p>
-      <w:pPr>
-        <w:pStyle w:val="Heading2"/>
-      </w:pPr>
-      <w:r>
-        <w:t>Code of Conduct - Part 6</w:t>
-      </w:r>
-    </w:p>
-    <w:p>
-      <w:r>
-        <w:t xml:space="preserve">This policy outlines the rules regarding Code of Conduct. All patrons must adhere strictly to these guidelines to ensure fair access and safety. Failure to comply with the Code of Conduct policy may result in suspension of library privileges. This policy outlines the rules regarding Code of Conduct. All patrons must adhere strictly to these guidelines to ensure fair access and safety. Failure to comply with the Code of Conduct policy may result in suspension of library privileges. This policy outlines the rules regarding Code of Conduct. All patrons must adhere strictly to these guidelines to ensure fair access and safety. Failure to comply with the Code of Conduct policy may result in suspension of library privileges. This policy outlines the rules regarding Code of Conduct. All patrons must adhere strictly to these guidelines to ensure fair access and safety. Failure to comply with the Code of Conduct policy may result in suspension of library privileges. This policy outlines the rules regarding Code of Conduct. All patrons must adhere strictly to these guidelines to ensure fair access and safety. Failure to comply with the Code of Conduct policy may result in suspension of library privileges. This policy outlines the rules regarding Code of Conduct. All patrons must adhere strictly to these guidelines to ensure fair access and safety. Failure to comply with the Code of Conduct policy may result in suspension of library privileges. </w:t>
-      </w:r>
-    </w:p>
-    <w:p>
-      <w:r>
-        <w:t xml:space="preserve">This policy outlines the rules regarding Code of Conduct. All patrons must adhere strictly to these guidelines to ensure fair access and safety. Failure to comply with the Code of Conduct policy may result in suspension of library privileges. This policy outlines the rules regarding Code of Conduct. All patrons must adhere strictly to these guidelines to ensure fair access and safety. Failure to comply with the Code of Conduct policy may result in suspension of library privileges. This policy outlines the rules regarding Code of Conduct. All patrons must adhere strictly to these guidelines to ensure fair access and safety. Failure to comply with the Code of Conduct policy may result in suspension of library privileges. This policy outlines the rules regarding Code of Conduct. All patrons must adhere strictly to these guidelines to ensure fair access and safety. Failure to comply with the Code of Conduct policy may result in suspension of library privileges. This policy outlines the rules regarding Code of Conduct. All patrons must adhere strictly to these guidelines to ensure fair access and safety. Failure to comply with the Code of Conduct policy may result in suspension of library privileges. This policy outlines the rules regarding Code of Conduct. All patrons must adhere strictly to these guidelines to ensure fair access and safety. Failure to comply with the Code of Conduct policy may result in suspension of library privileges. </w:t>
-      </w:r>
-    </w:p>
-    <w:p>
-      <w:r>
-        <w:t xml:space="preserve">This policy outlines the rules regarding Code of Conduct. All patrons must adhere strictly to these guidelines to ensure fair access and safety. Failure to comply with the Code of Conduct policy may result in suspension of library privileges. This policy outlines the rules regarding Code of Conduct. All patrons must adhere strictly to these guidelines to ensure fair access and safety. Failure to comply with the Code of Conduct policy may result in suspension of library privileges. This policy outlines the rules regarding Code of Conduct. All patrons must adhere strictly to these guidelines to ensure fair access and safety. Failure to comply with the Code of Conduct policy may result in suspension of library privileges. This policy outlines the rules regarding Code of Conduct. All patrons must adhere strictly to these guidelines to ensure fair access and safety. Failure to comply with the Code of Conduct policy may result in suspension of library privileges. This policy outlines the rules regarding Code of Conduct. All patrons must adhere strictly to these guidelines to ensure fair access and safety. Failure to comply with the Code of Conduct policy may result in suspension of library privileges. This policy outlines the rules regarding Code of Conduct. All patrons must adhere strictly to these guidelines to ensure fair access and safety. Failure to comply with the Code of Conduct policy may result in suspension of library privileges. </w:t>
-      </w:r>
-    </w:p>
-    <w:p>
-      <w:r>
-        <w:br w:type="page"/>
-      </w:r>
-    </w:p>
-    <w:p>
-      <w:pPr>
-        <w:pStyle w:val="Heading2"/>
-      </w:pPr>
-      <w:r>
-        <w:t>Code of Conduct - Part 7</w:t>
-      </w:r>
-    </w:p>
-    <w:p>
-      <w:r>
-        <w:t xml:space="preserve">This policy outlines the rules regarding Code of Conduct. All patrons must adhere strictly to these guidelines to ensure fair access and safety. Failure to comply with the Code of Conduct policy may result in suspension of library privileges. This policy outlines the rules regarding Code of Conduct. All patrons must adhere strictly to these guidelines to ensure fair access and safety. Failure to comply with the Code of Conduct policy may result in suspension of library privileges. This policy outlines the rules regarding Code of Conduct. All patrons must adhere strictly to these guidelines to ensure fair access and safety. Failure to comply with the Code of Conduct policy may result in suspension of library privileges. This policy outlines the rules regarding Code of Conduct. All patrons must adhere strictly to these guidelines to ensure fair access and safety. Failure to comply with the Code of Conduct policy may result in suspension of library privileges. This policy outlines the rules regarding Code of Conduct. All patrons must adhere strictly to these guidelines to ensure fair access and safety. Failure to comply with the Code of Conduct policy may result in suspension of library privileges. This policy outlines the rules regarding Code of Conduct. All patrons must adhere strictly to these guidelines to ensure fair access and safety. Failure to comply with the Code of Conduct policy may result in suspension of library privileges. </w:t>
-      </w:r>
-    </w:p>
-    <w:p>
-      <w:r>
-        <w:t xml:space="preserve">This policy outlines the rules regarding Code of Conduct. All patrons must adhere strictly to these guidelines to ensure fair access and safety. Failure to comply with the Code of Conduct policy may result in suspension of library privileges. This policy outlines the rules regarding Code of Conduct. All patrons must adhere strictly to these guidelines to ensure fair access and safety. Failure to comply with the Code of Conduct policy may result in suspension of library privileges. This policy outlines the rules regarding Code of Conduct. All patrons must adhere strictly to these guidelines to ensure fair access and safety. Failure to comply with the Code of Conduct policy may result in suspension of library privileges. This policy outlines the rules regarding Code of Conduct. All patrons must adhere strictly to these guidelines to ensure fair access and safety. Failure to comply with the Code of Conduct policy may result in suspension of library privileges. This policy outlines the rules regarding Code of Conduct. All patrons must adhere strictly to these guidelines to ensure fair access and safety. Failure to comply with the Code of Conduct policy may result in suspension of library privileges. This policy outlines the rules regarding Code of Conduct. All patrons must adhere strictly to these guidelines to ensure fair access and safety. Failure to comply with the Code of Conduct policy may result in suspension of library privileges. </w:t>
-      </w:r>
-    </w:p>
-    <w:p>
-      <w:r>
-        <w:t xml:space="preserve">This policy outlines the rules regarding Code of Conduct. All patrons must adhere strictly to these guidelines to ensure fair access and safety. Failure to comply with the Code of Conduct policy may result in suspension of library privileges. This policy outlines the rules regarding Code of Conduct. All patrons must adhere strictly to these guidelines to ensure fair access and safety. Failure to comply with the Code of Conduct policy may result in suspension of library privileges. This policy outlines the rules regarding Code of Conduct. All patrons must adhere strictly to these guidelines to ensure fair access and safety. Failure to comply with the Code of Conduct policy may result in suspension of library privileges. This policy outlines the rules regarding Code of Conduct. All patrons must adhere strictly to these guidelines to ensure fair access and safety. Failure to comply with the Code of Conduct policy may result in suspension of library privileges. This policy outlines the rules regarding Code of Conduct. All patrons must adhere strictly to these guidelines to ensure fair access and safety. Failure to comply with the Code of Conduct policy may result in suspension of library privileges. This policy outlines the rules regarding Code of Conduct. All patrons must adhere strictly to these guidelines to ensure fair access and safety. Failure to comply with the Code of Conduct policy may result in suspension of library privileges. </w:t>
-      </w:r>
-    </w:p>
-    <w:p>
-      <w:r>
-        <w:br w:type="page"/>
-      </w:r>
-    </w:p>
-    <w:p>
-      <w:pPr>
-        <w:pStyle w:val="Heading2"/>
-      </w:pPr>
-      <w:r>
-        <w:t>Code of Conduct - Part 8</w:t>
-      </w:r>
-    </w:p>
-    <w:p>
-      <w:r>
-        <w:t xml:space="preserve">This policy outlines the rules regarding Code of Conduct. All patrons must adhere strictly to these guidelines to ensure fair access and safety. Failure to comply with the Code of Conduct policy may result in suspension of library privileges. This policy outlines the rules regarding Code of Conduct. All patrons must adhere strictly to these guidelines to ensure fair access and safety. Failure to comply with the Code of Conduct policy may result in suspension of library privileges. This policy outlines the rules regarding Code of Conduct. All patrons must adhere strictly to these guidelines to ensure fair access and safety. Failure to comply with the Code of Conduct policy may result in suspension of library privileges. This policy outlines the rules regarding Code of Conduct. All patrons must adhere strictly to these guidelines to ensure fair access and safety. Failure to comply with the Code of Conduct policy may result in suspension of library privileges. This policy outlines the rules regarding Code of Conduct. All patrons must adhere strictly to these guidelines to ensure fair access and safety. Failure to comply with the Code of Conduct policy may result in suspension of library privileges. This policy outlines the rules regarding Code of Conduct. All patrons must adhere strictly to these guidelines to ensure fair access and safety. Failure to comply with the Code of Conduct policy may result in suspension of library privileges. </w:t>
-      </w:r>
-    </w:p>
-    <w:p>
-      <w:r>
-        <w:t xml:space="preserve">This policy outlines the rules regarding Code of Conduct. All patrons must adhere strictly to these guidelines to ensure fair access and safety. Failure to comply with the Code of Conduct policy may result in suspension of library privileges. This policy outlines the rules regarding Code of Conduct. All patrons must adhere strictly to these guidelines to ensure fair access and safety. Failure to comply with the Code of Conduct policy may result in suspension of library privileges. This policy outlines the rules regarding Code of Conduct. All patrons must adhere strictly to these guidelines to ensure fair access and safety. Failure to comply with the Code of Conduct policy may result in suspension of library privileges. This policy outlines the rules regarding Code of Conduct. All patrons must adhere strictly to these guidelines to ensure fair access and safety. Failure to comply with the Code of Conduct policy may result in suspension of library privileges. This policy outlines the rules regarding Code of Conduct. All patrons must adhere strictly to these guidelines to ensure fair access and safety. Failure to comply with the Code of Conduct policy may result in suspension of library privileges. This policy outlines the rules regarding Code of Conduct. All patrons must adhere strictly to these guidelines to ensure fair access and safety. Failure to comply with the Code of Conduct policy may result in suspension of library privileges. </w:t>
-      </w:r>
-    </w:p>
-    <w:p>
-      <w:r>
-        <w:t xml:space="preserve">This policy outlines the rules regarding Code of Conduct. All patrons must adhere strictly to these guidelines to ensure fair access and safety. Failure to comply with the Code of Conduct policy may result in suspension of library privileges. This policy outlines the rules regarding Code of Conduct. All patrons must adhere strictly to these guidelines to ensure fair access and safety. Failure to comply with the Code of Conduct policy may result in suspension of library privileges. This policy outlines the rules regarding Code of Conduct. All patrons must adhere strictly to these guidelines to ensure fair access and safety. Failure to comply with the Code of Conduct policy may result in suspension of library privileges. This policy outlines the rules regarding Code of Conduct. All patrons must adhere strictly to these guidelines to ensure fair access and safety. Failure to comply with the Code of Conduct policy may result in suspension of library privileges. This policy outlines the rules regarding Code of Conduct. All patrons must adhere strictly to these guidelines to ensure fair access and safety. Failure to comply with the Code of Conduct policy may result in suspension of library privileges. This policy outlines the rules regarding Code of Conduct. All patrons must adhere strictly to these guidelines to ensure fair access and safety. Failure to comply with the Code of Conduct policy may result in suspension of library privileges. </w:t>
-      </w:r>
-    </w:p>
-    <w:p>
-      <w:r>
-        <w:br w:type="page"/>
-      </w:r>
-    </w:p>
-    <w:p>
-      <w:pPr>
-        <w:pStyle w:val="Heading2"/>
-      </w:pPr>
-      <w:r>
-        <w:t>Code of Conduct - Part 9</w:t>
-      </w:r>
-    </w:p>
-    <w:p>
-      <w:r>
-        <w:t xml:space="preserve">This policy outlines the rules regarding Code of Conduct. All patrons must adhere strictly to these guidelines to ensure fair access and safety. Failure to comply with the Code of Conduct policy may result in suspension of library privileges. This policy outlines the rules regarding Code of Conduct. All patrons must adhere strictly to these guidelines to ensure fair access and safety. Failure to comply with the Code of Conduct policy may result in suspension of library privileges. This policy outlines the rules regarding Code of Conduct. All patrons must adhere strictly to these guidelines to ensure fair access and safety. Failure to comply with the Code of Conduct policy may result in suspension of library privileges. This policy outlines the rules regarding Code of Conduct. All patrons must adhere strictly to these guidelines to ensure fair access and safety. Failure to comply with the Code of Conduct policy may result in suspension of library privileges. This policy outlines the rules regarding Code of Conduct. All patrons must adhere strictly to these guidelines to ensure fair access and safety. Failure to comply with the Code of Conduct policy may result in suspension of library privileges. This policy outlines the rules regarding Code of Conduct. All patrons must adhere strictly to these guidelines to ensure fair access and safety. Failure to comply with the Code of Conduct policy may result in suspension of library privileges. </w:t>
-      </w:r>
-    </w:p>
-    <w:p>
-      <w:r>
-        <w:t xml:space="preserve">This policy outlines the rules regarding Code of Conduct. All patrons must adhere strictly to these guidelines to ensure fair access and safety. Failure to comply with the Code of Conduct policy may result in suspension of library privileges. This policy outlines the rules regarding Code of Conduct. All patrons must adhere strictly to these guidelines to ensure fair access and safety. Failure to comply with the Code of Conduct policy may result in suspension of library privileges. This policy outlines the rules regarding Code of Conduct. All patrons must adhere strictly to these guidelines to ensure fair access and safety. Failure to comply with the Code of Conduct policy may result in suspension of library privileges. This policy outlines the rules regarding Code of Conduct. All patrons must adhere strictly to these guidelines to ensure fair access and safety. Failure to comply with the Code of Conduct policy may result in suspension of library privileges. This policy outlines the rules regarding Code of Conduct. All patrons must adhere strictly to these guidelines to ensure fair access and safety. Failure to comply with the Code of Conduct policy may result in suspension of library privileges. This policy outlines the rules regarding Code of Conduct. All patrons must adhere strictly to these guidelines to ensure fair access and safety. Failure to comply with the Code of Conduct policy may result in suspension of library privileges. </w:t>
-      </w:r>
-    </w:p>
-    <w:p>
-      <w:r>
-        <w:t xml:space="preserve">This policy outlines the rules regarding Code of Conduct. All patrons must adhere strictly to these guidelines to ensure fair access and safety. Failure to comply with the Code of Conduct policy may result in suspension of library privileges. This policy outlines the rules regarding Code of Conduct. All patrons must adhere strictly to these guidelines to ensure fair access and safety. Failure to comply with the Code of Conduct policy may result in suspension of library privileges. This policy outlines the rules regarding Code of Conduct. All patrons must adhere strictly to these guidelines to ensure fair access and safety. Failure to comply with the Code of Conduct policy may result in suspension of library privileges. This policy outlines the rules regarding Code of Conduct. All patrons must adhere strictly to these guidelines to ensure fair access and safety. Failure to comply with the Code of Conduct policy may result in suspension of library privileges. This policy outlines the rules regarding Code of Conduct. All patrons must adhere strictly to these guidelines to ensure fair access and safety. Failure to comply with the Code of Conduct policy may result in suspension of library privileges. This policy outlines the rules regarding Code of Conduct. All patrons must adhere strictly to these guidelines to ensure fair access and safety. Failure to comply with the Code of Conduct policy may result in suspension of library privileges. </w:t>
-      </w:r>
-    </w:p>
-    <w:p>
-      <w:r>
-        <w:br w:type="page"/>
-      </w:r>
-    </w:p>
-    <w:p>
-      <w:pPr>
-        <w:pStyle w:val="Heading2"/>
-      </w:pPr>
-      <w:r>
-        <w:t>Code of Conduct - Part 10</w:t>
-      </w:r>
-    </w:p>
-    <w:p>
-      <w:r>
-        <w:t xml:space="preserve">This policy outlines the rules regarding Code of Conduct. All patrons must adhere strictly to these guidelines to ensure fair access and safety. Failure to comply with the Code of Conduct policy may result in suspension of library privileges. This policy outlines the rules regarding Code of Conduct. All patrons must adhere strictly to these guidelines to ensure fair access and safety. Failure to comply with the Code of Conduct policy may result in suspension of library privileges. This policy outlines the rules regarding Code of Conduct. All patrons must adhere strictly to these guidelines to ensure fair access and safety. Failure to comply with the Code of Conduct policy may result in suspension of library privileges. This policy outlines the rules regarding Code of Conduct. All patrons must adhere strictly to these guidelines to ensure fair access and safety. Failure to comply with the Code of Conduct policy may result in suspension of library privileges. This policy outlines the rules regarding Code of Conduct. All patrons must adhere strictly to these guidelines to ensure fair access and safety. Failure to comply with the Code of Conduct policy may result in suspension of library privileges. This policy outlines the rules regarding Code of Conduct. All patrons must adhere strictly to these guidelines to ensure fair access and safety. Failure to comply with the Code of Conduct policy may result in suspension of library privileges. </w:t>
-      </w:r>
-    </w:p>
-    <w:p>
-      <w:r>
-        <w:t xml:space="preserve">This policy outlines the rules regarding Code of Conduct. All patrons must adhere strictly to these guidelines to ensure fair access and safety. Failure to comply with the Code of Conduct policy may result in suspension of library privileges. This policy outlines the rules regarding Code of Conduct. All patrons must adhere strictly to these guidelines to ensure fair access and safety. Failure to comply with the Code of Conduct policy may result in suspension of library privileges. This policy outlines the rules regarding Code of Conduct. All patrons must adhere strictly to these guidelines to ensure fair access and safety. Failure to comply with the Code of Conduct policy may result in suspension of library privileges. This policy outlines the rules regarding Code of Conduct. All patrons must adhere strictly to these guidelines to ensure fair access and safety. Failure to comply with the Code of Conduct policy may result in suspension of library privileges. This policy outlines the rules regarding Code of Conduct. All patrons must adhere strictly to these guidelines to ensure fair access and safety. Failure to comply with the Code of Conduct policy may result in suspension of library privileges. This policy outlines the rules regarding Code of Conduct. All patrons must adhere strictly to these guidelines to ensure fair access and safety. Failure to comply with the Code of Conduct policy may result in suspension of library privileges. </w:t>
-      </w:r>
-    </w:p>
-    <w:p>
-      <w:r>
-        <w:t xml:space="preserve">This policy outlines the rules regarding Code of Conduct. All patrons must adhere strictly to these guidelines to ensure fair access and safety. Failure to comply with the Code of Conduct policy may result in suspension of library privileges. This policy outlines the rules regarding Code of Conduct. All patrons must adhere strictly to these guidelines to ensure fair access and safety. Failure to comply with the Code of Conduct policy may result in suspension of library privileges. This policy outlines the rules regarding Code of Conduct. All patrons must adhere strictly to these guidelines to ensure fair access and safety. Failure to comply with the Code of Conduct policy may result in suspension of library privileges. This policy outlines the rules regarding Code of Conduct. All patrons must adhere strictly to these guidelines to ensure fair access and safety. Failure to comply with the Code of Conduct policy may result in suspension of library privileges. This policy outlines the rules regarding Code of Conduct. All patrons must adhere strictly to these guidelines to ensure fair access and safety. Failure to comply with the Code of Conduct policy may result in suspension of library privileges. This policy outlines the rules regarding Code of Conduct. All patrons must adhere strictly to these guidelines to ensure fair access and safety. Failure to comply with the Code of Conduct policy may result in suspension of library privileges. </w:t>
-      </w:r>
-    </w:p>
-    <w:p>
-      <w:r>
-        <w:br w:type="page"/>
+        <w:t>- Quiet Zones: Floors 3 and 4 are designated Quiet Study Zones. Group discussions are prohibited in these areas.</w:t>
+        <w:br/>
+        <w:t>- Food and Drink: Only covered beverages and light, non-messy snacks are permitted. Meals and hot food are restricted to the ground floor cafeteria.</w:t>
+        <w:br/>
+        <w:t>- ID Verification: Patrons must present a valid University ID or visitor pass upon entering the library.</w:t>
+        <w:br/>
+        <w:t>- Property Care: Defacing library books, furniture, or computer equipment will result in immediate expulsion and repair fines.</w:t>
       </w:r>
     </w:p>
     <w:p>
@@ -595,283 +59,12 @@
       </w:r>
     </w:p>
     <w:p>
-      <w:pPr>
-        <w:pStyle w:val="Heading2"/>
-      </w:pPr>
       <w:r>
-        <w:t>Digital Resource Access - Part 1</w:t>
-      </w:r>
-    </w:p>
-    <w:p>
-      <w:r>
-        <w:t xml:space="preserve">This policy outlines the rules regarding Digital Resource Access. All patrons must adhere strictly to these guidelines to ensure fair access and safety. Failure to comply with the Digital Resource Access policy may result in suspension of library privileges. This policy outlines the rules regarding Digital Resource Access. All patrons must adhere strictly to these guidelines to ensure fair access and safety. Failure to comply with the Digital Resource Access policy may result in suspension of library privileges. This policy outlines the rules regarding Digital Resource Access. All patrons must adhere strictly to these guidelines to ensure fair access and safety. Failure to comply with the Digital Resource Access policy may result in suspension of library privileges. This policy outlines the rules regarding Digital Resource Access. All patrons must adhere strictly to these guidelines to ensure fair access and safety. Failure to comply with the Digital Resource Access policy may result in suspension of library privileges. This policy outlines the rules regarding Digital Resource Access. All patrons must adhere strictly to these guidelines to ensure fair access and safety. Failure to comply with the Digital Resource Access policy may result in suspension of library privileges. This policy outlines the rules regarding Digital Resource Access. All patrons must adhere strictly to these guidelines to ensure fair access and safety. Failure to comply with the Digital Resource Access policy may result in suspension of library privileges. </w:t>
-      </w:r>
-    </w:p>
-    <w:p>
-      <w:r>
-        <w:t xml:space="preserve">This policy outlines the rules regarding Digital Resource Access. All patrons must adhere strictly to these guidelines to ensure fair access and safety. Failure to comply with the Digital Resource Access policy may result in suspension of library privileges. This policy outlines the rules regarding Digital Resource Access. All patrons must adhere strictly to these guidelines to ensure fair access and safety. Failure to comply with the Digital Resource Access policy may result in suspension of library privileges. This policy outlines the rules regarding Digital Resource Access. All patrons must adhere strictly to these guidelines to ensure fair access and safety. Failure to comply with the Digital Resource Access policy may result in suspension of library privileges. This policy outlines the rules regarding Digital Resource Access. All patrons must adhere strictly to these guidelines to ensure fair access and safety. Failure to comply with the Digital Resource Access policy may result in suspension of library privileges. This policy outlines the rules regarding Digital Resource Access. All patrons must adhere strictly to these guidelines to ensure fair access and safety. Failure to comply with the Digital Resource Access policy may result in suspension of library privileges. This policy outlines the rules regarding Digital Resource Access. All patrons must adhere strictly to these guidelines to ensure fair access and safety. Failure to comply with the Digital Resource Access policy may result in suspension of library privileges. </w:t>
-      </w:r>
-    </w:p>
-    <w:p>
-      <w:r>
-        <w:t xml:space="preserve">This policy outlines the rules regarding Digital Resource Access. All patrons must adhere strictly to these guidelines to ensure fair access and safety. Failure to comply with the Digital Resource Access policy may result in suspension of library privileges. This policy outlines the rules regarding Digital Resource Access. All patrons must adhere strictly to these guidelines to ensure fair access and safety. Failure to comply with the Digital Resource Access policy may result in suspension of library privileges. This policy outlines the rules regarding Digital Resource Access. All patrons must adhere strictly to these guidelines to ensure fair access and safety. Failure to comply with the Digital Resource Access policy may result in suspension of library privileges. This policy outlines the rules regarding Digital Resource Access. All patrons must adhere strictly to these guidelines to ensure fair access and safety. Failure to comply with the Digital Resource Access policy may result in suspension of library privileges. This policy outlines the rules regarding Digital Resource Access. All patrons must adhere strictly to these guidelines to ensure fair access and safety. Failure to comply with the Digital Resource Access policy may result in suspension of library privileges. This policy outlines the rules regarding Digital Resource Access. All patrons must adhere strictly to these guidelines to ensure fair access and safety. Failure to comply with the Digital Resource Access policy may result in suspension of library privileges. </w:t>
-      </w:r>
-    </w:p>
-    <w:p>
-      <w:r>
-        <w:br w:type="page"/>
-      </w:r>
-    </w:p>
-    <w:p>
-      <w:pPr>
-        <w:pStyle w:val="Heading2"/>
-      </w:pPr>
-      <w:r>
-        <w:t>Digital Resource Access - Part 2</w:t>
-      </w:r>
-    </w:p>
-    <w:p>
-      <w:r>
-        <w:t xml:space="preserve">This policy outlines the rules regarding Digital Resource Access. All patrons must adhere strictly to these guidelines to ensure fair access and safety. Failure to comply with the Digital Resource Access policy may result in suspension of library privileges. This policy outlines the rules regarding Digital Resource Access. All patrons must adhere strictly to these guidelines to ensure fair access and safety. Failure to comply with the Digital Resource Access policy may result in suspension of library privileges. This policy outlines the rules regarding Digital Resource Access. All patrons must adhere strictly to these guidelines to ensure fair access and safety. Failure to comply with the Digital Resource Access policy may result in suspension of library privileges. This policy outlines the rules regarding Digital Resource Access. All patrons must adhere strictly to these guidelines to ensure fair access and safety. Failure to comply with the Digital Resource Access policy may result in suspension of library privileges. This policy outlines the rules regarding Digital Resource Access. All patrons must adhere strictly to these guidelines to ensure fair access and safety. Failure to comply with the Digital Resource Access policy may result in suspension of library privileges. This policy outlines the rules regarding Digital Resource Access. All patrons must adhere strictly to these guidelines to ensure fair access and safety. Failure to comply with the Digital Resource Access policy may result in suspension of library privileges. </w:t>
-      </w:r>
-    </w:p>
-    <w:p>
-      <w:r>
-        <w:t xml:space="preserve">This policy outlines the rules regarding Digital Resource Access. All patrons must adhere strictly to these guidelines to ensure fair access and safety. Failure to comply with the Digital Resource Access policy may result in suspension of library privileges. This policy outlines the rules regarding Digital Resource Access. All patrons must adhere strictly to these guidelines to ensure fair access and safety. Failure to comply with the Digital Resource Access policy may result in suspension of library privileges. This policy outlines the rules regarding Digital Resource Access. All patrons must adhere strictly to these guidelines to ensure fair access and safety. Failure to comply with the Digital Resource Access policy may result in suspension of library privileges. This policy outlines the rules regarding Digital Resource Access. All patrons must adhere strictly to these guidelines to ensure fair access and safety. Failure to comply with the Digital Resource Access policy may result in suspension of library privileges. This policy outlines the rules regarding Digital Resource Access. All patrons must adhere strictly to these guidelines to ensure fair access and safety. Failure to comply with the Digital Resource Access policy may result in suspension of library privileges. This policy outlines the rules regarding Digital Resource Access. All patrons must adhere strictly to these guidelines to ensure fair access and safety. Failure to comply with the Digital Resource Access policy may result in suspension of library privileges. </w:t>
-      </w:r>
-    </w:p>
-    <w:p>
-      <w:r>
-        <w:t xml:space="preserve">This policy outlines the rules regarding Digital Resource Access. All patrons must adhere strictly to these guidelines to ensure fair access and safety. Failure to comply with the Digital Resource Access policy may result in suspension of library privileges. This policy outlines the rules regarding Digital Resource Access. All patrons must adhere strictly to these guidelines to ensure fair access and safety. Failure to comply with the Digital Resource Access policy may result in suspension of library privileges. This policy outlines the rules regarding Digital Resource Access. All patrons must adhere strictly to these guidelines to ensure fair access and safety. Failure to comply with the Digital Resource Access policy may result in suspension of library privileges. This policy outlines the rules regarding Digital Resource Access. All patrons must adhere strictly to these guidelines to ensure fair access and safety. Failure to comply with the Digital Resource Access policy may result in suspension of library privileges. This policy outlines the rules regarding Digital Resource Access. All patrons must adhere strictly to these guidelines to ensure fair access and safety. Failure to comply with the Digital Resource Access policy may result in suspension of library privileges. This policy outlines the rules regarding Digital Resource Access. All patrons must adhere strictly to these guidelines to ensure fair access and safety. Failure to comply with the Digital Resource Access policy may result in suspension of library privileges. </w:t>
-      </w:r>
-    </w:p>
-    <w:p>
-      <w:r>
-        <w:br w:type="page"/>
-      </w:r>
-    </w:p>
-    <w:p>
-      <w:pPr>
-        <w:pStyle w:val="Heading2"/>
-      </w:pPr>
-      <w:r>
-        <w:t>Digital Resource Access - Part 3</w:t>
-      </w:r>
-    </w:p>
-    <w:p>
-      <w:r>
-        <w:t xml:space="preserve">This policy outlines the rules regarding Digital Resource Access. All patrons must adhere strictly to these guidelines to ensure fair access and safety. Failure to comply with the Digital Resource Access policy may result in suspension of library privileges. This policy outlines the rules regarding Digital Resource Access. All patrons must adhere strictly to these guidelines to ensure fair access and safety. Failure to comply with the Digital Resource Access policy may result in suspension of library privileges. This policy outlines the rules regarding Digital Resource Access. All patrons must adhere strictly to these guidelines to ensure fair access and safety. Failure to comply with the Digital Resource Access policy may result in suspension of library privileges. This policy outlines the rules regarding Digital Resource Access. All patrons must adhere strictly to these guidelines to ensure fair access and safety. Failure to comply with the Digital Resource Access policy may result in suspension of library privileges. This policy outlines the rules regarding Digital Resource Access. All patrons must adhere strictly to these guidelines to ensure fair access and safety. Failure to comply with the Digital Resource Access policy may result in suspension of library privileges. This policy outlines the rules regarding Digital Resource Access. All patrons must adhere strictly to these guidelines to ensure fair access and safety. Failure to comply with the Digital Resource Access policy may result in suspension of library privileges. </w:t>
-      </w:r>
-    </w:p>
-    <w:p>
-      <w:r>
-        <w:t xml:space="preserve">This policy outlines the rules regarding Digital Resource Access. All patrons must adhere strictly to these guidelines to ensure fair access and safety. Failure to comply with the Digital Resource Access policy may result in suspension of library privileges. This policy outlines the rules regarding Digital Resource Access. All patrons must adhere strictly to these guidelines to ensure fair access and safety. Failure to comply with the Digital Resource Access policy may result in suspension of library privileges. This policy outlines the rules regarding Digital Resource Access. All patrons must adhere strictly to these guidelines to ensure fair access and safety. Failure to comply with the Digital Resource Access policy may result in suspension of library privileges. This policy outlines the rules regarding Digital Resource Access. All patrons must adhere strictly to these guidelines to ensure fair access and safety. Failure to comply with the Digital Resource Access policy may result in suspension of library privileges. This policy outlines the rules regarding Digital Resource Access. All patrons must adhere strictly to these guidelines to ensure fair access and safety. Failure to comply with the Digital Resource Access policy may result in suspension of library privileges. This policy outlines the rules regarding Digital Resource Access. All patrons must adhere strictly to these guidelines to ensure fair access and safety. Failure to comply with the Digital Resource Access policy may result in suspension of library privileges. </w:t>
-      </w:r>
-    </w:p>
-    <w:p>
-      <w:r>
-        <w:t xml:space="preserve">This policy outlines the rules regarding Digital Resource Access. All patrons must adhere strictly to these guidelines to ensure fair access and safety. Failure to comply with the Digital Resource Access policy may result in suspension of library privileges. This policy outlines the rules regarding Digital Resource Access. All patrons must adhere strictly to these guidelines to ensure fair access and safety. Failure to comply with the Digital Resource Access policy may result in suspension of library privileges. This policy outlines the rules regarding Digital Resource Access. All patrons must adhere strictly to these guidelines to ensure fair access and safety. Failure to comply with the Digital Resource Access policy may result in suspension of library privileges. This policy outlines the rules regarding Digital Resource Access. All patrons must adhere strictly to these guidelines to ensure fair access and safety. Failure to comply with the Digital Resource Access policy may result in suspension of library privileges. This policy outlines the rules regarding Digital Resource Access. All patrons must adhere strictly to these guidelines to ensure fair access and safety. Failure to comply with the Digital Resource Access policy may result in suspension of library privileges. This policy outlines the rules regarding Digital Resource Access. All patrons must adhere strictly to these guidelines to ensure fair access and safety. Failure to comply with the Digital Resource Access policy may result in suspension of library privileges. </w:t>
-      </w:r>
-    </w:p>
-    <w:p>
-      <w:r>
-        <w:br w:type="page"/>
-      </w:r>
-    </w:p>
-    <w:p>
-      <w:pPr>
-        <w:pStyle w:val="Heading2"/>
-      </w:pPr>
-      <w:r>
-        <w:t>Digital Resource Access - Part 4</w:t>
-      </w:r>
-    </w:p>
-    <w:p>
-      <w:r>
-        <w:t xml:space="preserve">This policy outlines the rules regarding Digital Resource Access. All patrons must adhere strictly to these guidelines to ensure fair access and safety. Failure to comply with the Digital Resource Access policy may result in suspension of library privileges. This policy outlines the rules regarding Digital Resource Access. All patrons must adhere strictly to these guidelines to ensure fair access and safety. Failure to comply with the Digital Resource Access policy may result in suspension of library privileges. This policy outlines the rules regarding Digital Resource Access. All patrons must adhere strictly to these guidelines to ensure fair access and safety. Failure to comply with the Digital Resource Access policy may result in suspension of library privileges. This policy outlines the rules regarding Digital Resource Access. All patrons must adhere strictly to these guidelines to ensure fair access and safety. Failure to comply with the Digital Resource Access policy may result in suspension of library privileges. This policy outlines the rules regarding Digital Resource Access. All patrons must adhere strictly to these guidelines to ensure fair access and safety. Failure to comply with the Digital Resource Access policy may result in suspension of library privileges. This policy outlines the rules regarding Digital Resource Access. All patrons must adhere strictly to these guidelines to ensure fair access and safety. Failure to comply with the Digital Resource Access policy may result in suspension of library privileges. </w:t>
-      </w:r>
-    </w:p>
-    <w:p>
-      <w:r>
-        <w:t xml:space="preserve">This policy outlines the rules regarding Digital Resource Access. All patrons must adhere strictly to these guidelines to ensure fair access and safety. Failure to comply with the Digital Resource Access policy may result in suspension of library privileges. This policy outlines the rules regarding Digital Resource Access. All patrons must adhere strictly to these guidelines to ensure fair access and safety. Failure to comply with the Digital Resource Access policy may result in suspension of library privileges. This policy outlines the rules regarding Digital Resource Access. All patrons must adhere strictly to these guidelines to ensure fair access and safety. Failure to comply with the Digital Resource Access policy may result in suspension of library privileges. This policy outlines the rules regarding Digital Resource Access. All patrons must adhere strictly to these guidelines to ensure fair access and safety. Failure to comply with the Digital Resource Access policy may result in suspension of library privileges. This policy outlines the rules regarding Digital Resource Access. All patrons must adhere strictly to these guidelines to ensure fair access and safety. Failure to comply with the Digital Resource Access policy may result in suspension of library privileges. This policy outlines the rules regarding Digital Resource Access. All patrons must adhere strictly to these guidelines to ensure fair access and safety. Failure to comply with the Digital Resource Access policy may result in suspension of library privileges. </w:t>
-      </w:r>
-    </w:p>
-    <w:p>
-      <w:r>
-        <w:t xml:space="preserve">This policy outlines the rules regarding Digital Resource Access. All patrons must adhere strictly to these guidelines to ensure fair access and safety. Failure to comply with the Digital Resource Access policy may result in suspension of library privileges. This policy outlines the rules regarding Digital Resource Access. All patrons must adhere strictly to these guidelines to ensure fair access and safety. Failure to comply with the Digital Resource Access policy may result in suspension of library privileges. This policy outlines the rules regarding Digital Resource Access. All patrons must adhere strictly to these guidelines to ensure fair access and safety. Failure to comply with the Digital Resource Access policy may result in suspension of library privileges. This policy outlines the rules regarding Digital Resource Access. All patrons must adhere strictly to these guidelines to ensure fair access and safety. Failure to comply with the Digital Resource Access policy may result in suspension of library privileges. This policy outlines the rules regarding Digital Resource Access. All patrons must adhere strictly to these guidelines to ensure fair access and safety. Failure to comply with the Digital Resource Access policy may result in suspension of library privileges. This policy outlines the rules regarding Digital Resource Access. All patrons must adhere strictly to these guidelines to ensure fair access and safety. Failure to comply with the Digital Resource Access policy may result in suspension of library privileges. </w:t>
-      </w:r>
-    </w:p>
-    <w:p>
-      <w:r>
-        <w:br w:type="page"/>
-      </w:r>
-    </w:p>
-    <w:p>
-      <w:pPr>
-        <w:pStyle w:val="Heading2"/>
-      </w:pPr>
-      <w:r>
-        <w:t>Digital Resource Access - Part 5</w:t>
-      </w:r>
-    </w:p>
-    <w:p>
-      <w:r>
-        <w:t xml:space="preserve">This policy outlines the rules regarding Digital Resource Access. All patrons must adhere strictly to these guidelines to ensure fair access and safety. Failure to comply with the Digital Resource Access policy may result in suspension of library privileges. This policy outlines the rules regarding Digital Resource Access. All patrons must adhere strictly to these guidelines to ensure fair access and safety. Failure to comply with the Digital Resource Access policy may result in suspension of library privileges. This policy outlines the rules regarding Digital Resource Access. All patrons must adhere strictly to these guidelines to ensure fair access and safety. Failure to comply with the Digital Resource Access policy may result in suspension of library privileges. This policy outlines the rules regarding Digital Resource Access. All patrons must adhere strictly to these guidelines to ensure fair access and safety. Failure to comply with the Digital Resource Access policy may result in suspension of library privileges. This policy outlines the rules regarding Digital Resource Access. All patrons must adhere strictly to these guidelines to ensure fair access and safety. Failure to comply with the Digital Resource Access policy may result in suspension of library privileges. This policy outlines the rules regarding Digital Resource Access. All patrons must adhere strictly to these guidelines to ensure fair access and safety. Failure to comply with the Digital Resource Access policy may result in suspension of library privileges. </w:t>
-      </w:r>
-    </w:p>
-    <w:p>
-      <w:r>
-        <w:t xml:space="preserve">This policy outlines the rules regarding Digital Resource Access. All patrons must adhere strictly to these guidelines to ensure fair access and safety. Failure to comply with the Digital Resource Access policy may result in suspension of library privileges. This policy outlines the rules regarding Digital Resource Access. All patrons must adhere strictly to these guidelines to ensure fair access and safety. Failure to comply with the Digital Resource Access policy may result in suspension of library privileges. This policy outlines the rules regarding Digital Resource Access. All patrons must adhere strictly to these guidelines to ensure fair access and safety. Failure to comply with the Digital Resource Access policy may result in suspension of library privileges. This policy outlines the rules regarding Digital Resource Access. All patrons must adhere strictly to these guidelines to ensure fair access and safety. Failure to comply with the Digital Resource Access policy may result in suspension of library privileges. This policy outlines the rules regarding Digital Resource Access. All patrons must adhere strictly to these guidelines to ensure fair access and safety. Failure to comply with the Digital Resource Access policy may result in suspension of library privileges. This policy outlines the rules regarding Digital Resource Access. All patrons must adhere strictly to these guidelines to ensure fair access and safety. Failure to comply with the Digital Resource Access policy may result in suspension of library privileges. </w:t>
-      </w:r>
-    </w:p>
-    <w:p>
-      <w:r>
-        <w:t xml:space="preserve">This policy outlines the rules regarding Digital Resource Access. All patrons must adhere strictly to these guidelines to ensure fair access and safety. Failure to comply with the Digital Resource Access policy may result in suspension of library privileges. This policy outlines the rules regarding Digital Resource Access. All patrons must adhere strictly to these guidelines to ensure fair access and safety. Failure to comply with the Digital Resource Access policy may result in suspension of library privileges. This policy outlines the rules regarding Digital Resource Access. All patrons must adhere strictly to these guidelines to ensure fair access and safety. Failure to comply with the Digital Resource Access policy may result in suspension of library privileges. This policy outlines the rules regarding Digital Resource Access. All patrons must adhere strictly to these guidelines to ensure fair access and safety. Failure to comply with the Digital Resource Access policy may result in suspension of library privileges. This policy outlines the rules regarding Digital Resource Access. All patrons must adhere strictly to these guidelines to ensure fair access and safety. Failure to comply with the Digital Resource Access policy may result in suspension of library privileges. This policy outlines the rules regarding Digital Resource Access. All patrons must adhere strictly to these guidelines to ensure fair access and safety. Failure to comply with the Digital Resource Access policy may result in suspension of library privileges. </w:t>
-      </w:r>
-    </w:p>
-    <w:p>
-      <w:r>
-        <w:br w:type="page"/>
-      </w:r>
-    </w:p>
-    <w:p>
-      <w:pPr>
-        <w:pStyle w:val="Heading2"/>
-      </w:pPr>
-      <w:r>
-        <w:t>Digital Resource Access - Part 6</w:t>
-      </w:r>
-    </w:p>
-    <w:p>
-      <w:r>
-        <w:t xml:space="preserve">This policy outlines the rules regarding Digital Resource Access. All patrons must adhere strictly to these guidelines to ensure fair access and safety. Failure to comply with the Digital Resource Access policy may result in suspension of library privileges. This policy outlines the rules regarding Digital Resource Access. All patrons must adhere strictly to these guidelines to ensure fair access and safety. Failure to comply with the Digital Resource Access policy may result in suspension of library privileges. This policy outlines the rules regarding Digital Resource Access. All patrons must adhere strictly to these guidelines to ensure fair access and safety. Failure to comply with the Digital Resource Access policy may result in suspension of library privileges. This policy outlines the rules regarding Digital Resource Access. All patrons must adhere strictly to these guidelines to ensure fair access and safety. Failure to comply with the Digital Resource Access policy may result in suspension of library privileges. This policy outlines the rules regarding Digital Resource Access. All patrons must adhere strictly to these guidelines to ensure fair access and safety. Failure to comply with the Digital Resource Access policy may result in suspension of library privileges. This policy outlines the rules regarding Digital Resource Access. All patrons must adhere strictly to these guidelines to ensure fair access and safety. Failure to comply with the Digital Resource Access policy may result in suspension of library privileges. </w:t>
-      </w:r>
-    </w:p>
-    <w:p>
-      <w:r>
-        <w:t xml:space="preserve">This policy outlines the rules regarding Digital Resource Access. All patrons must adhere strictly to these guidelines to ensure fair access and safety. Failure to comply with the Digital Resource Access policy may result in suspension of library privileges. This policy outlines the rules regarding Digital Resource Access. All patrons must adhere strictly to these guidelines to ensure fair access and safety. Failure to comply with the Digital Resource Access policy may result in suspension of library privileges. This policy outlines the rules regarding Digital Resource Access. All patrons must adhere strictly to these guidelines to ensure fair access and safety. Failure to comply with the Digital Resource Access policy may result in suspension of library privileges. This policy outlines the rules regarding Digital Resource Access. All patrons must adhere strictly to these guidelines to ensure fair access and safety. Failure to comply with the Digital Resource Access policy may result in suspension of library privileges. This policy outlines the rules regarding Digital Resource Access. All patrons must adhere strictly to these guidelines to ensure fair access and safety. Failure to comply with the Digital Resource Access policy may result in suspension of library privileges. This policy outlines the rules regarding Digital Resource Access. All patrons must adhere strictly to these guidelines to ensure fair access and safety. Failure to comply with the Digital Resource Access policy may result in suspension of library privileges. </w:t>
-      </w:r>
-    </w:p>
-    <w:p>
-      <w:r>
-        <w:t xml:space="preserve">This policy outlines the rules regarding Digital Resource Access. All patrons must adhere strictly to these guidelines to ensure fair access and safety. Failure to comply with the Digital Resource Access policy may result in suspension of library privileges. This policy outlines the rules regarding Digital Resource Access. All patrons must adhere strictly to these guidelines to ensure fair access and safety. Failure to comply with the Digital Resource Access policy may result in suspension of library privileges. This policy outlines the rules regarding Digital Resource Access. All patrons must adhere strictly to these guidelines to ensure fair access and safety. Failure to comply with the Digital Resource Access policy may result in suspension of library privileges. This policy outlines the rules regarding Digital Resource Access. All patrons must adhere strictly to these guidelines to ensure fair access and safety. Failure to comply with the Digital Resource Access policy may result in suspension of library privileges. This policy outlines the rules regarding Digital Resource Access. All patrons must adhere strictly to these guidelines to ensure fair access and safety. Failure to comply with the Digital Resource Access policy may result in suspension of library privileges. This policy outlines the rules regarding Digital Resource Access. All patrons must adhere strictly to these guidelines to ensure fair access and safety. Failure to comply with the Digital Resource Access policy may result in suspension of library privileges. </w:t>
-      </w:r>
-    </w:p>
-    <w:p>
-      <w:r>
-        <w:br w:type="page"/>
-      </w:r>
-    </w:p>
-    <w:p>
-      <w:pPr>
-        <w:pStyle w:val="Heading2"/>
-      </w:pPr>
-      <w:r>
-        <w:t>Digital Resource Access - Part 7</w:t>
-      </w:r>
-    </w:p>
-    <w:p>
-      <w:r>
-        <w:t xml:space="preserve">This policy outlines the rules regarding Digital Resource Access. All patrons must adhere strictly to these guidelines to ensure fair access and safety. Failure to comply with the Digital Resource Access policy may result in suspension of library privileges. This policy outlines the rules regarding Digital Resource Access. All patrons must adhere strictly to these guidelines to ensure fair access and safety. Failure to comply with the Digital Resource Access policy may result in suspension of library privileges. This policy outlines the rules regarding Digital Resource Access. All patrons must adhere strictly to these guidelines to ensure fair access and safety. Failure to comply with the Digital Resource Access policy may result in suspension of library privileges. This policy outlines the rules regarding Digital Resource Access. All patrons must adhere strictly to these guidelines to ensure fair access and safety. Failure to comply with the Digital Resource Access policy may result in suspension of library privileges. This policy outlines the rules regarding Digital Resource Access. All patrons must adhere strictly to these guidelines to ensure fair access and safety. Failure to comply with the Digital Resource Access policy may result in suspension of library privileges. This policy outlines the rules regarding Digital Resource Access. All patrons must adhere strictly to these guidelines to ensure fair access and safety. Failure to comply with the Digital Resource Access policy may result in suspension of library privileges. </w:t>
-      </w:r>
-    </w:p>
-    <w:p>
-      <w:r>
-        <w:t xml:space="preserve">This policy outlines the rules regarding Digital Resource Access. All patrons must adhere strictly to these guidelines to ensure fair access and safety. Failure to comply with the Digital Resource Access policy may result in suspension of library privileges. This policy outlines the rules regarding Digital Resource Access. All patrons must adhere strictly to these guidelines to ensure fair access and safety. Failure to comply with the Digital Resource Access policy may result in suspension of library privileges. This policy outlines the rules regarding Digital Resource Access. All patrons must adhere strictly to these guidelines to ensure fair access and safety. Failure to comply with the Digital Resource Access policy may result in suspension of library privileges. This policy outlines the rules regarding Digital Resource Access. All patrons must adhere strictly to these guidelines to ensure fair access and safety. Failure to comply with the Digital Resource Access policy may result in suspension of library privileges. This policy outlines the rules regarding Digital Resource Access. All patrons must adhere strictly to these guidelines to ensure fair access and safety. Failure to comply with the Digital Resource Access policy may result in suspension of library privileges. This policy outlines the rules regarding Digital Resource Access. All patrons must adhere strictly to these guidelines to ensure fair access and safety. Failure to comply with the Digital Resource Access policy may result in suspension of library privileges. </w:t>
-      </w:r>
-    </w:p>
-    <w:p>
-      <w:r>
-        <w:t xml:space="preserve">This policy outlines the rules regarding Digital Resource Access. All patrons must adhere strictly to these guidelines to ensure fair access and safety. Failure to comply with the Digital Resource Access policy may result in suspension of library privileges. This policy outlines the rules regarding Digital Resource Access. All patrons must adhere strictly to these guidelines to ensure fair access and safety. Failure to comply with the Digital Resource Access policy may result in suspension of library privileges. This policy outlines the rules regarding Digital Resource Access. All patrons must adhere strictly to these guidelines to ensure fair access and safety. Failure to comply with the Digital Resource Access policy may result in suspension of library privileges. This policy outlines the rules regarding Digital Resource Access. All patrons must adhere strictly to these guidelines to ensure fair access and safety. Failure to comply with the Digital Resource Access policy may result in suspension of library privileges. This policy outlines the rules regarding Digital Resource Access. All patrons must adhere strictly to these guidelines to ensure fair access and safety. Failure to comply with the Digital Resource Access policy may result in suspension of library privileges. This policy outlines the rules regarding Digital Resource Access. All patrons must adhere strictly to these guidelines to ensure fair access and safety. Failure to comply with the Digital Resource Access policy may result in suspension of library privileges. </w:t>
-      </w:r>
-    </w:p>
-    <w:p>
-      <w:r>
-        <w:br w:type="page"/>
-      </w:r>
-    </w:p>
-    <w:p>
-      <w:pPr>
-        <w:pStyle w:val="Heading2"/>
-      </w:pPr>
-      <w:r>
-        <w:t>Digital Resource Access - Part 8</w:t>
-      </w:r>
-    </w:p>
-    <w:p>
-      <w:r>
-        <w:t xml:space="preserve">This policy outlines the rules regarding Digital Resource Access. All patrons must adhere strictly to these guidelines to ensure fair access and safety. Failure to comply with the Digital Resource Access policy may result in suspension of library privileges. This policy outlines the rules regarding Digital Resource Access. All patrons must adhere strictly to these guidelines to ensure fair access and safety. Failure to comply with the Digital Resource Access policy may result in suspension of library privileges. This policy outlines the rules regarding Digital Resource Access. All patrons must adhere strictly to these guidelines to ensure fair access and safety. Failure to comply with the Digital Resource Access policy may result in suspension of library privileges. This policy outlines the rules regarding Digital Resource Access. All patrons must adhere strictly to these guidelines to ensure fair access and safety. Failure to comply with the Digital Resource Access policy may result in suspension of library privileges. This policy outlines the rules regarding Digital Resource Access. All patrons must adhere strictly to these guidelines to ensure fair access and safety. Failure to comply with the Digital Resource Access policy may result in suspension of library privileges. This policy outlines the rules regarding Digital Resource Access. All patrons must adhere strictly to these guidelines to ensure fair access and safety. Failure to comply with the Digital Resource Access policy may result in suspension of library privileges. </w:t>
-      </w:r>
-    </w:p>
-    <w:p>
-      <w:r>
-        <w:t xml:space="preserve">This policy outlines the rules regarding Digital Resource Access. All patrons must adhere strictly to these guidelines to ensure fair access and safety. Failure to comply with the Digital Resource Access policy may result in suspension of library privileges. This policy outlines the rules regarding Digital Resource Access. All patrons must adhere strictly to these guidelines to ensure fair access and safety. Failure to comply with the Digital Resource Access policy may result in suspension of library privileges. This policy outlines the rules regarding Digital Resource Access. All patrons must adhere strictly to these guidelines to ensure fair access and safety. Failure to comply with the Digital Resource Access policy may result in suspension of library privileges. This policy outlines the rules regarding Digital Resource Access. All patrons must adhere strictly to these guidelines to ensure fair access and safety. Failure to comply with the Digital Resource Access policy may result in suspension of library privileges. This policy outlines the rules regarding Digital Resource Access. All patrons must adhere strictly to these guidelines to ensure fair access and safety. Failure to comply with the Digital Resource Access policy may result in suspension of library privileges. This policy outlines the rules regarding Digital Resource Access. All patrons must adhere strictly to these guidelines to ensure fair access and safety. Failure to comply with the Digital Resource Access policy may result in suspension of library privileges. </w:t>
-      </w:r>
-    </w:p>
-    <w:p>
-      <w:r>
-        <w:t xml:space="preserve">This policy outlines the rules regarding Digital Resource Access. All patrons must adhere strictly to these guidelines to ensure fair access and safety. Failure to comply with the Digital Resource Access policy may result in suspension of library privileges. This policy outlines the rules regarding Digital Resource Access. All patrons must adhere strictly to these guidelines to ensure fair access and safety. Failure to comply with the Digital Resource Access policy may result in suspension of library privileges. This policy outlines the rules regarding Digital Resource Access. All patrons must adhere strictly to these guidelines to ensure fair access and safety. Failure to comply with the Digital Resource Access policy may result in suspension of library privileges. This policy outlines the rules regarding Digital Resource Access. All patrons must adhere strictly to these guidelines to ensure fair access and safety. Failure to comply with the Digital Resource Access policy may result in suspension of library privileges. This policy outlines the rules regarding Digital Resource Access. All patrons must adhere strictly to these guidelines to ensure fair access and safety. Failure to comply with the Digital Resource Access policy may result in suspension of library privileges. This policy outlines the rules regarding Digital Resource Access. All patrons must adhere strictly to these guidelines to ensure fair access and safety. Failure to comply with the Digital Resource Access policy may result in suspension of library privileges. </w:t>
-      </w:r>
-    </w:p>
-    <w:p>
-      <w:r>
-        <w:br w:type="page"/>
-      </w:r>
-    </w:p>
-    <w:p>
-      <w:pPr>
-        <w:pStyle w:val="Heading2"/>
-      </w:pPr>
-      <w:r>
-        <w:t>Digital Resource Access - Part 9</w:t>
-      </w:r>
-    </w:p>
-    <w:p>
-      <w:r>
-        <w:t xml:space="preserve">This policy outlines the rules regarding Digital Resource Access. All patrons must adhere strictly to these guidelines to ensure fair access and safety. Failure to comply with the Digital Resource Access policy may result in suspension of library privileges. This policy outlines the rules regarding Digital Resource Access. All patrons must adhere strictly to these guidelines to ensure fair access and safety. Failure to comply with the Digital Resource Access policy may result in suspension of library privileges. This policy outlines the rules regarding Digital Resource Access. All patrons must adhere strictly to these guidelines to ensure fair access and safety. Failure to comply with the Digital Resource Access policy may result in suspension of library privileges. This policy outlines the rules regarding Digital Resource Access. All patrons must adhere strictly to these guidelines to ensure fair access and safety. Failure to comply with the Digital Resource Access policy may result in suspension of library privileges. This policy outlines the rules regarding Digital Resource Access. All patrons must adhere strictly to these guidelines to ensure fair access and safety. Failure to comply with the Digital Resource Access policy may result in suspension of library privileges. This policy outlines the rules regarding Digital Resource Access. All patrons must adhere strictly to these guidelines to ensure fair access and safety. Failure to comply with the Digital Resource Access policy may result in suspension of library privileges. </w:t>
-      </w:r>
-    </w:p>
-    <w:p>
-      <w:r>
-        <w:t xml:space="preserve">This policy outlines the rules regarding Digital Resource Access. All patrons must adhere strictly to these guidelines to ensure fair access and safety. Failure to comply with the Digital Resource Access policy may result in suspension of library privileges. This policy outlines the rules regarding Digital Resource Access. All patrons must adhere strictly to these guidelines to ensure fair access and safety. Failure to comply with the Digital Resource Access policy may result in suspension of library privileges. This policy outlines the rules regarding Digital Resource Access. All patrons must adhere strictly to these guidelines to ensure fair access and safety. Failure to comply with the Digital Resource Access policy may result in suspension of library privileges. This policy outlines the rules regarding Digital Resource Access. All patrons must adhere strictly to these guidelines to ensure fair access and safety. Failure to comply with the Digital Resource Access policy may result in suspension of library privileges. This policy outlines the rules regarding Digital Resource Access. All patrons must adhere strictly to these guidelines to ensure fair access and safety. Failure to comply with the Digital Resource Access policy may result in suspension of library privileges. This policy outlines the rules regarding Digital Resource Access. All patrons must adhere strictly to these guidelines to ensure fair access and safety. Failure to comply with the Digital Resource Access policy may result in suspension of library privileges. </w:t>
-      </w:r>
-    </w:p>
-    <w:p>
-      <w:r>
-        <w:t xml:space="preserve">This policy outlines the rules regarding Digital Resource Access. All patrons must adhere strictly to these guidelines to ensure fair access and safety. Failure to comply with the Digital Resource Access policy may result in suspension of library privileges. This policy outlines the rules regarding Digital Resource Access. All patrons must adhere strictly to these guidelines to ensure fair access and safety. Failure to comply with the Digital Resource Access policy may result in suspension of library privileges. This policy outlines the rules regarding Digital Resource Access. All patrons must adhere strictly to these guidelines to ensure fair access and safety. Failure to comply with the Digital Resource Access policy may result in suspension of library privileges. This policy outlines the rules regarding Digital Resource Access. All patrons must adhere strictly to these guidelines to ensure fair access and safety. Failure to comply with the Digital Resource Access policy may result in suspension of library privileges. This policy outlines the rules regarding Digital Resource Access. All patrons must adhere strictly to these guidelines to ensure fair access and safety. Failure to comply with the Digital Resource Access policy may result in suspension of library privileges. This policy outlines the rules regarding Digital Resource Access. All patrons must adhere strictly to these guidelines to ensure fair access and safety. Failure to comply with the Digital Resource Access policy may result in suspension of library privileges. </w:t>
-      </w:r>
-    </w:p>
-    <w:p>
-      <w:r>
-        <w:br w:type="page"/>
-      </w:r>
-    </w:p>
-    <w:p>
-      <w:pPr>
-        <w:pStyle w:val="Heading2"/>
-      </w:pPr>
-      <w:r>
-        <w:t>Digital Resource Access - Part 10</w:t>
-      </w:r>
-    </w:p>
-    <w:p>
-      <w:r>
-        <w:t xml:space="preserve">This policy outlines the rules regarding Digital Resource Access. All patrons must adhere strictly to these guidelines to ensure fair access and safety. Failure to comply with the Digital Resource Access policy may result in suspension of library privileges. This policy outlines the rules regarding Digital Resource Access. All patrons must adhere strictly to these guidelines to ensure fair access and safety. Failure to comply with the Digital Resource Access policy may result in suspension of library privileges. This policy outlines the rules regarding Digital Resource Access. All patrons must adhere strictly to these guidelines to ensure fair access and safety. Failure to comply with the Digital Resource Access policy may result in suspension of library privileges. This policy outlines the rules regarding Digital Resource Access. All patrons must adhere strictly to these guidelines to ensure fair access and safety. Failure to comply with the Digital Resource Access policy may result in suspension of library privileges. This policy outlines the rules regarding Digital Resource Access. All patrons must adhere strictly to these guidelines to ensure fair access and safety. Failure to comply with the Digital Resource Access policy may result in suspension of library privileges. This policy outlines the rules regarding Digital Resource Access. All patrons must adhere strictly to these guidelines to ensure fair access and safety. Failure to comply with the Digital Resource Access policy may result in suspension of library privileges. </w:t>
-      </w:r>
-    </w:p>
-    <w:p>
-      <w:r>
-        <w:t xml:space="preserve">This policy outlines the rules regarding Digital Resource Access. All patrons must adhere strictly to these guidelines to ensure fair access and safety. Failure to comply with the Digital Resource Access policy may result in suspension of library privileges. This policy outlines the rules regarding Digital Resource Access. All patrons must adhere strictly to these guidelines to ensure fair access and safety. Failure to comply with the Digital Resource Access policy may result in suspension of library privileges. This policy outlines the rules regarding Digital Resource Access. All patrons must adhere strictly to these guidelines to ensure fair access and safety. Failure to comply with the Digital Resource Access policy may result in suspension of library privileges. This policy outlines the rules regarding Digital Resource Access. All patrons must adhere strictly to these guidelines to ensure fair access and safety. Failure to comply with the Digital Resource Access policy may result in suspension of library privileges. This policy outlines the rules regarding Digital Resource Access. All patrons must adhere strictly to these guidelines to ensure fair access and safety. Failure to comply with the Digital Resource Access policy may result in suspension of library privileges. This policy outlines the rules regarding Digital Resource Access. All patrons must adhere strictly to these guidelines to ensure fair access and safety. Failure to comply with the Digital Resource Access policy may result in suspension of library privileges. </w:t>
-      </w:r>
-    </w:p>
-    <w:p>
-      <w:r>
-        <w:t xml:space="preserve">This policy outlines the rules regarding Digital Resource Access. All patrons must adhere strictly to these guidelines to ensure fair access and safety. Failure to comply with the Digital Resource Access policy may result in suspension of library privileges. This policy outlines the rules regarding Digital Resource Access. All patrons must adhere strictly to these guidelines to ensure fair access and safety. Failure to comply with the Digital Resource Access policy may result in suspension of library privileges. This policy outlines the rules regarding Digital Resource Access. All patrons must adhere strictly to these guidelines to ensure fair access and safety. Failure to comply with the Digital Resource Access policy may result in suspension of library privileges. This policy outlines the rules regarding Digital Resource Access. All patrons must adhere strictly to these guidelines to ensure fair access and safety. Failure to comply with the Digital Resource Access policy may result in suspension of library privileges. This policy outlines the rules regarding Digital Resource Access. All patrons must adhere strictly to these guidelines to ensure fair access and safety. Failure to comply with the Digital Resource Access policy may result in suspension of library privileges. This policy outlines the rules regarding Digital Resource Access. All patrons must adhere strictly to these guidelines to ensure fair access and safety. Failure to comply with the Digital Resource Access policy may result in suspension of library privileges. </w:t>
-      </w:r>
-    </w:p>
-    <w:p>
-      <w:r>
-        <w:br w:type="page"/>
+        <w:t>- Campus Network: Access to online journals, IEEE Xplore, ScienceDirect, and JSTOR is available to all active students and faculty on campus.</w:t>
+        <w:br/>
+        <w:t>- Off-Campus VPN: Off-campus access requires logging in through the University proxy/VPN service using institutional credentials.</w:t>
+        <w:br/>
+        <w:t>- Fair Usage: Bulk downloading or automated scraping of electronic databases is strictly prohibited by publisher license agreements.</w:t>
       </w:r>
     </w:p>
     <w:p>
@@ -879,287 +72,16 @@
         <w:pStyle w:val="Heading1"/>
       </w:pPr>
       <w:r>
-        <w:t>Section 4: Interlibrary Loan</w:t>
-      </w:r>
-    </w:p>
-    <w:p>
-      <w:pPr>
-        <w:pStyle w:val="Heading2"/>
-      </w:pPr>
-      <w:r>
-        <w:t>Interlibrary Loan - Part 1</w:t>
+        <w:t>Section 4: Interlibrary Loan (ILL)</w:t>
       </w:r>
     </w:p>
     <w:p>
       <w:r>
-        <w:t xml:space="preserve">This policy outlines the rules regarding Interlibrary Loan. All patrons must adhere strictly to these guidelines to ensure fair access and safety. Failure to comply with the Interlibrary Loan policy may result in suspension of library privileges. This policy outlines the rules regarding Interlibrary Loan. All patrons must adhere strictly to these guidelines to ensure fair access and safety. Failure to comply with the Interlibrary Loan policy may result in suspension of library privileges. This policy outlines the rules regarding Interlibrary Loan. All patrons must adhere strictly to these guidelines to ensure fair access and safety. Failure to comply with the Interlibrary Loan policy may result in suspension of library privileges. This policy outlines the rules regarding Interlibrary Loan. All patrons must adhere strictly to these guidelines to ensure fair access and safety. Failure to comply with the Interlibrary Loan policy may result in suspension of library privileges. This policy outlines the rules regarding Interlibrary Loan. All patrons must adhere strictly to these guidelines to ensure fair access and safety. Failure to comply with the Interlibrary Loan policy may result in suspension of library privileges. This policy outlines the rules regarding Interlibrary Loan. All patrons must adhere strictly to these guidelines to ensure fair access and safety. Failure to comply with the Interlibrary Loan policy may result in suspension of library privileges. </w:t>
-      </w:r>
-    </w:p>
-    <w:p>
-      <w:r>
-        <w:t xml:space="preserve">This policy outlines the rules regarding Interlibrary Loan. All patrons must adhere strictly to these guidelines to ensure fair access and safety. Failure to comply with the Interlibrary Loan policy may result in suspension of library privileges. This policy outlines the rules regarding Interlibrary Loan. All patrons must adhere strictly to these guidelines to ensure fair access and safety. Failure to comply with the Interlibrary Loan policy may result in suspension of library privileges. This policy outlines the rules regarding Interlibrary Loan. All patrons must adhere strictly to these guidelines to ensure fair access and safety. Failure to comply with the Interlibrary Loan policy may result in suspension of library privileges. This policy outlines the rules regarding Interlibrary Loan. All patrons must adhere strictly to these guidelines to ensure fair access and safety. Failure to comply with the Interlibrary Loan policy may result in suspension of library privileges. This policy outlines the rules regarding Interlibrary Loan. All patrons must adhere strictly to these guidelines to ensure fair access and safety. Failure to comply with the Interlibrary Loan policy may result in suspension of library privileges. This policy outlines the rules regarding Interlibrary Loan. All patrons must adhere strictly to these guidelines to ensure fair access and safety. Failure to comply with the Interlibrary Loan policy may result in suspension of library privileges. </w:t>
-      </w:r>
-    </w:p>
-    <w:p>
-      <w:r>
-        <w:t xml:space="preserve">This policy outlines the rules regarding Interlibrary Loan. All patrons must adhere strictly to these guidelines to ensure fair access and safety. Failure to comply with the Interlibrary Loan policy may result in suspension of library privileges. This policy outlines the rules regarding Interlibrary Loan. All patrons must adhere strictly to these guidelines to ensure fair access and safety. Failure to comply with the Interlibrary Loan policy may result in suspension of library privileges. This policy outlines the rules regarding Interlibrary Loan. All patrons must adhere strictly to these guidelines to ensure fair access and safety. Failure to comply with the Interlibrary Loan policy may result in suspension of library privileges. This policy outlines the rules regarding Interlibrary Loan. All patrons must adhere strictly to these guidelines to ensure fair access and safety. Failure to comply with the Interlibrary Loan policy may result in suspension of library privileges. This policy outlines the rules regarding Interlibrary Loan. All patrons must adhere strictly to these guidelines to ensure fair access and safety. Failure to comply with the Interlibrary Loan policy may result in suspension of library privileges. This policy outlines the rules regarding Interlibrary Loan. All patrons must adhere strictly to these guidelines to ensure fair access and safety. Failure to comply with the Interlibrary Loan policy may result in suspension of library privileges. </w:t>
-      </w:r>
-    </w:p>
-    <w:p>
-      <w:r>
-        <w:br w:type="page"/>
-      </w:r>
-    </w:p>
-    <w:p>
-      <w:pPr>
-        <w:pStyle w:val="Heading2"/>
-      </w:pPr>
-      <w:r>
-        <w:t>Interlibrary Loan - Part 2</w:t>
-      </w:r>
-    </w:p>
-    <w:p>
-      <w:r>
-        <w:t xml:space="preserve">This policy outlines the rules regarding Interlibrary Loan. All patrons must adhere strictly to these guidelines to ensure fair access and safety. Failure to comply with the Interlibrary Loan policy may result in suspension of library privileges. This policy outlines the rules regarding Interlibrary Loan. All patrons must adhere strictly to these guidelines to ensure fair access and safety. Failure to comply with the Interlibrary Loan policy may result in suspension of library privileges. This policy outlines the rules regarding Interlibrary Loan. All patrons must adhere strictly to these guidelines to ensure fair access and safety. Failure to comply with the Interlibrary Loan policy may result in suspension of library privileges. This policy outlines the rules regarding Interlibrary Loan. All patrons must adhere strictly to these guidelines to ensure fair access and safety. Failure to comply with the Interlibrary Loan policy may result in suspension of library privileges. This policy outlines the rules regarding Interlibrary Loan. All patrons must adhere strictly to these guidelines to ensure fair access and safety. Failure to comply with the Interlibrary Loan policy may result in suspension of library privileges. This policy outlines the rules regarding Interlibrary Loan. All patrons must adhere strictly to these guidelines to ensure fair access and safety. Failure to comply with the Interlibrary Loan policy may result in suspension of library privileges. </w:t>
-      </w:r>
-    </w:p>
-    <w:p>
-      <w:r>
-        <w:t xml:space="preserve">This policy outlines the rules regarding Interlibrary Loan. All patrons must adhere strictly to these guidelines to ensure fair access and safety. Failure to comply with the Interlibrary Loan policy may result in suspension of library privileges. This policy outlines the rules regarding Interlibrary Loan. All patrons must adhere strictly to these guidelines to ensure fair access and safety. Failure to comply with the Interlibrary Loan policy may result in suspension of library privileges. This policy outlines the rules regarding Interlibrary Loan. All patrons must adhere strictly to these guidelines to ensure fair access and safety. Failure to comply with the Interlibrary Loan policy may result in suspension of library privileges. This policy outlines the rules regarding Interlibrary Loan. All patrons must adhere strictly to these guidelines to ensure fair access and safety. Failure to comply with the Interlibrary Loan policy may result in suspension of library privileges. This policy outlines the rules regarding Interlibrary Loan. All patrons must adhere strictly to these guidelines to ensure fair access and safety. Failure to comply with the Interlibrary Loan policy may result in suspension of library privileges. This policy outlines the rules regarding Interlibrary Loan. All patrons must adhere strictly to these guidelines to ensure fair access and safety. Failure to comply with the Interlibrary Loan policy may result in suspension of library privileges. </w:t>
-      </w:r>
-    </w:p>
-    <w:p>
-      <w:r>
-        <w:t xml:space="preserve">This policy outlines the rules regarding Interlibrary Loan. All patrons must adhere strictly to these guidelines to ensure fair access and safety. Failure to comply with the Interlibrary Loan policy may result in suspension of library privileges. This policy outlines the rules regarding Interlibrary Loan. All patrons must adhere strictly to these guidelines to ensure fair access and safety. Failure to comply with the Interlibrary Loan policy may result in suspension of library privileges. This policy outlines the rules regarding Interlibrary Loan. All patrons must adhere strictly to these guidelines to ensure fair access and safety. Failure to comply with the Interlibrary Loan policy may result in suspension of library privileges. This policy outlines the rules regarding Interlibrary Loan. All patrons must adhere strictly to these guidelines to ensure fair access and safety. Failure to comply with the Interlibrary Loan policy may result in suspension of library privileges. This policy outlines the rules regarding Interlibrary Loan. All patrons must adhere strictly to these guidelines to ensure fair access and safety. Failure to comply with the Interlibrary Loan policy may result in suspension of library privileges. This policy outlines the rules regarding Interlibrary Loan. All patrons must adhere strictly to these guidelines to ensure fair access and safety. Failure to comply with the Interlibrary Loan policy may result in suspension of library privileges. </w:t>
-      </w:r>
-    </w:p>
-    <w:p>
-      <w:r>
-        <w:br w:type="page"/>
-      </w:r>
-    </w:p>
-    <w:p>
-      <w:pPr>
-        <w:pStyle w:val="Heading2"/>
-      </w:pPr>
-      <w:r>
-        <w:t>Interlibrary Loan - Part 3</w:t>
-      </w:r>
-    </w:p>
-    <w:p>
-      <w:r>
-        <w:t xml:space="preserve">This policy outlines the rules regarding Interlibrary Loan. All patrons must adhere strictly to these guidelines to ensure fair access and safety. Failure to comply with the Interlibrary Loan policy may result in suspension of library privileges. This policy outlines the rules regarding Interlibrary Loan. All patrons must adhere strictly to these guidelines to ensure fair access and safety. Failure to comply with the Interlibrary Loan policy may result in suspension of library privileges. This policy outlines the rules regarding Interlibrary Loan. All patrons must adhere strictly to these guidelines to ensure fair access and safety. Failure to comply with the Interlibrary Loan policy may result in suspension of library privileges. This policy outlines the rules regarding Interlibrary Loan. All patrons must adhere strictly to these guidelines to ensure fair access and safety. Failure to comply with the Interlibrary Loan policy may result in suspension of library privileges. This policy outlines the rules regarding Interlibrary Loan. All patrons must adhere strictly to these guidelines to ensure fair access and safety. Failure to comply with the Interlibrary Loan policy may result in suspension of library privileges. This policy outlines the rules regarding Interlibrary Loan. All patrons must adhere strictly to these guidelines to ensure fair access and safety. Failure to comply with the Interlibrary Loan policy may result in suspension of library privileges. </w:t>
-      </w:r>
-    </w:p>
-    <w:p>
-      <w:r>
-        <w:t xml:space="preserve">This policy outlines the rules regarding Interlibrary Loan. All patrons must adhere strictly to these guidelines to ensure fair access and safety. Failure to comply with the Interlibrary Loan policy may result in suspension of library privileges. This policy outlines the rules regarding Interlibrary Loan. All patrons must adhere strictly to these guidelines to ensure fair access and safety. Failure to comply with the Interlibrary Loan policy may result in suspension of library privileges. This policy outlines the rules regarding Interlibrary Loan. All patrons must adhere strictly to these guidelines to ensure fair access and safety. Failure to comply with the Interlibrary Loan policy may result in suspension of library privileges. This policy outlines the rules regarding Interlibrary Loan. All patrons must adhere strictly to these guidelines to ensure fair access and safety. Failure to comply with the Interlibrary Loan policy may result in suspension of library privileges. This policy outlines the rules regarding Interlibrary Loan. All patrons must adhere strictly to these guidelines to ensure fair access and safety. Failure to comply with the Interlibrary Loan policy may result in suspension of library privileges. This policy outlines the rules regarding Interlibrary Loan. All patrons must adhere strictly to these guidelines to ensure fair access and safety. Failure to comply with the Interlibrary Loan policy may result in suspension of library privileges. </w:t>
-      </w:r>
-    </w:p>
-    <w:p>
-      <w:r>
-        <w:t xml:space="preserve">This policy outlines the rules regarding Interlibrary Loan. All patrons must adhere strictly to these guidelines to ensure fair access and safety. Failure to comply with the Interlibrary Loan policy may result in suspension of library privileges. This policy outlines the rules regarding Interlibrary Loan. All patrons must adhere strictly to these guidelines to ensure fair access and safety. Failure to comply with the Interlibrary Loan policy may result in suspension of library privileges. This policy outlines the rules regarding Interlibrary Loan. All patrons must adhere strictly to these guidelines to ensure fair access and safety. Failure to comply with the Interlibrary Loan policy may result in suspension of library privileges. This policy outlines the rules regarding Interlibrary Loan. All patrons must adhere strictly to these guidelines to ensure fair access and safety. Failure to comply with the Interlibrary Loan policy may result in suspension of library privileges. This policy outlines the rules regarding Interlibrary Loan. All patrons must adhere strictly to these guidelines to ensure fair access and safety. Failure to comply with the Interlibrary Loan policy may result in suspension of library privileges. This policy outlines the rules regarding Interlibrary Loan. All patrons must adhere strictly to these guidelines to ensure fair access and safety. Failure to comply with the Interlibrary Loan policy may result in suspension of library privileges. </w:t>
-      </w:r>
-    </w:p>
-    <w:p>
-      <w:r>
-        <w:br w:type="page"/>
-      </w:r>
-    </w:p>
-    <w:p>
-      <w:pPr>
-        <w:pStyle w:val="Heading2"/>
-      </w:pPr>
-      <w:r>
-        <w:t>Interlibrary Loan - Part 4</w:t>
-      </w:r>
-    </w:p>
-    <w:p>
-      <w:r>
-        <w:t xml:space="preserve">This policy outlines the rules regarding Interlibrary Loan. All patrons must adhere strictly to these guidelines to ensure fair access and safety. Failure to comply with the Interlibrary Loan policy may result in suspension of library privileges. This policy outlines the rules regarding Interlibrary Loan. All patrons must adhere strictly to these guidelines to ensure fair access and safety. Failure to comply with the Interlibrary Loan policy may result in suspension of library privileges. This policy outlines the rules regarding Interlibrary Loan. All patrons must adhere strictly to these guidelines to ensure fair access and safety. Failure to comply with the Interlibrary Loan policy may result in suspension of library privileges. This policy outlines the rules regarding Interlibrary Loan. All patrons must adhere strictly to these guidelines to ensure fair access and safety. Failure to comply with the Interlibrary Loan policy may result in suspension of library privileges. This policy outlines the rules regarding Interlibrary Loan. All patrons must adhere strictly to these guidelines to ensure fair access and safety. Failure to comply with the Interlibrary Loan policy may result in suspension of library privileges. This policy outlines the rules regarding Interlibrary Loan. All patrons must adhere strictly to these guidelines to ensure fair access and safety. Failure to comply with the Interlibrary Loan policy may result in suspension of library privileges. </w:t>
-      </w:r>
-    </w:p>
-    <w:p>
-      <w:r>
-        <w:t xml:space="preserve">This policy outlines the rules regarding Interlibrary Loan. All patrons must adhere strictly to these guidelines to ensure fair access and safety. Failure to comply with the Interlibrary Loan policy may result in suspension of library privileges. This policy outlines the rules regarding Interlibrary Loan. All patrons must adhere strictly to these guidelines to ensure fair access and safety. Failure to comply with the Interlibrary Loan policy may result in suspension of library privileges. This policy outlines the rules regarding Interlibrary Loan. All patrons must adhere strictly to these guidelines to ensure fair access and safety. Failure to comply with the Interlibrary Loan policy may result in suspension of library privileges. This policy outlines the rules regarding Interlibrary Loan. All patrons must adhere strictly to these guidelines to ensure fair access and safety. Failure to comply with the Interlibrary Loan policy may result in suspension of library privileges. This policy outlines the rules regarding Interlibrary Loan. All patrons must adhere strictly to these guidelines to ensure fair access and safety. Failure to comply with the Interlibrary Loan policy may result in suspension of library privileges. This policy outlines the rules regarding Interlibrary Loan. All patrons must adhere strictly to these guidelines to ensure fair access and safety. Failure to comply with the Interlibrary Loan policy may result in suspension of library privileges. </w:t>
-      </w:r>
-    </w:p>
-    <w:p>
-      <w:r>
-        <w:t xml:space="preserve">This policy outlines the rules regarding Interlibrary Loan. All patrons must adhere strictly to these guidelines to ensure fair access and safety. Failure to comply with the Interlibrary Loan policy may result in suspension of library privileges. This policy outlines the rules regarding Interlibrary Loan. All patrons must adhere strictly to these guidelines to ensure fair access and safety. Failure to comply with the Interlibrary Loan policy may result in suspension of library privileges. This policy outlines the rules regarding Interlibrary Loan. All patrons must adhere strictly to these guidelines to ensure fair access and safety. Failure to comply with the Interlibrary Loan policy may result in suspension of library privileges. This policy outlines the rules regarding Interlibrary Loan. All patrons must adhere strictly to these guidelines to ensure fair access and safety. Failure to comply with the Interlibrary Loan policy may result in suspension of library privileges. This policy outlines the rules regarding Interlibrary Loan. All patrons must adhere strictly to these guidelines to ensure fair access and safety. Failure to comply with the Interlibrary Loan policy may result in suspension of library privileges. This policy outlines the rules regarding Interlibrary Loan. All patrons must adhere strictly to these guidelines to ensure fair access and safety. Failure to comply with the Interlibrary Loan policy may result in suspension of library privileges. </w:t>
-      </w:r>
-    </w:p>
-    <w:p>
-      <w:r>
-        <w:br w:type="page"/>
-      </w:r>
-    </w:p>
-    <w:p>
-      <w:pPr>
-        <w:pStyle w:val="Heading2"/>
-      </w:pPr>
-      <w:r>
-        <w:t>Interlibrary Loan - Part 5</w:t>
-      </w:r>
-    </w:p>
-    <w:p>
-      <w:r>
-        <w:t xml:space="preserve">This policy outlines the rules regarding Interlibrary Loan. All patrons must adhere strictly to these guidelines to ensure fair access and safety. Failure to comply with the Interlibrary Loan policy may result in suspension of library privileges. This policy outlines the rules regarding Interlibrary Loan. All patrons must adhere strictly to these guidelines to ensure fair access and safety. Failure to comply with the Interlibrary Loan policy may result in suspension of library privileges. This policy outlines the rules regarding Interlibrary Loan. All patrons must adhere strictly to these guidelines to ensure fair access and safety. Failure to comply with the Interlibrary Loan policy may result in suspension of library privileges. This policy outlines the rules regarding Interlibrary Loan. All patrons must adhere strictly to these guidelines to ensure fair access and safety. Failure to comply with the Interlibrary Loan policy may result in suspension of library privileges. This policy outlines the rules regarding Interlibrary Loan. All patrons must adhere strictly to these guidelines to ensure fair access and safety. Failure to comply with the Interlibrary Loan policy may result in suspension of library privileges. This policy outlines the rules regarding Interlibrary Loan. All patrons must adhere strictly to these guidelines to ensure fair access and safety. Failure to comply with the Interlibrary Loan policy may result in suspension of library privileges. </w:t>
-      </w:r>
-    </w:p>
-    <w:p>
-      <w:r>
-        <w:t xml:space="preserve">This policy outlines the rules regarding Interlibrary Loan. All patrons must adhere strictly to these guidelines to ensure fair access and safety. Failure to comply with the Interlibrary Loan policy may result in suspension of library privileges. This policy outlines the rules regarding Interlibrary Loan. All patrons must adhere strictly to these guidelines to ensure fair access and safety. Failure to comply with the Interlibrary Loan policy may result in suspension of library privileges. This policy outlines the rules regarding Interlibrary Loan. All patrons must adhere strictly to these guidelines to ensure fair access and safety. Failure to comply with the Interlibrary Loan policy may result in suspension of library privileges. This policy outlines the rules regarding Interlibrary Loan. All patrons must adhere strictly to these guidelines to ensure fair access and safety. Failure to comply with the Interlibrary Loan policy may result in suspension of library privileges. This policy outlines the rules regarding Interlibrary Loan. All patrons must adhere strictly to these guidelines to ensure fair access and safety. Failure to comply with the Interlibrary Loan policy may result in suspension of library privileges. This policy outlines the rules regarding Interlibrary Loan. All patrons must adhere strictly to these guidelines to ensure fair access and safety. Failure to comply with the Interlibrary Loan policy may result in suspension of library privileges. </w:t>
-      </w:r>
-    </w:p>
-    <w:p>
-      <w:r>
-        <w:t xml:space="preserve">This policy outlines the rules regarding Interlibrary Loan. All patrons must adhere strictly to these guidelines to ensure fair access and safety. Failure to comply with the Interlibrary Loan policy may result in suspension of library privileges. This policy outlines the rules regarding Interlibrary Loan. All patrons must adhere strictly to these guidelines to ensure fair access and safety. Failure to comply with the Interlibrary Loan policy may result in suspension of library privileges. This policy outlines the rules regarding Interlibrary Loan. All patrons must adhere strictly to these guidelines to ensure fair access and safety. Failure to comply with the Interlibrary Loan policy may result in suspension of library privileges. This policy outlines the rules regarding Interlibrary Loan. All patrons must adhere strictly to these guidelines to ensure fair access and safety. Failure to comply with the Interlibrary Loan policy may result in suspension of library privileges. This policy outlines the rules regarding Interlibrary Loan. All patrons must adhere strictly to these guidelines to ensure fair access and safety. Failure to comply with the Interlibrary Loan policy may result in suspension of library privileges. This policy outlines the rules regarding Interlibrary Loan. All patrons must adhere strictly to these guidelines to ensure fair access and safety. Failure to comply with the Interlibrary Loan policy may result in suspension of library privileges. </w:t>
-      </w:r>
-    </w:p>
-    <w:p>
-      <w:r>
-        <w:br w:type="page"/>
-      </w:r>
-    </w:p>
-    <w:p>
-      <w:pPr>
-        <w:pStyle w:val="Heading2"/>
-      </w:pPr>
-      <w:r>
-        <w:t>Interlibrary Loan - Part 6</w:t>
-      </w:r>
-    </w:p>
-    <w:p>
-      <w:r>
-        <w:t xml:space="preserve">This policy outlines the rules regarding Interlibrary Loan. All patrons must adhere strictly to these guidelines to ensure fair access and safety. Failure to comply with the Interlibrary Loan policy may result in suspension of library privileges. This policy outlines the rules regarding Interlibrary Loan. All patrons must adhere strictly to these guidelines to ensure fair access and safety. Failure to comply with the Interlibrary Loan policy may result in suspension of library privileges. This policy outlines the rules regarding Interlibrary Loan. All patrons must adhere strictly to these guidelines to ensure fair access and safety. Failure to comply with the Interlibrary Loan policy may result in suspension of library privileges. This policy outlines the rules regarding Interlibrary Loan. All patrons must adhere strictly to these guidelines to ensure fair access and safety. Failure to comply with the Interlibrary Loan policy may result in suspension of library privileges. This policy outlines the rules regarding Interlibrary Loan. All patrons must adhere strictly to these guidelines to ensure fair access and safety. Failure to comply with the Interlibrary Loan policy may result in suspension of library privileges. This policy outlines the rules regarding Interlibrary Loan. All patrons must adhere strictly to these guidelines to ensure fair access and safety. Failure to comply with the Interlibrary Loan policy may result in suspension of library privileges. </w:t>
-      </w:r>
-    </w:p>
-    <w:p>
-      <w:r>
-        <w:t xml:space="preserve">This policy outlines the rules regarding Interlibrary Loan. All patrons must adhere strictly to these guidelines to ensure fair access and safety. Failure to comply with the Interlibrary Loan policy may result in suspension of library privileges. This policy outlines the rules regarding Interlibrary Loan. All patrons must adhere strictly to these guidelines to ensure fair access and safety. Failure to comply with the Interlibrary Loan policy may result in suspension of library privileges. This policy outlines the rules regarding Interlibrary Loan. All patrons must adhere strictly to these guidelines to ensure fair access and safety. Failure to comply with the Interlibrary Loan policy may result in suspension of library privileges. This policy outlines the rules regarding Interlibrary Loan. All patrons must adhere strictly to these guidelines to ensure fair access and safety. Failure to comply with the Interlibrary Loan policy may result in suspension of library privileges. This policy outlines the rules regarding Interlibrary Loan. All patrons must adhere strictly to these guidelines to ensure fair access and safety. Failure to comply with the Interlibrary Loan policy may result in suspension of library privileges. This policy outlines the rules regarding Interlibrary Loan. All patrons must adhere strictly to these guidelines to ensure fair access and safety. Failure to comply with the Interlibrary Loan policy may result in suspension of library privileges. </w:t>
-      </w:r>
-    </w:p>
-    <w:p>
-      <w:r>
-        <w:t xml:space="preserve">This policy outlines the rules regarding Interlibrary Loan. All patrons must adhere strictly to these guidelines to ensure fair access and safety. Failure to comply with the Interlibrary Loan policy may result in suspension of library privileges. This policy outlines the rules regarding Interlibrary Loan. All patrons must adhere strictly to these guidelines to ensure fair access and safety. Failure to comply with the Interlibrary Loan policy may result in suspension of library privileges. This policy outlines the rules regarding Interlibrary Loan. All patrons must adhere strictly to these guidelines to ensure fair access and safety. Failure to comply with the Interlibrary Loan policy may result in suspension of library privileges. This policy outlines the rules regarding Interlibrary Loan. All patrons must adhere strictly to these guidelines to ensure fair access and safety. Failure to comply with the Interlibrary Loan policy may result in suspension of library privileges. This policy outlines the rules regarding Interlibrary Loan. All patrons must adhere strictly to these guidelines to ensure fair access and safety. Failure to comply with the Interlibrary Loan policy may result in suspension of library privileges. This policy outlines the rules regarding Interlibrary Loan. All patrons must adhere strictly to these guidelines to ensure fair access and safety. Failure to comply with the Interlibrary Loan policy may result in suspension of library privileges. </w:t>
-      </w:r>
-    </w:p>
-    <w:p>
-      <w:r>
-        <w:br w:type="page"/>
-      </w:r>
-    </w:p>
-    <w:p>
-      <w:pPr>
-        <w:pStyle w:val="Heading2"/>
-      </w:pPr>
-      <w:r>
-        <w:t>Interlibrary Loan - Part 7</w:t>
-      </w:r>
-    </w:p>
-    <w:p>
-      <w:r>
-        <w:t xml:space="preserve">This policy outlines the rules regarding Interlibrary Loan. All patrons must adhere strictly to these guidelines to ensure fair access and safety. Failure to comply with the Interlibrary Loan policy may result in suspension of library privileges. This policy outlines the rules regarding Interlibrary Loan. All patrons must adhere strictly to these guidelines to ensure fair access and safety. Failure to comply with the Interlibrary Loan policy may result in suspension of library privileges. This policy outlines the rules regarding Interlibrary Loan. All patrons must adhere strictly to these guidelines to ensure fair access and safety. Failure to comply with the Interlibrary Loan policy may result in suspension of library privileges. This policy outlines the rules regarding Interlibrary Loan. All patrons must adhere strictly to these guidelines to ensure fair access and safety. Failure to comply with the Interlibrary Loan policy may result in suspension of library privileges. This policy outlines the rules regarding Interlibrary Loan. All patrons must adhere strictly to these guidelines to ensure fair access and safety. Failure to comply with the Interlibrary Loan policy may result in suspension of library privileges. This policy outlines the rules regarding Interlibrary Loan. All patrons must adhere strictly to these guidelines to ensure fair access and safety. Failure to comply with the Interlibrary Loan policy may result in suspension of library privileges. </w:t>
-      </w:r>
-    </w:p>
-    <w:p>
-      <w:r>
-        <w:t xml:space="preserve">This policy outlines the rules regarding Interlibrary Loan. All patrons must adhere strictly to these guidelines to ensure fair access and safety. Failure to comply with the Interlibrary Loan policy may result in suspension of library privileges. This policy outlines the rules regarding Interlibrary Loan. All patrons must adhere strictly to these guidelines to ensure fair access and safety. Failure to comply with the Interlibrary Loan policy may result in suspension of library privileges. This policy outlines the rules regarding Interlibrary Loan. All patrons must adhere strictly to these guidelines to ensure fair access and safety. Failure to comply with the Interlibrary Loan policy may result in suspension of library privileges. This policy outlines the rules regarding Interlibrary Loan. All patrons must adhere strictly to these guidelines to ensure fair access and safety. Failure to comply with the Interlibrary Loan policy may result in suspension of library privileges. This policy outlines the rules regarding Interlibrary Loan. All patrons must adhere strictly to these guidelines to ensure fair access and safety. Failure to comply with the Interlibrary Loan policy may result in suspension of library privileges. This policy outlines the rules regarding Interlibrary Loan. All patrons must adhere strictly to these guidelines to ensure fair access and safety. Failure to comply with the Interlibrary Loan policy may result in suspension of library privileges. </w:t>
-      </w:r>
-    </w:p>
-    <w:p>
-      <w:r>
-        <w:t xml:space="preserve">This policy outlines the rules regarding Interlibrary Loan. All patrons must adhere strictly to these guidelines to ensure fair access and safety. Failure to comply with the Interlibrary Loan policy may result in suspension of library privileges. This policy outlines the rules regarding Interlibrary Loan. All patrons must adhere strictly to these guidelines to ensure fair access and safety. Failure to comply with the Interlibrary Loan policy may result in suspension of library privileges. This policy outlines the rules regarding Interlibrary Loan. All patrons must adhere strictly to these guidelines to ensure fair access and safety. Failure to comply with the Interlibrary Loan policy may result in suspension of library privileges. This policy outlines the rules regarding Interlibrary Loan. All patrons must adhere strictly to these guidelines to ensure fair access and safety. Failure to comply with the Interlibrary Loan policy may result in suspension of library privileges. This policy outlines the rules regarding Interlibrary Loan. All patrons must adhere strictly to these guidelines to ensure fair access and safety. Failure to comply with the Interlibrary Loan policy may result in suspension of library privileges. This policy outlines the rules regarding Interlibrary Loan. All patrons must adhere strictly to these guidelines to ensure fair access and safety. Failure to comply with the Interlibrary Loan policy may result in suspension of library privileges. </w:t>
-      </w:r>
-    </w:p>
-    <w:p>
-      <w:r>
-        <w:br w:type="page"/>
-      </w:r>
-    </w:p>
-    <w:p>
-      <w:pPr>
-        <w:pStyle w:val="Heading2"/>
-      </w:pPr>
-      <w:r>
-        <w:t>Interlibrary Loan - Part 8</w:t>
-      </w:r>
-    </w:p>
-    <w:p>
-      <w:r>
-        <w:t xml:space="preserve">This policy outlines the rules regarding Interlibrary Loan. All patrons must adhere strictly to these guidelines to ensure fair access and safety. Failure to comply with the Interlibrary Loan policy may result in suspension of library privileges. This policy outlines the rules regarding Interlibrary Loan. All patrons must adhere strictly to these guidelines to ensure fair access and safety. Failure to comply with the Interlibrary Loan policy may result in suspension of library privileges. This policy outlines the rules regarding Interlibrary Loan. All patrons must adhere strictly to these guidelines to ensure fair access and safety. Failure to comply with the Interlibrary Loan policy may result in suspension of library privileges. This policy outlines the rules regarding Interlibrary Loan. All patrons must adhere strictly to these guidelines to ensure fair access and safety. Failure to comply with the Interlibrary Loan policy may result in suspension of library privileges. This policy outlines the rules regarding Interlibrary Loan. All patrons must adhere strictly to these guidelines to ensure fair access and safety. Failure to comply with the Interlibrary Loan policy may result in suspension of library privileges. This policy outlines the rules regarding Interlibrary Loan. All patrons must adhere strictly to these guidelines to ensure fair access and safety. Failure to comply with the Interlibrary Loan policy may result in suspension of library privileges. </w:t>
-      </w:r>
-    </w:p>
-    <w:p>
-      <w:r>
-        <w:t xml:space="preserve">This policy outlines the rules regarding Interlibrary Loan. All patrons must adhere strictly to these guidelines to ensure fair access and safety. Failure to comply with the Interlibrary Loan policy may result in suspension of library privileges. This policy outlines the rules regarding Interlibrary Loan. All patrons must adhere strictly to these guidelines to ensure fair access and safety. Failure to comply with the Interlibrary Loan policy may result in suspension of library privileges. This policy outlines the rules regarding Interlibrary Loan. All patrons must adhere strictly to these guidelines to ensure fair access and safety. Failure to comply with the Interlibrary Loan policy may result in suspension of library privileges. This policy outlines the rules regarding Interlibrary Loan. All patrons must adhere strictly to these guidelines to ensure fair access and safety. Failure to comply with the Interlibrary Loan policy may result in suspension of library privileges. This policy outlines the rules regarding Interlibrary Loan. All patrons must adhere strictly to these guidelines to ensure fair access and safety. Failure to comply with the Interlibrary Loan policy may result in suspension of library privileges. This policy outlines the rules regarding Interlibrary Loan. All patrons must adhere strictly to these guidelines to ensure fair access and safety. Failure to comply with the Interlibrary Loan policy may result in suspension of library privileges. </w:t>
-      </w:r>
-    </w:p>
-    <w:p>
-      <w:r>
-        <w:t xml:space="preserve">This policy outlines the rules regarding Interlibrary Loan. All patrons must adhere strictly to these guidelines to ensure fair access and safety. Failure to comply with the Interlibrary Loan policy may result in suspension of library privileges. This policy outlines the rules regarding Interlibrary Loan. All patrons must adhere strictly to these guidelines to ensure fair access and safety. Failure to comply with the Interlibrary Loan policy may result in suspension of library privileges. This policy outlines the rules regarding Interlibrary Loan. All patrons must adhere strictly to these guidelines to ensure fair access and safety. Failure to comply with the Interlibrary Loan policy may result in suspension of library privileges. This policy outlines the rules regarding Interlibrary Loan. All patrons must adhere strictly to these guidelines to ensure fair access and safety. Failure to comply with the Interlibrary Loan policy may result in suspension of library privileges. This policy outlines the rules regarding Interlibrary Loan. All patrons must adhere strictly to these guidelines to ensure fair access and safety. Failure to comply with the Interlibrary Loan policy may result in suspension of library privileges. This policy outlines the rules regarding Interlibrary Loan. All patrons must adhere strictly to these guidelines to ensure fair access and safety. Failure to comply with the Interlibrary Loan policy may result in suspension of library privileges. </w:t>
-      </w:r>
-    </w:p>
-    <w:p>
-      <w:r>
-        <w:br w:type="page"/>
-      </w:r>
-    </w:p>
-    <w:p>
-      <w:pPr>
-        <w:pStyle w:val="Heading2"/>
-      </w:pPr>
-      <w:r>
-        <w:t>Interlibrary Loan - Part 9</w:t>
-      </w:r>
-    </w:p>
-    <w:p>
-      <w:r>
-        <w:t xml:space="preserve">This policy outlines the rules regarding Interlibrary Loan. All patrons must adhere strictly to these guidelines to ensure fair access and safety. Failure to comply with the Interlibrary Loan policy may result in suspension of library privileges. This policy outlines the rules regarding Interlibrary Loan. All patrons must adhere strictly to these guidelines to ensure fair access and safety. Failure to comply with the Interlibrary Loan policy may result in suspension of library privileges. This policy outlines the rules regarding Interlibrary Loan. All patrons must adhere strictly to these guidelines to ensure fair access and safety. Failure to comply with the Interlibrary Loan policy may result in suspension of library privileges. This policy outlines the rules regarding Interlibrary Loan. All patrons must adhere strictly to these guidelines to ensure fair access and safety. Failure to comply with the Interlibrary Loan policy may result in suspension of library privileges. This policy outlines the rules regarding Interlibrary Loan. All patrons must adhere strictly to these guidelines to ensure fair access and safety. Failure to comply with the Interlibrary Loan policy may result in suspension of library privileges. This policy outlines the rules regarding Interlibrary Loan. All patrons must adhere strictly to these guidelines to ensure fair access and safety. Failure to comply with the Interlibrary Loan policy may result in suspension of library privileges. </w:t>
-      </w:r>
-    </w:p>
-    <w:p>
-      <w:r>
-        <w:t xml:space="preserve">This policy outlines the rules regarding Interlibrary Loan. All patrons must adhere strictly to these guidelines to ensure fair access and safety. Failure to comply with the Interlibrary Loan policy may result in suspension of library privileges. This policy outlines the rules regarding Interlibrary Loan. All patrons must adhere strictly to these guidelines to ensure fair access and safety. Failure to comply with the Interlibrary Loan policy may result in suspension of library privileges. This policy outlines the rules regarding Interlibrary Loan. All patrons must adhere strictly to these guidelines to ensure fair access and safety. Failure to comply with the Interlibrary Loan policy may result in suspension of library privileges. This policy outlines the rules regarding Interlibrary Loan. All patrons must adhere strictly to these guidelines to ensure fair access and safety. Failure to comply with the Interlibrary Loan policy may result in suspension of library privileges. This policy outlines the rules regarding Interlibrary Loan. All patrons must adhere strictly to these guidelines to ensure fair access and safety. Failure to comply with the Interlibrary Loan policy may result in suspension of library privileges. This policy outlines the rules regarding Interlibrary Loan. All patrons must adhere strictly to these guidelines to ensure fair access and safety. Failure to comply with the Interlibrary Loan policy may result in suspension of library privileges. </w:t>
-      </w:r>
-    </w:p>
-    <w:p>
-      <w:r>
-        <w:t xml:space="preserve">This policy outlines the rules regarding Interlibrary Loan. All patrons must adhere strictly to these guidelines to ensure fair access and safety. Failure to comply with the Interlibrary Loan policy may result in suspension of library privileges. This policy outlines the rules regarding Interlibrary Loan. All patrons must adhere strictly to these guidelines to ensure fair access and safety. Failure to comply with the Interlibrary Loan policy may result in suspension of library privileges. This policy outlines the rules regarding Interlibrary Loan. All patrons must adhere strictly to these guidelines to ensure fair access and safety. Failure to comply with the Interlibrary Loan policy may result in suspension of library privileges. This policy outlines the rules regarding Interlibrary Loan. All patrons must adhere strictly to these guidelines to ensure fair access and safety. Failure to comply with the Interlibrary Loan policy may result in suspension of library privileges. This policy outlines the rules regarding Interlibrary Loan. All patrons must adhere strictly to these guidelines to ensure fair access and safety. Failure to comply with the Interlibrary Loan policy may result in suspension of library privileges. This policy outlines the rules regarding Interlibrary Loan. All patrons must adhere strictly to these guidelines to ensure fair access and safety. Failure to comply with the Interlibrary Loan policy may result in suspension of library privileges. </w:t>
-      </w:r>
-    </w:p>
-    <w:p>
-      <w:r>
-        <w:br w:type="page"/>
-      </w:r>
-    </w:p>
-    <w:p>
-      <w:pPr>
-        <w:pStyle w:val="Heading2"/>
-      </w:pPr>
-      <w:r>
-        <w:t>Interlibrary Loan - Part 10</w:t>
-      </w:r>
-    </w:p>
-    <w:p>
-      <w:r>
-        <w:t xml:space="preserve">This policy outlines the rules regarding Interlibrary Loan. All patrons must adhere strictly to these guidelines to ensure fair access and safety. Failure to comply with the Interlibrary Loan policy may result in suspension of library privileges. This policy outlines the rules regarding Interlibrary Loan. All patrons must adhere strictly to these guidelines to ensure fair access and safety. Failure to comply with the Interlibrary Loan policy may result in suspension of library privileges. This policy outlines the rules regarding Interlibrary Loan. All patrons must adhere strictly to these guidelines to ensure fair access and safety. Failure to comply with the Interlibrary Loan policy may result in suspension of library privileges. This policy outlines the rules regarding Interlibrary Loan. All patrons must adhere strictly to these guidelines to ensure fair access and safety. Failure to comply with the Interlibrary Loan policy may result in suspension of library privileges. This policy outlines the rules regarding Interlibrary Loan. All patrons must adhere strictly to these guidelines to ensure fair access and safety. Failure to comply with the Interlibrary Loan policy may result in suspension of library privileges. This policy outlines the rules regarding Interlibrary Loan. All patrons must adhere strictly to these guidelines to ensure fair access and safety. Failure to comply with the Interlibrary Loan policy may result in suspension of library privileges. </w:t>
-      </w:r>
-    </w:p>
-    <w:p>
-      <w:r>
-        <w:t xml:space="preserve">This policy outlines the rules regarding Interlibrary Loan. All patrons must adhere strictly to these guidelines to ensure fair access and safety. Failure to comply with the Interlibrary Loan policy may result in suspension of library privileges. This policy outlines the rules regarding Interlibrary Loan. All patrons must adhere strictly to these guidelines to ensure fair access and safety. Failure to comply with the Interlibrary Loan policy may result in suspension of library privileges. This policy outlines the rules regarding Interlibrary Loan. All patrons must adhere strictly to these guidelines to ensure fair access and safety. Failure to comply with the Interlibrary Loan policy may result in suspension of library privileges. This policy outlines the rules regarding Interlibrary Loan. All patrons must adhere strictly to these guidelines to ensure fair access and safety. Failure to comply with the Interlibrary Loan policy may result in suspension of library privileges. This policy outlines the rules regarding Interlibrary Loan. All patrons must adhere strictly to these guidelines to ensure fair access and safety. Failure to comply with the Interlibrary Loan policy may result in suspension of library privileges. This policy outlines the rules regarding Interlibrary Loan. All patrons must adhere strictly to these guidelines to ensure fair access and safety. Failure to comply with the Interlibrary Loan policy may result in suspension of library privileges. </w:t>
-      </w:r>
-    </w:p>
-    <w:p>
-      <w:r>
-        <w:t xml:space="preserve">This policy outlines the rules regarding Interlibrary Loan. All patrons must adhere strictly to these guidelines to ensure fair access and safety. Failure to comply with the Interlibrary Loan policy may result in suspension of library privileges. This policy outlines the rules regarding Interlibrary Loan. All patrons must adhere strictly to these guidelines to ensure fair access and safety. Failure to comply with the Interlibrary Loan policy may result in suspension of library privileges. This policy outlines the rules regarding Interlibrary Loan. All patrons must adhere strictly to these guidelines to ensure fair access and safety. Failure to comply with the Interlibrary Loan policy may result in suspension of library privileges. This policy outlines the rules regarding Interlibrary Loan. All patrons must adhere strictly to these guidelines to ensure fair access and safety. Failure to comply with the Interlibrary Loan policy may result in suspension of library privileges. This policy outlines the rules regarding Interlibrary Loan. All patrons must adhere strictly to these guidelines to ensure fair access and safety. Failure to comply with the Interlibrary Loan policy may result in suspension of library privileges. This policy outlines the rules regarding Interlibrary Loan. All patrons must adhere strictly to these guidelines to ensure fair access and safety. Failure to comply with the Interlibrary Loan policy may result in suspension of library privileges. </w:t>
-      </w:r>
-    </w:p>
-    <w:p>
-      <w:r>
-        <w:br w:type="page"/>
+        <w:t>- Eligibility: Active students, researchers, and faculty can request items not owned by the University Library via Interlibrary Loan.</w:t>
+        <w:br/>
+        <w:t>- Processing Time: Book requests take 5 to 10 business days. Electronic journal articles are delivered via email within 48 hours.</w:t>
+        <w:br/>
+        <w:t>- Fees: Standard ILL services are free for university members; special international requests may incur supplier fees.</w:t>
       </w:r>
     </w:p>
     <w:p>
@@ -1171,283 +93,12 @@
       </w:r>
     </w:p>
     <w:p>
-      <w:pPr>
-        <w:pStyle w:val="Heading2"/>
-      </w:pPr>
       <w:r>
-        <w:t>Study Room Booking - Part 1</w:t>
-      </w:r>
-    </w:p>
-    <w:p>
-      <w:r>
-        <w:t xml:space="preserve">This policy outlines the rules regarding Study Room Booking. All patrons must adhere strictly to these guidelines to ensure fair access and safety. Failure to comply with the Study Room Booking policy may result in suspension of library privileges. This policy outlines the rules regarding Study Room Booking. All patrons must adhere strictly to these guidelines to ensure fair access and safety. Failure to comply with the Study Room Booking policy may result in suspension of library privileges. This policy outlines the rules regarding Study Room Booking. All patrons must adhere strictly to these guidelines to ensure fair access and safety. Failure to comply with the Study Room Booking policy may result in suspension of library privileges. This policy outlines the rules regarding Study Room Booking. All patrons must adhere strictly to these guidelines to ensure fair access and safety. Failure to comply with the Study Room Booking policy may result in suspension of library privileges. This policy outlines the rules regarding Study Room Booking. All patrons must adhere strictly to these guidelines to ensure fair access and safety. Failure to comply with the Study Room Booking policy may result in suspension of library privileges. This policy outlines the rules regarding Study Room Booking. All patrons must adhere strictly to these guidelines to ensure fair access and safety. Failure to comply with the Study Room Booking policy may result in suspension of library privileges. </w:t>
-      </w:r>
-    </w:p>
-    <w:p>
-      <w:r>
-        <w:t xml:space="preserve">This policy outlines the rules regarding Study Room Booking. All patrons must adhere strictly to these guidelines to ensure fair access and safety. Failure to comply with the Study Room Booking policy may result in suspension of library privileges. This policy outlines the rules regarding Study Room Booking. All patrons must adhere strictly to these guidelines to ensure fair access and safety. Failure to comply with the Study Room Booking policy may result in suspension of library privileges. This policy outlines the rules regarding Study Room Booking. All patrons must adhere strictly to these guidelines to ensure fair access and safety. Failure to comply with the Study Room Booking policy may result in suspension of library privileges. This policy outlines the rules regarding Study Room Booking. All patrons must adhere strictly to these guidelines to ensure fair access and safety. Failure to comply with the Study Room Booking policy may result in suspension of library privileges. This policy outlines the rules regarding Study Room Booking. All patrons must adhere strictly to these guidelines to ensure fair access and safety. Failure to comply with the Study Room Booking policy may result in suspension of library privileges. This policy outlines the rules regarding Study Room Booking. All patrons must adhere strictly to these guidelines to ensure fair access and safety. Failure to comply with the Study Room Booking policy may result in suspension of library privileges. </w:t>
-      </w:r>
-    </w:p>
-    <w:p>
-      <w:r>
-        <w:t xml:space="preserve">This policy outlines the rules regarding Study Room Booking. All patrons must adhere strictly to these guidelines to ensure fair access and safety. Failure to comply with the Study Room Booking policy may result in suspension of library privileges. This policy outlines the rules regarding Study Room Booking. All patrons must adhere strictly to these guidelines to ensure fair access and safety. Failure to comply with the Study Room Booking policy may result in suspension of library privileges. This policy outlines the rules regarding Study Room Booking. All patrons must adhere strictly to these guidelines to ensure fair access and safety. Failure to comply with the Study Room Booking policy may result in suspension of library privileges. This policy outlines the rules regarding Study Room Booking. All patrons must adhere strictly to these guidelines to ensure fair access and safety. Failure to comply with the Study Room Booking policy may result in suspension of library privileges. This policy outlines the rules regarding Study Room Booking. All patrons must adhere strictly to these guidelines to ensure fair access and safety. Failure to comply with the Study Room Booking policy may result in suspension of library privileges. This policy outlines the rules regarding Study Room Booking. All patrons must adhere strictly to these guidelines to ensure fair access and safety. Failure to comply with the Study Room Booking policy may result in suspension of library privileges. </w:t>
-      </w:r>
-    </w:p>
-    <w:p>
-      <w:r>
-        <w:br w:type="page"/>
-      </w:r>
-    </w:p>
-    <w:p>
-      <w:pPr>
-        <w:pStyle w:val="Heading2"/>
-      </w:pPr>
-      <w:r>
-        <w:t>Study Room Booking - Part 2</w:t>
-      </w:r>
-    </w:p>
-    <w:p>
-      <w:r>
-        <w:t xml:space="preserve">This policy outlines the rules regarding Study Room Booking. All patrons must adhere strictly to these guidelines to ensure fair access and safety. Failure to comply with the Study Room Booking policy may result in suspension of library privileges. This policy outlines the rules regarding Study Room Booking. All patrons must adhere strictly to these guidelines to ensure fair access and safety. Failure to comply with the Study Room Booking policy may result in suspension of library privileges. This policy outlines the rules regarding Study Room Booking. All patrons must adhere strictly to these guidelines to ensure fair access and safety. Failure to comply with the Study Room Booking policy may result in suspension of library privileges. This policy outlines the rules regarding Study Room Booking. All patrons must adhere strictly to these guidelines to ensure fair access and safety. Failure to comply with the Study Room Booking policy may result in suspension of library privileges. This policy outlines the rules regarding Study Room Booking. All patrons must adhere strictly to these guidelines to ensure fair access and safety. Failure to comply with the Study Room Booking policy may result in suspension of library privileges. This policy outlines the rules regarding Study Room Booking. All patrons must adhere strictly to these guidelines to ensure fair access and safety. Failure to comply with the Study Room Booking policy may result in suspension of library privileges. </w:t>
-      </w:r>
-    </w:p>
-    <w:p>
-      <w:r>
-        <w:t xml:space="preserve">This policy outlines the rules regarding Study Room Booking. All patrons must adhere strictly to these guidelines to ensure fair access and safety. Failure to comply with the Study Room Booking policy may result in suspension of library privileges. This policy outlines the rules regarding Study Room Booking. All patrons must adhere strictly to these guidelines to ensure fair access and safety. Failure to comply with the Study Room Booking policy may result in suspension of library privileges. This policy outlines the rules regarding Study Room Booking. All patrons must adhere strictly to these guidelines to ensure fair access and safety. Failure to comply with the Study Room Booking policy may result in suspension of library privileges. This policy outlines the rules regarding Study Room Booking. All patrons must adhere strictly to these guidelines to ensure fair access and safety. Failure to comply with the Study Room Booking policy may result in suspension of library privileges. This policy outlines the rules regarding Study Room Booking. All patrons must adhere strictly to these guidelines to ensure fair access and safety. Failure to comply with the Study Room Booking policy may result in suspension of library privileges. This policy outlines the rules regarding Study Room Booking. All patrons must adhere strictly to these guidelines to ensure fair access and safety. Failure to comply with the Study Room Booking policy may result in suspension of library privileges. </w:t>
-      </w:r>
-    </w:p>
-    <w:p>
-      <w:r>
-        <w:t xml:space="preserve">This policy outlines the rules regarding Study Room Booking. All patrons must adhere strictly to these guidelines to ensure fair access and safety. Failure to comply with the Study Room Booking policy may result in suspension of library privileges. This policy outlines the rules regarding Study Room Booking. All patrons must adhere strictly to these guidelines to ensure fair access and safety. Failure to comply with the Study Room Booking policy may result in suspension of library privileges. This policy outlines the rules regarding Study Room Booking. All patrons must adhere strictly to these guidelines to ensure fair access and safety. Failure to comply with the Study Room Booking policy may result in suspension of library privileges. This policy outlines the rules regarding Study Room Booking. All patrons must adhere strictly to these guidelines to ensure fair access and safety. Failure to comply with the Study Room Booking policy may result in suspension of library privileges. This policy outlines the rules regarding Study Room Booking. All patrons must adhere strictly to these guidelines to ensure fair access and safety. Failure to comply with the Study Room Booking policy may result in suspension of library privileges. This policy outlines the rules regarding Study Room Booking. All patrons must adhere strictly to these guidelines to ensure fair access and safety. Failure to comply with the Study Room Booking policy may result in suspension of library privileges. </w:t>
-      </w:r>
-    </w:p>
-    <w:p>
-      <w:r>
-        <w:br w:type="page"/>
-      </w:r>
-    </w:p>
-    <w:p>
-      <w:pPr>
-        <w:pStyle w:val="Heading2"/>
-      </w:pPr>
-      <w:r>
-        <w:t>Study Room Booking - Part 3</w:t>
-      </w:r>
-    </w:p>
-    <w:p>
-      <w:r>
-        <w:t xml:space="preserve">This policy outlines the rules regarding Study Room Booking. All patrons must adhere strictly to these guidelines to ensure fair access and safety. Failure to comply with the Study Room Booking policy may result in suspension of library privileges. This policy outlines the rules regarding Study Room Booking. All patrons must adhere strictly to these guidelines to ensure fair access and safety. Failure to comply with the Study Room Booking policy may result in suspension of library privileges. This policy outlines the rules regarding Study Room Booking. All patrons must adhere strictly to these guidelines to ensure fair access and safety. Failure to comply with the Study Room Booking policy may result in suspension of library privileges. This policy outlines the rules regarding Study Room Booking. All patrons must adhere strictly to these guidelines to ensure fair access and safety. Failure to comply with the Study Room Booking policy may result in suspension of library privileges. This policy outlines the rules regarding Study Room Booking. All patrons must adhere strictly to these guidelines to ensure fair access and safety. Failure to comply with the Study Room Booking policy may result in suspension of library privileges. This policy outlines the rules regarding Study Room Booking. All patrons must adhere strictly to these guidelines to ensure fair access and safety. Failure to comply with the Study Room Booking policy may result in suspension of library privileges. </w:t>
-      </w:r>
-    </w:p>
-    <w:p>
-      <w:r>
-        <w:t xml:space="preserve">This policy outlines the rules regarding Study Room Booking. All patrons must adhere strictly to these guidelines to ensure fair access and safety. Failure to comply with the Study Room Booking policy may result in suspension of library privileges. This policy outlines the rules regarding Study Room Booking. All patrons must adhere strictly to these guidelines to ensure fair access and safety. Failure to comply with the Study Room Booking policy may result in suspension of library privileges. This policy outlines the rules regarding Study Room Booking. All patrons must adhere strictly to these guidelines to ensure fair access and safety. Failure to comply with the Study Room Booking policy may result in suspension of library privileges. This policy outlines the rules regarding Study Room Booking. All patrons must adhere strictly to these guidelines to ensure fair access and safety. Failure to comply with the Study Room Booking policy may result in suspension of library privileges. This policy outlines the rules regarding Study Room Booking. All patrons must adhere strictly to these guidelines to ensure fair access and safety. Failure to comply with the Study Room Booking policy may result in suspension of library privileges. This policy outlines the rules regarding Study Room Booking. All patrons must adhere strictly to these guidelines to ensure fair access and safety. Failure to comply with the Study Room Booking policy may result in suspension of library privileges. </w:t>
-      </w:r>
-    </w:p>
-    <w:p>
-      <w:r>
-        <w:t xml:space="preserve">This policy outlines the rules regarding Study Room Booking. All patrons must adhere strictly to these guidelines to ensure fair access and safety. Failure to comply with the Study Room Booking policy may result in suspension of library privileges. This policy outlines the rules regarding Study Room Booking. All patrons must adhere strictly to these guidelines to ensure fair access and safety. Failure to comply with the Study Room Booking policy may result in suspension of library privileges. This policy outlines the rules regarding Study Room Booking. All patrons must adhere strictly to these guidelines to ensure fair access and safety. Failure to comply with the Study Room Booking policy may result in suspension of library privileges. This policy outlines the rules regarding Study Room Booking. All patrons must adhere strictly to these guidelines to ensure fair access and safety. Failure to comply with the Study Room Booking policy may result in suspension of library privileges. This policy outlines the rules regarding Study Room Booking. All patrons must adhere strictly to these guidelines to ensure fair access and safety. Failure to comply with the Study Room Booking policy may result in suspension of library privileges. This policy outlines the rules regarding Study Room Booking. All patrons must adhere strictly to these guidelines to ensure fair access and safety. Failure to comply with the Study Room Booking policy may result in suspension of library privileges. </w:t>
-      </w:r>
-    </w:p>
-    <w:p>
-      <w:r>
-        <w:br w:type="page"/>
-      </w:r>
-    </w:p>
-    <w:p>
-      <w:pPr>
-        <w:pStyle w:val="Heading2"/>
-      </w:pPr>
-      <w:r>
-        <w:t>Study Room Booking - Part 4</w:t>
-      </w:r>
-    </w:p>
-    <w:p>
-      <w:r>
-        <w:t xml:space="preserve">This policy outlines the rules regarding Study Room Booking. All patrons must adhere strictly to these guidelines to ensure fair access and safety. Failure to comply with the Study Room Booking policy may result in suspension of library privileges. This policy outlines the rules regarding Study Room Booking. All patrons must adhere strictly to these guidelines to ensure fair access and safety. Failure to comply with the Study Room Booking policy may result in suspension of library privileges. This policy outlines the rules regarding Study Room Booking. All patrons must adhere strictly to these guidelines to ensure fair access and safety. Failure to comply with the Study Room Booking policy may result in suspension of library privileges. This policy outlines the rules regarding Study Room Booking. All patrons must adhere strictly to these guidelines to ensure fair access and safety. Failure to comply with the Study Room Booking policy may result in suspension of library privileges. This policy outlines the rules regarding Study Room Booking. All patrons must adhere strictly to these guidelines to ensure fair access and safety. Failure to comply with the Study Room Booking policy may result in suspension of library privileges. This policy outlines the rules regarding Study Room Booking. All patrons must adhere strictly to these guidelines to ensure fair access and safety. Failure to comply with the Study Room Booking policy may result in suspension of library privileges. </w:t>
-      </w:r>
-    </w:p>
-    <w:p>
-      <w:r>
-        <w:t xml:space="preserve">This policy outlines the rules regarding Study Room Booking. All patrons must adhere strictly to these guidelines to ensure fair access and safety. Failure to comply with the Study Room Booking policy may result in suspension of library privileges. This policy outlines the rules regarding Study Room Booking. All patrons must adhere strictly to these guidelines to ensure fair access and safety. Failure to comply with the Study Room Booking policy may result in suspension of library privileges. This policy outlines the rules regarding Study Room Booking. All patrons must adhere strictly to these guidelines to ensure fair access and safety. Failure to comply with the Study Room Booking policy may result in suspension of library privileges. This policy outlines the rules regarding Study Room Booking. All patrons must adhere strictly to these guidelines to ensure fair access and safety. Failure to comply with the Study Room Booking policy may result in suspension of library privileges. This policy outlines the rules regarding Study Room Booking. All patrons must adhere strictly to these guidelines to ensure fair access and safety. Failure to comply with the Study Room Booking policy may result in suspension of library privileges. This policy outlines the rules regarding Study Room Booking. All patrons must adhere strictly to these guidelines to ensure fair access and safety. Failure to comply with the Study Room Booking policy may result in suspension of library privileges. </w:t>
-      </w:r>
-    </w:p>
-    <w:p>
-      <w:r>
-        <w:t xml:space="preserve">This policy outlines the rules regarding Study Room Booking. All patrons must adhere strictly to these guidelines to ensure fair access and safety. Failure to comply with the Study Room Booking policy may result in suspension of library privileges. This policy outlines the rules regarding Study Room Booking. All patrons must adhere strictly to these guidelines to ensure fair access and safety. Failure to comply with the Study Room Booking policy may result in suspension of library privileges. This policy outlines the rules regarding Study Room Booking. All patrons must adhere strictly to these guidelines to ensure fair access and safety. Failure to comply with the Study Room Booking policy may result in suspension of library privileges. This policy outlines the rules regarding Study Room Booking. All patrons must adhere strictly to these guidelines to ensure fair access and safety. Failure to comply with the Study Room Booking policy may result in suspension of library privileges. This policy outlines the rules regarding Study Room Booking. All patrons must adhere strictly to these guidelines to ensure fair access and safety. Failure to comply with the Study Room Booking policy may result in suspension of library privileges. This policy outlines the rules regarding Study Room Booking. All patrons must adhere strictly to these guidelines to ensure fair access and safety. Failure to comply with the Study Room Booking policy may result in suspension of library privileges. </w:t>
-      </w:r>
-    </w:p>
-    <w:p>
-      <w:r>
-        <w:br w:type="page"/>
-      </w:r>
-    </w:p>
-    <w:p>
-      <w:pPr>
-        <w:pStyle w:val="Heading2"/>
-      </w:pPr>
-      <w:r>
-        <w:t>Study Room Booking - Part 5</w:t>
-      </w:r>
-    </w:p>
-    <w:p>
-      <w:r>
-        <w:t xml:space="preserve">This policy outlines the rules regarding Study Room Booking. All patrons must adhere strictly to these guidelines to ensure fair access and safety. Failure to comply with the Study Room Booking policy may result in suspension of library privileges. This policy outlines the rules regarding Study Room Booking. All patrons must adhere strictly to these guidelines to ensure fair access and safety. Failure to comply with the Study Room Booking policy may result in suspension of library privileges. This policy outlines the rules regarding Study Room Booking. All patrons must adhere strictly to these guidelines to ensure fair access and safety. Failure to comply with the Study Room Booking policy may result in suspension of library privileges. This policy outlines the rules regarding Study Room Booking. All patrons must adhere strictly to these guidelines to ensure fair access and safety. Failure to comply with the Study Room Booking policy may result in suspension of library privileges. This policy outlines the rules regarding Study Room Booking. All patrons must adhere strictly to these guidelines to ensure fair access and safety. Failure to comply with the Study Room Booking policy may result in suspension of library privileges. This policy outlines the rules regarding Study Room Booking. All patrons must adhere strictly to these guidelines to ensure fair access and safety. Failure to comply with the Study Room Booking policy may result in suspension of library privileges. </w:t>
-      </w:r>
-    </w:p>
-    <w:p>
-      <w:r>
-        <w:t xml:space="preserve">This policy outlines the rules regarding Study Room Booking. All patrons must adhere strictly to these guidelines to ensure fair access and safety. Failure to comply with the Study Room Booking policy may result in suspension of library privileges. This policy outlines the rules regarding Study Room Booking. All patrons must adhere strictly to these guidelines to ensure fair access and safety. Failure to comply with the Study Room Booking policy may result in suspension of library privileges. This policy outlines the rules regarding Study Room Booking. All patrons must adhere strictly to these guidelines to ensure fair access and safety. Failure to comply with the Study Room Booking policy may result in suspension of library privileges. This policy outlines the rules regarding Study Room Booking. All patrons must adhere strictly to these guidelines to ensure fair access and safety. Failure to comply with the Study Room Booking policy may result in suspension of library privileges. This policy outlines the rules regarding Study Room Booking. All patrons must adhere strictly to these guidelines to ensure fair access and safety. Failure to comply with the Study Room Booking policy may result in suspension of library privileges. This policy outlines the rules regarding Study Room Booking. All patrons must adhere strictly to these guidelines to ensure fair access and safety. Failure to comply with the Study Room Booking policy may result in suspension of library privileges. </w:t>
-      </w:r>
-    </w:p>
-    <w:p>
-      <w:r>
-        <w:t xml:space="preserve">This policy outlines the rules regarding Study Room Booking. All patrons must adhere strictly to these guidelines to ensure fair access and safety. Failure to comply with the Study Room Booking policy may result in suspension of library privileges. This policy outlines the rules regarding Study Room Booking. All patrons must adhere strictly to these guidelines to ensure fair access and safety. Failure to comply with the Study Room Booking policy may result in suspension of library privileges. This policy outlines the rules regarding Study Room Booking. All patrons must adhere strictly to these guidelines to ensure fair access and safety. Failure to comply with the Study Room Booking policy may result in suspension of library privileges. This policy outlines the rules regarding Study Room Booking. All patrons must adhere strictly to these guidelines to ensure fair access and safety. Failure to comply with the Study Room Booking policy may result in suspension of library privileges. This policy outlines the rules regarding Study Room Booking. All patrons must adhere strictly to these guidelines to ensure fair access and safety. Failure to comply with the Study Room Booking policy may result in suspension of library privileges. This policy outlines the rules regarding Study Room Booking. All patrons must adhere strictly to these guidelines to ensure fair access and safety. Failure to comply with the Study Room Booking policy may result in suspension of library privileges. </w:t>
-      </w:r>
-    </w:p>
-    <w:p>
-      <w:r>
-        <w:br w:type="page"/>
-      </w:r>
-    </w:p>
-    <w:p>
-      <w:pPr>
-        <w:pStyle w:val="Heading2"/>
-      </w:pPr>
-      <w:r>
-        <w:t>Study Room Booking - Part 6</w:t>
-      </w:r>
-    </w:p>
-    <w:p>
-      <w:r>
-        <w:t xml:space="preserve">This policy outlines the rules regarding Study Room Booking. All patrons must adhere strictly to these guidelines to ensure fair access and safety. Failure to comply with the Study Room Booking policy may result in suspension of library privileges. This policy outlines the rules regarding Study Room Booking. All patrons must adhere strictly to these guidelines to ensure fair access and safety. Failure to comply with the Study Room Booking policy may result in suspension of library privileges. This policy outlines the rules regarding Study Room Booking. All patrons must adhere strictly to these guidelines to ensure fair access and safety. Failure to comply with the Study Room Booking policy may result in suspension of library privileges. This policy outlines the rules regarding Study Room Booking. All patrons must adhere strictly to these guidelines to ensure fair access and safety. Failure to comply with the Study Room Booking policy may result in suspension of library privileges. This policy outlines the rules regarding Study Room Booking. All patrons must adhere strictly to these guidelines to ensure fair access and safety. Failure to comply with the Study Room Booking policy may result in suspension of library privileges. This policy outlines the rules regarding Study Room Booking. All patrons must adhere strictly to these guidelines to ensure fair access and safety. Failure to comply with the Study Room Booking policy may result in suspension of library privileges. </w:t>
-      </w:r>
-    </w:p>
-    <w:p>
-      <w:r>
-        <w:t xml:space="preserve">This policy outlines the rules regarding Study Room Booking. All patrons must adhere strictly to these guidelines to ensure fair access and safety. Failure to comply with the Study Room Booking policy may result in suspension of library privileges. This policy outlines the rules regarding Study Room Booking. All patrons must adhere strictly to these guidelines to ensure fair access and safety. Failure to comply with the Study Room Booking policy may result in suspension of library privileges. This policy outlines the rules regarding Study Room Booking. All patrons must adhere strictly to these guidelines to ensure fair access and safety. Failure to comply with the Study Room Booking policy may result in suspension of library privileges. This policy outlines the rules regarding Study Room Booking. All patrons must adhere strictly to these guidelines to ensure fair access and safety. Failure to comply with the Study Room Booking policy may result in suspension of library privileges. This policy outlines the rules regarding Study Room Booking. All patrons must adhere strictly to these guidelines to ensure fair access and safety. Failure to comply with the Study Room Booking policy may result in suspension of library privileges. This policy outlines the rules regarding Study Room Booking. All patrons must adhere strictly to these guidelines to ensure fair access and safety. Failure to comply with the Study Room Booking policy may result in suspension of library privileges. </w:t>
-      </w:r>
-    </w:p>
-    <w:p>
-      <w:r>
-        <w:t xml:space="preserve">This policy outlines the rules regarding Study Room Booking. All patrons must adhere strictly to these guidelines to ensure fair access and safety. Failure to comply with the Study Room Booking policy may result in suspension of library privileges. This policy outlines the rules regarding Study Room Booking. All patrons must adhere strictly to these guidelines to ensure fair access and safety. Failure to comply with the Study Room Booking policy may result in suspension of library privileges. This policy outlines the rules regarding Study Room Booking. All patrons must adhere strictly to these guidelines to ensure fair access and safety. Failure to comply with the Study Room Booking policy may result in suspension of library privileges. This policy outlines the rules regarding Study Room Booking. All patrons must adhere strictly to these guidelines to ensure fair access and safety. Failure to comply with the Study Room Booking policy may result in suspension of library privileges. This policy outlines the rules regarding Study Room Booking. All patrons must adhere strictly to these guidelines to ensure fair access and safety. Failure to comply with the Study Room Booking policy may result in suspension of library privileges. This policy outlines the rules regarding Study Room Booking. All patrons must adhere strictly to these guidelines to ensure fair access and safety. Failure to comply with the Study Room Booking policy may result in suspension of library privileges. </w:t>
-      </w:r>
-    </w:p>
-    <w:p>
-      <w:r>
-        <w:br w:type="page"/>
-      </w:r>
-    </w:p>
-    <w:p>
-      <w:pPr>
-        <w:pStyle w:val="Heading2"/>
-      </w:pPr>
-      <w:r>
-        <w:t>Study Room Booking - Part 7</w:t>
-      </w:r>
-    </w:p>
-    <w:p>
-      <w:r>
-        <w:t xml:space="preserve">This policy outlines the rules regarding Study Room Booking. All patrons must adhere strictly to these guidelines to ensure fair access and safety. Failure to comply with the Study Room Booking policy may result in suspension of library privileges. This policy outlines the rules regarding Study Room Booking. All patrons must adhere strictly to these guidelines to ensure fair access and safety. Failure to comply with the Study Room Booking policy may result in suspension of library privileges. This policy outlines the rules regarding Study Room Booking. All patrons must adhere strictly to these guidelines to ensure fair access and safety. Failure to comply with the Study Room Booking policy may result in suspension of library privileges. This policy outlines the rules regarding Study Room Booking. All patrons must adhere strictly to these guidelines to ensure fair access and safety. Failure to comply with the Study Room Booking policy may result in suspension of library privileges. This policy outlines the rules regarding Study Room Booking. All patrons must adhere strictly to these guidelines to ensure fair access and safety. Failure to comply with the Study Room Booking policy may result in suspension of library privileges. This policy outlines the rules regarding Study Room Booking. All patrons must adhere strictly to these guidelines to ensure fair access and safety. Failure to comply with the Study Room Booking policy may result in suspension of library privileges. </w:t>
-      </w:r>
-    </w:p>
-    <w:p>
-      <w:r>
-        <w:t xml:space="preserve">This policy outlines the rules regarding Study Room Booking. All patrons must adhere strictly to these guidelines to ensure fair access and safety. Failure to comply with the Study Room Booking policy may result in suspension of library privileges. This policy outlines the rules regarding Study Room Booking. All patrons must adhere strictly to these guidelines to ensure fair access and safety. Failure to comply with the Study Room Booking policy may result in suspension of library privileges. This policy outlines the rules regarding Study Room Booking. All patrons must adhere strictly to these guidelines to ensure fair access and safety. Failure to comply with the Study Room Booking policy may result in suspension of library privileges. This policy outlines the rules regarding Study Room Booking. All patrons must adhere strictly to these guidelines to ensure fair access and safety. Failure to comply with the Study Room Booking policy may result in suspension of library privileges. This policy outlines the rules regarding Study Room Booking. All patrons must adhere strictly to these guidelines to ensure fair access and safety. Failure to comply with the Study Room Booking policy may result in suspension of library privileges. This policy outlines the rules regarding Study Room Booking. All patrons must adhere strictly to these guidelines to ensure fair access and safety. Failure to comply with the Study Room Booking policy may result in suspension of library privileges. </w:t>
-      </w:r>
-    </w:p>
-    <w:p>
-      <w:r>
-        <w:t xml:space="preserve">This policy outlines the rules regarding Study Room Booking. All patrons must adhere strictly to these guidelines to ensure fair access and safety. Failure to comply with the Study Room Booking policy may result in suspension of library privileges. This policy outlines the rules regarding Study Room Booking. All patrons must adhere strictly to these guidelines to ensure fair access and safety. Failure to comply with the Study Room Booking policy may result in suspension of library privileges. This policy outlines the rules regarding Study Room Booking. All patrons must adhere strictly to these guidelines to ensure fair access and safety. Failure to comply with the Study Room Booking policy may result in suspension of library privileges. This policy outlines the rules regarding Study Room Booking. All patrons must adhere strictly to these guidelines to ensure fair access and safety. Failure to comply with the Study Room Booking policy may result in suspension of library privileges. This policy outlines the rules regarding Study Room Booking. All patrons must adhere strictly to these guidelines to ensure fair access and safety. Failure to comply with the Study Room Booking policy may result in suspension of library privileges. This policy outlines the rules regarding Study Room Booking. All patrons must adhere strictly to these guidelines to ensure fair access and safety. Failure to comply with the Study Room Booking policy may result in suspension of library privileges. </w:t>
-      </w:r>
-    </w:p>
-    <w:p>
-      <w:r>
-        <w:br w:type="page"/>
-      </w:r>
-    </w:p>
-    <w:p>
-      <w:pPr>
-        <w:pStyle w:val="Heading2"/>
-      </w:pPr>
-      <w:r>
-        <w:t>Study Room Booking - Part 8</w:t>
-      </w:r>
-    </w:p>
-    <w:p>
-      <w:r>
-        <w:t xml:space="preserve">This policy outlines the rules regarding Study Room Booking. All patrons must adhere strictly to these guidelines to ensure fair access and safety. Failure to comply with the Study Room Booking policy may result in suspension of library privileges. This policy outlines the rules regarding Study Room Booking. All patrons must adhere strictly to these guidelines to ensure fair access and safety. Failure to comply with the Study Room Booking policy may result in suspension of library privileges. This policy outlines the rules regarding Study Room Booking. All patrons must adhere strictly to these guidelines to ensure fair access and safety. Failure to comply with the Study Room Booking policy may result in suspension of library privileges. This policy outlines the rules regarding Study Room Booking. All patrons must adhere strictly to these guidelines to ensure fair access and safety. Failure to comply with the Study Room Booking policy may result in suspension of library privileges. This policy outlines the rules regarding Study Room Booking. All patrons must adhere strictly to these guidelines to ensure fair access and safety. Failure to comply with the Study Room Booking policy may result in suspension of library privileges. This policy outlines the rules regarding Study Room Booking. All patrons must adhere strictly to these guidelines to ensure fair access and safety. Failure to comply with the Study Room Booking policy may result in suspension of library privileges. </w:t>
-      </w:r>
-    </w:p>
-    <w:p>
-      <w:r>
-        <w:t xml:space="preserve">This policy outlines the rules regarding Study Room Booking. All patrons must adhere strictly to these guidelines to ensure fair access and safety. Failure to comply with the Study Room Booking policy may result in suspension of library privileges. This policy outlines the rules regarding Study Room Booking. All patrons must adhere strictly to these guidelines to ensure fair access and safety. Failure to comply with the Study Room Booking policy may result in suspension of library privileges. This policy outlines the rules regarding Study Room Booking. All patrons must adhere strictly to these guidelines to ensure fair access and safety. Failure to comply with the Study Room Booking policy may result in suspension of library privileges. This policy outlines the rules regarding Study Room Booking. All patrons must adhere strictly to these guidelines to ensure fair access and safety. Failure to comply with the Study Room Booking policy may result in suspension of library privileges. This policy outlines the rules regarding Study Room Booking. All patrons must adhere strictly to these guidelines to ensure fair access and safety. Failure to comply with the Study Room Booking policy may result in suspension of library privileges. This policy outlines the rules regarding Study Room Booking. All patrons must adhere strictly to these guidelines to ensure fair access and safety. Failure to comply with the Study Room Booking policy may result in suspension of library privileges. </w:t>
-      </w:r>
-    </w:p>
-    <w:p>
-      <w:r>
-        <w:t xml:space="preserve">This policy outlines the rules regarding Study Room Booking. All patrons must adhere strictly to these guidelines to ensure fair access and safety. Failure to comply with the Study Room Booking policy may result in suspension of library privileges. This policy outlines the rules regarding Study Room Booking. All patrons must adhere strictly to these guidelines to ensure fair access and safety. Failure to comply with the Study Room Booking policy may result in suspension of library privileges. This policy outlines the rules regarding Study Room Booking. All patrons must adhere strictly to these guidelines to ensure fair access and safety. Failure to comply with the Study Room Booking policy may result in suspension of library privileges. This policy outlines the rules regarding Study Room Booking. All patrons must adhere strictly to these guidelines to ensure fair access and safety. Failure to comply with the Study Room Booking policy may result in suspension of library privileges. This policy outlines the rules regarding Study Room Booking. All patrons must adhere strictly to these guidelines to ensure fair access and safety. Failure to comply with the Study Room Booking policy may result in suspension of library privileges. This policy outlines the rules regarding Study Room Booking. All patrons must adhere strictly to these guidelines to ensure fair access and safety. Failure to comply with the Study Room Booking policy may result in suspension of library privileges. </w:t>
-      </w:r>
-    </w:p>
-    <w:p>
-      <w:r>
-        <w:br w:type="page"/>
-      </w:r>
-    </w:p>
-    <w:p>
-      <w:pPr>
-        <w:pStyle w:val="Heading2"/>
-      </w:pPr>
-      <w:r>
-        <w:t>Study Room Booking - Part 9</w:t>
-      </w:r>
-    </w:p>
-    <w:p>
-      <w:r>
-        <w:t xml:space="preserve">This policy outlines the rules regarding Study Room Booking. All patrons must adhere strictly to these guidelines to ensure fair access and safety. Failure to comply with the Study Room Booking policy may result in suspension of library privileges. This policy outlines the rules regarding Study Room Booking. All patrons must adhere strictly to these guidelines to ensure fair access and safety. Failure to comply with the Study Room Booking policy may result in suspension of library privileges. This policy outlines the rules regarding Study Room Booking. All patrons must adhere strictly to these guidelines to ensure fair access and safety. Failure to comply with the Study Room Booking policy may result in suspension of library privileges. This policy outlines the rules regarding Study Room Booking. All patrons must adhere strictly to these guidelines to ensure fair access and safety. Failure to comply with the Study Room Booking policy may result in suspension of library privileges. This policy outlines the rules regarding Study Room Booking. All patrons must adhere strictly to these guidelines to ensure fair access and safety. Failure to comply with the Study Room Booking policy may result in suspension of library privileges. This policy outlines the rules regarding Study Room Booking. All patrons must adhere strictly to these guidelines to ensure fair access and safety. Failure to comply with the Study Room Booking policy may result in suspension of library privileges. </w:t>
-      </w:r>
-    </w:p>
-    <w:p>
-      <w:r>
-        <w:t xml:space="preserve">This policy outlines the rules regarding Study Room Booking. All patrons must adhere strictly to these guidelines to ensure fair access and safety. Failure to comply with the Study Room Booking policy may result in suspension of library privileges. This policy outlines the rules regarding Study Room Booking. All patrons must adhere strictly to these guidelines to ensure fair access and safety. Failure to comply with the Study Room Booking policy may result in suspension of library privileges. This policy outlines the rules regarding Study Room Booking. All patrons must adhere strictly to these guidelines to ensure fair access and safety. Failure to comply with the Study Room Booking policy may result in suspension of library privileges. This policy outlines the rules regarding Study Room Booking. All patrons must adhere strictly to these guidelines to ensure fair access and safety. Failure to comply with the Study Room Booking policy may result in suspension of library privileges. This policy outlines the rules regarding Study Room Booking. All patrons must adhere strictly to these guidelines to ensure fair access and safety. Failure to comply with the Study Room Booking policy may result in suspension of library privileges. This policy outlines the rules regarding Study Room Booking. All patrons must adhere strictly to these guidelines to ensure fair access and safety. Failure to comply with the Study Room Booking policy may result in suspension of library privileges. </w:t>
-      </w:r>
-    </w:p>
-    <w:p>
-      <w:r>
-        <w:t xml:space="preserve">This policy outlines the rules regarding Study Room Booking. All patrons must adhere strictly to these guidelines to ensure fair access and safety. Failure to comply with the Study Room Booking policy may result in suspension of library privileges. This policy outlines the rules regarding Study Room Booking. All patrons must adhere strictly to these guidelines to ensure fair access and safety. Failure to comply with the Study Room Booking policy may result in suspension of library privileges. This policy outlines the rules regarding Study Room Booking. All patrons must adhere strictly to these guidelines to ensure fair access and safety. Failure to comply with the Study Room Booking policy may result in suspension of library privileges. This policy outlines the rules regarding Study Room Booking. All patrons must adhere strictly to these guidelines to ensure fair access and safety. Failure to comply with the Study Room Booking policy may result in suspension of library privileges. This policy outlines the rules regarding Study Room Booking. All patrons must adhere strictly to these guidelines to ensure fair access and safety. Failure to comply with the Study Room Booking policy may result in suspension of library privileges. This policy outlines the rules regarding Study Room Booking. All patrons must adhere strictly to these guidelines to ensure fair access and safety. Failure to comply with the Study Room Booking policy may result in suspension of library privileges. </w:t>
-      </w:r>
-    </w:p>
-    <w:p>
-      <w:r>
-        <w:br w:type="page"/>
-      </w:r>
-    </w:p>
-    <w:p>
-      <w:pPr>
-        <w:pStyle w:val="Heading2"/>
-      </w:pPr>
-      <w:r>
-        <w:t>Study Room Booking - Part 10</w:t>
-      </w:r>
-    </w:p>
-    <w:p>
-      <w:r>
-        <w:t xml:space="preserve">This policy outlines the rules regarding Study Room Booking. All patrons must adhere strictly to these guidelines to ensure fair access and safety. Failure to comply with the Study Room Booking policy may result in suspension of library privileges. This policy outlines the rules regarding Study Room Booking. All patrons must adhere strictly to these guidelines to ensure fair access and safety. Failure to comply with the Study Room Booking policy may result in suspension of library privileges. This policy outlines the rules regarding Study Room Booking. All patrons must adhere strictly to these guidelines to ensure fair access and safety. Failure to comply with the Study Room Booking policy may result in suspension of library privileges. This policy outlines the rules regarding Study Room Booking. All patrons must adhere strictly to these guidelines to ensure fair access and safety. Failure to comply with the Study Room Booking policy may result in suspension of library privileges. This policy outlines the rules regarding Study Room Booking. All patrons must adhere strictly to these guidelines to ensure fair access and safety. Failure to comply with the Study Room Booking policy may result in suspension of library privileges. This policy outlines the rules regarding Study Room Booking. All patrons must adhere strictly to these guidelines to ensure fair access and safety. Failure to comply with the Study Room Booking policy may result in suspension of library privileges. </w:t>
-      </w:r>
-    </w:p>
-    <w:p>
-      <w:r>
-        <w:t xml:space="preserve">This policy outlines the rules regarding Study Room Booking. All patrons must adhere strictly to these guidelines to ensure fair access and safety. Failure to comply with the Study Room Booking policy may result in suspension of library privileges. This policy outlines the rules regarding Study Room Booking. All patrons must adhere strictly to these guidelines to ensure fair access and safety. Failure to comply with the Study Room Booking policy may result in suspension of library privileges. This policy outlines the rules regarding Study Room Booking. All patrons must adhere strictly to these guidelines to ensure fair access and safety. Failure to comply with the Study Room Booking policy may result in suspension of library privileges. This policy outlines the rules regarding Study Room Booking. All patrons must adhere strictly to these guidelines to ensure fair access and safety. Failure to comply with the Study Room Booking policy may result in suspension of library privileges. This policy outlines the rules regarding Study Room Booking. All patrons must adhere strictly to these guidelines to ensure fair access and safety. Failure to comply with the Study Room Booking policy may result in suspension of library privileges. This policy outlines the rules regarding Study Room Booking. All patrons must adhere strictly to these guidelines to ensure fair access and safety. Failure to comply with the Study Room Booking policy may result in suspension of library privileges. </w:t>
-      </w:r>
-    </w:p>
-    <w:p>
-      <w:r>
-        <w:t xml:space="preserve">This policy outlines the rules regarding Study Room Booking. All patrons must adhere strictly to these guidelines to ensure fair access and safety. Failure to comply with the Study Room Booking policy may result in suspension of library privileges. This policy outlines the rules regarding Study Room Booking. All patrons must adhere strictly to these guidelines to ensure fair access and safety. Failure to comply with the Study Room Booking policy may result in suspension of library privileges. This policy outlines the rules regarding Study Room Booking. All patrons must adhere strictly to these guidelines to ensure fair access and safety. Failure to comply with the Study Room Booking policy may result in suspension of library privileges. This policy outlines the rules regarding Study Room Booking. All patrons must adhere strictly to these guidelines to ensure fair access and safety. Failure to comply with the Study Room Booking policy may result in suspension of library privileges. This policy outlines the rules regarding Study Room Booking. All patrons must adhere strictly to these guidelines to ensure fair access and safety. Failure to comply with the Study Room Booking policy may result in suspension of library privileges. This policy outlines the rules regarding Study Room Booking. All patrons must adhere strictly to these guidelines to ensure fair access and safety. Failure to comply with the Study Room Booking policy may result in suspension of library privileges. </w:t>
-      </w:r>
-    </w:p>
-    <w:p>
-      <w:r>
-        <w:br w:type="page"/>
+        <w:t>- Group Size: Study rooms are reserved for group study of 2 to 8 students. Single occupancy is not permitted.</w:t>
+        <w:br/>
+        <w:t>- Reservation Limit: Rooms can be booked up to 7 days in advance for a maximum of 2 hours per day per group.</w:t>
+        <w:br/>
+        <w:t>- Grace Period: If a group fails to claim a room within 15 minutes of their booking start time, the reservation is forfeited.</w:t>
       </w:r>
     </w:p>
     <w:p>
@@ -1459,283 +110,12 @@
       </w:r>
     </w:p>
     <w:p>
-      <w:pPr>
-        <w:pStyle w:val="Heading2"/>
-      </w:pPr>
       <w:r>
-        <w:t>Lost Items and Fines - Part 1</w:t>
-      </w:r>
-    </w:p>
-    <w:p>
-      <w:r>
-        <w:t xml:space="preserve">This policy outlines the rules regarding Lost Items and Fines. All patrons must adhere strictly to these guidelines to ensure fair access and safety. Failure to comply with the Lost Items and Fines policy may result in suspension of library privileges. This policy outlines the rules regarding Lost Items and Fines. All patrons must adhere strictly to these guidelines to ensure fair access and safety. Failure to comply with the Lost Items and Fines policy may result in suspension of library privileges. This policy outlines the rules regarding Lost Items and Fines. All patrons must adhere strictly to these guidelines to ensure fair access and safety. Failure to comply with the Lost Items and Fines policy may result in suspension of library privileges. This policy outlines the rules regarding Lost Items and Fines. All patrons must adhere strictly to these guidelines to ensure fair access and safety. Failure to comply with the Lost Items and Fines policy may result in suspension of library privileges. This policy outlines the rules regarding Lost Items and Fines. All patrons must adhere strictly to these guidelines to ensure fair access and safety. Failure to comply with the Lost Items and Fines policy may result in suspension of library privileges. This policy outlines the rules regarding Lost Items and Fines. All patrons must adhere strictly to these guidelines to ensure fair access and safety. Failure to comply with the Lost Items and Fines policy may result in suspension of library privileges. </w:t>
-      </w:r>
-    </w:p>
-    <w:p>
-      <w:r>
-        <w:t xml:space="preserve">This policy outlines the rules regarding Lost Items and Fines. All patrons must adhere strictly to these guidelines to ensure fair access and safety. Failure to comply with the Lost Items and Fines policy may result in suspension of library privileges. This policy outlines the rules regarding Lost Items and Fines. All patrons must adhere strictly to these guidelines to ensure fair access and safety. Failure to comply with the Lost Items and Fines policy may result in suspension of library privileges. This policy outlines the rules regarding Lost Items and Fines. All patrons must adhere strictly to these guidelines to ensure fair access and safety. Failure to comply with the Lost Items and Fines policy may result in suspension of library privileges. This policy outlines the rules regarding Lost Items and Fines. All patrons must adhere strictly to these guidelines to ensure fair access and safety. Failure to comply with the Lost Items and Fines policy may result in suspension of library privileges. This policy outlines the rules regarding Lost Items and Fines. All patrons must adhere strictly to these guidelines to ensure fair access and safety. Failure to comply with the Lost Items and Fines policy may result in suspension of library privileges. This policy outlines the rules regarding Lost Items and Fines. All patrons must adhere strictly to these guidelines to ensure fair access and safety. Failure to comply with the Lost Items and Fines policy may result in suspension of library privileges. </w:t>
-      </w:r>
-    </w:p>
-    <w:p>
-      <w:r>
-        <w:t xml:space="preserve">This policy outlines the rules regarding Lost Items and Fines. All patrons must adhere strictly to these guidelines to ensure fair access and safety. Failure to comply with the Lost Items and Fines policy may result in suspension of library privileges. This policy outlines the rules regarding Lost Items and Fines. All patrons must adhere strictly to these guidelines to ensure fair access and safety. Failure to comply with the Lost Items and Fines policy may result in suspension of library privileges. This policy outlines the rules regarding Lost Items and Fines. All patrons must adhere strictly to these guidelines to ensure fair access and safety. Failure to comply with the Lost Items and Fines policy may result in suspension of library privileges. This policy outlines the rules regarding Lost Items and Fines. All patrons must adhere strictly to these guidelines to ensure fair access and safety. Failure to comply with the Lost Items and Fines policy may result in suspension of library privileges. This policy outlines the rules regarding Lost Items and Fines. All patrons must adhere strictly to these guidelines to ensure fair access and safety. Failure to comply with the Lost Items and Fines policy may result in suspension of library privileges. This policy outlines the rules regarding Lost Items and Fines. All patrons must adhere strictly to these guidelines to ensure fair access and safety. Failure to comply with the Lost Items and Fines policy may result in suspension of library privileges. </w:t>
-      </w:r>
-    </w:p>
-    <w:p>
-      <w:r>
-        <w:br w:type="page"/>
-      </w:r>
-    </w:p>
-    <w:p>
-      <w:pPr>
-        <w:pStyle w:val="Heading2"/>
-      </w:pPr>
-      <w:r>
-        <w:t>Lost Items and Fines - Part 2</w:t>
-      </w:r>
-    </w:p>
-    <w:p>
-      <w:r>
-        <w:t xml:space="preserve">This policy outlines the rules regarding Lost Items and Fines. All patrons must adhere strictly to these guidelines to ensure fair access and safety. Failure to comply with the Lost Items and Fines policy may result in suspension of library privileges. This policy outlines the rules regarding Lost Items and Fines. All patrons must adhere strictly to these guidelines to ensure fair access and safety. Failure to comply with the Lost Items and Fines policy may result in suspension of library privileges. This policy outlines the rules regarding Lost Items and Fines. All patrons must adhere strictly to these guidelines to ensure fair access and safety. Failure to comply with the Lost Items and Fines policy may result in suspension of library privileges. This policy outlines the rules regarding Lost Items and Fines. All patrons must adhere strictly to these guidelines to ensure fair access and safety. Failure to comply with the Lost Items and Fines policy may result in suspension of library privileges. This policy outlines the rules regarding Lost Items and Fines. All patrons must adhere strictly to these guidelines to ensure fair access and safety. Failure to comply with the Lost Items and Fines policy may result in suspension of library privileges. This policy outlines the rules regarding Lost Items and Fines. All patrons must adhere strictly to these guidelines to ensure fair access and safety. Failure to comply with the Lost Items and Fines policy may result in suspension of library privileges. </w:t>
-      </w:r>
-    </w:p>
-    <w:p>
-      <w:r>
-        <w:t xml:space="preserve">This policy outlines the rules regarding Lost Items and Fines. All patrons must adhere strictly to these guidelines to ensure fair access and safety. Failure to comply with the Lost Items and Fines policy may result in suspension of library privileges. This policy outlines the rules regarding Lost Items and Fines. All patrons must adhere strictly to these guidelines to ensure fair access and safety. Failure to comply with the Lost Items and Fines policy may result in suspension of library privileges. This policy outlines the rules regarding Lost Items and Fines. All patrons must adhere strictly to these guidelines to ensure fair access and safety. Failure to comply with the Lost Items and Fines policy may result in suspension of library privileges. This policy outlines the rules regarding Lost Items and Fines. All patrons must adhere strictly to these guidelines to ensure fair access and safety. Failure to comply with the Lost Items and Fines policy may result in suspension of library privileges. This policy outlines the rules regarding Lost Items and Fines. All patrons must adhere strictly to these guidelines to ensure fair access and safety. Failure to comply with the Lost Items and Fines policy may result in suspension of library privileges. This policy outlines the rules regarding Lost Items and Fines. All patrons must adhere strictly to these guidelines to ensure fair access and safety. Failure to comply with the Lost Items and Fines policy may result in suspension of library privileges. </w:t>
-      </w:r>
-    </w:p>
-    <w:p>
-      <w:r>
-        <w:t xml:space="preserve">This policy outlines the rules regarding Lost Items and Fines. All patrons must adhere strictly to these guidelines to ensure fair access and safety. Failure to comply with the Lost Items and Fines policy may result in suspension of library privileges. This policy outlines the rules regarding Lost Items and Fines. All patrons must adhere strictly to these guidelines to ensure fair access and safety. Failure to comply with the Lost Items and Fines policy may result in suspension of library privileges. This policy outlines the rules regarding Lost Items and Fines. All patrons must adhere strictly to these guidelines to ensure fair access and safety. Failure to comply with the Lost Items and Fines policy may result in suspension of library privileges. This policy outlines the rules regarding Lost Items and Fines. All patrons must adhere strictly to these guidelines to ensure fair access and safety. Failure to comply with the Lost Items and Fines policy may result in suspension of library privileges. This policy outlines the rules regarding Lost Items and Fines. All patrons must adhere strictly to these guidelines to ensure fair access and safety. Failure to comply with the Lost Items and Fines policy may result in suspension of library privileges. This policy outlines the rules regarding Lost Items and Fines. All patrons must adhere strictly to these guidelines to ensure fair access and safety. Failure to comply with the Lost Items and Fines policy may result in suspension of library privileges. </w:t>
-      </w:r>
-    </w:p>
-    <w:p>
-      <w:r>
-        <w:br w:type="page"/>
-      </w:r>
-    </w:p>
-    <w:p>
-      <w:pPr>
-        <w:pStyle w:val="Heading2"/>
-      </w:pPr>
-      <w:r>
-        <w:t>Lost Items and Fines - Part 3</w:t>
-      </w:r>
-    </w:p>
-    <w:p>
-      <w:r>
-        <w:t xml:space="preserve">This policy outlines the rules regarding Lost Items and Fines. All patrons must adhere strictly to these guidelines to ensure fair access and safety. Failure to comply with the Lost Items and Fines policy may result in suspension of library privileges. This policy outlines the rules regarding Lost Items and Fines. All patrons must adhere strictly to these guidelines to ensure fair access and safety. Failure to comply with the Lost Items and Fines policy may result in suspension of library privileges. This policy outlines the rules regarding Lost Items and Fines. All patrons must adhere strictly to these guidelines to ensure fair access and safety. Failure to comply with the Lost Items and Fines policy may result in suspension of library privileges. This policy outlines the rules regarding Lost Items and Fines. All patrons must adhere strictly to these guidelines to ensure fair access and safety. Failure to comply with the Lost Items and Fines policy may result in suspension of library privileges. This policy outlines the rules regarding Lost Items and Fines. All patrons must adhere strictly to these guidelines to ensure fair access and safety. Failure to comply with the Lost Items and Fines policy may result in suspension of library privileges. This policy outlines the rules regarding Lost Items and Fines. All patrons must adhere strictly to these guidelines to ensure fair access and safety. Failure to comply with the Lost Items and Fines policy may result in suspension of library privileges. </w:t>
-      </w:r>
-    </w:p>
-    <w:p>
-      <w:r>
-        <w:t xml:space="preserve">This policy outlines the rules regarding Lost Items and Fines. All patrons must adhere strictly to these guidelines to ensure fair access and safety. Failure to comply with the Lost Items and Fines policy may result in suspension of library privileges. This policy outlines the rules regarding Lost Items and Fines. All patrons must adhere strictly to these guidelines to ensure fair access and safety. Failure to comply with the Lost Items and Fines policy may result in suspension of library privileges. This policy outlines the rules regarding Lost Items and Fines. All patrons must adhere strictly to these guidelines to ensure fair access and safety. Failure to comply with the Lost Items and Fines policy may result in suspension of library privileges. This policy outlines the rules regarding Lost Items and Fines. All patrons must adhere strictly to these guidelines to ensure fair access and safety. Failure to comply with the Lost Items and Fines policy may result in suspension of library privileges. This policy outlines the rules regarding Lost Items and Fines. All patrons must adhere strictly to these guidelines to ensure fair access and safety. Failure to comply with the Lost Items and Fines policy may result in suspension of library privileges. This policy outlines the rules regarding Lost Items and Fines. All patrons must adhere strictly to these guidelines to ensure fair access and safety. Failure to comply with the Lost Items and Fines policy may result in suspension of library privileges. </w:t>
-      </w:r>
-    </w:p>
-    <w:p>
-      <w:r>
-        <w:t xml:space="preserve">This policy outlines the rules regarding Lost Items and Fines. All patrons must adhere strictly to these guidelines to ensure fair access and safety. Failure to comply with the Lost Items and Fines policy may result in suspension of library privileges. This policy outlines the rules regarding Lost Items and Fines. All patrons must adhere strictly to these guidelines to ensure fair access and safety. Failure to comply with the Lost Items and Fines policy may result in suspension of library privileges. This policy outlines the rules regarding Lost Items and Fines. All patrons must adhere strictly to these guidelines to ensure fair access and safety. Failure to comply with the Lost Items and Fines policy may result in suspension of library privileges. This policy outlines the rules regarding Lost Items and Fines. All patrons must adhere strictly to these guidelines to ensure fair access and safety. Failure to comply with the Lost Items and Fines policy may result in suspension of library privileges. This policy outlines the rules regarding Lost Items and Fines. All patrons must adhere strictly to these guidelines to ensure fair access and safety. Failure to comply with the Lost Items and Fines policy may result in suspension of library privileges. This policy outlines the rules regarding Lost Items and Fines. All patrons must adhere strictly to these guidelines to ensure fair access and safety. Failure to comply with the Lost Items and Fines policy may result in suspension of library privileges. </w:t>
-      </w:r>
-    </w:p>
-    <w:p>
-      <w:r>
-        <w:br w:type="page"/>
-      </w:r>
-    </w:p>
-    <w:p>
-      <w:pPr>
-        <w:pStyle w:val="Heading2"/>
-      </w:pPr>
-      <w:r>
-        <w:t>Lost Items and Fines - Part 4</w:t>
-      </w:r>
-    </w:p>
-    <w:p>
-      <w:r>
-        <w:t xml:space="preserve">This policy outlines the rules regarding Lost Items and Fines. All patrons must adhere strictly to these guidelines to ensure fair access and safety. Failure to comply with the Lost Items and Fines policy may result in suspension of library privileges. This policy outlines the rules regarding Lost Items and Fines. All patrons must adhere strictly to these guidelines to ensure fair access and safety. Failure to comply with the Lost Items and Fines policy may result in suspension of library privileges. This policy outlines the rules regarding Lost Items and Fines. All patrons must adhere strictly to these guidelines to ensure fair access and safety. Failure to comply with the Lost Items and Fines policy may result in suspension of library privileges. This policy outlines the rules regarding Lost Items and Fines. All patrons must adhere strictly to these guidelines to ensure fair access and safety. Failure to comply with the Lost Items and Fines policy may result in suspension of library privileges. This policy outlines the rules regarding Lost Items and Fines. All patrons must adhere strictly to these guidelines to ensure fair access and safety. Failure to comply with the Lost Items and Fines policy may result in suspension of library privileges. This policy outlines the rules regarding Lost Items and Fines. All patrons must adhere strictly to these guidelines to ensure fair access and safety. Failure to comply with the Lost Items and Fines policy may result in suspension of library privileges. </w:t>
-      </w:r>
-    </w:p>
-    <w:p>
-      <w:r>
-        <w:t xml:space="preserve">This policy outlines the rules regarding Lost Items and Fines. All patrons must adhere strictly to these guidelines to ensure fair access and safety. Failure to comply with the Lost Items and Fines policy may result in suspension of library privileges. This policy outlines the rules regarding Lost Items and Fines. All patrons must adhere strictly to these guidelines to ensure fair access and safety. Failure to comply with the Lost Items and Fines policy may result in suspension of library privileges. This policy outlines the rules regarding Lost Items and Fines. All patrons must adhere strictly to these guidelines to ensure fair access and safety. Failure to comply with the Lost Items and Fines policy may result in suspension of library privileges. This policy outlines the rules regarding Lost Items and Fines. All patrons must adhere strictly to these guidelines to ensure fair access and safety. Failure to comply with the Lost Items and Fines policy may result in suspension of library privileges. This policy outlines the rules regarding Lost Items and Fines. All patrons must adhere strictly to these guidelines to ensure fair access and safety. Failure to comply with the Lost Items and Fines policy may result in suspension of library privileges. This policy outlines the rules regarding Lost Items and Fines. All patrons must adhere strictly to these guidelines to ensure fair access and safety. Failure to comply with the Lost Items and Fines policy may result in suspension of library privileges. </w:t>
-      </w:r>
-    </w:p>
-    <w:p>
-      <w:r>
-        <w:t xml:space="preserve">This policy outlines the rules regarding Lost Items and Fines. All patrons must adhere strictly to these guidelines to ensure fair access and safety. Failure to comply with the Lost Items and Fines policy may result in suspension of library privileges. This policy outlines the rules regarding Lost Items and Fines. All patrons must adhere strictly to these guidelines to ensure fair access and safety. Failure to comply with the Lost Items and Fines policy may result in suspension of library privileges. This policy outlines the rules regarding Lost Items and Fines. All patrons must adhere strictly to these guidelines to ensure fair access and safety. Failure to comply with the Lost Items and Fines policy may result in suspension of library privileges. This policy outlines the rules regarding Lost Items and Fines. All patrons must adhere strictly to these guidelines to ensure fair access and safety. Failure to comply with the Lost Items and Fines policy may result in suspension of library privileges. This policy outlines the rules regarding Lost Items and Fines. All patrons must adhere strictly to these guidelines to ensure fair access and safety. Failure to comply with the Lost Items and Fines policy may result in suspension of library privileges. This policy outlines the rules regarding Lost Items and Fines. All patrons must adhere strictly to these guidelines to ensure fair access and safety. Failure to comply with the Lost Items and Fines policy may result in suspension of library privileges. </w:t>
-      </w:r>
-    </w:p>
-    <w:p>
-      <w:r>
-        <w:br w:type="page"/>
-      </w:r>
-    </w:p>
-    <w:p>
-      <w:pPr>
-        <w:pStyle w:val="Heading2"/>
-      </w:pPr>
-      <w:r>
-        <w:t>Lost Items and Fines - Part 5</w:t>
-      </w:r>
-    </w:p>
-    <w:p>
-      <w:r>
-        <w:t xml:space="preserve">This policy outlines the rules regarding Lost Items and Fines. All patrons must adhere strictly to these guidelines to ensure fair access and safety. Failure to comply with the Lost Items and Fines policy may result in suspension of library privileges. This policy outlines the rules regarding Lost Items and Fines. All patrons must adhere strictly to these guidelines to ensure fair access and safety. Failure to comply with the Lost Items and Fines policy may result in suspension of library privileges. This policy outlines the rules regarding Lost Items and Fines. All patrons must adhere strictly to these guidelines to ensure fair access and safety. Failure to comply with the Lost Items and Fines policy may result in suspension of library privileges. This policy outlines the rules regarding Lost Items and Fines. All patrons must adhere strictly to these guidelines to ensure fair access and safety. Failure to comply with the Lost Items and Fines policy may result in suspension of library privileges. This policy outlines the rules regarding Lost Items and Fines. All patrons must adhere strictly to these guidelines to ensure fair access and safety. Failure to comply with the Lost Items and Fines policy may result in suspension of library privileges. This policy outlines the rules regarding Lost Items and Fines. All patrons must adhere strictly to these guidelines to ensure fair access and safety. Failure to comply with the Lost Items and Fines policy may result in suspension of library privileges. </w:t>
-      </w:r>
-    </w:p>
-    <w:p>
-      <w:r>
-        <w:t xml:space="preserve">This policy outlines the rules regarding Lost Items and Fines. All patrons must adhere strictly to these guidelines to ensure fair access and safety. Failure to comply with the Lost Items and Fines policy may result in suspension of library privileges. This policy outlines the rules regarding Lost Items and Fines. All patrons must adhere strictly to these guidelines to ensure fair access and safety. Failure to comply with the Lost Items and Fines policy may result in suspension of library privileges. This policy outlines the rules regarding Lost Items and Fines. All patrons must adhere strictly to these guidelines to ensure fair access and safety. Failure to comply with the Lost Items and Fines policy may result in suspension of library privileges. This policy outlines the rules regarding Lost Items and Fines. All patrons must adhere strictly to these guidelines to ensure fair access and safety. Failure to comply with the Lost Items and Fines policy may result in suspension of library privileges. This policy outlines the rules regarding Lost Items and Fines. All patrons must adhere strictly to these guidelines to ensure fair access and safety. Failure to comply with the Lost Items and Fines policy may result in suspension of library privileges. This policy outlines the rules regarding Lost Items and Fines. All patrons must adhere strictly to these guidelines to ensure fair access and safety. Failure to comply with the Lost Items and Fines policy may result in suspension of library privileges. </w:t>
-      </w:r>
-    </w:p>
-    <w:p>
-      <w:r>
-        <w:t xml:space="preserve">This policy outlines the rules regarding Lost Items and Fines. All patrons must adhere strictly to these guidelines to ensure fair access and safety. Failure to comply with the Lost Items and Fines policy may result in suspension of library privileges. This policy outlines the rules regarding Lost Items and Fines. All patrons must adhere strictly to these guidelines to ensure fair access and safety. Failure to comply with the Lost Items and Fines policy may result in suspension of library privileges. This policy outlines the rules regarding Lost Items and Fines. All patrons must adhere strictly to these guidelines to ensure fair access and safety. Failure to comply with the Lost Items and Fines policy may result in suspension of library privileges. This policy outlines the rules regarding Lost Items and Fines. All patrons must adhere strictly to these guidelines to ensure fair access and safety. Failure to comply with the Lost Items and Fines policy may result in suspension of library privileges. This policy outlines the rules regarding Lost Items and Fines. All patrons must adhere strictly to these guidelines to ensure fair access and safety. Failure to comply with the Lost Items and Fines policy may result in suspension of library privileges. This policy outlines the rules regarding Lost Items and Fines. All patrons must adhere strictly to these guidelines to ensure fair access and safety. Failure to comply with the Lost Items and Fines policy may result in suspension of library privileges. </w:t>
-      </w:r>
-    </w:p>
-    <w:p>
-      <w:r>
-        <w:br w:type="page"/>
-      </w:r>
-    </w:p>
-    <w:p>
-      <w:pPr>
-        <w:pStyle w:val="Heading2"/>
-      </w:pPr>
-      <w:r>
-        <w:t>Lost Items and Fines - Part 6</w:t>
-      </w:r>
-    </w:p>
-    <w:p>
-      <w:r>
-        <w:t xml:space="preserve">This policy outlines the rules regarding Lost Items and Fines. All patrons must adhere strictly to these guidelines to ensure fair access and safety. Failure to comply with the Lost Items and Fines policy may result in suspension of library privileges. This policy outlines the rules regarding Lost Items and Fines. All patrons must adhere strictly to these guidelines to ensure fair access and safety. Failure to comply with the Lost Items and Fines policy may result in suspension of library privileges. This policy outlines the rules regarding Lost Items and Fines. All patrons must adhere strictly to these guidelines to ensure fair access and safety. Failure to comply with the Lost Items and Fines policy may result in suspension of library privileges. This policy outlines the rules regarding Lost Items and Fines. All patrons must adhere strictly to these guidelines to ensure fair access and safety. Failure to comply with the Lost Items and Fines policy may result in suspension of library privileges. This policy outlines the rules regarding Lost Items and Fines. All patrons must adhere strictly to these guidelines to ensure fair access and safety. Failure to comply with the Lost Items and Fines policy may result in suspension of library privileges. This policy outlines the rules regarding Lost Items and Fines. All patrons must adhere strictly to these guidelines to ensure fair access and safety. Failure to comply with the Lost Items and Fines policy may result in suspension of library privileges. </w:t>
-      </w:r>
-    </w:p>
-    <w:p>
-      <w:r>
-        <w:t xml:space="preserve">This policy outlines the rules regarding Lost Items and Fines. All patrons must adhere strictly to these guidelines to ensure fair access and safety. Failure to comply with the Lost Items and Fines policy may result in suspension of library privileges. This policy outlines the rules regarding Lost Items and Fines. All patrons must adhere strictly to these guidelines to ensure fair access and safety. Failure to comply with the Lost Items and Fines policy may result in suspension of library privileges. This policy outlines the rules regarding Lost Items and Fines. All patrons must adhere strictly to these guidelines to ensure fair access and safety. Failure to comply with the Lost Items and Fines policy may result in suspension of library privileges. This policy outlines the rules regarding Lost Items and Fines. All patrons must adhere strictly to these guidelines to ensure fair access and safety. Failure to comply with the Lost Items and Fines policy may result in suspension of library privileges. This policy outlines the rules regarding Lost Items and Fines. All patrons must adhere strictly to these guidelines to ensure fair access and safety. Failure to comply with the Lost Items and Fines policy may result in suspension of library privileges. This policy outlines the rules regarding Lost Items and Fines. All patrons must adhere strictly to these guidelines to ensure fair access and safety. Failure to comply with the Lost Items and Fines policy may result in suspension of library privileges. </w:t>
-      </w:r>
-    </w:p>
-    <w:p>
-      <w:r>
-        <w:t xml:space="preserve">This policy outlines the rules regarding Lost Items and Fines. All patrons must adhere strictly to these guidelines to ensure fair access and safety. Failure to comply with the Lost Items and Fines policy may result in suspension of library privileges. This policy outlines the rules regarding Lost Items and Fines. All patrons must adhere strictly to these guidelines to ensure fair access and safety. Failure to comply with the Lost Items and Fines policy may result in suspension of library privileges. This policy outlines the rules regarding Lost Items and Fines. All patrons must adhere strictly to these guidelines to ensure fair access and safety. Failure to comply with the Lost Items and Fines policy may result in suspension of library privileges. This policy outlines the rules regarding Lost Items and Fines. All patrons must adhere strictly to these guidelines to ensure fair access and safety. Failure to comply with the Lost Items and Fines policy may result in suspension of library privileges. This policy outlines the rules regarding Lost Items and Fines. All patrons must adhere strictly to these guidelines to ensure fair access and safety. Failure to comply with the Lost Items and Fines policy may result in suspension of library privileges. This policy outlines the rules regarding Lost Items and Fines. All patrons must adhere strictly to these guidelines to ensure fair access and safety. Failure to comply with the Lost Items and Fines policy may result in suspension of library privileges. </w:t>
-      </w:r>
-    </w:p>
-    <w:p>
-      <w:r>
-        <w:br w:type="page"/>
-      </w:r>
-    </w:p>
-    <w:p>
-      <w:pPr>
-        <w:pStyle w:val="Heading2"/>
-      </w:pPr>
-      <w:r>
-        <w:t>Lost Items and Fines - Part 7</w:t>
-      </w:r>
-    </w:p>
-    <w:p>
-      <w:r>
-        <w:t xml:space="preserve">This policy outlines the rules regarding Lost Items and Fines. All patrons must adhere strictly to these guidelines to ensure fair access and safety. Failure to comply with the Lost Items and Fines policy may result in suspension of library privileges. This policy outlines the rules regarding Lost Items and Fines. All patrons must adhere strictly to these guidelines to ensure fair access and safety. Failure to comply with the Lost Items and Fines policy may result in suspension of library privileges. This policy outlines the rules regarding Lost Items and Fines. All patrons must adhere strictly to these guidelines to ensure fair access and safety. Failure to comply with the Lost Items and Fines policy may result in suspension of library privileges. This policy outlines the rules regarding Lost Items and Fines. All patrons must adhere strictly to these guidelines to ensure fair access and safety. Failure to comply with the Lost Items and Fines policy may result in suspension of library privileges. This policy outlines the rules regarding Lost Items and Fines. All patrons must adhere strictly to these guidelines to ensure fair access and safety. Failure to comply with the Lost Items and Fines policy may result in suspension of library privileges. This policy outlines the rules regarding Lost Items and Fines. All patrons must adhere strictly to these guidelines to ensure fair access and safety. Failure to comply with the Lost Items and Fines policy may result in suspension of library privileges. </w:t>
-      </w:r>
-    </w:p>
-    <w:p>
-      <w:r>
-        <w:t xml:space="preserve">This policy outlines the rules regarding Lost Items and Fines. All patrons must adhere strictly to these guidelines to ensure fair access and safety. Failure to comply with the Lost Items and Fines policy may result in suspension of library privileges. This policy outlines the rules regarding Lost Items and Fines. All patrons must adhere strictly to these guidelines to ensure fair access and safety. Failure to comply with the Lost Items and Fines policy may result in suspension of library privileges. This policy outlines the rules regarding Lost Items and Fines. All patrons must adhere strictly to these guidelines to ensure fair access and safety. Failure to comply with the Lost Items and Fines policy may result in suspension of library privileges. This policy outlines the rules regarding Lost Items and Fines. All patrons must adhere strictly to these guidelines to ensure fair access and safety. Failure to comply with the Lost Items and Fines policy may result in suspension of library privileges. This policy outlines the rules regarding Lost Items and Fines. All patrons must adhere strictly to these guidelines to ensure fair access and safety. Failure to comply with the Lost Items and Fines policy may result in suspension of library privileges. This policy outlines the rules regarding Lost Items and Fines. All patrons must adhere strictly to these guidelines to ensure fair access and safety. Failure to comply with the Lost Items and Fines policy may result in suspension of library privileges. </w:t>
-      </w:r>
-    </w:p>
-    <w:p>
-      <w:r>
-        <w:t xml:space="preserve">This policy outlines the rules regarding Lost Items and Fines. All patrons must adhere strictly to these guidelines to ensure fair access and safety. Failure to comply with the Lost Items and Fines policy may result in suspension of library privileges. This policy outlines the rules regarding Lost Items and Fines. All patrons must adhere strictly to these guidelines to ensure fair access and safety. Failure to comply with the Lost Items and Fines policy may result in suspension of library privileges. This policy outlines the rules regarding Lost Items and Fines. All patrons must adhere strictly to these guidelines to ensure fair access and safety. Failure to comply with the Lost Items and Fines policy may result in suspension of library privileges. This policy outlines the rules regarding Lost Items and Fines. All patrons must adhere strictly to these guidelines to ensure fair access and safety. Failure to comply with the Lost Items and Fines policy may result in suspension of library privileges. This policy outlines the rules regarding Lost Items and Fines. All patrons must adhere strictly to these guidelines to ensure fair access and safety. Failure to comply with the Lost Items and Fines policy may result in suspension of library privileges. This policy outlines the rules regarding Lost Items and Fines. All patrons must adhere strictly to these guidelines to ensure fair access and safety. Failure to comply with the Lost Items and Fines policy may result in suspension of library privileges. </w:t>
-      </w:r>
-    </w:p>
-    <w:p>
-      <w:r>
-        <w:br w:type="page"/>
-      </w:r>
-    </w:p>
-    <w:p>
-      <w:pPr>
-        <w:pStyle w:val="Heading2"/>
-      </w:pPr>
-      <w:r>
-        <w:t>Lost Items and Fines - Part 8</w:t>
-      </w:r>
-    </w:p>
-    <w:p>
-      <w:r>
-        <w:t xml:space="preserve">This policy outlines the rules regarding Lost Items and Fines. All patrons must adhere strictly to these guidelines to ensure fair access and safety. Failure to comply with the Lost Items and Fines policy may result in suspension of library privileges. This policy outlines the rules regarding Lost Items and Fines. All patrons must adhere strictly to these guidelines to ensure fair access and safety. Failure to comply with the Lost Items and Fines policy may result in suspension of library privileges. This policy outlines the rules regarding Lost Items and Fines. All patrons must adhere strictly to these guidelines to ensure fair access and safety. Failure to comply with the Lost Items and Fines policy may result in suspension of library privileges. This policy outlines the rules regarding Lost Items and Fines. All patrons must adhere strictly to these guidelines to ensure fair access and safety. Failure to comply with the Lost Items and Fines policy may result in suspension of library privileges. This policy outlines the rules regarding Lost Items and Fines. All patrons must adhere strictly to these guidelines to ensure fair access and safety. Failure to comply with the Lost Items and Fines policy may result in suspension of library privileges. This policy outlines the rules regarding Lost Items and Fines. All patrons must adhere strictly to these guidelines to ensure fair access and safety. Failure to comply with the Lost Items and Fines policy may result in suspension of library privileges. </w:t>
-      </w:r>
-    </w:p>
-    <w:p>
-      <w:r>
-        <w:t xml:space="preserve">This policy outlines the rules regarding Lost Items and Fines. All patrons must adhere strictly to these guidelines to ensure fair access and safety. Failure to comply with the Lost Items and Fines policy may result in suspension of library privileges. This policy outlines the rules regarding Lost Items and Fines. All patrons must adhere strictly to these guidelines to ensure fair access and safety. Failure to comply with the Lost Items and Fines policy may result in suspension of library privileges. This policy outlines the rules regarding Lost Items and Fines. All patrons must adhere strictly to these guidelines to ensure fair access and safety. Failure to comply with the Lost Items and Fines policy may result in suspension of library privileges. This policy outlines the rules regarding Lost Items and Fines. All patrons must adhere strictly to these guidelines to ensure fair access and safety. Failure to comply with the Lost Items and Fines policy may result in suspension of library privileges. This policy outlines the rules regarding Lost Items and Fines. All patrons must adhere strictly to these guidelines to ensure fair access and safety. Failure to comply with the Lost Items and Fines policy may result in suspension of library privileges. This policy outlines the rules regarding Lost Items and Fines. All patrons must adhere strictly to these guidelines to ensure fair access and safety. Failure to comply with the Lost Items and Fines policy may result in suspension of library privileges. </w:t>
-      </w:r>
-    </w:p>
-    <w:p>
-      <w:r>
-        <w:t xml:space="preserve">This policy outlines the rules regarding Lost Items and Fines. All patrons must adhere strictly to these guidelines to ensure fair access and safety. Failure to comply with the Lost Items and Fines policy may result in suspension of library privileges. This policy outlines the rules regarding Lost Items and Fines. All patrons must adhere strictly to these guidelines to ensure fair access and safety. Failure to comply with the Lost Items and Fines policy may result in suspension of library privileges. This policy outlines the rules regarding Lost Items and Fines. All patrons must adhere strictly to these guidelines to ensure fair access and safety. Failure to comply with the Lost Items and Fines policy may result in suspension of library privileges. This policy outlines the rules regarding Lost Items and Fines. All patrons must adhere strictly to these guidelines to ensure fair access and safety. Failure to comply with the Lost Items and Fines policy may result in suspension of library privileges. This policy outlines the rules regarding Lost Items and Fines. All patrons must adhere strictly to these guidelines to ensure fair access and safety. Failure to comply with the Lost Items and Fines policy may result in suspension of library privileges. This policy outlines the rules regarding Lost Items and Fines. All patrons must adhere strictly to these guidelines to ensure fair access and safety. Failure to comply with the Lost Items and Fines policy may result in suspension of library privileges. </w:t>
-      </w:r>
-    </w:p>
-    <w:p>
-      <w:r>
-        <w:br w:type="page"/>
-      </w:r>
-    </w:p>
-    <w:p>
-      <w:pPr>
-        <w:pStyle w:val="Heading2"/>
-      </w:pPr>
-      <w:r>
-        <w:t>Lost Items and Fines - Part 9</w:t>
-      </w:r>
-    </w:p>
-    <w:p>
-      <w:r>
-        <w:t xml:space="preserve">This policy outlines the rules regarding Lost Items and Fines. All patrons must adhere strictly to these guidelines to ensure fair access and safety. Failure to comply with the Lost Items and Fines policy may result in suspension of library privileges. This policy outlines the rules regarding Lost Items and Fines. All patrons must adhere strictly to these guidelines to ensure fair access and safety. Failure to comply with the Lost Items and Fines policy may result in suspension of library privileges. This policy outlines the rules regarding Lost Items and Fines. All patrons must adhere strictly to these guidelines to ensure fair access and safety. Failure to comply with the Lost Items and Fines policy may result in suspension of library privileges. This policy outlines the rules regarding Lost Items and Fines. All patrons must adhere strictly to these guidelines to ensure fair access and safety. Failure to comply with the Lost Items and Fines policy may result in suspension of library privileges. This policy outlines the rules regarding Lost Items and Fines. All patrons must adhere strictly to these guidelines to ensure fair access and safety. Failure to comply with the Lost Items and Fines policy may result in suspension of library privileges. This policy outlines the rules regarding Lost Items and Fines. All patrons must adhere strictly to these guidelines to ensure fair access and safety. Failure to comply with the Lost Items and Fines policy may result in suspension of library privileges. </w:t>
-      </w:r>
-    </w:p>
-    <w:p>
-      <w:r>
-        <w:t xml:space="preserve">This policy outlines the rules regarding Lost Items and Fines. All patrons must adhere strictly to these guidelines to ensure fair access and safety. Failure to comply with the Lost Items and Fines policy may result in suspension of library privileges. This policy outlines the rules regarding Lost Items and Fines. All patrons must adhere strictly to these guidelines to ensure fair access and safety. Failure to comply with the Lost Items and Fines policy may result in suspension of library privileges. This policy outlines the rules regarding Lost Items and Fines. All patrons must adhere strictly to these guidelines to ensure fair access and safety. Failure to comply with the Lost Items and Fines policy may result in suspension of library privileges. This policy outlines the rules regarding Lost Items and Fines. All patrons must adhere strictly to these guidelines to ensure fair access and safety. Failure to comply with the Lost Items and Fines policy may result in suspension of library privileges. This policy outlines the rules regarding Lost Items and Fines. All patrons must adhere strictly to these guidelines to ensure fair access and safety. Failure to comply with the Lost Items and Fines policy may result in suspension of library privileges. This policy outlines the rules regarding Lost Items and Fines. All patrons must adhere strictly to these guidelines to ensure fair access and safety. Failure to comply with the Lost Items and Fines policy may result in suspension of library privileges. </w:t>
-      </w:r>
-    </w:p>
-    <w:p>
-      <w:r>
-        <w:t xml:space="preserve">This policy outlines the rules regarding Lost Items and Fines. All patrons must adhere strictly to these guidelines to ensure fair access and safety. Failure to comply with the Lost Items and Fines policy may result in suspension of library privileges. This policy outlines the rules regarding Lost Items and Fines. All patrons must adhere strictly to these guidelines to ensure fair access and safety. Failure to comply with the Lost Items and Fines policy may result in suspension of library privileges. This policy outlines the rules regarding Lost Items and Fines. All patrons must adhere strictly to these guidelines to ensure fair access and safety. Failure to comply with the Lost Items and Fines policy may result in suspension of library privileges. This policy outlines the rules regarding Lost Items and Fines. All patrons must adhere strictly to these guidelines to ensure fair access and safety. Failure to comply with the Lost Items and Fines policy may result in suspension of library privileges. This policy outlines the rules regarding Lost Items and Fines. All patrons must adhere strictly to these guidelines to ensure fair access and safety. Failure to comply with the Lost Items and Fines policy may result in suspension of library privileges. This policy outlines the rules regarding Lost Items and Fines. All patrons must adhere strictly to these guidelines to ensure fair access and safety. Failure to comply with the Lost Items and Fines policy may result in suspension of library privileges. </w:t>
-      </w:r>
-    </w:p>
-    <w:p>
-      <w:r>
-        <w:br w:type="page"/>
-      </w:r>
-    </w:p>
-    <w:p>
-      <w:pPr>
-        <w:pStyle w:val="Heading2"/>
-      </w:pPr>
-      <w:r>
-        <w:t>Lost Items and Fines - Part 10</w:t>
-      </w:r>
-    </w:p>
-    <w:p>
-      <w:r>
-        <w:t xml:space="preserve">This policy outlines the rules regarding Lost Items and Fines. All patrons must adhere strictly to these guidelines to ensure fair access and safety. Failure to comply with the Lost Items and Fines policy may result in suspension of library privileges. This policy outlines the rules regarding Lost Items and Fines. All patrons must adhere strictly to these guidelines to ensure fair access and safety. Failure to comply with the Lost Items and Fines policy may result in suspension of library privileges. This policy outlines the rules regarding Lost Items and Fines. All patrons must adhere strictly to these guidelines to ensure fair access and safety. Failure to comply with the Lost Items and Fines policy may result in suspension of library privileges. This policy outlines the rules regarding Lost Items and Fines. All patrons must adhere strictly to these guidelines to ensure fair access and safety. Failure to comply with the Lost Items and Fines policy may result in suspension of library privileges. This policy outlines the rules regarding Lost Items and Fines. All patrons must adhere strictly to these guidelines to ensure fair access and safety. Failure to comply with the Lost Items and Fines policy may result in suspension of library privileges. This policy outlines the rules regarding Lost Items and Fines. All patrons must adhere strictly to these guidelines to ensure fair access and safety. Failure to comply with the Lost Items and Fines policy may result in suspension of library privileges. </w:t>
-      </w:r>
-    </w:p>
-    <w:p>
-      <w:r>
-        <w:t xml:space="preserve">This policy outlines the rules regarding Lost Items and Fines. All patrons must adhere strictly to these guidelines to ensure fair access and safety. Failure to comply with the Lost Items and Fines policy may result in suspension of library privileges. This policy outlines the rules regarding Lost Items and Fines. All patrons must adhere strictly to these guidelines to ensure fair access and safety. Failure to comply with the Lost Items and Fines policy may result in suspension of library privileges. This policy outlines the rules regarding Lost Items and Fines. All patrons must adhere strictly to these guidelines to ensure fair access and safety. Failure to comply with the Lost Items and Fines policy may result in suspension of library privileges. This policy outlines the rules regarding Lost Items and Fines. All patrons must adhere strictly to these guidelines to ensure fair access and safety. Failure to comply with the Lost Items and Fines policy may result in suspension of library privileges. This policy outlines the rules regarding Lost Items and Fines. All patrons must adhere strictly to these guidelines to ensure fair access and safety. Failure to comply with the Lost Items and Fines policy may result in suspension of library privileges. This policy outlines the rules regarding Lost Items and Fines. All patrons must adhere strictly to these guidelines to ensure fair access and safety. Failure to comply with the Lost Items and Fines policy may result in suspension of library privileges. </w:t>
-      </w:r>
-    </w:p>
-    <w:p>
-      <w:r>
-        <w:t xml:space="preserve">This policy outlines the rules regarding Lost Items and Fines. All patrons must adhere strictly to these guidelines to ensure fair access and safety. Failure to comply with the Lost Items and Fines policy may result in suspension of library privileges. This policy outlines the rules regarding Lost Items and Fines. All patrons must adhere strictly to these guidelines to ensure fair access and safety. Failure to comply with the Lost Items and Fines policy may result in suspension of library privileges. This policy outlines the rules regarding Lost Items and Fines. All patrons must adhere strictly to these guidelines to ensure fair access and safety. Failure to comply with the Lost Items and Fines policy may result in suspension of library privileges. This policy outlines the rules regarding Lost Items and Fines. All patrons must adhere strictly to these guidelines to ensure fair access and safety. Failure to comply with the Lost Items and Fines policy may result in suspension of library privileges. This policy outlines the rules regarding Lost Items and Fines. All patrons must adhere strictly to these guidelines to ensure fair access and safety. Failure to comply with the Lost Items and Fines policy may result in suspension of library privileges. This policy outlines the rules regarding Lost Items and Fines. All patrons must adhere strictly to these guidelines to ensure fair access and safety. Failure to comply with the Lost Items and Fines policy may result in suspension of library privileges. </w:t>
-      </w:r>
-    </w:p>
-    <w:p>
-      <w:r>
-        <w:br w:type="page"/>
+        <w:t>- Lost Declaration: An item is declared lost if overdue by 45 days or reported missing by the borrower.</w:t>
+        <w:br/>
+        <w:t>- Replacement Cost: Borrowers are charged the standard replacement cost of the book plus a .00 processing fee.</w:t>
+        <w:br/>
+        <w:t>- Damaged Materials: Books returned with water damage, highlighting, or missing pages will be billed at full replacement cost.</w:t>
       </w:r>
     </w:p>
     <w:p>
@@ -1747,283 +127,12 @@
       </w:r>
     </w:p>
     <w:p>
-      <w:pPr>
-        <w:pStyle w:val="Heading2"/>
-      </w:pPr>
       <w:r>
-        <w:t>Visitor Access - Part 1</w:t>
-      </w:r>
-    </w:p>
-    <w:p>
-      <w:r>
-        <w:t xml:space="preserve">This policy outlines the rules regarding Visitor Access. All patrons must adhere strictly to these guidelines to ensure fair access and safety. Failure to comply with the Visitor Access policy may result in suspension of library privileges. This policy outlines the rules regarding Visitor Access. All patrons must adhere strictly to these guidelines to ensure fair access and safety. Failure to comply with the Visitor Access policy may result in suspension of library privileges. This policy outlines the rules regarding Visitor Access. All patrons must adhere strictly to these guidelines to ensure fair access and safety. Failure to comply with the Visitor Access policy may result in suspension of library privileges. This policy outlines the rules regarding Visitor Access. All patrons must adhere strictly to these guidelines to ensure fair access and safety. Failure to comply with the Visitor Access policy may result in suspension of library privileges. This policy outlines the rules regarding Visitor Access. All patrons must adhere strictly to these guidelines to ensure fair access and safety. Failure to comply with the Visitor Access policy may result in suspension of library privileges. This policy outlines the rules regarding Visitor Access. All patrons must adhere strictly to these guidelines to ensure fair access and safety. Failure to comply with the Visitor Access policy may result in suspension of library privileges. </w:t>
-      </w:r>
-    </w:p>
-    <w:p>
-      <w:r>
-        <w:t xml:space="preserve">This policy outlines the rules regarding Visitor Access. All patrons must adhere strictly to these guidelines to ensure fair access and safety. Failure to comply with the Visitor Access policy may result in suspension of library privileges. This policy outlines the rules regarding Visitor Access. All patrons must adhere strictly to these guidelines to ensure fair access and safety. Failure to comply with the Visitor Access policy may result in suspension of library privileges. This policy outlines the rules regarding Visitor Access. All patrons must adhere strictly to these guidelines to ensure fair access and safety. Failure to comply with the Visitor Access policy may result in suspension of library privileges. This policy outlines the rules regarding Visitor Access. All patrons must adhere strictly to these guidelines to ensure fair access and safety. Failure to comply with the Visitor Access policy may result in suspension of library privileges. This policy outlines the rules regarding Visitor Access. All patrons must adhere strictly to these guidelines to ensure fair access and safety. Failure to comply with the Visitor Access policy may result in suspension of library privileges. This policy outlines the rules regarding Visitor Access. All patrons must adhere strictly to these guidelines to ensure fair access and safety. Failure to comply with the Visitor Access policy may result in suspension of library privileges. </w:t>
-      </w:r>
-    </w:p>
-    <w:p>
-      <w:r>
-        <w:t xml:space="preserve">This policy outlines the rules regarding Visitor Access. All patrons must adhere strictly to these guidelines to ensure fair access and safety. Failure to comply with the Visitor Access policy may result in suspension of library privileges. This policy outlines the rules regarding Visitor Access. All patrons must adhere strictly to these guidelines to ensure fair access and safety. Failure to comply with the Visitor Access policy may result in suspension of library privileges. This policy outlines the rules regarding Visitor Access. All patrons must adhere strictly to these guidelines to ensure fair access and safety. Failure to comply with the Visitor Access policy may result in suspension of library privileges. This policy outlines the rules regarding Visitor Access. All patrons must adhere strictly to these guidelines to ensure fair access and safety. Failure to comply with the Visitor Access policy may result in suspension of library privileges. This policy outlines the rules regarding Visitor Access. All patrons must adhere strictly to these guidelines to ensure fair access and safety. Failure to comply with the Visitor Access policy may result in suspension of library privileges. This policy outlines the rules regarding Visitor Access. All patrons must adhere strictly to these guidelines to ensure fair access and safety. Failure to comply with the Visitor Access policy may result in suspension of library privileges. </w:t>
-      </w:r>
-    </w:p>
-    <w:p>
-      <w:r>
-        <w:br w:type="page"/>
-      </w:r>
-    </w:p>
-    <w:p>
-      <w:pPr>
-        <w:pStyle w:val="Heading2"/>
-      </w:pPr>
-      <w:r>
-        <w:t>Visitor Access - Part 2</w:t>
-      </w:r>
-    </w:p>
-    <w:p>
-      <w:r>
-        <w:t xml:space="preserve">This policy outlines the rules regarding Visitor Access. All patrons must adhere strictly to these guidelines to ensure fair access and safety. Failure to comply with the Visitor Access policy may result in suspension of library privileges. This policy outlines the rules regarding Visitor Access. All patrons must adhere strictly to these guidelines to ensure fair access and safety. Failure to comply with the Visitor Access policy may result in suspension of library privileges. This policy outlines the rules regarding Visitor Access. All patrons must adhere strictly to these guidelines to ensure fair access and safety. Failure to comply with the Visitor Access policy may result in suspension of library privileges. This policy outlines the rules regarding Visitor Access. All patrons must adhere strictly to these guidelines to ensure fair access and safety. Failure to comply with the Visitor Access policy may result in suspension of library privileges. This policy outlines the rules regarding Visitor Access. All patrons must adhere strictly to these guidelines to ensure fair access and safety. Failure to comply with the Visitor Access policy may result in suspension of library privileges. This policy outlines the rules regarding Visitor Access. All patrons must adhere strictly to these guidelines to ensure fair access and safety. Failure to comply with the Visitor Access policy may result in suspension of library privileges. </w:t>
-      </w:r>
-    </w:p>
-    <w:p>
-      <w:r>
-        <w:t xml:space="preserve">This policy outlines the rules regarding Visitor Access. All patrons must adhere strictly to these guidelines to ensure fair access and safety. Failure to comply with the Visitor Access policy may result in suspension of library privileges. This policy outlines the rules regarding Visitor Access. All patrons must adhere strictly to these guidelines to ensure fair access and safety. Failure to comply with the Visitor Access policy may result in suspension of library privileges. This policy outlines the rules regarding Visitor Access. All patrons must adhere strictly to these guidelines to ensure fair access and safety. Failure to comply with the Visitor Access policy may result in suspension of library privileges. This policy outlines the rules regarding Visitor Access. All patrons must adhere strictly to these guidelines to ensure fair access and safety. Failure to comply with the Visitor Access policy may result in suspension of library privileges. This policy outlines the rules regarding Visitor Access. All patrons must adhere strictly to these guidelines to ensure fair access and safety. Failure to comply with the Visitor Access policy may result in suspension of library privileges. This policy outlines the rules regarding Visitor Access. All patrons must adhere strictly to these guidelines to ensure fair access and safety. Failure to comply with the Visitor Access policy may result in suspension of library privileges. </w:t>
-      </w:r>
-    </w:p>
-    <w:p>
-      <w:r>
-        <w:t xml:space="preserve">This policy outlines the rules regarding Visitor Access. All patrons must adhere strictly to these guidelines to ensure fair access and safety. Failure to comply with the Visitor Access policy may result in suspension of library privileges. This policy outlines the rules regarding Visitor Access. All patrons must adhere strictly to these guidelines to ensure fair access and safety. Failure to comply with the Visitor Access policy may result in suspension of library privileges. This policy outlines the rules regarding Visitor Access. All patrons must adhere strictly to these guidelines to ensure fair access and safety. Failure to comply with the Visitor Access policy may result in suspension of library privileges. This policy outlines the rules regarding Visitor Access. All patrons must adhere strictly to these guidelines to ensure fair access and safety. Failure to comply with the Visitor Access policy may result in suspension of library privileges. This policy outlines the rules regarding Visitor Access. All patrons must adhere strictly to these guidelines to ensure fair access and safety. Failure to comply with the Visitor Access policy may result in suspension of library privileges. This policy outlines the rules regarding Visitor Access. All patrons must adhere strictly to these guidelines to ensure fair access and safety. Failure to comply with the Visitor Access policy may result in suspension of library privileges. </w:t>
-      </w:r>
-    </w:p>
-    <w:p>
-      <w:r>
-        <w:br w:type="page"/>
-      </w:r>
-    </w:p>
-    <w:p>
-      <w:pPr>
-        <w:pStyle w:val="Heading2"/>
-      </w:pPr>
-      <w:r>
-        <w:t>Visitor Access - Part 3</w:t>
-      </w:r>
-    </w:p>
-    <w:p>
-      <w:r>
-        <w:t xml:space="preserve">This policy outlines the rules regarding Visitor Access. All patrons must adhere strictly to these guidelines to ensure fair access and safety. Failure to comply with the Visitor Access policy may result in suspension of library privileges. This policy outlines the rules regarding Visitor Access. All patrons must adhere strictly to these guidelines to ensure fair access and safety. Failure to comply with the Visitor Access policy may result in suspension of library privileges. This policy outlines the rules regarding Visitor Access. All patrons must adhere strictly to these guidelines to ensure fair access and safety. Failure to comply with the Visitor Access policy may result in suspension of library privileges. This policy outlines the rules regarding Visitor Access. All patrons must adhere strictly to these guidelines to ensure fair access and safety. Failure to comply with the Visitor Access policy may result in suspension of library privileges. This policy outlines the rules regarding Visitor Access. All patrons must adhere strictly to these guidelines to ensure fair access and safety. Failure to comply with the Visitor Access policy may result in suspension of library privileges. This policy outlines the rules regarding Visitor Access. All patrons must adhere strictly to these guidelines to ensure fair access and safety. Failure to comply with the Visitor Access policy may result in suspension of library privileges. </w:t>
-      </w:r>
-    </w:p>
-    <w:p>
-      <w:r>
-        <w:t xml:space="preserve">This policy outlines the rules regarding Visitor Access. All patrons must adhere strictly to these guidelines to ensure fair access and safety. Failure to comply with the Visitor Access policy may result in suspension of library privileges. This policy outlines the rules regarding Visitor Access. All patrons must adhere strictly to these guidelines to ensure fair access and safety. Failure to comply with the Visitor Access policy may result in suspension of library privileges. This policy outlines the rules regarding Visitor Access. All patrons must adhere strictly to these guidelines to ensure fair access and safety. Failure to comply with the Visitor Access policy may result in suspension of library privileges. This policy outlines the rules regarding Visitor Access. All patrons must adhere strictly to these guidelines to ensure fair access and safety. Failure to comply with the Visitor Access policy may result in suspension of library privileges. This policy outlines the rules regarding Visitor Access. All patrons must adhere strictly to these guidelines to ensure fair access and safety. Failure to comply with the Visitor Access policy may result in suspension of library privileges. This policy outlines the rules regarding Visitor Access. All patrons must adhere strictly to these guidelines to ensure fair access and safety. Failure to comply with the Visitor Access policy may result in suspension of library privileges. </w:t>
-      </w:r>
-    </w:p>
-    <w:p>
-      <w:r>
-        <w:t xml:space="preserve">This policy outlines the rules regarding Visitor Access. All patrons must adhere strictly to these guidelines to ensure fair access and safety. Failure to comply with the Visitor Access policy may result in suspension of library privileges. This policy outlines the rules regarding Visitor Access. All patrons must adhere strictly to these guidelines to ensure fair access and safety. Failure to comply with the Visitor Access policy may result in suspension of library privileges. This policy outlines the rules regarding Visitor Access. All patrons must adhere strictly to these guidelines to ensure fair access and safety. Failure to comply with the Visitor Access policy may result in suspension of library privileges. This policy outlines the rules regarding Visitor Access. All patrons must adhere strictly to these guidelines to ensure fair access and safety. Failure to comply with the Visitor Access policy may result in suspension of library privileges. This policy outlines the rules regarding Visitor Access. All patrons must adhere strictly to these guidelines to ensure fair access and safety. Failure to comply with the Visitor Access policy may result in suspension of library privileges. This policy outlines the rules regarding Visitor Access. All patrons must adhere strictly to these guidelines to ensure fair access and safety. Failure to comply with the Visitor Access policy may result in suspension of library privileges. </w:t>
-      </w:r>
-    </w:p>
-    <w:p>
-      <w:r>
-        <w:br w:type="page"/>
-      </w:r>
-    </w:p>
-    <w:p>
-      <w:pPr>
-        <w:pStyle w:val="Heading2"/>
-      </w:pPr>
-      <w:r>
-        <w:t>Visitor Access - Part 4</w:t>
-      </w:r>
-    </w:p>
-    <w:p>
-      <w:r>
-        <w:t xml:space="preserve">This policy outlines the rules regarding Visitor Access. All patrons must adhere strictly to these guidelines to ensure fair access and safety. Failure to comply with the Visitor Access policy may result in suspension of library privileges. This policy outlines the rules regarding Visitor Access. All patrons must adhere strictly to these guidelines to ensure fair access and safety. Failure to comply with the Visitor Access policy may result in suspension of library privileges. This policy outlines the rules regarding Visitor Access. All patrons must adhere strictly to these guidelines to ensure fair access and safety. Failure to comply with the Visitor Access policy may result in suspension of library privileges. This policy outlines the rules regarding Visitor Access. All patrons must adhere strictly to these guidelines to ensure fair access and safety. Failure to comply with the Visitor Access policy may result in suspension of library privileges. This policy outlines the rules regarding Visitor Access. All patrons must adhere strictly to these guidelines to ensure fair access and safety. Failure to comply with the Visitor Access policy may result in suspension of library privileges. This policy outlines the rules regarding Visitor Access. All patrons must adhere strictly to these guidelines to ensure fair access and safety. Failure to comply with the Visitor Access policy may result in suspension of library privileges. </w:t>
-      </w:r>
-    </w:p>
-    <w:p>
-      <w:r>
-        <w:t xml:space="preserve">This policy outlines the rules regarding Visitor Access. All patrons must adhere strictly to these guidelines to ensure fair access and safety. Failure to comply with the Visitor Access policy may result in suspension of library privileges. This policy outlines the rules regarding Visitor Access. All patrons must adhere strictly to these guidelines to ensure fair access and safety. Failure to comply with the Visitor Access policy may result in suspension of library privileges. This policy outlines the rules regarding Visitor Access. All patrons must adhere strictly to these guidelines to ensure fair access and safety. Failure to comply with the Visitor Access policy may result in suspension of library privileges. This policy outlines the rules regarding Visitor Access. All patrons must adhere strictly to these guidelines to ensure fair access and safety. Failure to comply with the Visitor Access policy may result in suspension of library privileges. This policy outlines the rules regarding Visitor Access. All patrons must adhere strictly to these guidelines to ensure fair access and safety. Failure to comply with the Visitor Access policy may result in suspension of library privileges. This policy outlines the rules regarding Visitor Access. All patrons must adhere strictly to these guidelines to ensure fair access and safety. Failure to comply with the Visitor Access policy may result in suspension of library privileges. </w:t>
-      </w:r>
-    </w:p>
-    <w:p>
-      <w:r>
-        <w:t xml:space="preserve">This policy outlines the rules regarding Visitor Access. All patrons must adhere strictly to these guidelines to ensure fair access and safety. Failure to comply with the Visitor Access policy may result in suspension of library privileges. This policy outlines the rules regarding Visitor Access. All patrons must adhere strictly to these guidelines to ensure fair access and safety. Failure to comply with the Visitor Access policy may result in suspension of library privileges. This policy outlines the rules regarding Visitor Access. All patrons must adhere strictly to these guidelines to ensure fair access and safety. Failure to comply with the Visitor Access policy may result in suspension of library privileges. This policy outlines the rules regarding Visitor Access. All patrons must adhere strictly to these guidelines to ensure fair access and safety. Failure to comply with the Visitor Access policy may result in suspension of library privileges. This policy outlines the rules regarding Visitor Access. All patrons must adhere strictly to these guidelines to ensure fair access and safety. Failure to comply with the Visitor Access policy may result in suspension of library privileges. This policy outlines the rules regarding Visitor Access. All patrons must adhere strictly to these guidelines to ensure fair access and safety. Failure to comply with the Visitor Access policy may result in suspension of library privileges. </w:t>
-      </w:r>
-    </w:p>
-    <w:p>
-      <w:r>
-        <w:br w:type="page"/>
-      </w:r>
-    </w:p>
-    <w:p>
-      <w:pPr>
-        <w:pStyle w:val="Heading2"/>
-      </w:pPr>
-      <w:r>
-        <w:t>Visitor Access - Part 5</w:t>
-      </w:r>
-    </w:p>
-    <w:p>
-      <w:r>
-        <w:t xml:space="preserve">This policy outlines the rules regarding Visitor Access. All patrons must adhere strictly to these guidelines to ensure fair access and safety. Failure to comply with the Visitor Access policy may result in suspension of library privileges. This policy outlines the rules regarding Visitor Access. All patrons must adhere strictly to these guidelines to ensure fair access and safety. Failure to comply with the Visitor Access policy may result in suspension of library privileges. This policy outlines the rules regarding Visitor Access. All patrons must adhere strictly to these guidelines to ensure fair access and safety. Failure to comply with the Visitor Access policy may result in suspension of library privileges. This policy outlines the rules regarding Visitor Access. All patrons must adhere strictly to these guidelines to ensure fair access and safety. Failure to comply with the Visitor Access policy may result in suspension of library privileges. This policy outlines the rules regarding Visitor Access. All patrons must adhere strictly to these guidelines to ensure fair access and safety. Failure to comply with the Visitor Access policy may result in suspension of library privileges. This policy outlines the rules regarding Visitor Access. All patrons must adhere strictly to these guidelines to ensure fair access and safety. Failure to comply with the Visitor Access policy may result in suspension of library privileges. </w:t>
-      </w:r>
-    </w:p>
-    <w:p>
-      <w:r>
-        <w:t xml:space="preserve">This policy outlines the rules regarding Visitor Access. All patrons must adhere strictly to these guidelines to ensure fair access and safety. Failure to comply with the Visitor Access policy may result in suspension of library privileges. This policy outlines the rules regarding Visitor Access. All patrons must adhere strictly to these guidelines to ensure fair access and safety. Failure to comply with the Visitor Access policy may result in suspension of library privileges. This policy outlines the rules regarding Visitor Access. All patrons must adhere strictly to these guidelines to ensure fair access and safety. Failure to comply with the Visitor Access policy may result in suspension of library privileges. This policy outlines the rules regarding Visitor Access. All patrons must adhere strictly to these guidelines to ensure fair access and safety. Failure to comply with the Visitor Access policy may result in suspension of library privileges. This policy outlines the rules regarding Visitor Access. All patrons must adhere strictly to these guidelines to ensure fair access and safety. Failure to comply with the Visitor Access policy may result in suspension of library privileges. This policy outlines the rules regarding Visitor Access. All patrons must adhere strictly to these guidelines to ensure fair access and safety. Failure to comply with the Visitor Access policy may result in suspension of library privileges. </w:t>
-      </w:r>
-    </w:p>
-    <w:p>
-      <w:r>
-        <w:t xml:space="preserve">This policy outlines the rules regarding Visitor Access. All patrons must adhere strictly to these guidelines to ensure fair access and safety. Failure to comply with the Visitor Access policy may result in suspension of library privileges. This policy outlines the rules regarding Visitor Access. All patrons must adhere strictly to these guidelines to ensure fair access and safety. Failure to comply with the Visitor Access policy may result in suspension of library privileges. This policy outlines the rules regarding Visitor Access. All patrons must adhere strictly to these guidelines to ensure fair access and safety. Failure to comply with the Visitor Access policy may result in suspension of library privileges. This policy outlines the rules regarding Visitor Access. All patrons must adhere strictly to these guidelines to ensure fair access and safety. Failure to comply with the Visitor Access policy may result in suspension of library privileges. This policy outlines the rules regarding Visitor Access. All patrons must adhere strictly to these guidelines to ensure fair access and safety. Failure to comply with the Visitor Access policy may result in suspension of library privileges. This policy outlines the rules regarding Visitor Access. All patrons must adhere strictly to these guidelines to ensure fair access and safety. Failure to comply with the Visitor Access policy may result in suspension of library privileges. </w:t>
-      </w:r>
-    </w:p>
-    <w:p>
-      <w:r>
-        <w:br w:type="page"/>
-      </w:r>
-    </w:p>
-    <w:p>
-      <w:pPr>
-        <w:pStyle w:val="Heading2"/>
-      </w:pPr>
-      <w:r>
-        <w:t>Visitor Access - Part 6</w:t>
-      </w:r>
-    </w:p>
-    <w:p>
-      <w:r>
-        <w:t xml:space="preserve">This policy outlines the rules regarding Visitor Access. All patrons must adhere strictly to these guidelines to ensure fair access and safety. Failure to comply with the Visitor Access policy may result in suspension of library privileges. This policy outlines the rules regarding Visitor Access. All patrons must adhere strictly to these guidelines to ensure fair access and safety. Failure to comply with the Visitor Access policy may result in suspension of library privileges. This policy outlines the rules regarding Visitor Access. All patrons must adhere strictly to these guidelines to ensure fair access and safety. Failure to comply with the Visitor Access policy may result in suspension of library privileges. This policy outlines the rules regarding Visitor Access. All patrons must adhere strictly to these guidelines to ensure fair access and safety. Failure to comply with the Visitor Access policy may result in suspension of library privileges. This policy outlines the rules regarding Visitor Access. All patrons must adhere strictly to these guidelines to ensure fair access and safety. Failure to comply with the Visitor Access policy may result in suspension of library privileges. This policy outlines the rules regarding Visitor Access. All patrons must adhere strictly to these guidelines to ensure fair access and safety. Failure to comply with the Visitor Access policy may result in suspension of library privileges. </w:t>
-      </w:r>
-    </w:p>
-    <w:p>
-      <w:r>
-        <w:t xml:space="preserve">This policy outlines the rules regarding Visitor Access. All patrons must adhere strictly to these guidelines to ensure fair access and safety. Failure to comply with the Visitor Access policy may result in suspension of library privileges. This policy outlines the rules regarding Visitor Access. All patrons must adhere strictly to these guidelines to ensure fair access and safety. Failure to comply with the Visitor Access policy may result in suspension of library privileges. This policy outlines the rules regarding Visitor Access. All patrons must adhere strictly to these guidelines to ensure fair access and safety. Failure to comply with the Visitor Access policy may result in suspension of library privileges. This policy outlines the rules regarding Visitor Access. All patrons must adhere strictly to these guidelines to ensure fair access and safety. Failure to comply with the Visitor Access policy may result in suspension of library privileges. This policy outlines the rules regarding Visitor Access. All patrons must adhere strictly to these guidelines to ensure fair access and safety. Failure to comply with the Visitor Access policy may result in suspension of library privileges. This policy outlines the rules regarding Visitor Access. All patrons must adhere strictly to these guidelines to ensure fair access and safety. Failure to comply with the Visitor Access policy may result in suspension of library privileges. </w:t>
-      </w:r>
-    </w:p>
-    <w:p>
-      <w:r>
-        <w:t xml:space="preserve">This policy outlines the rules regarding Visitor Access. All patrons must adhere strictly to these guidelines to ensure fair access and safety. Failure to comply with the Visitor Access policy may result in suspension of library privileges. This policy outlines the rules regarding Visitor Access. All patrons must adhere strictly to these guidelines to ensure fair access and safety. Failure to comply with the Visitor Access policy may result in suspension of library privileges. This policy outlines the rules regarding Visitor Access. All patrons must adhere strictly to these guidelines to ensure fair access and safety. Failure to comply with the Visitor Access policy may result in suspension of library privileges. This policy outlines the rules regarding Visitor Access. All patrons must adhere strictly to these guidelines to ensure fair access and safety. Failure to comply with the Visitor Access policy may result in suspension of library privileges. This policy outlines the rules regarding Visitor Access. All patrons must adhere strictly to these guidelines to ensure fair access and safety. Failure to comply with the Visitor Access policy may result in suspension of library privileges. This policy outlines the rules regarding Visitor Access. All patrons must adhere strictly to these guidelines to ensure fair access and safety. Failure to comply with the Visitor Access policy may result in suspension of library privileges. </w:t>
-      </w:r>
-    </w:p>
-    <w:p>
-      <w:r>
-        <w:br w:type="page"/>
-      </w:r>
-    </w:p>
-    <w:p>
-      <w:pPr>
-        <w:pStyle w:val="Heading2"/>
-      </w:pPr>
-      <w:r>
-        <w:t>Visitor Access - Part 7</w:t>
-      </w:r>
-    </w:p>
-    <w:p>
-      <w:r>
-        <w:t xml:space="preserve">This policy outlines the rules regarding Visitor Access. All patrons must adhere strictly to these guidelines to ensure fair access and safety. Failure to comply with the Visitor Access policy may result in suspension of library privileges. This policy outlines the rules regarding Visitor Access. All patrons must adhere strictly to these guidelines to ensure fair access and safety. Failure to comply with the Visitor Access policy may result in suspension of library privileges. This policy outlines the rules regarding Visitor Access. All patrons must adhere strictly to these guidelines to ensure fair access and safety. Failure to comply with the Visitor Access policy may result in suspension of library privileges. This policy outlines the rules regarding Visitor Access. All patrons must adhere strictly to these guidelines to ensure fair access and safety. Failure to comply with the Visitor Access policy may result in suspension of library privileges. This policy outlines the rules regarding Visitor Access. All patrons must adhere strictly to these guidelines to ensure fair access and safety. Failure to comply with the Visitor Access policy may result in suspension of library privileges. This policy outlines the rules regarding Visitor Access. All patrons must adhere strictly to these guidelines to ensure fair access and safety. Failure to comply with the Visitor Access policy may result in suspension of library privileges. </w:t>
-      </w:r>
-    </w:p>
-    <w:p>
-      <w:r>
-        <w:t xml:space="preserve">This policy outlines the rules regarding Visitor Access. All patrons must adhere strictly to these guidelines to ensure fair access and safety. Failure to comply with the Visitor Access policy may result in suspension of library privileges. This policy outlines the rules regarding Visitor Access. All patrons must adhere strictly to these guidelines to ensure fair access and safety. Failure to comply with the Visitor Access policy may result in suspension of library privileges. This policy outlines the rules regarding Visitor Access. All patrons must adhere strictly to these guidelines to ensure fair access and safety. Failure to comply with the Visitor Access policy may result in suspension of library privileges. This policy outlines the rules regarding Visitor Access. All patrons must adhere strictly to these guidelines to ensure fair access and safety. Failure to comply with the Visitor Access policy may result in suspension of library privileges. This policy outlines the rules regarding Visitor Access. All patrons must adhere strictly to these guidelines to ensure fair access and safety. Failure to comply with the Visitor Access policy may result in suspension of library privileges. This policy outlines the rules regarding Visitor Access. All patrons must adhere strictly to these guidelines to ensure fair access and safety. Failure to comply with the Visitor Access policy may result in suspension of library privileges. </w:t>
-      </w:r>
-    </w:p>
-    <w:p>
-      <w:r>
-        <w:t xml:space="preserve">This policy outlines the rules regarding Visitor Access. All patrons must adhere strictly to these guidelines to ensure fair access and safety. Failure to comply with the Visitor Access policy may result in suspension of library privileges. This policy outlines the rules regarding Visitor Access. All patrons must adhere strictly to these guidelines to ensure fair access and safety. Failure to comply with the Visitor Access policy may result in suspension of library privileges. This policy outlines the rules regarding Visitor Access. All patrons must adhere strictly to these guidelines to ensure fair access and safety. Failure to comply with the Visitor Access policy may result in suspension of library privileges. This policy outlines the rules regarding Visitor Access. All patrons must adhere strictly to these guidelines to ensure fair access and safety. Failure to comply with the Visitor Access policy may result in suspension of library privileges. This policy outlines the rules regarding Visitor Access. All patrons must adhere strictly to these guidelines to ensure fair access and safety. Failure to comply with the Visitor Access policy may result in suspension of library privileges. This policy outlines the rules regarding Visitor Access. All patrons must adhere strictly to these guidelines to ensure fair access and safety. Failure to comply with the Visitor Access policy may result in suspension of library privileges. </w:t>
-      </w:r>
-    </w:p>
-    <w:p>
-      <w:r>
-        <w:br w:type="page"/>
-      </w:r>
-    </w:p>
-    <w:p>
-      <w:pPr>
-        <w:pStyle w:val="Heading2"/>
-      </w:pPr>
-      <w:r>
-        <w:t>Visitor Access - Part 8</w:t>
-      </w:r>
-    </w:p>
-    <w:p>
-      <w:r>
-        <w:t xml:space="preserve">This policy outlines the rules regarding Visitor Access. All patrons must adhere strictly to these guidelines to ensure fair access and safety. Failure to comply with the Visitor Access policy may result in suspension of library privileges. This policy outlines the rules regarding Visitor Access. All patrons must adhere strictly to these guidelines to ensure fair access and safety. Failure to comply with the Visitor Access policy may result in suspension of library privileges. This policy outlines the rules regarding Visitor Access. All patrons must adhere strictly to these guidelines to ensure fair access and safety. Failure to comply with the Visitor Access policy may result in suspension of library privileges. This policy outlines the rules regarding Visitor Access. All patrons must adhere strictly to these guidelines to ensure fair access and safety. Failure to comply with the Visitor Access policy may result in suspension of library privileges. This policy outlines the rules regarding Visitor Access. All patrons must adhere strictly to these guidelines to ensure fair access and safety. Failure to comply with the Visitor Access policy may result in suspension of library privileges. This policy outlines the rules regarding Visitor Access. All patrons must adhere strictly to these guidelines to ensure fair access and safety. Failure to comply with the Visitor Access policy may result in suspension of library privileges. </w:t>
-      </w:r>
-    </w:p>
-    <w:p>
-      <w:r>
-        <w:t xml:space="preserve">This policy outlines the rules regarding Visitor Access. All patrons must adhere strictly to these guidelines to ensure fair access and safety. Failure to comply with the Visitor Access policy may result in suspension of library privileges. This policy outlines the rules regarding Visitor Access. All patrons must adhere strictly to these guidelines to ensure fair access and safety. Failure to comply with the Visitor Access policy may result in suspension of library privileges. This policy outlines the rules regarding Visitor Access. All patrons must adhere strictly to these guidelines to ensure fair access and safety. Failure to comply with the Visitor Access policy may result in suspension of library privileges. This policy outlines the rules regarding Visitor Access. All patrons must adhere strictly to these guidelines to ensure fair access and safety. Failure to comply with the Visitor Access policy may result in suspension of library privileges. This policy outlines the rules regarding Visitor Access. All patrons must adhere strictly to these guidelines to ensure fair access and safety. Failure to comply with the Visitor Access policy may result in suspension of library privileges. This policy outlines the rules regarding Visitor Access. All patrons must adhere strictly to these guidelines to ensure fair access and safety. Failure to comply with the Visitor Access policy may result in suspension of library privileges. </w:t>
-      </w:r>
-    </w:p>
-    <w:p>
-      <w:r>
-        <w:t xml:space="preserve">This policy outlines the rules regarding Visitor Access. All patrons must adhere strictly to these guidelines to ensure fair access and safety. Failure to comply with the Visitor Access policy may result in suspension of library privileges. This policy outlines the rules regarding Visitor Access. All patrons must adhere strictly to these guidelines to ensure fair access and safety. Failure to comply with the Visitor Access policy may result in suspension of library privileges. This policy outlines the rules regarding Visitor Access. All patrons must adhere strictly to these guidelines to ensure fair access and safety. Failure to comply with the Visitor Access policy may result in suspension of library privileges. This policy outlines the rules regarding Visitor Access. All patrons must adhere strictly to these guidelines to ensure fair access and safety. Failure to comply with the Visitor Access policy may result in suspension of library privileges. This policy outlines the rules regarding Visitor Access. All patrons must adhere strictly to these guidelines to ensure fair access and safety. Failure to comply with the Visitor Access policy may result in suspension of library privileges. This policy outlines the rules regarding Visitor Access. All patrons must adhere strictly to these guidelines to ensure fair access and safety. Failure to comply with the Visitor Access policy may result in suspension of library privileges. </w:t>
-      </w:r>
-    </w:p>
-    <w:p>
-      <w:r>
-        <w:br w:type="page"/>
-      </w:r>
-    </w:p>
-    <w:p>
-      <w:pPr>
-        <w:pStyle w:val="Heading2"/>
-      </w:pPr>
-      <w:r>
-        <w:t>Visitor Access - Part 9</w:t>
-      </w:r>
-    </w:p>
-    <w:p>
-      <w:r>
-        <w:t xml:space="preserve">This policy outlines the rules regarding Visitor Access. All patrons must adhere strictly to these guidelines to ensure fair access and safety. Failure to comply with the Visitor Access policy may result in suspension of library privileges. This policy outlines the rules regarding Visitor Access. All patrons must adhere strictly to these guidelines to ensure fair access and safety. Failure to comply with the Visitor Access policy may result in suspension of library privileges. This policy outlines the rules regarding Visitor Access. All patrons must adhere strictly to these guidelines to ensure fair access and safety. Failure to comply with the Visitor Access policy may result in suspension of library privileges. This policy outlines the rules regarding Visitor Access. All patrons must adhere strictly to these guidelines to ensure fair access and safety. Failure to comply with the Visitor Access policy may result in suspension of library privileges. This policy outlines the rules regarding Visitor Access. All patrons must adhere strictly to these guidelines to ensure fair access and safety. Failure to comply with the Visitor Access policy may result in suspension of library privileges. This policy outlines the rules regarding Visitor Access. All patrons must adhere strictly to these guidelines to ensure fair access and safety. Failure to comply with the Visitor Access policy may result in suspension of library privileges. </w:t>
-      </w:r>
-    </w:p>
-    <w:p>
-      <w:r>
-        <w:t xml:space="preserve">This policy outlines the rules regarding Visitor Access. All patrons must adhere strictly to these guidelines to ensure fair access and safety. Failure to comply with the Visitor Access policy may result in suspension of library privileges. This policy outlines the rules regarding Visitor Access. All patrons must adhere strictly to these guidelines to ensure fair access and safety. Failure to comply with the Visitor Access policy may result in suspension of library privileges. This policy outlines the rules regarding Visitor Access. All patrons must adhere strictly to these guidelines to ensure fair access and safety. Failure to comply with the Visitor Access policy may result in suspension of library privileges. This policy outlines the rules regarding Visitor Access. All patrons must adhere strictly to these guidelines to ensure fair access and safety. Failure to comply with the Visitor Access policy may result in suspension of library privileges. This policy outlines the rules regarding Visitor Access. All patrons must adhere strictly to these guidelines to ensure fair access and safety. Failure to comply with the Visitor Access policy may result in suspension of library privileges. This policy outlines the rules regarding Visitor Access. All patrons must adhere strictly to these guidelines to ensure fair access and safety. Failure to comply with the Visitor Access policy may result in suspension of library privileges. </w:t>
-      </w:r>
-    </w:p>
-    <w:p>
-      <w:r>
-        <w:t xml:space="preserve">This policy outlines the rules regarding Visitor Access. All patrons must adhere strictly to these guidelines to ensure fair access and safety. Failure to comply with the Visitor Access policy may result in suspension of library privileges. This policy outlines the rules regarding Visitor Access. All patrons must adhere strictly to these guidelines to ensure fair access and safety. Failure to comply with the Visitor Access policy may result in suspension of library privileges. This policy outlines the rules regarding Visitor Access. All patrons must adhere strictly to these guidelines to ensure fair access and safety. Failure to comply with the Visitor Access policy may result in suspension of library privileges. This policy outlines the rules regarding Visitor Access. All patrons must adhere strictly to these guidelines to ensure fair access and safety. Failure to comply with the Visitor Access policy may result in suspension of library privileges. This policy outlines the rules regarding Visitor Access. All patrons must adhere strictly to these guidelines to ensure fair access and safety. Failure to comply with the Visitor Access policy may result in suspension of library privileges. This policy outlines the rules regarding Visitor Access. All patrons must adhere strictly to these guidelines to ensure fair access and safety. Failure to comply with the Visitor Access policy may result in suspension of library privileges. </w:t>
-      </w:r>
-    </w:p>
-    <w:p>
-      <w:r>
-        <w:br w:type="page"/>
-      </w:r>
-    </w:p>
-    <w:p>
-      <w:pPr>
-        <w:pStyle w:val="Heading2"/>
-      </w:pPr>
-      <w:r>
-        <w:t>Visitor Access - Part 10</w:t>
-      </w:r>
-    </w:p>
-    <w:p>
-      <w:r>
-        <w:t xml:space="preserve">This policy outlines the rules regarding Visitor Access. All patrons must adhere strictly to these guidelines to ensure fair access and safety. Failure to comply with the Visitor Access policy may result in suspension of library privileges. This policy outlines the rules regarding Visitor Access. All patrons must adhere strictly to these guidelines to ensure fair access and safety. Failure to comply with the Visitor Access policy may result in suspension of library privileges. This policy outlines the rules regarding Visitor Access. All patrons must adhere strictly to these guidelines to ensure fair access and safety. Failure to comply with the Visitor Access policy may result in suspension of library privileges. This policy outlines the rules regarding Visitor Access. All patrons must adhere strictly to these guidelines to ensure fair access and safety. Failure to comply with the Visitor Access policy may result in suspension of library privileges. This policy outlines the rules regarding Visitor Access. All patrons must adhere strictly to these guidelines to ensure fair access and safety. Failure to comply with the Visitor Access policy may result in suspension of library privileges. This policy outlines the rules regarding Visitor Access. All patrons must adhere strictly to these guidelines to ensure fair access and safety. Failure to comply with the Visitor Access policy may result in suspension of library privileges. </w:t>
-      </w:r>
-    </w:p>
-    <w:p>
-      <w:r>
-        <w:t xml:space="preserve">This policy outlines the rules regarding Visitor Access. All patrons must adhere strictly to these guidelines to ensure fair access and safety. Failure to comply with the Visitor Access policy may result in suspension of library privileges. This policy outlines the rules regarding Visitor Access. All patrons must adhere strictly to these guidelines to ensure fair access and safety. Failure to comply with the Visitor Access policy may result in suspension of library privileges. This policy outlines the rules regarding Visitor Access. All patrons must adhere strictly to these guidelines to ensure fair access and safety. Failure to comply with the Visitor Access policy may result in suspension of library privileges. This policy outlines the rules regarding Visitor Access. All patrons must adhere strictly to these guidelines to ensure fair access and safety. Failure to comply with the Visitor Access policy may result in suspension of library privileges. This policy outlines the rules regarding Visitor Access. All patrons must adhere strictly to these guidelines to ensure fair access and safety. Failure to comply with the Visitor Access policy may result in suspension of library privileges. This policy outlines the rules regarding Visitor Access. All patrons must adhere strictly to these guidelines to ensure fair access and safety. Failure to comply with the Visitor Access policy may result in suspension of library privileges. </w:t>
-      </w:r>
-    </w:p>
-    <w:p>
-      <w:r>
-        <w:t xml:space="preserve">This policy outlines the rules regarding Visitor Access. All patrons must adhere strictly to these guidelines to ensure fair access and safety. Failure to comply with the Visitor Access policy may result in suspension of library privileges. This policy outlines the rules regarding Visitor Access. All patrons must adhere strictly to these guidelines to ensure fair access and safety. Failure to comply with the Visitor Access policy may result in suspension of library privileges. This policy outlines the rules regarding Visitor Access. All patrons must adhere strictly to these guidelines to ensure fair access and safety. Failure to comply with the Visitor Access policy may result in suspension of library privileges. This policy outlines the rules regarding Visitor Access. All patrons must adhere strictly to these guidelines to ensure fair access and safety. Failure to comply with the Visitor Access policy may result in suspension of library privileges. This policy outlines the rules regarding Visitor Access. All patrons must adhere strictly to these guidelines to ensure fair access and safety. Failure to comply with the Visitor Access policy may result in suspension of library privileges. This policy outlines the rules regarding Visitor Access. All patrons must adhere strictly to these guidelines to ensure fair access and safety. Failure to comply with the Visitor Access policy may result in suspension of library privileges. </w:t>
-      </w:r>
-    </w:p>
-    <w:p>
-      <w:r>
-        <w:br w:type="page"/>
+        <w:t>- Visitor Passes: External researchers and visitors may obtain a 1-day guest pass at the Information Desk by showing photo ID.</w:t>
+        <w:br/>
+        <w:t>- Access Hours: Visitor access is limited to Monday through Friday, 9:00 AM to 5:00 PM.</w:t>
+        <w:br/>
+        <w:t>- Computer Access: Guests receive limited internet access; subscription database access is restricted to campus network terminals.</w:t>
       </w:r>
     </w:p>
     <w:p>
@@ -2035,283 +144,12 @@
       </w:r>
     </w:p>
     <w:p>
-      <w:pPr>
-        <w:pStyle w:val="Heading2"/>
-      </w:pPr>
       <w:r>
-        <w:t>Donations - Part 1</w:t>
-      </w:r>
-    </w:p>
-    <w:p>
-      <w:r>
-        <w:t xml:space="preserve">This policy outlines the rules regarding Donations. All patrons must adhere strictly to these guidelines to ensure fair access and safety. Failure to comply with the Donations policy may result in suspension of library privileges. This policy outlines the rules regarding Donations. All patrons must adhere strictly to these guidelines to ensure fair access and safety. Failure to comply with the Donations policy may result in suspension of library privileges. This policy outlines the rules regarding Donations. All patrons must adhere strictly to these guidelines to ensure fair access and safety. Failure to comply with the Donations policy may result in suspension of library privileges. This policy outlines the rules regarding Donations. All patrons must adhere strictly to these guidelines to ensure fair access and safety. Failure to comply with the Donations policy may result in suspension of library privileges. This policy outlines the rules regarding Donations. All patrons must adhere strictly to these guidelines to ensure fair access and safety. Failure to comply with the Donations policy may result in suspension of library privileges. This policy outlines the rules regarding Donations. All patrons must adhere strictly to these guidelines to ensure fair access and safety. Failure to comply with the Donations policy may result in suspension of library privileges. </w:t>
-      </w:r>
-    </w:p>
-    <w:p>
-      <w:r>
-        <w:t xml:space="preserve">This policy outlines the rules regarding Donations. All patrons must adhere strictly to these guidelines to ensure fair access and safety. Failure to comply with the Donations policy may result in suspension of library privileges. This policy outlines the rules regarding Donations. All patrons must adhere strictly to these guidelines to ensure fair access and safety. Failure to comply with the Donations policy may result in suspension of library privileges. This policy outlines the rules regarding Donations. All patrons must adhere strictly to these guidelines to ensure fair access and safety. Failure to comply with the Donations policy may result in suspension of library privileges. This policy outlines the rules regarding Donations. All patrons must adhere strictly to these guidelines to ensure fair access and safety. Failure to comply with the Donations policy may result in suspension of library privileges. This policy outlines the rules regarding Donations. All patrons must adhere strictly to these guidelines to ensure fair access and safety. Failure to comply with the Donations policy may result in suspension of library privileges. This policy outlines the rules regarding Donations. All patrons must adhere strictly to these guidelines to ensure fair access and safety. Failure to comply with the Donations policy may result in suspension of library privileges. </w:t>
-      </w:r>
-    </w:p>
-    <w:p>
-      <w:r>
-        <w:t xml:space="preserve">This policy outlines the rules regarding Donations. All patrons must adhere strictly to these guidelines to ensure fair access and safety. Failure to comply with the Donations policy may result in suspension of library privileges. This policy outlines the rules regarding Donations. All patrons must adhere strictly to these guidelines to ensure fair access and safety. Failure to comply with the Donations policy may result in suspension of library privileges. This policy outlines the rules regarding Donations. All patrons must adhere strictly to these guidelines to ensure fair access and safety. Failure to comply with the Donations policy may result in suspension of library privileges. This policy outlines the rules regarding Donations. All patrons must adhere strictly to these guidelines to ensure fair access and safety. Failure to comply with the Donations policy may result in suspension of library privileges. This policy outlines the rules regarding Donations. All patrons must adhere strictly to these guidelines to ensure fair access and safety. Failure to comply with the Donations policy may result in suspension of library privileges. This policy outlines the rules regarding Donations. All patrons must adhere strictly to these guidelines to ensure fair access and safety. Failure to comply with the Donations policy may result in suspension of library privileges. </w:t>
-      </w:r>
-    </w:p>
-    <w:p>
-      <w:r>
-        <w:br w:type="page"/>
-      </w:r>
-    </w:p>
-    <w:p>
-      <w:pPr>
-        <w:pStyle w:val="Heading2"/>
-      </w:pPr>
-      <w:r>
-        <w:t>Donations - Part 2</w:t>
-      </w:r>
-    </w:p>
-    <w:p>
-      <w:r>
-        <w:t xml:space="preserve">This policy outlines the rules regarding Donations. All patrons must adhere strictly to these guidelines to ensure fair access and safety. Failure to comply with the Donations policy may result in suspension of library privileges. This policy outlines the rules regarding Donations. All patrons must adhere strictly to these guidelines to ensure fair access and safety. Failure to comply with the Donations policy may result in suspension of library privileges. This policy outlines the rules regarding Donations. All patrons must adhere strictly to these guidelines to ensure fair access and safety. Failure to comply with the Donations policy may result in suspension of library privileges. This policy outlines the rules regarding Donations. All patrons must adhere strictly to these guidelines to ensure fair access and safety. Failure to comply with the Donations policy may result in suspension of library privileges. This policy outlines the rules regarding Donations. All patrons must adhere strictly to these guidelines to ensure fair access and safety. Failure to comply with the Donations policy may result in suspension of library privileges. This policy outlines the rules regarding Donations. All patrons must adhere strictly to these guidelines to ensure fair access and safety. Failure to comply with the Donations policy may result in suspension of library privileges. </w:t>
-      </w:r>
-    </w:p>
-    <w:p>
-      <w:r>
-        <w:t xml:space="preserve">This policy outlines the rules regarding Donations. All patrons must adhere strictly to these guidelines to ensure fair access and safety. Failure to comply with the Donations policy may result in suspension of library privileges. This policy outlines the rules regarding Donations. All patrons must adhere strictly to these guidelines to ensure fair access and safety. Failure to comply with the Donations policy may result in suspension of library privileges. This policy outlines the rules regarding Donations. All patrons must adhere strictly to these guidelines to ensure fair access and safety. Failure to comply with the Donations policy may result in suspension of library privileges. This policy outlines the rules regarding Donations. All patrons must adhere strictly to these guidelines to ensure fair access and safety. Failure to comply with the Donations policy may result in suspension of library privileges. This policy outlines the rules regarding Donations. All patrons must adhere strictly to these guidelines to ensure fair access and safety. Failure to comply with the Donations policy may result in suspension of library privileges. This policy outlines the rules regarding Donations. All patrons must adhere strictly to these guidelines to ensure fair access and safety. Failure to comply with the Donations policy may result in suspension of library privileges. </w:t>
-      </w:r>
-    </w:p>
-    <w:p>
-      <w:r>
-        <w:t xml:space="preserve">This policy outlines the rules regarding Donations. All patrons must adhere strictly to these guidelines to ensure fair access and safety. Failure to comply with the Donations policy may result in suspension of library privileges. This policy outlines the rules regarding Donations. All patrons must adhere strictly to these guidelines to ensure fair access and safety. Failure to comply with the Donations policy may result in suspension of library privileges. This policy outlines the rules regarding Donations. All patrons must adhere strictly to these guidelines to ensure fair access and safety. Failure to comply with the Donations policy may result in suspension of library privileges. This policy outlines the rules regarding Donations. All patrons must adhere strictly to these guidelines to ensure fair access and safety. Failure to comply with the Donations policy may result in suspension of library privileges. This policy outlines the rules regarding Donations. All patrons must adhere strictly to these guidelines to ensure fair access and safety. Failure to comply with the Donations policy may result in suspension of library privileges. This policy outlines the rules regarding Donations. All patrons must adhere strictly to these guidelines to ensure fair access and safety. Failure to comply with the Donations policy may result in suspension of library privileges. </w:t>
-      </w:r>
-    </w:p>
-    <w:p>
-      <w:r>
-        <w:br w:type="page"/>
-      </w:r>
-    </w:p>
-    <w:p>
-      <w:pPr>
-        <w:pStyle w:val="Heading2"/>
-      </w:pPr>
-      <w:r>
-        <w:t>Donations - Part 3</w:t>
-      </w:r>
-    </w:p>
-    <w:p>
-      <w:r>
-        <w:t xml:space="preserve">This policy outlines the rules regarding Donations. All patrons must adhere strictly to these guidelines to ensure fair access and safety. Failure to comply with the Donations policy may result in suspension of library privileges. This policy outlines the rules regarding Donations. All patrons must adhere strictly to these guidelines to ensure fair access and safety. Failure to comply with the Donations policy may result in suspension of library privileges. This policy outlines the rules regarding Donations. All patrons must adhere strictly to these guidelines to ensure fair access and safety. Failure to comply with the Donations policy may result in suspension of library privileges. This policy outlines the rules regarding Donations. All patrons must adhere strictly to these guidelines to ensure fair access and safety. Failure to comply with the Donations policy may result in suspension of library privileges. This policy outlines the rules regarding Donations. All patrons must adhere strictly to these guidelines to ensure fair access and safety. Failure to comply with the Donations policy may result in suspension of library privileges. This policy outlines the rules regarding Donations. All patrons must adhere strictly to these guidelines to ensure fair access and safety. Failure to comply with the Donations policy may result in suspension of library privileges. </w:t>
-      </w:r>
-    </w:p>
-    <w:p>
-      <w:r>
-        <w:t xml:space="preserve">This policy outlines the rules regarding Donations. All patrons must adhere strictly to these guidelines to ensure fair access and safety. Failure to comply with the Donations policy may result in suspension of library privileges. This policy outlines the rules regarding Donations. All patrons must adhere strictly to these guidelines to ensure fair access and safety. Failure to comply with the Donations policy may result in suspension of library privileges. This policy outlines the rules regarding Donations. All patrons must adhere strictly to these guidelines to ensure fair access and safety. Failure to comply with the Donations policy may result in suspension of library privileges. This policy outlines the rules regarding Donations. All patrons must adhere strictly to these guidelines to ensure fair access and safety. Failure to comply with the Donations policy may result in suspension of library privileges. This policy outlines the rules regarding Donations. All patrons must adhere strictly to these guidelines to ensure fair access and safety. Failure to comply with the Donations policy may result in suspension of library privileges. This policy outlines the rules regarding Donations. All patrons must adhere strictly to these guidelines to ensure fair access and safety. Failure to comply with the Donations policy may result in suspension of library privileges. </w:t>
-      </w:r>
-    </w:p>
-    <w:p>
-      <w:r>
-        <w:t xml:space="preserve">This policy outlines the rules regarding Donations. All patrons must adhere strictly to these guidelines to ensure fair access and safety. Failure to comply with the Donations policy may result in suspension of library privileges. This policy outlines the rules regarding Donations. All patrons must adhere strictly to these guidelines to ensure fair access and safety. Failure to comply with the Donations policy may result in suspension of library privileges. This policy outlines the rules regarding Donations. All patrons must adhere strictly to these guidelines to ensure fair access and safety. Failure to comply with the Donations policy may result in suspension of library privileges. This policy outlines the rules regarding Donations. All patrons must adhere strictly to these guidelines to ensure fair access and safety. Failure to comply with the Donations policy may result in suspension of library privileges. This policy outlines the rules regarding Donations. All patrons must adhere strictly to these guidelines to ensure fair access and safety. Failure to comply with the Donations policy may result in suspension of library privileges. This policy outlines the rules regarding Donations. All patrons must adhere strictly to these guidelines to ensure fair access and safety. Failure to comply with the Donations policy may result in suspension of library privileges. </w:t>
-      </w:r>
-    </w:p>
-    <w:p>
-      <w:r>
-        <w:br w:type="page"/>
-      </w:r>
-    </w:p>
-    <w:p>
-      <w:pPr>
-        <w:pStyle w:val="Heading2"/>
-      </w:pPr>
-      <w:r>
-        <w:t>Donations - Part 4</w:t>
-      </w:r>
-    </w:p>
-    <w:p>
-      <w:r>
-        <w:t xml:space="preserve">This policy outlines the rules regarding Donations. All patrons must adhere strictly to these guidelines to ensure fair access and safety. Failure to comply with the Donations policy may result in suspension of library privileges. This policy outlines the rules regarding Donations. All patrons must adhere strictly to these guidelines to ensure fair access and safety. Failure to comply with the Donations policy may result in suspension of library privileges. This policy outlines the rules regarding Donations. All patrons must adhere strictly to these guidelines to ensure fair access and safety. Failure to comply with the Donations policy may result in suspension of library privileges. This policy outlines the rules regarding Donations. All patrons must adhere strictly to these guidelines to ensure fair access and safety. Failure to comply with the Donations policy may result in suspension of library privileges. This policy outlines the rules regarding Donations. All patrons must adhere strictly to these guidelines to ensure fair access and safety. Failure to comply with the Donations policy may result in suspension of library privileges. This policy outlines the rules regarding Donations. All patrons must adhere strictly to these guidelines to ensure fair access and safety. Failure to comply with the Donations policy may result in suspension of library privileges. </w:t>
-      </w:r>
-    </w:p>
-    <w:p>
-      <w:r>
-        <w:t xml:space="preserve">This policy outlines the rules regarding Donations. All patrons must adhere strictly to these guidelines to ensure fair access and safety. Failure to comply with the Donations policy may result in suspension of library privileges. This policy outlines the rules regarding Donations. All patrons must adhere strictly to these guidelines to ensure fair access and safety. Failure to comply with the Donations policy may result in suspension of library privileges. This policy outlines the rules regarding Donations. All patrons must adhere strictly to these guidelines to ensure fair access and safety. Failure to comply with the Donations policy may result in suspension of library privileges. This policy outlines the rules regarding Donations. All patrons must adhere strictly to these guidelines to ensure fair access and safety. Failure to comply with the Donations policy may result in suspension of library privileges. This policy outlines the rules regarding Donations. All patrons must adhere strictly to these guidelines to ensure fair access and safety. Failure to comply with the Donations policy may result in suspension of library privileges. This policy outlines the rules regarding Donations. All patrons must adhere strictly to these guidelines to ensure fair access and safety. Failure to comply with the Donations policy may result in suspension of library privileges. </w:t>
-      </w:r>
-    </w:p>
-    <w:p>
-      <w:r>
-        <w:t xml:space="preserve">This policy outlines the rules regarding Donations. All patrons must adhere strictly to these guidelines to ensure fair access and safety. Failure to comply with the Donations policy may result in suspension of library privileges. This policy outlines the rules regarding Donations. All patrons must adhere strictly to these guidelines to ensure fair access and safety. Failure to comply with the Donations policy may result in suspension of library privileges. This policy outlines the rules regarding Donations. All patrons must adhere strictly to these guidelines to ensure fair access and safety. Failure to comply with the Donations policy may result in suspension of library privileges. This policy outlines the rules regarding Donations. All patrons must adhere strictly to these guidelines to ensure fair access and safety. Failure to comply with the Donations policy may result in suspension of library privileges. This policy outlines the rules regarding Donations. All patrons must adhere strictly to these guidelines to ensure fair access and safety. Failure to comply with the Donations policy may result in suspension of library privileges. This policy outlines the rules regarding Donations. All patrons must adhere strictly to these guidelines to ensure fair access and safety. Failure to comply with the Donations policy may result in suspension of library privileges. </w:t>
-      </w:r>
-    </w:p>
-    <w:p>
-      <w:r>
-        <w:br w:type="page"/>
-      </w:r>
-    </w:p>
-    <w:p>
-      <w:pPr>
-        <w:pStyle w:val="Heading2"/>
-      </w:pPr>
-      <w:r>
-        <w:t>Donations - Part 5</w:t>
-      </w:r>
-    </w:p>
-    <w:p>
-      <w:r>
-        <w:t xml:space="preserve">This policy outlines the rules regarding Donations. All patrons must adhere strictly to these guidelines to ensure fair access and safety. Failure to comply with the Donations policy may result in suspension of library privileges. This policy outlines the rules regarding Donations. All patrons must adhere strictly to these guidelines to ensure fair access and safety. Failure to comply with the Donations policy may result in suspension of library privileges. This policy outlines the rules regarding Donations. All patrons must adhere strictly to these guidelines to ensure fair access and safety. Failure to comply with the Donations policy may result in suspension of library privileges. This policy outlines the rules regarding Donations. All patrons must adhere strictly to these guidelines to ensure fair access and safety. Failure to comply with the Donations policy may result in suspension of library privileges. This policy outlines the rules regarding Donations. All patrons must adhere strictly to these guidelines to ensure fair access and safety. Failure to comply with the Donations policy may result in suspension of library privileges. This policy outlines the rules regarding Donations. All patrons must adhere strictly to these guidelines to ensure fair access and safety. Failure to comply with the Donations policy may result in suspension of library privileges. </w:t>
-      </w:r>
-    </w:p>
-    <w:p>
-      <w:r>
-        <w:t xml:space="preserve">This policy outlines the rules regarding Donations. All patrons must adhere strictly to these guidelines to ensure fair access and safety. Failure to comply with the Donations policy may result in suspension of library privileges. This policy outlines the rules regarding Donations. All patrons must adhere strictly to these guidelines to ensure fair access and safety. Failure to comply with the Donations policy may result in suspension of library privileges. This policy outlines the rules regarding Donations. All patrons must adhere strictly to these guidelines to ensure fair access and safety. Failure to comply with the Donations policy may result in suspension of library privileges. This policy outlines the rules regarding Donations. All patrons must adhere strictly to these guidelines to ensure fair access and safety. Failure to comply with the Donations policy may result in suspension of library privileges. This policy outlines the rules regarding Donations. All patrons must adhere strictly to these guidelines to ensure fair access and safety. Failure to comply with the Donations policy may result in suspension of library privileges. This policy outlines the rules regarding Donations. All patrons must adhere strictly to these guidelines to ensure fair access and safety. Failure to comply with the Donations policy may result in suspension of library privileges. </w:t>
-      </w:r>
-    </w:p>
-    <w:p>
-      <w:r>
-        <w:t xml:space="preserve">This policy outlines the rules regarding Donations. All patrons must adhere strictly to these guidelines to ensure fair access and safety. Failure to comply with the Donations policy may result in suspension of library privileges. This policy outlines the rules regarding Donations. All patrons must adhere strictly to these guidelines to ensure fair access and safety. Failure to comply with the Donations policy may result in suspension of library privileges. This policy outlines the rules regarding Donations. All patrons must adhere strictly to these guidelines to ensure fair access and safety. Failure to comply with the Donations policy may result in suspension of library privileges. This policy outlines the rules regarding Donations. All patrons must adhere strictly to these guidelines to ensure fair access and safety. Failure to comply with the Donations policy may result in suspension of library privileges. This policy outlines the rules regarding Donations. All patrons must adhere strictly to these guidelines to ensure fair access and safety. Failure to comply with the Donations policy may result in suspension of library privileges. This policy outlines the rules regarding Donations. All patrons must adhere strictly to these guidelines to ensure fair access and safety. Failure to comply with the Donations policy may result in suspension of library privileges. </w:t>
-      </w:r>
-    </w:p>
-    <w:p>
-      <w:r>
-        <w:br w:type="page"/>
-      </w:r>
-    </w:p>
-    <w:p>
-      <w:pPr>
-        <w:pStyle w:val="Heading2"/>
-      </w:pPr>
-      <w:r>
-        <w:t>Donations - Part 6</w:t>
-      </w:r>
-    </w:p>
-    <w:p>
-      <w:r>
-        <w:t xml:space="preserve">This policy outlines the rules regarding Donations. All patrons must adhere strictly to these guidelines to ensure fair access and safety. Failure to comply with the Donations policy may result in suspension of library privileges. This policy outlines the rules regarding Donations. All patrons must adhere strictly to these guidelines to ensure fair access and safety. Failure to comply with the Donations policy may result in suspension of library privileges. This policy outlines the rules regarding Donations. All patrons must adhere strictly to these guidelines to ensure fair access and safety. Failure to comply with the Donations policy may result in suspension of library privileges. This policy outlines the rules regarding Donations. All patrons must adhere strictly to these guidelines to ensure fair access and safety. Failure to comply with the Donations policy may result in suspension of library privileges. This policy outlines the rules regarding Donations. All patrons must adhere strictly to these guidelines to ensure fair access and safety. Failure to comply with the Donations policy may result in suspension of library privileges. This policy outlines the rules regarding Donations. All patrons must adhere strictly to these guidelines to ensure fair access and safety. Failure to comply with the Donations policy may result in suspension of library privileges. </w:t>
-      </w:r>
-    </w:p>
-    <w:p>
-      <w:r>
-        <w:t xml:space="preserve">This policy outlines the rules regarding Donations. All patrons must adhere strictly to these guidelines to ensure fair access and safety. Failure to comply with the Donations policy may result in suspension of library privileges. This policy outlines the rules regarding Donations. All patrons must adhere strictly to these guidelines to ensure fair access and safety. Failure to comply with the Donations policy may result in suspension of library privileges. This policy outlines the rules regarding Donations. All patrons must adhere strictly to these guidelines to ensure fair access and safety. Failure to comply with the Donations policy may result in suspension of library privileges. This policy outlines the rules regarding Donations. All patrons must adhere strictly to these guidelines to ensure fair access and safety. Failure to comply with the Donations policy may result in suspension of library privileges. This policy outlines the rules regarding Donations. All patrons must adhere strictly to these guidelines to ensure fair access and safety. Failure to comply with the Donations policy may result in suspension of library privileges. This policy outlines the rules regarding Donations. All patrons must adhere strictly to these guidelines to ensure fair access and safety. Failure to comply with the Donations policy may result in suspension of library privileges. </w:t>
-      </w:r>
-    </w:p>
-    <w:p>
-      <w:r>
-        <w:t xml:space="preserve">This policy outlines the rules regarding Donations. All patrons must adhere strictly to these guidelines to ensure fair access and safety. Failure to comply with the Donations policy may result in suspension of library privileges. This policy outlines the rules regarding Donations. All patrons must adhere strictly to these guidelines to ensure fair access and safety. Failure to comply with the Donations policy may result in suspension of library privileges. This policy outlines the rules regarding Donations. All patrons must adhere strictly to these guidelines to ensure fair access and safety. Failure to comply with the Donations policy may result in suspension of library privileges. This policy outlines the rules regarding Donations. All patrons must adhere strictly to these guidelines to ensure fair access and safety. Failure to comply with the Donations policy may result in suspension of library privileges. This policy outlines the rules regarding Donations. All patrons must adhere strictly to these guidelines to ensure fair access and safety. Failure to comply with the Donations policy may result in suspension of library privileges. This policy outlines the rules regarding Donations. All patrons must adhere strictly to these guidelines to ensure fair access and safety. Failure to comply with the Donations policy may result in suspension of library privileges. </w:t>
-      </w:r>
-    </w:p>
-    <w:p>
-      <w:r>
-        <w:br w:type="page"/>
-      </w:r>
-    </w:p>
-    <w:p>
-      <w:pPr>
-        <w:pStyle w:val="Heading2"/>
-      </w:pPr>
-      <w:r>
-        <w:t>Donations - Part 7</w:t>
-      </w:r>
-    </w:p>
-    <w:p>
-      <w:r>
-        <w:t xml:space="preserve">This policy outlines the rules regarding Donations. All patrons must adhere strictly to these guidelines to ensure fair access and safety. Failure to comply with the Donations policy may result in suspension of library privileges. This policy outlines the rules regarding Donations. All patrons must adhere strictly to these guidelines to ensure fair access and safety. Failure to comply with the Donations policy may result in suspension of library privileges. This policy outlines the rules regarding Donations. All patrons must adhere strictly to these guidelines to ensure fair access and safety. Failure to comply with the Donations policy may result in suspension of library privileges. This policy outlines the rules regarding Donations. All patrons must adhere strictly to these guidelines to ensure fair access and safety. Failure to comply with the Donations policy may result in suspension of library privileges. This policy outlines the rules regarding Donations. All patrons must adhere strictly to these guidelines to ensure fair access and safety. Failure to comply with the Donations policy may result in suspension of library privileges. This policy outlines the rules regarding Donations. All patrons must adhere strictly to these guidelines to ensure fair access and safety. Failure to comply with the Donations policy may result in suspension of library privileges. </w:t>
-      </w:r>
-    </w:p>
-    <w:p>
-      <w:r>
-        <w:t xml:space="preserve">This policy outlines the rules regarding Donations. All patrons must adhere strictly to these guidelines to ensure fair access and safety. Failure to comply with the Donations policy may result in suspension of library privileges. This policy outlines the rules regarding Donations. All patrons must adhere strictly to these guidelines to ensure fair access and safety. Failure to comply with the Donations policy may result in suspension of library privileges. This policy outlines the rules regarding Donations. All patrons must adhere strictly to these guidelines to ensure fair access and safety. Failure to comply with the Donations policy may result in suspension of library privileges. This policy outlines the rules regarding Donations. All patrons must adhere strictly to these guidelines to ensure fair access and safety. Failure to comply with the Donations policy may result in suspension of library privileges. This policy outlines the rules regarding Donations. All patrons must adhere strictly to these guidelines to ensure fair access and safety. Failure to comply with the Donations policy may result in suspension of library privileges. This policy outlines the rules regarding Donations. All patrons must adhere strictly to these guidelines to ensure fair access and safety. Failure to comply with the Donations policy may result in suspension of library privileges. </w:t>
-      </w:r>
-    </w:p>
-    <w:p>
-      <w:r>
-        <w:t xml:space="preserve">This policy outlines the rules regarding Donations. All patrons must adhere strictly to these guidelines to ensure fair access and safety. Failure to comply with the Donations policy may result in suspension of library privileges. This policy outlines the rules regarding Donations. All patrons must adhere strictly to these guidelines to ensure fair access and safety. Failure to comply with the Donations policy may result in suspension of library privileges. This policy outlines the rules regarding Donations. All patrons must adhere strictly to these guidelines to ensure fair access and safety. Failure to comply with the Donations policy may result in suspension of library privileges. This policy outlines the rules regarding Donations. All patrons must adhere strictly to these guidelines to ensure fair access and safety. Failure to comply with the Donations policy may result in suspension of library privileges. This policy outlines the rules regarding Donations. All patrons must adhere strictly to these guidelines to ensure fair access and safety. Failure to comply with the Donations policy may result in suspension of library privileges. This policy outlines the rules regarding Donations. All patrons must adhere strictly to these guidelines to ensure fair access and safety. Failure to comply with the Donations policy may result in suspension of library privileges. </w:t>
-      </w:r>
-    </w:p>
-    <w:p>
-      <w:r>
-        <w:br w:type="page"/>
-      </w:r>
-    </w:p>
-    <w:p>
-      <w:pPr>
-        <w:pStyle w:val="Heading2"/>
-      </w:pPr>
-      <w:r>
-        <w:t>Donations - Part 8</w:t>
-      </w:r>
-    </w:p>
-    <w:p>
-      <w:r>
-        <w:t xml:space="preserve">This policy outlines the rules regarding Donations. All patrons must adhere strictly to these guidelines to ensure fair access and safety. Failure to comply with the Donations policy may result in suspension of library privileges. This policy outlines the rules regarding Donations. All patrons must adhere strictly to these guidelines to ensure fair access and safety. Failure to comply with the Donations policy may result in suspension of library privileges. This policy outlines the rules regarding Donations. All patrons must adhere strictly to these guidelines to ensure fair access and safety. Failure to comply with the Donations policy may result in suspension of library privileges. This policy outlines the rules regarding Donations. All patrons must adhere strictly to these guidelines to ensure fair access and safety. Failure to comply with the Donations policy may result in suspension of library privileges. This policy outlines the rules regarding Donations. All patrons must adhere strictly to these guidelines to ensure fair access and safety. Failure to comply with the Donations policy may result in suspension of library privileges. This policy outlines the rules regarding Donations. All patrons must adhere strictly to these guidelines to ensure fair access and safety. Failure to comply with the Donations policy may result in suspension of library privileges. </w:t>
-      </w:r>
-    </w:p>
-    <w:p>
-      <w:r>
-        <w:t xml:space="preserve">This policy outlines the rules regarding Donations. All patrons must adhere strictly to these guidelines to ensure fair access and safety. Failure to comply with the Donations policy may result in suspension of library privileges. This policy outlines the rules regarding Donations. All patrons must adhere strictly to these guidelines to ensure fair access and safety. Failure to comply with the Donations policy may result in suspension of library privileges. This policy outlines the rules regarding Donations. All patrons must adhere strictly to these guidelines to ensure fair access and safety. Failure to comply with the Donations policy may result in suspension of library privileges. This policy outlines the rules regarding Donations. All patrons must adhere strictly to these guidelines to ensure fair access and safety. Failure to comply with the Donations policy may result in suspension of library privileges. This policy outlines the rules regarding Donations. All patrons must adhere strictly to these guidelines to ensure fair access and safety. Failure to comply with the Donations policy may result in suspension of library privileges. This policy outlines the rules regarding Donations. All patrons must adhere strictly to these guidelines to ensure fair access and safety. Failure to comply with the Donations policy may result in suspension of library privileges. </w:t>
-      </w:r>
-    </w:p>
-    <w:p>
-      <w:r>
-        <w:t xml:space="preserve">This policy outlines the rules regarding Donations. All patrons must adhere strictly to these guidelines to ensure fair access and safety. Failure to comply with the Donations policy may result in suspension of library privileges. This policy outlines the rules regarding Donations. All patrons must adhere strictly to these guidelines to ensure fair access and safety. Failure to comply with the Donations policy may result in suspension of library privileges. This policy outlines the rules regarding Donations. All patrons must adhere strictly to these guidelines to ensure fair access and safety. Failure to comply with the Donations policy may result in suspension of library privileges. This policy outlines the rules regarding Donations. All patrons must adhere strictly to these guidelines to ensure fair access and safety. Failure to comply with the Donations policy may result in suspension of library privileges. This policy outlines the rules regarding Donations. All patrons must adhere strictly to these guidelines to ensure fair access and safety. Failure to comply with the Donations policy may result in suspension of library privileges. This policy outlines the rules regarding Donations. All patrons must adhere strictly to these guidelines to ensure fair access and safety. Failure to comply with the Donations policy may result in suspension of library privileges. </w:t>
-      </w:r>
-    </w:p>
-    <w:p>
-      <w:r>
-        <w:br w:type="page"/>
-      </w:r>
-    </w:p>
-    <w:p>
-      <w:pPr>
-        <w:pStyle w:val="Heading2"/>
-      </w:pPr>
-      <w:r>
-        <w:t>Donations - Part 9</w:t>
-      </w:r>
-    </w:p>
-    <w:p>
-      <w:r>
-        <w:t xml:space="preserve">This policy outlines the rules regarding Donations. All patrons must adhere strictly to these guidelines to ensure fair access and safety. Failure to comply with the Donations policy may result in suspension of library privileges. This policy outlines the rules regarding Donations. All patrons must adhere strictly to these guidelines to ensure fair access and safety. Failure to comply with the Donations policy may result in suspension of library privileges. This policy outlines the rules regarding Donations. All patrons must adhere strictly to these guidelines to ensure fair access and safety. Failure to comply with the Donations policy may result in suspension of library privileges. This policy outlines the rules regarding Donations. All patrons must adhere strictly to these guidelines to ensure fair access and safety. Failure to comply with the Donations policy may result in suspension of library privileges. This policy outlines the rules regarding Donations. All patrons must adhere strictly to these guidelines to ensure fair access and safety. Failure to comply with the Donations policy may result in suspension of library privileges. This policy outlines the rules regarding Donations. All patrons must adhere strictly to these guidelines to ensure fair access and safety. Failure to comply with the Donations policy may result in suspension of library privileges. </w:t>
-      </w:r>
-    </w:p>
-    <w:p>
-      <w:r>
-        <w:t xml:space="preserve">This policy outlines the rules regarding Donations. All patrons must adhere strictly to these guidelines to ensure fair access and safety. Failure to comply with the Donations policy may result in suspension of library privileges. This policy outlines the rules regarding Donations. All patrons must adhere strictly to these guidelines to ensure fair access and safety. Failure to comply with the Donations policy may result in suspension of library privileges. This policy outlines the rules regarding Donations. All patrons must adhere strictly to these guidelines to ensure fair access and safety. Failure to comply with the Donations policy may result in suspension of library privileges. This policy outlines the rules regarding Donations. All patrons must adhere strictly to these guidelines to ensure fair access and safety. Failure to comply with the Donations policy may result in suspension of library privileges. This policy outlines the rules regarding Donations. All patrons must adhere strictly to these guidelines to ensure fair access and safety. Failure to comply with the Donations policy may result in suspension of library privileges. This policy outlines the rules regarding Donations. All patrons must adhere strictly to these guidelines to ensure fair access and safety. Failure to comply with the Donations policy may result in suspension of library privileges. </w:t>
-      </w:r>
-    </w:p>
-    <w:p>
-      <w:r>
-        <w:t xml:space="preserve">This policy outlines the rules regarding Donations. All patrons must adhere strictly to these guidelines to ensure fair access and safety. Failure to comply with the Donations policy may result in suspension of library privileges. This policy outlines the rules regarding Donations. All patrons must adhere strictly to these guidelines to ensure fair access and safety. Failure to comply with the Donations policy may result in suspension of library privileges. This policy outlines the rules regarding Donations. All patrons must adhere strictly to these guidelines to ensure fair access and safety. Failure to comply with the Donations policy may result in suspension of library privileges. This policy outlines the rules regarding Donations. All patrons must adhere strictly to these guidelines to ensure fair access and safety. Failure to comply with the Donations policy may result in suspension of library privileges. This policy outlines the rules regarding Donations. All patrons must adhere strictly to these guidelines to ensure fair access and safety. Failure to comply with the Donations policy may result in suspension of library privileges. This policy outlines the rules regarding Donations. All patrons must adhere strictly to these guidelines to ensure fair access and safety. Failure to comply with the Donations policy may result in suspension of library privileges. </w:t>
-      </w:r>
-    </w:p>
-    <w:p>
-      <w:r>
-        <w:br w:type="page"/>
-      </w:r>
-    </w:p>
-    <w:p>
-      <w:pPr>
-        <w:pStyle w:val="Heading2"/>
-      </w:pPr>
-      <w:r>
-        <w:t>Donations - Part 10</w:t>
-      </w:r>
-    </w:p>
-    <w:p>
-      <w:r>
-        <w:t xml:space="preserve">This policy outlines the rules regarding Donations. All patrons must adhere strictly to these guidelines to ensure fair access and safety. Failure to comply with the Donations policy may result in suspension of library privileges. This policy outlines the rules regarding Donations. All patrons must adhere strictly to these guidelines to ensure fair access and safety. Failure to comply with the Donations policy may result in suspension of library privileges. This policy outlines the rules regarding Donations. All patrons must adhere strictly to these guidelines to ensure fair access and safety. Failure to comply with the Donations policy may result in suspension of library privileges. This policy outlines the rules regarding Donations. All patrons must adhere strictly to these guidelines to ensure fair access and safety. Failure to comply with the Donations policy may result in suspension of library privileges. This policy outlines the rules regarding Donations. All patrons must adhere strictly to these guidelines to ensure fair access and safety. Failure to comply with the Donations policy may result in suspension of library privileges. This policy outlines the rules regarding Donations. All patrons must adhere strictly to these guidelines to ensure fair access and safety. Failure to comply with the Donations policy may result in suspension of library privileges. </w:t>
-      </w:r>
-    </w:p>
-    <w:p>
-      <w:r>
-        <w:t xml:space="preserve">This policy outlines the rules regarding Donations. All patrons must adhere strictly to these guidelines to ensure fair access and safety. Failure to comply with the Donations policy may result in suspension of library privileges. This policy outlines the rules regarding Donations. All patrons must adhere strictly to these guidelines to ensure fair access and safety. Failure to comply with the Donations policy may result in suspension of library privileges. This policy outlines the rules regarding Donations. All patrons must adhere strictly to these guidelines to ensure fair access and safety. Failure to comply with the Donations policy may result in suspension of library privileges. This policy outlines the rules regarding Donations. All patrons must adhere strictly to these guidelines to ensure fair access and safety. Failure to comply with the Donations policy may result in suspension of library privileges. This policy outlines the rules regarding Donations. All patrons must adhere strictly to these guidelines to ensure fair access and safety. Failure to comply with the Donations policy may result in suspension of library privileges. This policy outlines the rules regarding Donations. All patrons must adhere strictly to these guidelines to ensure fair access and safety. Failure to comply with the Donations policy may result in suspension of library privileges. </w:t>
-      </w:r>
-    </w:p>
-    <w:p>
-      <w:r>
-        <w:t xml:space="preserve">This policy outlines the rules regarding Donations. All patrons must adhere strictly to these guidelines to ensure fair access and safety. Failure to comply with the Donations policy may result in suspension of library privileges. This policy outlines the rules regarding Donations. All patrons must adhere strictly to these guidelines to ensure fair access and safety. Failure to comply with the Donations policy may result in suspension of library privileges. This policy outlines the rules regarding Donations. All patrons must adhere strictly to these guidelines to ensure fair access and safety. Failure to comply with the Donations policy may result in suspension of library privileges. This policy outlines the rules regarding Donations. All patrons must adhere strictly to these guidelines to ensure fair access and safety. Failure to comply with the Donations policy may result in suspension of library privileges. This policy outlines the rules regarding Donations. All patrons must adhere strictly to these guidelines to ensure fair access and safety. Failure to comply with the Donations policy may result in suspension of library privileges. This policy outlines the rules regarding Donations. All patrons must adhere strictly to these guidelines to ensure fair access and safety. Failure to comply with the Donations policy may result in suspension of library privileges. </w:t>
-      </w:r>
-    </w:p>
-    <w:p>
-      <w:r>
-        <w:br w:type="page"/>
+        <w:t>- Acceptance Criteria: The library accepts scholarly books and historical manuscripts relevant to university curricula.</w:t>
+        <w:br/>
+        <w:t>- Exclusions: Outdated textbooks, damaged materials, and popular magazines are not accepted.</w:t>
+        <w:br/>
+        <w:t>- Tax Receipts: A gift acknowledgement letter is provided upon request, though the library does not appraise financial values.</w:t>
       </w:r>
     </w:p>
     <w:p>
@@ -2323,283 +161,12 @@
       </w:r>
     </w:p>
     <w:p>
-      <w:pPr>
-        <w:pStyle w:val="Heading2"/>
-      </w:pPr>
       <w:r>
-        <w:t>Archival Access - Part 1</w:t>
-      </w:r>
-    </w:p>
-    <w:p>
-      <w:r>
-        <w:t xml:space="preserve">This policy outlines the rules regarding Archival Access. All patrons must adhere strictly to these guidelines to ensure fair access and safety. Failure to comply with the Archival Access policy may result in suspension of library privileges. This policy outlines the rules regarding Archival Access. All patrons must adhere strictly to these guidelines to ensure fair access and safety. Failure to comply with the Archival Access policy may result in suspension of library privileges. This policy outlines the rules regarding Archival Access. All patrons must adhere strictly to these guidelines to ensure fair access and safety. Failure to comply with the Archival Access policy may result in suspension of library privileges. This policy outlines the rules regarding Archival Access. All patrons must adhere strictly to these guidelines to ensure fair access and safety. Failure to comply with the Archival Access policy may result in suspension of library privileges. This policy outlines the rules regarding Archival Access. All patrons must adhere strictly to these guidelines to ensure fair access and safety. Failure to comply with the Archival Access policy may result in suspension of library privileges. This policy outlines the rules regarding Archival Access. All patrons must adhere strictly to these guidelines to ensure fair access and safety. Failure to comply with the Archival Access policy may result in suspension of library privileges. </w:t>
-      </w:r>
-    </w:p>
-    <w:p>
-      <w:r>
-        <w:t xml:space="preserve">This policy outlines the rules regarding Archival Access. All patrons must adhere strictly to these guidelines to ensure fair access and safety. Failure to comply with the Archival Access policy may result in suspension of library privileges. This policy outlines the rules regarding Archival Access. All patrons must adhere strictly to these guidelines to ensure fair access and safety. Failure to comply with the Archival Access policy may result in suspension of library privileges. This policy outlines the rules regarding Archival Access. All patrons must adhere strictly to these guidelines to ensure fair access and safety. Failure to comply with the Archival Access policy may result in suspension of library privileges. This policy outlines the rules regarding Archival Access. All patrons must adhere strictly to these guidelines to ensure fair access and safety. Failure to comply with the Archival Access policy may result in suspension of library privileges. This policy outlines the rules regarding Archival Access. All patrons must adhere strictly to these guidelines to ensure fair access and safety. Failure to comply with the Archival Access policy may result in suspension of library privileges. This policy outlines the rules regarding Archival Access. All patrons must adhere strictly to these guidelines to ensure fair access and safety. Failure to comply with the Archival Access policy may result in suspension of library privileges. </w:t>
-      </w:r>
-    </w:p>
-    <w:p>
-      <w:r>
-        <w:t xml:space="preserve">This policy outlines the rules regarding Archival Access. All patrons must adhere strictly to these guidelines to ensure fair access and safety. Failure to comply with the Archival Access policy may result in suspension of library privileges. This policy outlines the rules regarding Archival Access. All patrons must adhere strictly to these guidelines to ensure fair access and safety. Failure to comply with the Archival Access policy may result in suspension of library privileges. This policy outlines the rules regarding Archival Access. All patrons must adhere strictly to these guidelines to ensure fair access and safety. Failure to comply with the Archival Access policy may result in suspension of library privileges. This policy outlines the rules regarding Archival Access. All patrons must adhere strictly to these guidelines to ensure fair access and safety. Failure to comply with the Archival Access policy may result in suspension of library privileges. This policy outlines the rules regarding Archival Access. All patrons must adhere strictly to these guidelines to ensure fair access and safety. Failure to comply with the Archival Access policy may result in suspension of library privileges. This policy outlines the rules regarding Archival Access. All patrons must adhere strictly to these guidelines to ensure fair access and safety. Failure to comply with the Archival Access policy may result in suspension of library privileges. </w:t>
-      </w:r>
-    </w:p>
-    <w:p>
-      <w:r>
-        <w:br w:type="page"/>
-      </w:r>
-    </w:p>
-    <w:p>
-      <w:pPr>
-        <w:pStyle w:val="Heading2"/>
-      </w:pPr>
-      <w:r>
-        <w:t>Archival Access - Part 2</w:t>
-      </w:r>
-    </w:p>
-    <w:p>
-      <w:r>
-        <w:t xml:space="preserve">This policy outlines the rules regarding Archival Access. All patrons must adhere strictly to these guidelines to ensure fair access and safety. Failure to comply with the Archival Access policy may result in suspension of library privileges. This policy outlines the rules regarding Archival Access. All patrons must adhere strictly to these guidelines to ensure fair access and safety. Failure to comply with the Archival Access policy may result in suspension of library privileges. This policy outlines the rules regarding Archival Access. All patrons must adhere strictly to these guidelines to ensure fair access and safety. Failure to comply with the Archival Access policy may result in suspension of library privileges. This policy outlines the rules regarding Archival Access. All patrons must adhere strictly to these guidelines to ensure fair access and safety. Failure to comply with the Archival Access policy may result in suspension of library privileges. This policy outlines the rules regarding Archival Access. All patrons must adhere strictly to these guidelines to ensure fair access and safety. Failure to comply with the Archival Access policy may result in suspension of library privileges. This policy outlines the rules regarding Archival Access. All patrons must adhere strictly to these guidelines to ensure fair access and safety. Failure to comply with the Archival Access policy may result in suspension of library privileges. </w:t>
-      </w:r>
-    </w:p>
-    <w:p>
-      <w:r>
-        <w:t xml:space="preserve">This policy outlines the rules regarding Archival Access. All patrons must adhere strictly to these guidelines to ensure fair access and safety. Failure to comply with the Archival Access policy may result in suspension of library privileges. This policy outlines the rules regarding Archival Access. All patrons must adhere strictly to these guidelines to ensure fair access and safety. Failure to comply with the Archival Access policy may result in suspension of library privileges. This policy outlines the rules regarding Archival Access. All patrons must adhere strictly to these guidelines to ensure fair access and safety. Failure to comply with the Archival Access policy may result in suspension of library privileges. This policy outlines the rules regarding Archival Access. All patrons must adhere strictly to these guidelines to ensure fair access and safety. Failure to comply with the Archival Access policy may result in suspension of library privileges. This policy outlines the rules regarding Archival Access. All patrons must adhere strictly to these guidelines to ensure fair access and safety. Failure to comply with the Archival Access policy may result in suspension of library privileges. This policy outlines the rules regarding Archival Access. All patrons must adhere strictly to these guidelines to ensure fair access and safety. Failure to comply with the Archival Access policy may result in suspension of library privileges. </w:t>
-      </w:r>
-    </w:p>
-    <w:p>
-      <w:r>
-        <w:t xml:space="preserve">This policy outlines the rules regarding Archival Access. All patrons must adhere strictly to these guidelines to ensure fair access and safety. Failure to comply with the Archival Access policy may result in suspension of library privileges. This policy outlines the rules regarding Archival Access. All patrons must adhere strictly to these guidelines to ensure fair access and safety. Failure to comply with the Archival Access policy may result in suspension of library privileges. This policy outlines the rules regarding Archival Access. All patrons must adhere strictly to these guidelines to ensure fair access and safety. Failure to comply with the Archival Access policy may result in suspension of library privileges. This policy outlines the rules regarding Archival Access. All patrons must adhere strictly to these guidelines to ensure fair access and safety. Failure to comply with the Archival Access policy may result in suspension of library privileges. This policy outlines the rules regarding Archival Access. All patrons must adhere strictly to these guidelines to ensure fair access and safety. Failure to comply with the Archival Access policy may result in suspension of library privileges. This policy outlines the rules regarding Archival Access. All patrons must adhere strictly to these guidelines to ensure fair access and safety. Failure to comply with the Archival Access policy may result in suspension of library privileges. </w:t>
-      </w:r>
-    </w:p>
-    <w:p>
-      <w:r>
-        <w:br w:type="page"/>
-      </w:r>
-    </w:p>
-    <w:p>
-      <w:pPr>
-        <w:pStyle w:val="Heading2"/>
-      </w:pPr>
-      <w:r>
-        <w:t>Archival Access - Part 3</w:t>
-      </w:r>
-    </w:p>
-    <w:p>
-      <w:r>
-        <w:t xml:space="preserve">This policy outlines the rules regarding Archival Access. All patrons must adhere strictly to these guidelines to ensure fair access and safety. Failure to comply with the Archival Access policy may result in suspension of library privileges. This policy outlines the rules regarding Archival Access. All patrons must adhere strictly to these guidelines to ensure fair access and safety. Failure to comply with the Archival Access policy may result in suspension of library privileges. This policy outlines the rules regarding Archival Access. All patrons must adhere strictly to these guidelines to ensure fair access and safety. Failure to comply with the Archival Access policy may result in suspension of library privileges. This policy outlines the rules regarding Archival Access. All patrons must adhere strictly to these guidelines to ensure fair access and safety. Failure to comply with the Archival Access policy may result in suspension of library privileges. This policy outlines the rules regarding Archival Access. All patrons must adhere strictly to these guidelines to ensure fair access and safety. Failure to comply with the Archival Access policy may result in suspension of library privileges. This policy outlines the rules regarding Archival Access. All patrons must adhere strictly to these guidelines to ensure fair access and safety. Failure to comply with the Archival Access policy may result in suspension of library privileges. </w:t>
-      </w:r>
-    </w:p>
-    <w:p>
-      <w:r>
-        <w:t xml:space="preserve">This policy outlines the rules regarding Archival Access. All patrons must adhere strictly to these guidelines to ensure fair access and safety. Failure to comply with the Archival Access policy may result in suspension of library privileges. This policy outlines the rules regarding Archival Access. All patrons must adhere strictly to these guidelines to ensure fair access and safety. Failure to comply with the Archival Access policy may result in suspension of library privileges. This policy outlines the rules regarding Archival Access. All patrons must adhere strictly to these guidelines to ensure fair access and safety. Failure to comply with the Archival Access policy may result in suspension of library privileges. This policy outlines the rules regarding Archival Access. All patrons must adhere strictly to these guidelines to ensure fair access and safety. Failure to comply with the Archival Access policy may result in suspension of library privileges. This policy outlines the rules regarding Archival Access. All patrons must adhere strictly to these guidelines to ensure fair access and safety. Failure to comply with the Archival Access policy may result in suspension of library privileges. This policy outlines the rules regarding Archival Access. All patrons must adhere strictly to these guidelines to ensure fair access and safety. Failure to comply with the Archival Access policy may result in suspension of library privileges. </w:t>
-      </w:r>
-    </w:p>
-    <w:p>
-      <w:r>
-        <w:t xml:space="preserve">This policy outlines the rules regarding Archival Access. All patrons must adhere strictly to these guidelines to ensure fair access and safety. Failure to comply with the Archival Access policy may result in suspension of library privileges. This policy outlines the rules regarding Archival Access. All patrons must adhere strictly to these guidelines to ensure fair access and safety. Failure to comply with the Archival Access policy may result in suspension of library privileges. This policy outlines the rules regarding Archival Access. All patrons must adhere strictly to these guidelines to ensure fair access and safety. Failure to comply with the Archival Access policy may result in suspension of library privileges. This policy outlines the rules regarding Archival Access. All patrons must adhere strictly to these guidelines to ensure fair access and safety. Failure to comply with the Archival Access policy may result in suspension of library privileges. This policy outlines the rules regarding Archival Access. All patrons must adhere strictly to these guidelines to ensure fair access and safety. Failure to comply with the Archival Access policy may result in suspension of library privileges. This policy outlines the rules regarding Archival Access. All patrons must adhere strictly to these guidelines to ensure fair access and safety. Failure to comply with the Archival Access policy may result in suspension of library privileges. </w:t>
-      </w:r>
-    </w:p>
-    <w:p>
-      <w:r>
-        <w:br w:type="page"/>
-      </w:r>
-    </w:p>
-    <w:p>
-      <w:pPr>
-        <w:pStyle w:val="Heading2"/>
-      </w:pPr>
-      <w:r>
-        <w:t>Archival Access - Part 4</w:t>
-      </w:r>
-    </w:p>
-    <w:p>
-      <w:r>
-        <w:t xml:space="preserve">This policy outlines the rules regarding Archival Access. All patrons must adhere strictly to these guidelines to ensure fair access and safety. Failure to comply with the Archival Access policy may result in suspension of library privileges. This policy outlines the rules regarding Archival Access. All patrons must adhere strictly to these guidelines to ensure fair access and safety. Failure to comply with the Archival Access policy may result in suspension of library privileges. This policy outlines the rules regarding Archival Access. All patrons must adhere strictly to these guidelines to ensure fair access and safety. Failure to comply with the Archival Access policy may result in suspension of library privileges. This policy outlines the rules regarding Archival Access. All patrons must adhere strictly to these guidelines to ensure fair access and safety. Failure to comply with the Archival Access policy may result in suspension of library privileges. This policy outlines the rules regarding Archival Access. All patrons must adhere strictly to these guidelines to ensure fair access and safety. Failure to comply with the Archival Access policy may result in suspension of library privileges. This policy outlines the rules regarding Archival Access. All patrons must adhere strictly to these guidelines to ensure fair access and safety. Failure to comply with the Archival Access policy may result in suspension of library privileges. </w:t>
-      </w:r>
-    </w:p>
-    <w:p>
-      <w:r>
-        <w:t xml:space="preserve">This policy outlines the rules regarding Archival Access. All patrons must adhere strictly to these guidelines to ensure fair access and safety. Failure to comply with the Archival Access policy may result in suspension of library privileges. This policy outlines the rules regarding Archival Access. All patrons must adhere strictly to these guidelines to ensure fair access and safety. Failure to comply with the Archival Access policy may result in suspension of library privileges. This policy outlines the rules regarding Archival Access. All patrons must adhere strictly to these guidelines to ensure fair access and safety. Failure to comply with the Archival Access policy may result in suspension of library privileges. This policy outlines the rules regarding Archival Access. All patrons must adhere strictly to these guidelines to ensure fair access and safety. Failure to comply with the Archival Access policy may result in suspension of library privileges. This policy outlines the rules regarding Archival Access. All patrons must adhere strictly to these guidelines to ensure fair access and safety. Failure to comply with the Archival Access policy may result in suspension of library privileges. This policy outlines the rules regarding Archival Access. All patrons must adhere strictly to these guidelines to ensure fair access and safety. Failure to comply with the Archival Access policy may result in suspension of library privileges. </w:t>
-      </w:r>
-    </w:p>
-    <w:p>
-      <w:r>
-        <w:t xml:space="preserve">This policy outlines the rules regarding Archival Access. All patrons must adhere strictly to these guidelines to ensure fair access and safety. Failure to comply with the Archival Access policy may result in suspension of library privileges. This policy outlines the rules regarding Archival Access. All patrons must adhere strictly to these guidelines to ensure fair access and safety. Failure to comply with the Archival Access policy may result in suspension of library privileges. This policy outlines the rules regarding Archival Access. All patrons must adhere strictly to these guidelines to ensure fair access and safety. Failure to comply with the Archival Access policy may result in suspension of library privileges. This policy outlines the rules regarding Archival Access. All patrons must adhere strictly to these guidelines to ensure fair access and safety. Failure to comply with the Archival Access policy may result in suspension of library privileges. This policy outlines the rules regarding Archival Access. All patrons must adhere strictly to these guidelines to ensure fair access and safety. Failure to comply with the Archival Access policy may result in suspension of library privileges. This policy outlines the rules regarding Archival Access. All patrons must adhere strictly to these guidelines to ensure fair access and safety. Failure to comply with the Archival Access policy may result in suspension of library privileges. </w:t>
-      </w:r>
-    </w:p>
-    <w:p>
-      <w:r>
-        <w:br w:type="page"/>
-      </w:r>
-    </w:p>
-    <w:p>
-      <w:pPr>
-        <w:pStyle w:val="Heading2"/>
-      </w:pPr>
-      <w:r>
-        <w:t>Archival Access - Part 5</w:t>
-      </w:r>
-    </w:p>
-    <w:p>
-      <w:r>
-        <w:t xml:space="preserve">This policy outlines the rules regarding Archival Access. All patrons must adhere strictly to these guidelines to ensure fair access and safety. Failure to comply with the Archival Access policy may result in suspension of library privileges. This policy outlines the rules regarding Archival Access. All patrons must adhere strictly to these guidelines to ensure fair access and safety. Failure to comply with the Archival Access policy may result in suspension of library privileges. This policy outlines the rules regarding Archival Access. All patrons must adhere strictly to these guidelines to ensure fair access and safety. Failure to comply with the Archival Access policy may result in suspension of library privileges. This policy outlines the rules regarding Archival Access. All patrons must adhere strictly to these guidelines to ensure fair access and safety. Failure to comply with the Archival Access policy may result in suspension of library privileges. This policy outlines the rules regarding Archival Access. All patrons must adhere strictly to these guidelines to ensure fair access and safety. Failure to comply with the Archival Access policy may result in suspension of library privileges. This policy outlines the rules regarding Archival Access. All patrons must adhere strictly to these guidelines to ensure fair access and safety. Failure to comply with the Archival Access policy may result in suspension of library privileges. </w:t>
-      </w:r>
-    </w:p>
-    <w:p>
-      <w:r>
-        <w:t xml:space="preserve">This policy outlines the rules regarding Archival Access. All patrons must adhere strictly to these guidelines to ensure fair access and safety. Failure to comply with the Archival Access policy may result in suspension of library privileges. This policy outlines the rules regarding Archival Access. All patrons must adhere strictly to these guidelines to ensure fair access and safety. Failure to comply with the Archival Access policy may result in suspension of library privileges. This policy outlines the rules regarding Archival Access. All patrons must adhere strictly to these guidelines to ensure fair access and safety. Failure to comply with the Archival Access policy may result in suspension of library privileges. This policy outlines the rules regarding Archival Access. All patrons must adhere strictly to these guidelines to ensure fair access and safety. Failure to comply with the Archival Access policy may result in suspension of library privileges. This policy outlines the rules regarding Archival Access. All patrons must adhere strictly to these guidelines to ensure fair access and safety. Failure to comply with the Archival Access policy may result in suspension of library privileges. This policy outlines the rules regarding Archival Access. All patrons must adhere strictly to these guidelines to ensure fair access and safety. Failure to comply with the Archival Access policy may result in suspension of library privileges. </w:t>
-      </w:r>
-    </w:p>
-    <w:p>
-      <w:r>
-        <w:t xml:space="preserve">This policy outlines the rules regarding Archival Access. All patrons must adhere strictly to these guidelines to ensure fair access and safety. Failure to comply with the Archival Access policy may result in suspension of library privileges. This policy outlines the rules regarding Archival Access. All patrons must adhere strictly to these guidelines to ensure fair access and safety. Failure to comply with the Archival Access policy may result in suspension of library privileges. This policy outlines the rules regarding Archival Access. All patrons must adhere strictly to these guidelines to ensure fair access and safety. Failure to comply with the Archival Access policy may result in suspension of library privileges. This policy outlines the rules regarding Archival Access. All patrons must adhere strictly to these guidelines to ensure fair access and safety. Failure to comply with the Archival Access policy may result in suspension of library privileges. This policy outlines the rules regarding Archival Access. All patrons must adhere strictly to these guidelines to ensure fair access and safety. Failure to comply with the Archival Access policy may result in suspension of library privileges. This policy outlines the rules regarding Archival Access. All patrons must adhere strictly to these guidelines to ensure fair access and safety. Failure to comply with the Archival Access policy may result in suspension of library privileges. </w:t>
-      </w:r>
-    </w:p>
-    <w:p>
-      <w:r>
-        <w:br w:type="page"/>
-      </w:r>
-    </w:p>
-    <w:p>
-      <w:pPr>
-        <w:pStyle w:val="Heading2"/>
-      </w:pPr>
-      <w:r>
-        <w:t>Archival Access - Part 6</w:t>
-      </w:r>
-    </w:p>
-    <w:p>
-      <w:r>
-        <w:t xml:space="preserve">This policy outlines the rules regarding Archival Access. All patrons must adhere strictly to these guidelines to ensure fair access and safety. Failure to comply with the Archival Access policy may result in suspension of library privileges. This policy outlines the rules regarding Archival Access. All patrons must adhere strictly to these guidelines to ensure fair access and safety. Failure to comply with the Archival Access policy may result in suspension of library privileges. This policy outlines the rules regarding Archival Access. All patrons must adhere strictly to these guidelines to ensure fair access and safety. Failure to comply with the Archival Access policy may result in suspension of library privileges. This policy outlines the rules regarding Archival Access. All patrons must adhere strictly to these guidelines to ensure fair access and safety. Failure to comply with the Archival Access policy may result in suspension of library privileges. This policy outlines the rules regarding Archival Access. All patrons must adhere strictly to these guidelines to ensure fair access and safety. Failure to comply with the Archival Access policy may result in suspension of library privileges. This policy outlines the rules regarding Archival Access. All patrons must adhere strictly to these guidelines to ensure fair access and safety. Failure to comply with the Archival Access policy may result in suspension of library privileges. </w:t>
-      </w:r>
-    </w:p>
-    <w:p>
-      <w:r>
-        <w:t xml:space="preserve">This policy outlines the rules regarding Archival Access. All patrons must adhere strictly to these guidelines to ensure fair access and safety. Failure to comply with the Archival Access policy may result in suspension of library privileges. This policy outlines the rules regarding Archival Access. All patrons must adhere strictly to these guidelines to ensure fair access and safety. Failure to comply with the Archival Access policy may result in suspension of library privileges. This policy outlines the rules regarding Archival Access. All patrons must adhere strictly to these guidelines to ensure fair access and safety. Failure to comply with the Archival Access policy may result in suspension of library privileges. This policy outlines the rules regarding Archival Access. All patrons must adhere strictly to these guidelines to ensure fair access and safety. Failure to comply with the Archival Access policy may result in suspension of library privileges. This policy outlines the rules regarding Archival Access. All patrons must adhere strictly to these guidelines to ensure fair access and safety. Failure to comply with the Archival Access policy may result in suspension of library privileges. This policy outlines the rules regarding Archival Access. All patrons must adhere strictly to these guidelines to ensure fair access and safety. Failure to comply with the Archival Access policy may result in suspension of library privileges. </w:t>
-      </w:r>
-    </w:p>
-    <w:p>
-      <w:r>
-        <w:t xml:space="preserve">This policy outlines the rules regarding Archival Access. All patrons must adhere strictly to these guidelines to ensure fair access and safety. Failure to comply with the Archival Access policy may result in suspension of library privileges. This policy outlines the rules regarding Archival Access. All patrons must adhere strictly to these guidelines to ensure fair access and safety. Failure to comply with the Archival Access policy may result in suspension of library privileges. This policy outlines the rules regarding Archival Access. All patrons must adhere strictly to these guidelines to ensure fair access and safety. Failure to comply with the Archival Access policy may result in suspension of library privileges. This policy outlines the rules regarding Archival Access. All patrons must adhere strictly to these guidelines to ensure fair access and safety. Failure to comply with the Archival Access policy may result in suspension of library privileges. This policy outlines the rules regarding Archival Access. All patrons must adhere strictly to these guidelines to ensure fair access and safety. Failure to comply with the Archival Access policy may result in suspension of library privileges. This policy outlines the rules regarding Archival Access. All patrons must adhere strictly to these guidelines to ensure fair access and safety. Failure to comply with the Archival Access policy may result in suspension of library privileges. </w:t>
-      </w:r>
-    </w:p>
-    <w:p>
-      <w:r>
-        <w:br w:type="page"/>
-      </w:r>
-    </w:p>
-    <w:p>
-      <w:pPr>
-        <w:pStyle w:val="Heading2"/>
-      </w:pPr>
-      <w:r>
-        <w:t>Archival Access - Part 7</w:t>
-      </w:r>
-    </w:p>
-    <w:p>
-      <w:r>
-        <w:t xml:space="preserve">This policy outlines the rules regarding Archival Access. All patrons must adhere strictly to these guidelines to ensure fair access and safety. Failure to comply with the Archival Access policy may result in suspension of library privileges. This policy outlines the rules regarding Archival Access. All patrons must adhere strictly to these guidelines to ensure fair access and safety. Failure to comply with the Archival Access policy may result in suspension of library privileges. This policy outlines the rules regarding Archival Access. All patrons must adhere strictly to these guidelines to ensure fair access and safety. Failure to comply with the Archival Access policy may result in suspension of library privileges. This policy outlines the rules regarding Archival Access. All patrons must adhere strictly to these guidelines to ensure fair access and safety. Failure to comply with the Archival Access policy may result in suspension of library privileges. This policy outlines the rules regarding Archival Access. All patrons must adhere strictly to these guidelines to ensure fair access and safety. Failure to comply with the Archival Access policy may result in suspension of library privileges. This policy outlines the rules regarding Archival Access. All patrons must adhere strictly to these guidelines to ensure fair access and safety. Failure to comply with the Archival Access policy may result in suspension of library privileges. </w:t>
-      </w:r>
-    </w:p>
-    <w:p>
-      <w:r>
-        <w:t xml:space="preserve">This policy outlines the rules regarding Archival Access. All patrons must adhere strictly to these guidelines to ensure fair access and safety. Failure to comply with the Archival Access policy may result in suspension of library privileges. This policy outlines the rules regarding Archival Access. All patrons must adhere strictly to these guidelines to ensure fair access and safety. Failure to comply with the Archival Access policy may result in suspension of library privileges. This policy outlines the rules regarding Archival Access. All patrons must adhere strictly to these guidelines to ensure fair access and safety. Failure to comply with the Archival Access policy may result in suspension of library privileges. This policy outlines the rules regarding Archival Access. All patrons must adhere strictly to these guidelines to ensure fair access and safety. Failure to comply with the Archival Access policy may result in suspension of library privileges. This policy outlines the rules regarding Archival Access. All patrons must adhere strictly to these guidelines to ensure fair access and safety. Failure to comply with the Archival Access policy may result in suspension of library privileges. This policy outlines the rules regarding Archival Access. All patrons must adhere strictly to these guidelines to ensure fair access and safety. Failure to comply with the Archival Access policy may result in suspension of library privileges. </w:t>
-      </w:r>
-    </w:p>
-    <w:p>
-      <w:r>
-        <w:t xml:space="preserve">This policy outlines the rules regarding Archival Access. All patrons must adhere strictly to these guidelines to ensure fair access and safety. Failure to comply with the Archival Access policy may result in suspension of library privileges. This policy outlines the rules regarding Archival Access. All patrons must adhere strictly to these guidelines to ensure fair access and safety. Failure to comply with the Archival Access policy may result in suspension of library privileges. This policy outlines the rules regarding Archival Access. All patrons must adhere strictly to these guidelines to ensure fair access and safety. Failure to comply with the Archival Access policy may result in suspension of library privileges. This policy outlines the rules regarding Archival Access. All patrons must adhere strictly to these guidelines to ensure fair access and safety. Failure to comply with the Archival Access policy may result in suspension of library privileges. This policy outlines the rules regarding Archival Access. All patrons must adhere strictly to these guidelines to ensure fair access and safety. Failure to comply with the Archival Access policy may result in suspension of library privileges. This policy outlines the rules regarding Archival Access. All patrons must adhere strictly to these guidelines to ensure fair access and safety. Failure to comply with the Archival Access policy may result in suspension of library privileges. </w:t>
-      </w:r>
-    </w:p>
-    <w:p>
-      <w:r>
-        <w:br w:type="page"/>
-      </w:r>
-    </w:p>
-    <w:p>
-      <w:pPr>
-        <w:pStyle w:val="Heading2"/>
-      </w:pPr>
-      <w:r>
-        <w:t>Archival Access - Part 8</w:t>
-      </w:r>
-    </w:p>
-    <w:p>
-      <w:r>
-        <w:t xml:space="preserve">This policy outlines the rules regarding Archival Access. All patrons must adhere strictly to these guidelines to ensure fair access and safety. Failure to comply with the Archival Access policy may result in suspension of library privileges. This policy outlines the rules regarding Archival Access. All patrons must adhere strictly to these guidelines to ensure fair access and safety. Failure to comply with the Archival Access policy may result in suspension of library privileges. This policy outlines the rules regarding Archival Access. All patrons must adhere strictly to these guidelines to ensure fair access and safety. Failure to comply with the Archival Access policy may result in suspension of library privileges. This policy outlines the rules regarding Archival Access. All patrons must adhere strictly to these guidelines to ensure fair access and safety. Failure to comply with the Archival Access policy may result in suspension of library privileges. This policy outlines the rules regarding Archival Access. All patrons must adhere strictly to these guidelines to ensure fair access and safety. Failure to comply with the Archival Access policy may result in suspension of library privileges. This policy outlines the rules regarding Archival Access. All patrons must adhere strictly to these guidelines to ensure fair access and safety. Failure to comply with the Archival Access policy may result in suspension of library privileges. </w:t>
-      </w:r>
-    </w:p>
-    <w:p>
-      <w:r>
-        <w:t xml:space="preserve">This policy outlines the rules regarding Archival Access. All patrons must adhere strictly to these guidelines to ensure fair access and safety. Failure to comply with the Archival Access policy may result in suspension of library privileges. This policy outlines the rules regarding Archival Access. All patrons must adhere strictly to these guidelines to ensure fair access and safety. Failure to comply with the Archival Access policy may result in suspension of library privileges. This policy outlines the rules regarding Archival Access. All patrons must adhere strictly to these guidelines to ensure fair access and safety. Failure to comply with the Archival Access policy may result in suspension of library privileges. This policy outlines the rules regarding Archival Access. All patrons must adhere strictly to these guidelines to ensure fair access and safety. Failure to comply with the Archival Access policy may result in suspension of library privileges. This policy outlines the rules regarding Archival Access. All patrons must adhere strictly to these guidelines to ensure fair access and safety. Failure to comply with the Archival Access policy may result in suspension of library privileges. This policy outlines the rules regarding Archival Access. All patrons must adhere strictly to these guidelines to ensure fair access and safety. Failure to comply with the Archival Access policy may result in suspension of library privileges. </w:t>
-      </w:r>
-    </w:p>
-    <w:p>
-      <w:r>
-        <w:t xml:space="preserve">This policy outlines the rules regarding Archival Access. All patrons must adhere strictly to these guidelines to ensure fair access and safety. Failure to comply with the Archival Access policy may result in suspension of library privileges. This policy outlines the rules regarding Archival Access. All patrons must adhere strictly to these guidelines to ensure fair access and safety. Failure to comply with the Archival Access policy may result in suspension of library privileges. This policy outlines the rules regarding Archival Access. All patrons must adhere strictly to these guidelines to ensure fair access and safety. Failure to comply with the Archival Access policy may result in suspension of library privileges. This policy outlines the rules regarding Archival Access. All patrons must adhere strictly to these guidelines to ensure fair access and safety. Failure to comply with the Archival Access policy may result in suspension of library privileges. This policy outlines the rules regarding Archival Access. All patrons must adhere strictly to these guidelines to ensure fair access and safety. Failure to comply with the Archival Access policy may result in suspension of library privileges. This policy outlines the rules regarding Archival Access. All patrons must adhere strictly to these guidelines to ensure fair access and safety. Failure to comply with the Archival Access policy may result in suspension of library privileges. </w:t>
-      </w:r>
-    </w:p>
-    <w:p>
-      <w:r>
-        <w:br w:type="page"/>
-      </w:r>
-    </w:p>
-    <w:p>
-      <w:pPr>
-        <w:pStyle w:val="Heading2"/>
-      </w:pPr>
-      <w:r>
-        <w:t>Archival Access - Part 9</w:t>
-      </w:r>
-    </w:p>
-    <w:p>
-      <w:r>
-        <w:t xml:space="preserve">This policy outlines the rules regarding Archival Access. All patrons must adhere strictly to these guidelines to ensure fair access and safety. Failure to comply with the Archival Access policy may result in suspension of library privileges. This policy outlines the rules regarding Archival Access. All patrons must adhere strictly to these guidelines to ensure fair access and safety. Failure to comply with the Archival Access policy may result in suspension of library privileges. This policy outlines the rules regarding Archival Access. All patrons must adhere strictly to these guidelines to ensure fair access and safety. Failure to comply with the Archival Access policy may result in suspension of library privileges. This policy outlines the rules regarding Archival Access. All patrons must adhere strictly to these guidelines to ensure fair access and safety. Failure to comply with the Archival Access policy may result in suspension of library privileges. This policy outlines the rules regarding Archival Access. All patrons must adhere strictly to these guidelines to ensure fair access and safety. Failure to comply with the Archival Access policy may result in suspension of library privileges. This policy outlines the rules regarding Archival Access. All patrons must adhere strictly to these guidelines to ensure fair access and safety. Failure to comply with the Archival Access policy may result in suspension of library privileges. </w:t>
-      </w:r>
-    </w:p>
-    <w:p>
-      <w:r>
-        <w:t xml:space="preserve">This policy outlines the rules regarding Archival Access. All patrons must adhere strictly to these guidelines to ensure fair access and safety. Failure to comply with the Archival Access policy may result in suspension of library privileges. This policy outlines the rules regarding Archival Access. All patrons must adhere strictly to these guidelines to ensure fair access and safety. Failure to comply with the Archival Access policy may result in suspension of library privileges. This policy outlines the rules regarding Archival Access. All patrons must adhere strictly to these guidelines to ensure fair access and safety. Failure to comply with the Archival Access policy may result in suspension of library privileges. This policy outlines the rules regarding Archival Access. All patrons must adhere strictly to these guidelines to ensure fair access and safety. Failure to comply with the Archival Access policy may result in suspension of library privileges. This policy outlines the rules regarding Archival Access. All patrons must adhere strictly to these guidelines to ensure fair access and safety. Failure to comply with the Archival Access policy may result in suspension of library privileges. This policy outlines the rules regarding Archival Access. All patrons must adhere strictly to these guidelines to ensure fair access and safety. Failure to comply with the Archival Access policy may result in suspension of library privileges. </w:t>
-      </w:r>
-    </w:p>
-    <w:p>
-      <w:r>
-        <w:t xml:space="preserve">This policy outlines the rules regarding Archival Access. All patrons must adhere strictly to these guidelines to ensure fair access and safety. Failure to comply with the Archival Access policy may result in suspension of library privileges. This policy outlines the rules regarding Archival Access. All patrons must adhere strictly to these guidelines to ensure fair access and safety. Failure to comply with the Archival Access policy may result in suspension of library privileges. This policy outlines the rules regarding Archival Access. All patrons must adhere strictly to these guidelines to ensure fair access and safety. Failure to comply with the Archival Access policy may result in suspension of library privileges. This policy outlines the rules regarding Archival Access. All patrons must adhere strictly to these guidelines to ensure fair access and safety. Failure to comply with the Archival Access policy may result in suspension of library privileges. This policy outlines the rules regarding Archival Access. All patrons must adhere strictly to these guidelines to ensure fair access and safety. Failure to comply with the Archival Access policy may result in suspension of library privileges. This policy outlines the rules regarding Archival Access. All patrons must adhere strictly to these guidelines to ensure fair access and safety. Failure to comply with the Archival Access policy may result in suspension of library privileges. </w:t>
-      </w:r>
-    </w:p>
-    <w:p>
-      <w:r>
-        <w:br w:type="page"/>
-      </w:r>
-    </w:p>
-    <w:p>
-      <w:pPr>
-        <w:pStyle w:val="Heading2"/>
-      </w:pPr>
-      <w:r>
-        <w:t>Archival Access - Part 10</w:t>
-      </w:r>
-    </w:p>
-    <w:p>
-      <w:r>
-        <w:t xml:space="preserve">This policy outlines the rules regarding Archival Access. All patrons must adhere strictly to these guidelines to ensure fair access and safety. Failure to comply with the Archival Access policy may result in suspension of library privileges. This policy outlines the rules regarding Archival Access. All patrons must adhere strictly to these guidelines to ensure fair access and safety. Failure to comply with the Archival Access policy may result in suspension of library privileges. This policy outlines the rules regarding Archival Access. All patrons must adhere strictly to these guidelines to ensure fair access and safety. Failure to comply with the Archival Access policy may result in suspension of library privileges. This policy outlines the rules regarding Archival Access. All patrons must adhere strictly to these guidelines to ensure fair access and safety. Failure to comply with the Archival Access policy may result in suspension of library privileges. This policy outlines the rules regarding Archival Access. All patrons must adhere strictly to these guidelines to ensure fair access and safety. Failure to comply with the Archival Access policy may result in suspension of library privileges. This policy outlines the rules regarding Archival Access. All patrons must adhere strictly to these guidelines to ensure fair access and safety. Failure to comply with the Archival Access policy may result in suspension of library privileges. </w:t>
-      </w:r>
-    </w:p>
-    <w:p>
-      <w:r>
-        <w:t xml:space="preserve">This policy outlines the rules regarding Archival Access. All patrons must adhere strictly to these guidelines to ensure fair access and safety. Failure to comply with the Archival Access policy may result in suspension of library privileges. This policy outlines the rules regarding Archival Access. All patrons must adhere strictly to these guidelines to ensure fair access and safety. Failure to comply with the Archival Access policy may result in suspension of library privileges. This policy outlines the rules regarding Archival Access. All patrons must adhere strictly to these guidelines to ensure fair access and safety. Failure to comply with the Archival Access policy may result in suspension of library privileges. This policy outlines the rules regarding Archival Access. All patrons must adhere strictly to these guidelines to ensure fair access and safety. Failure to comply with the Archival Access policy may result in suspension of library privileges. This policy outlines the rules regarding Archival Access. All patrons must adhere strictly to these guidelines to ensure fair access and safety. Failure to comply with the Archival Access policy may result in suspension of library privileges. This policy outlines the rules regarding Archival Access. All patrons must adhere strictly to these guidelines to ensure fair access and safety. Failure to comply with the Archival Access policy may result in suspension of library privileges. </w:t>
-      </w:r>
-    </w:p>
-    <w:p>
-      <w:r>
-        <w:t xml:space="preserve">This policy outlines the rules regarding Archival Access. All patrons must adhere strictly to these guidelines to ensure fair access and safety. Failure to comply with the Archival Access policy may result in suspension of library privileges. This policy outlines the rules regarding Archival Access. All patrons must adhere strictly to these guidelines to ensure fair access and safety. Failure to comply with the Archival Access policy may result in suspension of library privileges. This policy outlines the rules regarding Archival Access. All patrons must adhere strictly to these guidelines to ensure fair access and safety. Failure to comply with the Archival Access policy may result in suspension of library privileges. This policy outlines the rules regarding Archival Access. All patrons must adhere strictly to these guidelines to ensure fair access and safety. Failure to comply with the Archival Access policy may result in suspension of library privileges. This policy outlines the rules regarding Archival Access. All patrons must adhere strictly to these guidelines to ensure fair access and safety. Failure to comply with the Archival Access policy may result in suspension of library privileges. This policy outlines the rules regarding Archival Access. All patrons must adhere strictly to these guidelines to ensure fair access and safety. Failure to comply with the Archival Access policy may result in suspension of library privileges. </w:t>
-      </w:r>
-    </w:p>
-    <w:p>
-      <w:r>
-        <w:br w:type="page"/>
+        <w:t>- Special Collections: Rare books and University archives must be consulted in the Special Collections Reading Room on Floor 5.</w:t>
+        <w:br/>
+        <w:t>- Handling Rules: Gloves and pencils only; pens, food, and bags are prohibited inside the Reading Room.</w:t>
+        <w:br/>
+        <w:t>- Digitization Requests: High-resolution scans can be requested through the archives desk subject to copyright law.</w:t>
       </w:r>
     </w:p>
     <w:p>
@@ -2611,278 +178,12 @@
       </w:r>
     </w:p>
     <w:p>
-      <w:pPr>
-        <w:pStyle w:val="Heading2"/>
-      </w:pPr>
       <w:r>
-        <w:t>Emergency Procedures - Part 1</w:t>
-      </w:r>
-    </w:p>
-    <w:p>
-      <w:r>
-        <w:t xml:space="preserve">This policy outlines the rules regarding Emergency Procedures. All patrons must adhere strictly to these guidelines to ensure fair access and safety. Failure to comply with the Emergency Procedures policy may result in suspension of library privileges. This policy outlines the rules regarding Emergency Procedures. All patrons must adhere strictly to these guidelines to ensure fair access and safety. Failure to comply with the Emergency Procedures policy may result in suspension of library privileges. This policy outlines the rules regarding Emergency Procedures. All patrons must adhere strictly to these guidelines to ensure fair access and safety. Failure to comply with the Emergency Procedures policy may result in suspension of library privileges. This policy outlines the rules regarding Emergency Procedures. All patrons must adhere strictly to these guidelines to ensure fair access and safety. Failure to comply with the Emergency Procedures policy may result in suspension of library privileges. This policy outlines the rules regarding Emergency Procedures. All patrons must adhere strictly to these guidelines to ensure fair access and safety. Failure to comply with the Emergency Procedures policy may result in suspension of library privileges. This policy outlines the rules regarding Emergency Procedures. All patrons must adhere strictly to these guidelines to ensure fair access and safety. Failure to comply with the Emergency Procedures policy may result in suspension of library privileges. </w:t>
-      </w:r>
-    </w:p>
-    <w:p>
-      <w:r>
-        <w:t xml:space="preserve">This policy outlines the rules regarding Emergency Procedures. All patrons must adhere strictly to these guidelines to ensure fair access and safety. Failure to comply with the Emergency Procedures policy may result in suspension of library privileges. This policy outlines the rules regarding Emergency Procedures. All patrons must adhere strictly to these guidelines to ensure fair access and safety. Failure to comply with the Emergency Procedures policy may result in suspension of library privileges. This policy outlines the rules regarding Emergency Procedures. All patrons must adhere strictly to these guidelines to ensure fair access and safety. Failure to comply with the Emergency Procedures policy may result in suspension of library privileges. This policy outlines the rules regarding Emergency Procedures. All patrons must adhere strictly to these guidelines to ensure fair access and safety. Failure to comply with the Emergency Procedures policy may result in suspension of library privileges. This policy outlines the rules regarding Emergency Procedures. All patrons must adhere strictly to these guidelines to ensure fair access and safety. Failure to comply with the Emergency Procedures policy may result in suspension of library privileges. This policy outlines the rules regarding Emergency Procedures. All patrons must adhere strictly to these guidelines to ensure fair access and safety. Failure to comply with the Emergency Procedures policy may result in suspension of library privileges. </w:t>
-      </w:r>
-    </w:p>
-    <w:p>
-      <w:r>
-        <w:t xml:space="preserve">This policy outlines the rules regarding Emergency Procedures. All patrons must adhere strictly to these guidelines to ensure fair access and safety. Failure to comply with the Emergency Procedures policy may result in suspension of library privileges. This policy outlines the rules regarding Emergency Procedures. All patrons must adhere strictly to these guidelines to ensure fair access and safety. Failure to comply with the Emergency Procedures policy may result in suspension of library privileges. This policy outlines the rules regarding Emergency Procedures. All patrons must adhere strictly to these guidelines to ensure fair access and safety. Failure to comply with the Emergency Procedures policy may result in suspension of library privileges. This policy outlines the rules regarding Emergency Procedures. All patrons must adhere strictly to these guidelines to ensure fair access and safety. Failure to comply with the Emergency Procedures policy may result in suspension of library privileges. This policy outlines the rules regarding Emergency Procedures. All patrons must adhere strictly to these guidelines to ensure fair access and safety. Failure to comply with the Emergency Procedures policy may result in suspension of library privileges. This policy outlines the rules regarding Emergency Procedures. All patrons must adhere strictly to these guidelines to ensure fair access and safety. Failure to comply with the Emergency Procedures policy may result in suspension of library privileges. </w:t>
-      </w:r>
-    </w:p>
-    <w:p>
-      <w:r>
-        <w:br w:type="page"/>
-      </w:r>
-    </w:p>
-    <w:p>
-      <w:pPr>
-        <w:pStyle w:val="Heading2"/>
-      </w:pPr>
-      <w:r>
-        <w:t>Emergency Procedures - Part 2</w:t>
-      </w:r>
-    </w:p>
-    <w:p>
-      <w:r>
-        <w:t xml:space="preserve">This policy outlines the rules regarding Emergency Procedures. All patrons must adhere strictly to these guidelines to ensure fair access and safety. Failure to comply with the Emergency Procedures policy may result in suspension of library privileges. This policy outlines the rules regarding Emergency Procedures. All patrons must adhere strictly to these guidelines to ensure fair access and safety. Failure to comply with the Emergency Procedures policy may result in suspension of library privileges. This policy outlines the rules regarding Emergency Procedures. All patrons must adhere strictly to these guidelines to ensure fair access and safety. Failure to comply with the Emergency Procedures policy may result in suspension of library privileges. This policy outlines the rules regarding Emergency Procedures. All patrons must adhere strictly to these guidelines to ensure fair access and safety. Failure to comply with the Emergency Procedures policy may result in suspension of library privileges. This policy outlines the rules regarding Emergency Procedures. All patrons must adhere strictly to these guidelines to ensure fair access and safety. Failure to comply with the Emergency Procedures policy may result in suspension of library privileges. This policy outlines the rules regarding Emergency Procedures. All patrons must adhere strictly to these guidelines to ensure fair access and safety. Failure to comply with the Emergency Procedures policy may result in suspension of library privileges. </w:t>
-      </w:r>
-    </w:p>
-    <w:p>
-      <w:r>
-        <w:t xml:space="preserve">This policy outlines the rules regarding Emergency Procedures. All patrons must adhere strictly to these guidelines to ensure fair access and safety. Failure to comply with the Emergency Procedures policy may result in suspension of library privileges. This policy outlines the rules regarding Emergency Procedures. All patrons must adhere strictly to these guidelines to ensure fair access and safety. Failure to comply with the Emergency Procedures policy may result in suspension of library privileges. This policy outlines the rules regarding Emergency Procedures. All patrons must adhere strictly to these guidelines to ensure fair access and safety. Failure to comply with the Emergency Procedures policy may result in suspension of library privileges. This policy outlines the rules regarding Emergency Procedures. All patrons must adhere strictly to these guidelines to ensure fair access and safety. Failure to comply with the Emergency Procedures policy may result in suspension of library privileges. This policy outlines the rules regarding Emergency Procedures. All patrons must adhere strictly to these guidelines to ensure fair access and safety. Failure to comply with the Emergency Procedures policy may result in suspension of library privileges. This policy outlines the rules regarding Emergency Procedures. All patrons must adhere strictly to these guidelines to ensure fair access and safety. Failure to comply with the Emergency Procedures policy may result in suspension of library privileges. </w:t>
-      </w:r>
-    </w:p>
-    <w:p>
-      <w:r>
-        <w:t xml:space="preserve">This policy outlines the rules regarding Emergency Procedures. All patrons must adhere strictly to these guidelines to ensure fair access and safety. Failure to comply with the Emergency Procedures policy may result in suspension of library privileges. This policy outlines the rules regarding Emergency Procedures. All patrons must adhere strictly to these guidelines to ensure fair access and safety. Failure to comply with the Emergency Procedures policy may result in suspension of library privileges. This policy outlines the rules regarding Emergency Procedures. All patrons must adhere strictly to these guidelines to ensure fair access and safety. Failure to comply with the Emergency Procedures policy may result in suspension of library privileges. This policy outlines the rules regarding Emergency Procedures. All patrons must adhere strictly to these guidelines to ensure fair access and safety. Failure to comply with the Emergency Procedures policy may result in suspension of library privileges. This policy outlines the rules regarding Emergency Procedures. All patrons must adhere strictly to these guidelines to ensure fair access and safety. Failure to comply with the Emergency Procedures policy may result in suspension of library privileges. This policy outlines the rules regarding Emergency Procedures. All patrons must adhere strictly to these guidelines to ensure fair access and safety. Failure to comply with the Emergency Procedures policy may result in suspension of library privileges. </w:t>
-      </w:r>
-    </w:p>
-    <w:p>
-      <w:r>
-        <w:br w:type="page"/>
-      </w:r>
-    </w:p>
-    <w:p>
-      <w:pPr>
-        <w:pStyle w:val="Heading2"/>
-      </w:pPr>
-      <w:r>
-        <w:t>Emergency Procedures - Part 3</w:t>
-      </w:r>
-    </w:p>
-    <w:p>
-      <w:r>
-        <w:t xml:space="preserve">This policy outlines the rules regarding Emergency Procedures. All patrons must adhere strictly to these guidelines to ensure fair access and safety. Failure to comply with the Emergency Procedures policy may result in suspension of library privileges. This policy outlines the rules regarding Emergency Procedures. All patrons must adhere strictly to these guidelines to ensure fair access and safety. Failure to comply with the Emergency Procedures policy may result in suspension of library privileges. This policy outlines the rules regarding Emergency Procedures. All patrons must adhere strictly to these guidelines to ensure fair access and safety. Failure to comply with the Emergency Procedures policy may result in suspension of library privileges. This policy outlines the rules regarding Emergency Procedures. All patrons must adhere strictly to these guidelines to ensure fair access and safety. Failure to comply with the Emergency Procedures policy may result in suspension of library privileges. This policy outlines the rules regarding Emergency Procedures. All patrons must adhere strictly to these guidelines to ensure fair access and safety. Failure to comply with the Emergency Procedures policy may result in suspension of library privileges. This policy outlines the rules regarding Emergency Procedures. All patrons must adhere strictly to these guidelines to ensure fair access and safety. Failure to comply with the Emergency Procedures policy may result in suspension of library privileges. </w:t>
-      </w:r>
-    </w:p>
-    <w:p>
-      <w:r>
-        <w:t xml:space="preserve">This policy outlines the rules regarding Emergency Procedures. All patrons must adhere strictly to these guidelines to ensure fair access and safety. Failure to comply with the Emergency Procedures policy may result in suspension of library privileges. This policy outlines the rules regarding Emergency Procedures. All patrons must adhere strictly to these guidelines to ensure fair access and safety. Failure to comply with the Emergency Procedures policy may result in suspension of library privileges. This policy outlines the rules regarding Emergency Procedures. All patrons must adhere strictly to these guidelines to ensure fair access and safety. Failure to comply with the Emergency Procedures policy may result in suspension of library privileges. This policy outlines the rules regarding Emergency Procedures. All patrons must adhere strictly to these guidelines to ensure fair access and safety. Failure to comply with the Emergency Procedures policy may result in suspension of library privileges. This policy outlines the rules regarding Emergency Procedures. All patrons must adhere strictly to these guidelines to ensure fair access and safety. Failure to comply with the Emergency Procedures policy may result in suspension of library privileges. This policy outlines the rules regarding Emergency Procedures. All patrons must adhere strictly to these guidelines to ensure fair access and safety. Failure to comply with the Emergency Procedures policy may result in suspension of library privileges. </w:t>
-      </w:r>
-    </w:p>
-    <w:p>
-      <w:r>
-        <w:t xml:space="preserve">This policy outlines the rules regarding Emergency Procedures. All patrons must adhere strictly to these guidelines to ensure fair access and safety. Failure to comply with the Emergency Procedures policy may result in suspension of library privileges. This policy outlines the rules regarding Emergency Procedures. All patrons must adhere strictly to these guidelines to ensure fair access and safety. Failure to comply with the Emergency Procedures policy may result in suspension of library privileges. This policy outlines the rules regarding Emergency Procedures. All patrons must adhere strictly to these guidelines to ensure fair access and safety. Failure to comply with the Emergency Procedures policy may result in suspension of library privileges. This policy outlines the rules regarding Emergency Procedures. All patrons must adhere strictly to these guidelines to ensure fair access and safety. Failure to comply with the Emergency Procedures policy may result in suspension of library privileges. This policy outlines the rules regarding Emergency Procedures. All patrons must adhere strictly to these guidelines to ensure fair access and safety. Failure to comply with the Emergency Procedures policy may result in suspension of library privileges. This policy outlines the rules regarding Emergency Procedures. All patrons must adhere strictly to these guidelines to ensure fair access and safety. Failure to comply with the Emergency Procedures policy may result in suspension of library privileges. </w:t>
-      </w:r>
-    </w:p>
-    <w:p>
-      <w:r>
-        <w:br w:type="page"/>
-      </w:r>
-    </w:p>
-    <w:p>
-      <w:pPr>
-        <w:pStyle w:val="Heading2"/>
-      </w:pPr>
-      <w:r>
-        <w:t>Emergency Procedures - Part 4</w:t>
-      </w:r>
-    </w:p>
-    <w:p>
-      <w:r>
-        <w:t xml:space="preserve">This policy outlines the rules regarding Emergency Procedures. All patrons must adhere strictly to these guidelines to ensure fair access and safety. Failure to comply with the Emergency Procedures policy may result in suspension of library privileges. This policy outlines the rules regarding Emergency Procedures. All patrons must adhere strictly to these guidelines to ensure fair access and safety. Failure to comply with the Emergency Procedures policy may result in suspension of library privileges. This policy outlines the rules regarding Emergency Procedures. All patrons must adhere strictly to these guidelines to ensure fair access and safety. Failure to comply with the Emergency Procedures policy may result in suspension of library privileges. This policy outlines the rules regarding Emergency Procedures. All patrons must adhere strictly to these guidelines to ensure fair access and safety. Failure to comply with the Emergency Procedures policy may result in suspension of library privileges. This policy outlines the rules regarding Emergency Procedures. All patrons must adhere strictly to these guidelines to ensure fair access and safety. Failure to comply with the Emergency Procedures policy may result in suspension of library privileges. This policy outlines the rules regarding Emergency Procedures. All patrons must adhere strictly to these guidelines to ensure fair access and safety. Failure to comply with the Emergency Procedures policy may result in suspension of library privileges. </w:t>
-      </w:r>
-    </w:p>
-    <w:p>
-      <w:r>
-        <w:t xml:space="preserve">This policy outlines the rules regarding Emergency Procedures. All patrons must adhere strictly to these guidelines to ensure fair access and safety. Failure to comply with the Emergency Procedures policy may result in suspension of library privileges. This policy outlines the rules regarding Emergency Procedures. All patrons must adhere strictly to these guidelines to ensure fair access and safety. Failure to comply with the Emergency Procedures policy may result in suspension of library privileges. This policy outlines the rules regarding Emergency Procedures. All patrons must adhere strictly to these guidelines to ensure fair access and safety. Failure to comply with the Emergency Procedures policy may result in suspension of library privileges. This policy outlines the rules regarding Emergency Procedures. All patrons must adhere strictly to these guidelines to ensure fair access and safety. Failure to comply with the Emergency Procedures policy may result in suspension of library privileges. This policy outlines the rules regarding Emergency Procedures. All patrons must adhere strictly to these guidelines to ensure fair access and safety. Failure to comply with the Emergency Procedures policy may result in suspension of library privileges. This policy outlines the rules regarding Emergency Procedures. All patrons must adhere strictly to these guidelines to ensure fair access and safety. Failure to comply with the Emergency Procedures policy may result in suspension of library privileges. </w:t>
-      </w:r>
-    </w:p>
-    <w:p>
-      <w:r>
-        <w:t xml:space="preserve">This policy outlines the rules regarding Emergency Procedures. All patrons must adhere strictly to these guidelines to ensure fair access and safety. Failure to comply with the Emergency Procedures policy may result in suspension of library privileges. This policy outlines the rules regarding Emergency Procedures. All patrons must adhere strictly to these guidelines to ensure fair access and safety. Failure to comply with the Emergency Procedures policy may result in suspension of library privileges. This policy outlines the rules regarding Emergency Procedures. All patrons must adhere strictly to these guidelines to ensure fair access and safety. Failure to comply with the Emergency Procedures policy may result in suspension of library privileges. This policy outlines the rules regarding Emergency Procedures. All patrons must adhere strictly to these guidelines to ensure fair access and safety. Failure to comply with the Emergency Procedures policy may result in suspension of library privileges. This policy outlines the rules regarding Emergency Procedures. All patrons must adhere strictly to these guidelines to ensure fair access and safety. Failure to comply with the Emergency Procedures policy may result in suspension of library privileges. This policy outlines the rules regarding Emergency Procedures. All patrons must adhere strictly to these guidelines to ensure fair access and safety. Failure to comply with the Emergency Procedures policy may result in suspension of library privileges. </w:t>
-      </w:r>
-    </w:p>
-    <w:p>
-      <w:r>
-        <w:br w:type="page"/>
-      </w:r>
-    </w:p>
-    <w:p>
-      <w:pPr>
-        <w:pStyle w:val="Heading2"/>
-      </w:pPr>
-      <w:r>
-        <w:t>Emergency Procedures - Part 5</w:t>
-      </w:r>
-    </w:p>
-    <w:p>
-      <w:r>
-        <w:t xml:space="preserve">This policy outlines the rules regarding Emergency Procedures. All patrons must adhere strictly to these guidelines to ensure fair access and safety. Failure to comply with the Emergency Procedures policy may result in suspension of library privileges. This policy outlines the rules regarding Emergency Procedures. All patrons must adhere strictly to these guidelines to ensure fair access and safety. Failure to comply with the Emergency Procedures policy may result in suspension of library privileges. This policy outlines the rules regarding Emergency Procedures. All patrons must adhere strictly to these guidelines to ensure fair access and safety. Failure to comply with the Emergency Procedures policy may result in suspension of library privileges. This policy outlines the rules regarding Emergency Procedures. All patrons must adhere strictly to these guidelines to ensure fair access and safety. Failure to comply with the Emergency Procedures policy may result in suspension of library privileges. This policy outlines the rules regarding Emergency Procedures. All patrons must adhere strictly to these guidelines to ensure fair access and safety. Failure to comply with the Emergency Procedures policy may result in suspension of library privileges. This policy outlines the rules regarding Emergency Procedures. All patrons must adhere strictly to these guidelines to ensure fair access and safety. Failure to comply with the Emergency Procedures policy may result in suspension of library privileges. </w:t>
-      </w:r>
-    </w:p>
-    <w:p>
-      <w:r>
-        <w:t xml:space="preserve">This policy outlines the rules regarding Emergency Procedures. All patrons must adhere strictly to these guidelines to ensure fair access and safety. Failure to comply with the Emergency Procedures policy may result in suspension of library privileges. This policy outlines the rules regarding Emergency Procedures. All patrons must adhere strictly to these guidelines to ensure fair access and safety. Failure to comply with the Emergency Procedures policy may result in suspension of library privileges. This policy outlines the rules regarding Emergency Procedures. All patrons must adhere strictly to these guidelines to ensure fair access and safety. Failure to comply with the Emergency Procedures policy may result in suspension of library privileges. This policy outlines the rules regarding Emergency Procedures. All patrons must adhere strictly to these guidelines to ensure fair access and safety. Failure to comply with the Emergency Procedures policy may result in suspension of library privileges. This policy outlines the rules regarding Emergency Procedures. All patrons must adhere strictly to these guidelines to ensure fair access and safety. Failure to comply with the Emergency Procedures policy may result in suspension of library privileges. This policy outlines the rules regarding Emergency Procedures. All patrons must adhere strictly to these guidelines to ensure fair access and safety. Failure to comply with the Emergency Procedures policy may result in suspension of library privileges. </w:t>
-      </w:r>
-    </w:p>
-    <w:p>
-      <w:r>
-        <w:t xml:space="preserve">This policy outlines the rules regarding Emergency Procedures. All patrons must adhere strictly to these guidelines to ensure fair access and safety. Failure to comply with the Emergency Procedures policy may result in suspension of library privileges. This policy outlines the rules regarding Emergency Procedures. All patrons must adhere strictly to these guidelines to ensure fair access and safety. Failure to comply with the Emergency Procedures policy may result in suspension of library privileges. This policy outlines the rules regarding Emergency Procedures. All patrons must adhere strictly to these guidelines to ensure fair access and safety. Failure to comply with the Emergency Procedures policy may result in suspension of library privileges. This policy outlines the rules regarding Emergency Procedures. All patrons must adhere strictly to these guidelines to ensure fair access and safety. Failure to comply with the Emergency Procedures policy may result in suspension of library privileges. This policy outlines the rules regarding Emergency Procedures. All patrons must adhere strictly to these guidelines to ensure fair access and safety. Failure to comply with the Emergency Procedures policy may result in suspension of library privileges. This policy outlines the rules regarding Emergency Procedures. All patrons must adhere strictly to these guidelines to ensure fair access and safety. Failure to comply with the Emergency Procedures policy may result in suspension of library privileges. </w:t>
-      </w:r>
-    </w:p>
-    <w:p>
-      <w:r>
-        <w:br w:type="page"/>
-      </w:r>
-    </w:p>
-    <w:p>
-      <w:pPr>
-        <w:pStyle w:val="Heading2"/>
-      </w:pPr>
-      <w:r>
-        <w:t>Emergency Procedures - Part 6</w:t>
-      </w:r>
-    </w:p>
-    <w:p>
-      <w:r>
-        <w:t xml:space="preserve">This policy outlines the rules regarding Emergency Procedures. All patrons must adhere strictly to these guidelines to ensure fair access and safety. Failure to comply with the Emergency Procedures policy may result in suspension of library privileges. This policy outlines the rules regarding Emergency Procedures. All patrons must adhere strictly to these guidelines to ensure fair access and safety. Failure to comply with the Emergency Procedures policy may result in suspension of library privileges. This policy outlines the rules regarding Emergency Procedures. All patrons must adhere strictly to these guidelines to ensure fair access and safety. Failure to comply with the Emergency Procedures policy may result in suspension of library privileges. This policy outlines the rules regarding Emergency Procedures. All patrons must adhere strictly to these guidelines to ensure fair access and safety. Failure to comply with the Emergency Procedures policy may result in suspension of library privileges. This policy outlines the rules regarding Emergency Procedures. All patrons must adhere strictly to these guidelines to ensure fair access and safety. Failure to comply with the Emergency Procedures policy may result in suspension of library privileges. This policy outlines the rules regarding Emergency Procedures. All patrons must adhere strictly to these guidelines to ensure fair access and safety. Failure to comply with the Emergency Procedures policy may result in suspension of library privileges. </w:t>
-      </w:r>
-    </w:p>
-    <w:p>
-      <w:r>
-        <w:t xml:space="preserve">This policy outlines the rules regarding Emergency Procedures. All patrons must adhere strictly to these guidelines to ensure fair access and safety. Failure to comply with the Emergency Procedures policy may result in suspension of library privileges. This policy outlines the rules regarding Emergency Procedures. All patrons must adhere strictly to these guidelines to ensure fair access and safety. Failure to comply with the Emergency Procedures policy may result in suspension of library privileges. This policy outlines the rules regarding Emergency Procedures. All patrons must adhere strictly to these guidelines to ensure fair access and safety. Failure to comply with the Emergency Procedures policy may result in suspension of library privileges. This policy outlines the rules regarding Emergency Procedures. All patrons must adhere strictly to these guidelines to ensure fair access and safety. Failure to comply with the Emergency Procedures policy may result in suspension of library privileges. This policy outlines the rules regarding Emergency Procedures. All patrons must adhere strictly to these guidelines to ensure fair access and safety. Failure to comply with the Emergency Procedures policy may result in suspension of library privileges. This policy outlines the rules regarding Emergency Procedures. All patrons must adhere strictly to these guidelines to ensure fair access and safety. Failure to comply with the Emergency Procedures policy may result in suspension of library privileges. </w:t>
-      </w:r>
-    </w:p>
-    <w:p>
-      <w:r>
-        <w:t xml:space="preserve">This policy outlines the rules regarding Emergency Procedures. All patrons must adhere strictly to these guidelines to ensure fair access and safety. Failure to comply with the Emergency Procedures policy may result in suspension of library privileges. This policy outlines the rules regarding Emergency Procedures. All patrons must adhere strictly to these guidelines to ensure fair access and safety. Failure to comply with the Emergency Procedures policy may result in suspension of library privileges. This policy outlines the rules regarding Emergency Procedures. All patrons must adhere strictly to these guidelines to ensure fair access and safety. Failure to comply with the Emergency Procedures policy may result in suspension of library privileges. This policy outlines the rules regarding Emergency Procedures. All patrons must adhere strictly to these guidelines to ensure fair access and safety. Failure to comply with the Emergency Procedures policy may result in suspension of library privileges. This policy outlines the rules regarding Emergency Procedures. All patrons must adhere strictly to these guidelines to ensure fair access and safety. Failure to comply with the Emergency Procedures policy may result in suspension of library privileges. This policy outlines the rules regarding Emergency Procedures. All patrons must adhere strictly to these guidelines to ensure fair access and safety. Failure to comply with the Emergency Procedures policy may result in suspension of library privileges. </w:t>
-      </w:r>
-    </w:p>
-    <w:p>
-      <w:r>
-        <w:br w:type="page"/>
-      </w:r>
-    </w:p>
-    <w:p>
-      <w:pPr>
-        <w:pStyle w:val="Heading2"/>
-      </w:pPr>
-      <w:r>
-        <w:t>Emergency Procedures - Part 7</w:t>
-      </w:r>
-    </w:p>
-    <w:p>
-      <w:r>
-        <w:t xml:space="preserve">This policy outlines the rules regarding Emergency Procedures. All patrons must adhere strictly to these guidelines to ensure fair access and safety. Failure to comply with the Emergency Procedures policy may result in suspension of library privileges. This policy outlines the rules regarding Emergency Procedures. All patrons must adhere strictly to these guidelines to ensure fair access and safety. Failure to comply with the Emergency Procedures policy may result in suspension of library privileges. This policy outlines the rules regarding Emergency Procedures. All patrons must adhere strictly to these guidelines to ensure fair access and safety. Failure to comply with the Emergency Procedures policy may result in suspension of library privileges. This policy outlines the rules regarding Emergency Procedures. All patrons must adhere strictly to these guidelines to ensure fair access and safety. Failure to comply with the Emergency Procedures policy may result in suspension of library privileges. This policy outlines the rules regarding Emergency Procedures. All patrons must adhere strictly to these guidelines to ensure fair access and safety. Failure to comply with the Emergency Procedures policy may result in suspension of library privileges. This policy outlines the rules regarding Emergency Procedures. All patrons must adhere strictly to these guidelines to ensure fair access and safety. Failure to comply with the Emergency Procedures policy may result in suspension of library privileges. </w:t>
-      </w:r>
-    </w:p>
-    <w:p>
-      <w:r>
-        <w:t xml:space="preserve">This policy outlines the rules regarding Emergency Procedures. All patrons must adhere strictly to these guidelines to ensure fair access and safety. Failure to comply with the Emergency Procedures policy may result in suspension of library privileges. This policy outlines the rules regarding Emergency Procedures. All patrons must adhere strictly to these guidelines to ensure fair access and safety. Failure to comply with the Emergency Procedures policy may result in suspension of library privileges. This policy outlines the rules regarding Emergency Procedures. All patrons must adhere strictly to these guidelines to ensure fair access and safety. Failure to comply with the Emergency Procedures policy may result in suspension of library privileges. This policy outlines the rules regarding Emergency Procedures. All patrons must adhere strictly to these guidelines to ensure fair access and safety. Failure to comply with the Emergency Procedures policy may result in suspension of library privileges. This policy outlines the rules regarding Emergency Procedures. All patrons must adhere strictly to these guidelines to ensure fair access and safety. Failure to comply with the Emergency Procedures policy may result in suspension of library privileges. This policy outlines the rules regarding Emergency Procedures. All patrons must adhere strictly to these guidelines to ensure fair access and safety. Failure to comply with the Emergency Procedures policy may result in suspension of library privileges. </w:t>
-      </w:r>
-    </w:p>
-    <w:p>
-      <w:r>
-        <w:t xml:space="preserve">This policy outlines the rules regarding Emergency Procedures. All patrons must adhere strictly to these guidelines to ensure fair access and safety. Failure to comply with the Emergency Procedures policy may result in suspension of library privileges. This policy outlines the rules regarding Emergency Procedures. All patrons must adhere strictly to these guidelines to ensure fair access and safety. Failure to comply with the Emergency Procedures policy may result in suspension of library privileges. This policy outlines the rules regarding Emergency Procedures. All patrons must adhere strictly to these guidelines to ensure fair access and safety. Failure to comply with the Emergency Procedures policy may result in suspension of library privileges. This policy outlines the rules regarding Emergency Procedures. All patrons must adhere strictly to these guidelines to ensure fair access and safety. Failure to comply with the Emergency Procedures policy may result in suspension of library privileges. This policy outlines the rules regarding Emergency Procedures. All patrons must adhere strictly to these guidelines to ensure fair access and safety. Failure to comply with the Emergency Procedures policy may result in suspension of library privileges. This policy outlines the rules regarding Emergency Procedures. All patrons must adhere strictly to these guidelines to ensure fair access and safety. Failure to comply with the Emergency Procedures policy may result in suspension of library privileges. </w:t>
-      </w:r>
-    </w:p>
-    <w:p>
-      <w:r>
-        <w:br w:type="page"/>
-      </w:r>
-    </w:p>
-    <w:p>
-      <w:pPr>
-        <w:pStyle w:val="Heading2"/>
-      </w:pPr>
-      <w:r>
-        <w:t>Emergency Procedures - Part 8</w:t>
-      </w:r>
-    </w:p>
-    <w:p>
-      <w:r>
-        <w:t xml:space="preserve">This policy outlines the rules regarding Emergency Procedures. All patrons must adhere strictly to these guidelines to ensure fair access and safety. Failure to comply with the Emergency Procedures policy may result in suspension of library privileges. This policy outlines the rules regarding Emergency Procedures. All patrons must adhere strictly to these guidelines to ensure fair access and safety. Failure to comply with the Emergency Procedures policy may result in suspension of library privileges. This policy outlines the rules regarding Emergency Procedures. All patrons must adhere strictly to these guidelines to ensure fair access and safety. Failure to comply with the Emergency Procedures policy may result in suspension of library privileges. This policy outlines the rules regarding Emergency Procedures. All patrons must adhere strictly to these guidelines to ensure fair access and safety. Failure to comply with the Emergency Procedures policy may result in suspension of library privileges. This policy outlines the rules regarding Emergency Procedures. All patrons must adhere strictly to these guidelines to ensure fair access and safety. Failure to comply with the Emergency Procedures policy may result in suspension of library privileges. This policy outlines the rules regarding Emergency Procedures. All patrons must adhere strictly to these guidelines to ensure fair access and safety. Failure to comply with the Emergency Procedures policy may result in suspension of library privileges. </w:t>
-      </w:r>
-    </w:p>
-    <w:p>
-      <w:r>
-        <w:t xml:space="preserve">This policy outlines the rules regarding Emergency Procedures. All patrons must adhere strictly to these guidelines to ensure fair access and safety. Failure to comply with the Emergency Procedures policy may result in suspension of library privileges. This policy outlines the rules regarding Emergency Procedures. All patrons must adhere strictly to these guidelines to ensure fair access and safety. Failure to comply with the Emergency Procedures policy may result in suspension of library privileges. This policy outlines the rules regarding Emergency Procedures. All patrons must adhere strictly to these guidelines to ensure fair access and safety. Failure to comply with the Emergency Procedures policy may result in suspension of library privileges. This policy outlines the rules regarding Emergency Procedures. All patrons must adhere strictly to these guidelines to ensure fair access and safety. Failure to comply with the Emergency Procedures policy may result in suspension of library privileges. This policy outlines the rules regarding Emergency Procedures. All patrons must adhere strictly to these guidelines to ensure fair access and safety. Failure to comply with the Emergency Procedures policy may result in suspension of library privileges. This policy outlines the rules regarding Emergency Procedures. All patrons must adhere strictly to these guidelines to ensure fair access and safety. Failure to comply with the Emergency Procedures policy may result in suspension of library privileges. </w:t>
-      </w:r>
-    </w:p>
-    <w:p>
-      <w:r>
-        <w:t xml:space="preserve">This policy outlines the rules regarding Emergency Procedures. All patrons must adhere strictly to these guidelines to ensure fair access and safety. Failure to comply with the Emergency Procedures policy may result in suspension of library privileges. This policy outlines the rules regarding Emergency Procedures. All patrons must adhere strictly to these guidelines to ensure fair access and safety. Failure to comply with the Emergency Procedures policy may result in suspension of library privileges. This policy outlines the rules regarding Emergency Procedures. All patrons must adhere strictly to these guidelines to ensure fair access and safety. Failure to comply with the Emergency Procedures policy may result in suspension of library privileges. This policy outlines the rules regarding Emergency Procedures. All patrons must adhere strictly to these guidelines to ensure fair access and safety. Failure to comply with the Emergency Procedures policy may result in suspension of library privileges. This policy outlines the rules regarding Emergency Procedures. All patrons must adhere strictly to these guidelines to ensure fair access and safety. Failure to comply with the Emergency Procedures policy may result in suspension of library privileges. This policy outlines the rules regarding Emergency Procedures. All patrons must adhere strictly to these guidelines to ensure fair access and safety. Failure to comply with the Emergency Procedures policy may result in suspension of library privileges. </w:t>
-      </w:r>
-    </w:p>
-    <w:p>
-      <w:r>
-        <w:br w:type="page"/>
-      </w:r>
-    </w:p>
-    <w:p>
-      <w:pPr>
-        <w:pStyle w:val="Heading2"/>
-      </w:pPr>
-      <w:r>
-        <w:t>Emergency Procedures - Part 9</w:t>
-      </w:r>
-    </w:p>
-    <w:p>
-      <w:r>
-        <w:t xml:space="preserve">This policy outlines the rules regarding Emergency Procedures. All patrons must adhere strictly to these guidelines to ensure fair access and safety. Failure to comply with the Emergency Procedures policy may result in suspension of library privileges. This policy outlines the rules regarding Emergency Procedures. All patrons must adhere strictly to these guidelines to ensure fair access and safety. Failure to comply with the Emergency Procedures policy may result in suspension of library privileges. This policy outlines the rules regarding Emergency Procedures. All patrons must adhere strictly to these guidelines to ensure fair access and safety. Failure to comply with the Emergency Procedures policy may result in suspension of library privileges. This policy outlines the rules regarding Emergency Procedures. All patrons must adhere strictly to these guidelines to ensure fair access and safety. Failure to comply with the Emergency Procedures policy may result in suspension of library privileges. This policy outlines the rules regarding Emergency Procedures. All patrons must adhere strictly to these guidelines to ensure fair access and safety. Failure to comply with the Emergency Procedures policy may result in suspension of library privileges. This policy outlines the rules regarding Emergency Procedures. All patrons must adhere strictly to these guidelines to ensure fair access and safety. Failure to comply with the Emergency Procedures policy may result in suspension of library privileges. </w:t>
-      </w:r>
-    </w:p>
-    <w:p>
-      <w:r>
-        <w:t xml:space="preserve">This policy outlines the rules regarding Emergency Procedures. All patrons must adhere strictly to these guidelines to ensure fair access and safety. Failure to comply with the Emergency Procedures policy may result in suspension of library privileges. This policy outlines the rules regarding Emergency Procedures. All patrons must adhere strictly to these guidelines to ensure fair access and safety. Failure to comply with the Emergency Procedures policy may result in suspension of library privileges. This policy outlines the rules regarding Emergency Procedures. All patrons must adhere strictly to these guidelines to ensure fair access and safety. Failure to comply with the Emergency Procedures policy may result in suspension of library privileges. This policy outlines the rules regarding Emergency Procedures. All patrons must adhere strictly to these guidelines to ensure fair access and safety. Failure to comply with the Emergency Procedures policy may result in suspension of library privileges. This policy outlines the rules regarding Emergency Procedures. All patrons must adhere strictly to these guidelines to ensure fair access and safety. Failure to comply with the Emergency Procedures policy may result in suspension of library privileges. This policy outlines the rules regarding Emergency Procedures. All patrons must adhere strictly to these guidelines to ensure fair access and safety. Failure to comply with the Emergency Procedures policy may result in suspension of library privileges. </w:t>
-      </w:r>
-    </w:p>
-    <w:p>
-      <w:r>
-        <w:t xml:space="preserve">This policy outlines the rules regarding Emergency Procedures. All patrons must adhere strictly to these guidelines to ensure fair access and safety. Failure to comply with the Emergency Procedures policy may result in suspension of library privileges. This policy outlines the rules regarding Emergency Procedures. All patrons must adhere strictly to these guidelines to ensure fair access and safety. Failure to comply with the Emergency Procedures policy may result in suspension of library privileges. This policy outlines the rules regarding Emergency Procedures. All patrons must adhere strictly to these guidelines to ensure fair access and safety. Failure to comply with the Emergency Procedures policy may result in suspension of library privileges. This policy outlines the rules regarding Emergency Procedures. All patrons must adhere strictly to these guidelines to ensure fair access and safety. Failure to comply with the Emergency Procedures policy may result in suspension of library privileges. This policy outlines the rules regarding Emergency Procedures. All patrons must adhere strictly to these guidelines to ensure fair access and safety. Failure to comply with the Emergency Procedures policy may result in suspension of library privileges. This policy outlines the rules regarding Emergency Procedures. All patrons must adhere strictly to these guidelines to ensure fair access and safety. Failure to comply with the Emergency Procedures policy may result in suspension of library privileges. </w:t>
-      </w:r>
-    </w:p>
-    <w:p>
-      <w:r>
-        <w:br w:type="page"/>
-      </w:r>
-    </w:p>
-    <w:p>
-      <w:pPr>
-        <w:pStyle w:val="Heading2"/>
-      </w:pPr>
-      <w:r>
-        <w:t>Emergency Procedures - Part 10</w:t>
-      </w:r>
-    </w:p>
-    <w:p>
-      <w:r>
-        <w:t xml:space="preserve">This policy outlines the rules regarding Emergency Procedures. All patrons must adhere strictly to these guidelines to ensure fair access and safety. Failure to comply with the Emergency Procedures policy may result in suspension of library privileges. This policy outlines the rules regarding Emergency Procedures. All patrons must adhere strictly to these guidelines to ensure fair access and safety. Failure to comply with the Emergency Procedures policy may result in suspension of library privileges. This policy outlines the rules regarding Emergency Procedures. All patrons must adhere strictly to these guidelines to ensure fair access and safety. Failure to comply with the Emergency Procedures policy may result in suspension of library privileges. This policy outlines the rules regarding Emergency Procedures. All patrons must adhere strictly to these guidelines to ensure fair access and safety. Failure to comply with the Emergency Procedures policy may result in suspension of library privileges. This policy outlines the rules regarding Emergency Procedures. All patrons must adhere strictly to these guidelines to ensure fair access and safety. Failure to comply with the Emergency Procedures policy may result in suspension of library privileges. This policy outlines the rules regarding Emergency Procedures. All patrons must adhere strictly to these guidelines to ensure fair access and safety. Failure to comply with the Emergency Procedures policy may result in suspension of library privileges. </w:t>
-      </w:r>
-    </w:p>
-    <w:p>
-      <w:r>
-        <w:t xml:space="preserve">This policy outlines the rules regarding Emergency Procedures. All patrons must adhere strictly to these guidelines to ensure fair access and safety. Failure to comply with the Emergency Procedures policy may result in suspension of library privileges. This policy outlines the rules regarding Emergency Procedures. All patrons must adhere strictly to these guidelines to ensure fair access and safety. Failure to comply with the Emergency Procedures policy may result in suspension of library privileges. This policy outlines the rules regarding Emergency Procedures. All patrons must adhere strictly to these guidelines to ensure fair access and safety. Failure to comply with the Emergency Procedures policy may result in suspension of library privileges. This policy outlines the rules regarding Emergency Procedures. All patrons must adhere strictly to these guidelines to ensure fair access and safety. Failure to comply with the Emergency Procedures policy may result in suspension of library privileges. This policy outlines the rules regarding Emergency Procedures. All patrons must adhere strictly to these guidelines to ensure fair access and safety. Failure to comply with the Emergency Procedures policy may result in suspension of library privileges. This policy outlines the rules regarding Emergency Procedures. All patrons must adhere strictly to these guidelines to ensure fair access and safety. Failure to comply with the Emergency Procedures policy may result in suspension of library privileges. </w:t>
-      </w:r>
-    </w:p>
-    <w:p>
-      <w:r>
-        <w:t xml:space="preserve">This policy outlines the rules regarding Emergency Procedures. All patrons must adhere strictly to these guidelines to ensure fair access and safety. Failure to comply with the Emergency Procedures policy may result in suspension of library privileges. This policy outlines the rules regarding Emergency Procedures. All patrons must adhere strictly to these guidelines to ensure fair access and safety. Failure to comply with the Emergency Procedures policy may result in suspension of library privileges. This policy outlines the rules regarding Emergency Procedures. All patrons must adhere strictly to these guidelines to ensure fair access and safety. Failure to comply with the Emergency Procedures policy may result in suspension of library privileges. This policy outlines the rules regarding Emergency Procedures. All patrons must adhere strictly to these guidelines to ensure fair access and safety. Failure to comply with the Emergency Procedures policy may result in suspension of library privileges. This policy outlines the rules regarding Emergency Procedures. All patrons must adhere strictly to these guidelines to ensure fair access and safety. Failure to comply with the Emergency Procedures policy may result in suspension of library privileges. This policy outlines the rules regarding Emergency Procedures. All patrons must adhere strictly to these guidelines to ensure fair access and safety. Failure to comply with the Emergency Procedures policy may result in suspension of library privileges. </w:t>
+        <w:t>- Evacuation Alarms: When the fire alarm sounds, all occupants must evacuate immediately using designated stairwells (do not use elevators).</w:t>
+        <w:br/>
+        <w:t>- Assembly Point: Gather at the University Plaza outside the main entrance for headcount.</w:t>
+        <w:br/>
+        <w:t>- Medical Emergencies: Contact Campus Security immediately at extension 4444 or notify any library staff member.</w:t>
       </w:r>
     </w:p>
     <w:sectPr>

</xml_diff>